<commit_message>
Update Spotify Connect design.docx, Spotify Connect design.odt, and spotify_connect.sh
</commit_message>
<xml_diff>
--- a/Documents/Spotify/Spotify Connect design.docx
+++ b/Documents/Spotify/Spotify Connect design.docx
@@ -67,6 +67,7 @@
       <w:pPr>
         <w:pStyle w:val="BodyText"/>
         <w:bidi w:val="0"/>
+        <w:spacing w:lineRule="auto" w:line="276" w:before="0" w:after="140"/>
         <w:jc w:val="start"/>
         <w:rPr/>
       </w:pPr>
@@ -79,6 +80,7 @@
       <w:pPr>
         <w:pStyle w:val="BodyText"/>
         <w:bidi w:val="0"/>
+        <w:spacing w:lineRule="auto" w:line="276" w:before="0" w:after="140"/>
         <w:jc w:val="start"/>
         <w:rPr/>
       </w:pPr>
@@ -91,6 +93,7 @@
       <w:pPr>
         <w:pStyle w:val="BodyText"/>
         <w:bidi w:val="0"/>
+        <w:spacing w:lineRule="auto" w:line="276" w:before="0" w:after="140"/>
         <w:jc w:val="start"/>
         <w:rPr/>
       </w:pPr>
@@ -144,74 +147,6 @@
       <w:r>
         <w:rPr/>
         <w:t>two packages:</w:t>
-      </w:r>
-    </w:p>
-    <w:p>
-      <w:pPr>
-        <w:pStyle w:val="BodyText"/>
-        <w:numPr>
-          <w:ilvl w:val="0"/>
-          <w:numId w:val="1"/>
-        </w:numPr>
-        <w:bidi w:val="0"/>
-        <w:jc w:val="start"/>
-        <w:rPr/>
-      </w:pPr>
-      <w:r>
-        <w:rPr/>
-        <w:t>The r</w:t>
-      </w:r>
-      <w:r>
-        <w:rPr/>
-        <w:t xml:space="preserve">aspotify package: will turning our Raspberry Pi into a Spotify Connect device. </w:t>
-      </w:r>
-    </w:p>
-    <w:p>
-      <w:pPr>
-        <w:pStyle w:val="BodyText"/>
-        <w:numPr>
-          <w:ilvl w:val="0"/>
-          <w:numId w:val="1"/>
-        </w:numPr>
-        <w:bidi w:val="0"/>
-        <w:jc w:val="start"/>
-        <w:rPr/>
-      </w:pPr>
-      <w:r>
-        <w:rPr/>
-        <w:t xml:space="preserve">The avahi-daemon package: is a free Zero-configuration networking (zeroconf) implementation, including a system for multicast DNS/DNS-SD service discovery. </w:t>
-      </w:r>
-    </w:p>
-    <w:p>
-      <w:pPr>
-        <w:pStyle w:val="BodyText"/>
-        <w:bidi w:val="0"/>
-        <w:jc w:val="start"/>
-        <w:rPr/>
-      </w:pPr>
-      <w:r>
-        <w:rPr/>
-        <w:t xml:space="preserve">Spotify uses mDNS to discover endpoints (hence a librespot instance will use mDNS to broadcast itself). By default, librespot uses its own mDNS responder implementation. </w:t>
-      </w:r>
-    </w:p>
-    <w:p>
-      <w:pPr>
-        <w:pStyle w:val="BodyText"/>
-        <w:bidi w:val="0"/>
-        <w:jc w:val="start"/>
-        <w:rPr/>
-      </w:pPr>
-      <w:r>
-        <w:rPr/>
-        <w:t xml:space="preserve">Avahi is a system daemon, </w:t>
-      </w:r>
-      <w:r>
-        <w:rPr/>
-        <w:t>that</w:t>
-      </w:r>
-      <w:r>
-        <w:rPr/>
-        <w:t xml:space="preserve"> does multiple things:</w:t>
       </w:r>
     </w:p>
     <w:p>
@@ -221,19 +156,17 @@
           <w:ilvl w:val="0"/>
           <w:numId w:val="2"/>
         </w:numPr>
-        <w:tabs>
-          <w:tab w:val="clear" w:pos="709"/>
-          <w:tab w:val="left" w:pos="709" w:leader="none"/>
-        </w:tabs>
-        <w:bidi w:val="0"/>
-        <w:spacing w:before="0" w:after="0"/>
-        <w:ind w:hanging="283" w:start="709"/>
-        <w:jc w:val="start"/>
-        <w:rPr/>
-      </w:pPr>
-      <w:r>
-        <w:rPr/>
-        <w:t>client: provide name resolution for mDNS services.</w:t>
+        <w:bidi w:val="0"/>
+        <w:jc w:val="start"/>
+        <w:rPr/>
+      </w:pPr>
+      <w:r>
+        <w:rPr/>
+        <w:t>The r</w:t>
+      </w:r>
+      <w:r>
+        <w:rPr/>
+        <w:t xml:space="preserve">aspotify package: will turning our Raspberry Pi into a Spotify Connect device. </w:t>
       </w:r>
     </w:p>
     <w:p>
@@ -243,18 +176,68 @@
           <w:ilvl w:val="0"/>
           <w:numId w:val="2"/>
         </w:numPr>
+        <w:bidi w:val="0"/>
+        <w:jc w:val="start"/>
+        <w:rPr/>
+      </w:pPr>
+      <w:r>
+        <w:rPr/>
+        <w:t xml:space="preserve">The avahi-daemon package: is a free Zero-configuration networking (zeroconf) implementation, including a system for multicast DNS/DNS-SD service discovery. </w:t>
+      </w:r>
+    </w:p>
+    <w:p>
+      <w:pPr>
+        <w:pStyle w:val="BodyText"/>
+        <w:bidi w:val="0"/>
+        <w:spacing w:lineRule="auto" w:line="276" w:before="0" w:after="140"/>
+        <w:jc w:val="start"/>
+        <w:rPr/>
+      </w:pPr>
+      <w:r>
+        <w:rPr/>
+        <w:t xml:space="preserve">Spotify uses mDNS to discover endpoints (hence a librespot instance will use mDNS to broadcast itself). By default, librespot uses its own mDNS responder implementation. </w:t>
+      </w:r>
+    </w:p>
+    <w:p>
+      <w:pPr>
+        <w:pStyle w:val="BodyText"/>
+        <w:bidi w:val="0"/>
+        <w:jc w:val="start"/>
+        <w:rPr/>
+      </w:pPr>
+      <w:r>
+        <w:rPr/>
+        <w:t xml:space="preserve">Avahi is a system daemon, </w:t>
+      </w:r>
+      <w:r>
+        <w:rPr/>
+        <w:t>that</w:t>
+      </w:r>
+      <w:r>
+        <w:rPr/>
+        <w:t xml:space="preserve"> does multiple things:</w:t>
+      </w:r>
+    </w:p>
+    <w:p>
+      <w:pPr>
+        <w:pStyle w:val="BodyText"/>
+        <w:numPr>
+          <w:ilvl w:val="0"/>
+          <w:numId w:val="3"/>
+        </w:numPr>
         <w:tabs>
           <w:tab w:val="clear" w:pos="709"/>
           <w:tab w:val="left" w:pos="709" w:leader="none"/>
         </w:tabs>
         <w:bidi w:val="0"/>
+        <w:spacing w:before="0" w:after="0"/>
         <w:ind w:hanging="283" w:start="709"/>
         <w:jc w:val="start"/>
         <w:rPr/>
       </w:pPr>
       <w:r>
         <w:rPr/>
-        <w:t xml:space="preserve">responder: optionally, avahi will also broadcast services records for other programs (typically through dbus) </w:t>
+        <w:t>client: provide name resolution for mDNS services.</w:t>
       </w:r>
     </w:p>
     <w:p>
@@ -262,7 +245,28 @@
         <w:pStyle w:val="BodyText"/>
         <w:numPr>
           <w:ilvl w:val="0"/>
-          <w:numId w:val="2"/>
+          <w:numId w:val="3"/>
+        </w:numPr>
+        <w:tabs>
+          <w:tab w:val="clear" w:pos="709"/>
+          <w:tab w:val="left" w:pos="709" w:leader="none"/>
+        </w:tabs>
+        <w:bidi w:val="0"/>
+        <w:ind w:hanging="283" w:start="709"/>
+        <w:jc w:val="start"/>
+        <w:rPr/>
+      </w:pPr>
+      <w:r>
+        <w:rPr/>
+        <w:t xml:space="preserve">responder: optionally, avahi will also broadcast services records for other programs (typically through dbus) </w:t>
+      </w:r>
+    </w:p>
+    <w:p>
+      <w:pPr>
+        <w:pStyle w:val="BodyText"/>
+        <w:numPr>
+          <w:ilvl w:val="0"/>
+          <w:numId w:val="3"/>
         </w:numPr>
         <w:tabs>
           <w:tab w:val="clear" w:pos="709"/>
@@ -400,9 +404,7 @@
         </w:rPr>
       </w:pPr>
       <w:r>
-        <w:rPr>
-          <w:rFonts w:ascii="Liberation Serif" w:hAnsi="Liberation Serif"/>
-        </w:rPr>
+        <w:rPr/>
         <w:t>Searches for sound devices using the mDNS Discovery service of avahi-daemon. The Oradio advertises with &lt;Oradio-luidspreker&gt; as sound device.</w:t>
       </w:r>
     </w:p>
@@ -416,7 +418,6 @@
       </w:pPr>
       <w:r>
         <w:rPr>
-          <w:rFonts w:ascii="Liberation Serif" w:hAnsi="Liberation Serif"/>
           <w:b w:val="false"/>
           <w:bCs w:val="false"/>
         </w:rPr>
@@ -425,7 +426,6 @@
       <w:r>
         <w:rPr>
           <w:rStyle w:val="Strong"/>
-          <w:rFonts w:ascii="Liberation Serif" w:hAnsi="Liberation Serif"/>
           <w:b w:val="false"/>
           <w:bCs w:val="false"/>
         </w:rPr>
@@ -433,7 +433,6 @@
       </w:r>
       <w:r>
         <w:rPr>
-          <w:rFonts w:ascii="Liberation Serif" w:hAnsi="Liberation Serif"/>
           <w:b w:val="false"/>
           <w:bCs w:val="false"/>
         </w:rPr>
@@ -450,7 +449,6 @@
       </w:pPr>
       <w:r>
         <w:rPr>
-          <w:rFonts w:ascii="Liberation Serif" w:hAnsi="Liberation Serif"/>
           <w:b w:val="false"/>
           <w:bCs w:val="false"/>
         </w:rPr>
@@ -459,7 +457,6 @@
       <w:r>
         <w:rPr>
           <w:rStyle w:val="Strong"/>
-          <w:rFonts w:ascii="Liberation Serif" w:hAnsi="Liberation Serif"/>
           <w:b w:val="false"/>
           <w:bCs w:val="false"/>
         </w:rPr>
@@ -467,7 +464,6 @@
       </w:r>
       <w:r>
         <w:rPr>
-          <w:rFonts w:ascii="Liberation Serif" w:hAnsi="Liberation Serif"/>
           <w:b w:val="false"/>
           <w:bCs w:val="false"/>
         </w:rPr>
@@ -476,7 +472,6 @@
       <w:r>
         <w:rPr>
           <w:rStyle w:val="SourceText"/>
-          <w:rFonts w:ascii="Liberation Serif" w:hAnsi="Liberation Serif"/>
           <w:b w:val="false"/>
           <w:bCs w:val="false"/>
         </w:rPr>
@@ -484,7 +479,6 @@
       </w:r>
       <w:r>
         <w:rPr>
-          <w:rFonts w:ascii="Liberation Serif" w:hAnsi="Liberation Serif"/>
           <w:b w:val="false"/>
           <w:bCs w:val="false"/>
         </w:rPr>
@@ -492,7 +486,6 @@
       </w:r>
       <w:r>
         <w:rPr>
-          <w:rFonts w:ascii="Liberation Serif" w:hAnsi="Liberation Serif"/>
           <w:b w:val="false"/>
           <w:bCs w:val="false"/>
         </w:rPr>
@@ -501,7 +494,6 @@
       <w:r>
         <w:rPr>
           <w:rStyle w:val="SourceText"/>
-          <w:rFonts w:ascii="Liberation Serif" w:hAnsi="Liberation Serif"/>
           <w:b w:val="false"/>
           <w:bCs w:val="false"/>
         </w:rPr>
@@ -509,7 +501,6 @@
       </w:r>
       <w:r>
         <w:rPr>
-          <w:rFonts w:ascii="Liberation Serif" w:hAnsi="Liberation Serif"/>
           <w:b w:val="false"/>
           <w:bCs w:val="false"/>
         </w:rPr>
@@ -518,7 +509,6 @@
       <w:r>
         <w:rPr>
           <w:rStyle w:val="SourceText"/>
-          <w:rFonts w:ascii="Liberation Serif" w:hAnsi="Liberation Serif"/>
           <w:b w:val="false"/>
           <w:bCs w:val="false"/>
         </w:rPr>
@@ -526,7 +516,6 @@
       </w:r>
       <w:r>
         <w:rPr>
-          <w:rFonts w:ascii="Liberation Serif" w:hAnsi="Liberation Serif"/>
           <w:b w:val="false"/>
           <w:bCs w:val="false"/>
         </w:rPr>
@@ -537,12 +526,12 @@
       <w:pPr>
         <w:pStyle w:val="BodyText"/>
         <w:bidi w:val="0"/>
-        <w:jc w:val="start"/>
-        <w:rPr/>
-      </w:pPr>
-      <w:r>
-        <w:rPr>
-          <w:rFonts w:ascii="Liberation Serif" w:hAnsi="Liberation Serif"/>
+        <w:spacing w:lineRule="auto" w:line="276" w:before="0" w:after="140"/>
+        <w:jc w:val="start"/>
+        <w:rPr/>
+      </w:pPr>
+      <w:r>
+        <w:rPr>
           <w:b w:val="false"/>
           <w:bCs w:val="false"/>
         </w:rPr>
@@ -550,7 +539,6 @@
       </w:r>
       <w:r>
         <w:rPr>
-          <w:rFonts w:ascii="Liberation Serif" w:hAnsi="Liberation Serif"/>
           <w:b w:val="false"/>
           <w:bCs w:val="false"/>
         </w:rPr>
@@ -558,7 +546,6 @@
       </w:r>
       <w:r>
         <w:rPr>
-          <w:rFonts w:ascii="Liberation Serif" w:hAnsi="Liberation Serif"/>
           <w:b w:val="false"/>
           <w:bCs w:val="false"/>
         </w:rPr>
@@ -567,7 +554,6 @@
       <w:r>
         <w:rPr>
           <w:rStyle w:val="SourceText"/>
-          <w:rFonts w:ascii="Liberation Serif" w:hAnsi="Liberation Serif"/>
           <w:b w:val="false"/>
           <w:bCs w:val="false"/>
         </w:rPr>
@@ -575,7 +561,6 @@
       </w:r>
       <w:r>
         <w:rPr>
-          <w:rFonts w:ascii="Liberation Serif" w:hAnsi="Liberation Serif"/>
           <w:b w:val="false"/>
           <w:bCs w:val="false"/>
         </w:rPr>
@@ -599,213 +584,6 @@
       </w:r>
       <w:r>
         <w:rPr/>
-        <w:t>:</w:t>
-      </w:r>
-    </w:p>
-    <w:p>
-      <w:pPr>
-        <w:pStyle w:val="BodyText"/>
-        <w:numPr>
-          <w:ilvl w:val="0"/>
-          <w:numId w:val="3"/>
-        </w:numPr>
-        <w:tabs>
-          <w:tab w:val="clear" w:pos="709"/>
-          <w:tab w:val="left" w:pos="709" w:leader="none"/>
-        </w:tabs>
-        <w:bidi w:val="0"/>
-        <w:spacing w:before="0" w:after="0"/>
-        <w:ind w:hanging="283" w:start="709"/>
-        <w:jc w:val="start"/>
-        <w:rPr/>
-      </w:pPr>
-      <w:r>
-        <w:rPr>
-          <w:b w:val="false"/>
-          <w:bCs w:val="false"/>
-        </w:rPr>
-        <w:t xml:space="preserve">It establishes a connection with </w:t>
-      </w:r>
-      <w:r>
-        <w:rPr>
-          <w:b w:val="false"/>
-          <w:bCs w:val="false"/>
-        </w:rPr>
-        <w:t xml:space="preserve">Librespot </w:t>
-      </w:r>
-      <w:r>
-        <w:rPr>
-          <w:b w:val="false"/>
-          <w:bCs w:val="false"/>
-        </w:rPr>
-        <w:t xml:space="preserve">using </w:t>
-      </w:r>
-      <w:r>
-        <w:rPr>
-          <w:rStyle w:val="Strong"/>
-          <w:b w:val="false"/>
-          <w:bCs w:val="false"/>
-        </w:rPr>
-        <w:t>Spotify's authentication and control protocols</w:t>
-      </w:r>
-      <w:r>
-        <w:rPr>
-          <w:b w:val="false"/>
-          <w:bCs w:val="false"/>
-        </w:rPr>
-        <w:t>.</w:t>
-      </w:r>
-    </w:p>
-    <w:p>
-      <w:pPr>
-        <w:pStyle w:val="BodyText"/>
-        <w:numPr>
-          <w:ilvl w:val="0"/>
-          <w:numId w:val="3"/>
-        </w:numPr>
-        <w:tabs>
-          <w:tab w:val="clear" w:pos="709"/>
-          <w:tab w:val="left" w:pos="709" w:leader="none"/>
-        </w:tabs>
-        <w:bidi w:val="0"/>
-        <w:spacing w:before="0" w:after="0"/>
-        <w:ind w:hanging="283" w:start="709"/>
-        <w:jc w:val="start"/>
-        <w:rPr/>
-      </w:pPr>
-      <w:r>
-        <w:rPr>
-          <w:b w:val="false"/>
-          <w:bCs w:val="false"/>
-        </w:rPr>
-        <w:t xml:space="preserve">It sends commands like </w:t>
-      </w:r>
-      <w:r>
-        <w:rPr>
-          <w:rStyle w:val="Strong"/>
-          <w:b w:val="false"/>
-          <w:bCs w:val="false"/>
-        </w:rPr>
-        <w:t>Play, Pause, Skip, Volume Control</w:t>
-      </w:r>
-      <w:r>
-        <w:rPr>
-          <w:b w:val="false"/>
-          <w:bCs w:val="false"/>
-        </w:rPr>
-        <w:t>.</w:t>
-      </w:r>
-    </w:p>
-    <w:p>
-      <w:pPr>
-        <w:pStyle w:val="BodyText"/>
-        <w:numPr>
-          <w:ilvl w:val="0"/>
-          <w:numId w:val="3"/>
-        </w:numPr>
-        <w:tabs>
-          <w:tab w:val="clear" w:pos="709"/>
-          <w:tab w:val="left" w:pos="709" w:leader="none"/>
-        </w:tabs>
-        <w:bidi w:val="0"/>
-        <w:ind w:hanging="283" w:start="709"/>
-        <w:jc w:val="start"/>
-        <w:rPr/>
-      </w:pPr>
-      <w:r>
-        <w:rPr>
-          <w:b w:val="false"/>
-          <w:bCs w:val="false"/>
-        </w:rPr>
-        <w:t xml:space="preserve">Librespot </w:t>
-      </w:r>
-      <w:r>
-        <w:rPr>
-          <w:b w:val="false"/>
-          <w:bCs w:val="false"/>
-        </w:rPr>
-        <w:t xml:space="preserve">then fetches and plays the audio </w:t>
-      </w:r>
-      <w:r>
-        <w:rPr>
-          <w:rStyle w:val="Strong"/>
-          <w:b w:val="false"/>
-          <w:bCs w:val="false"/>
-        </w:rPr>
-        <w:t>directly from Spotify servers</w:t>
-      </w:r>
-      <w:r>
-        <w:rPr>
-          <w:b w:val="false"/>
-          <w:bCs w:val="false"/>
-        </w:rPr>
-        <w:t>.</w:t>
-      </w:r>
-    </w:p>
-    <w:p>
-      <w:pPr>
-        <w:pStyle w:val="Normal"/>
-        <w:bidi w:val="0"/>
-        <w:jc w:val="start"/>
-        <w:rPr/>
-      </w:pPr>
-      <w:r>
-        <w:rPr>
-          <w:b/>
-          <w:bCs/>
-          <w:u w:val="single"/>
-        </w:rPr>
-        <w:t>Librespot Service</w:t>
-      </w:r>
-    </w:p>
-    <w:p>
-      <w:pPr>
-        <w:pStyle w:val="Normal"/>
-        <w:bidi w:val="0"/>
-        <w:jc w:val="start"/>
-        <w:rPr>
-          <w:b w:val="false"/>
-          <w:bCs w:val="false"/>
-          <w:u w:val="none"/>
-        </w:rPr>
-      </w:pPr>
-      <w:r>
-        <w:rPr>
-          <w:b w:val="false"/>
-          <w:bCs w:val="false"/>
-          <w:u w:val="none"/>
-        </w:rPr>
-        <w:t xml:space="preserve">After receiving a </w:t>
-      </w:r>
-      <w:r>
-        <w:rPr>
-          <w:rStyle w:val="Strong"/>
-          <w:u w:val="none"/>
-        </w:rPr>
-        <w:t>play command</w:t>
-      </w:r>
-      <w:r>
-        <w:rPr>
-          <w:b w:val="false"/>
-          <w:bCs w:val="false"/>
-          <w:u w:val="none"/>
-        </w:rPr>
-        <w:t xml:space="preserve">, </w:t>
-      </w:r>
-      <w:r>
-        <w:rPr>
-          <w:b w:val="false"/>
-          <w:bCs w:val="false"/>
-          <w:u w:val="none"/>
-        </w:rPr>
-        <w:t>Librespot</w:t>
-      </w:r>
-      <w:r>
-        <w:rPr>
-          <w:b w:val="false"/>
-          <w:bCs w:val="false"/>
-          <w:u w:val="none"/>
-        </w:rPr>
         <w:t>:</w:t>
       </w:r>
     </w:p>
@@ -827,8 +605,40 @@
         <w:rPr/>
       </w:pPr>
       <w:r>
-        <w:rPr/>
-        <w:t>Authenticates with Spotify servers.</w:t>
+        <w:rPr>
+          <w:b w:val="false"/>
+          <w:bCs w:val="false"/>
+        </w:rPr>
+        <w:t xml:space="preserve">It establishes a connection with </w:t>
+      </w:r>
+      <w:r>
+        <w:rPr>
+          <w:b w:val="false"/>
+          <w:bCs w:val="false"/>
+        </w:rPr>
+        <w:t xml:space="preserve">Librespot </w:t>
+      </w:r>
+      <w:r>
+        <w:rPr>
+          <w:b w:val="false"/>
+          <w:bCs w:val="false"/>
+        </w:rPr>
+        <w:t xml:space="preserve">using </w:t>
+      </w:r>
+      <w:r>
+        <w:rPr>
+          <w:rStyle w:val="Strong"/>
+          <w:b w:val="false"/>
+          <w:bCs w:val="false"/>
+        </w:rPr>
+        <w:t>Spotify's authentication and control protocols</w:t>
+      </w:r>
+      <w:r>
+        <w:rPr>
+          <w:b w:val="false"/>
+          <w:bCs w:val="false"/>
+        </w:rPr>
+        <w:t>.</w:t>
       </w:r>
     </w:p>
     <w:p>
@@ -849,8 +659,26 @@
         <w:rPr/>
       </w:pPr>
       <w:r>
-        <w:rPr/>
-        <w:t>Retrieves the requested audio stream.</w:t>
+        <w:rPr>
+          <w:b w:val="false"/>
+          <w:bCs w:val="false"/>
+        </w:rPr>
+        <w:t xml:space="preserve">It sends commands like </w:t>
+      </w:r>
+      <w:r>
+        <w:rPr>
+          <w:rStyle w:val="Strong"/>
+          <w:b w:val="false"/>
+          <w:bCs w:val="false"/>
+        </w:rPr>
+        <w:t>Play, Pause, Skip, Volume Control</w:t>
+      </w:r>
+      <w:r>
+        <w:rPr>
+          <w:b w:val="false"/>
+          <w:bCs w:val="false"/>
+        </w:rPr>
+        <w:t>.</w:t>
       </w:r>
     </w:p>
     <w:p>
@@ -870,21 +698,104 @@
         <w:rPr/>
       </w:pPr>
       <w:r>
-        <w:rPr/>
-        <w:t>Decodes and outputs the audio to the Raspberry Pi’s sound card or external DAC.</w:t>
-      </w:r>
-    </w:p>
-    <w:p>
-      <w:pPr>
-        <w:pStyle w:val="BodyText"/>
-        <w:bidi w:val="0"/>
-        <w:spacing w:lineRule="auto" w:line="240" w:before="0" w:after="26"/>
-        <w:jc w:val="start"/>
-        <w:rPr/>
-      </w:pPr>
-      <w:r>
-        <w:rPr/>
-        <w:t>If Librespot stops or restarts:</w:t>
+        <w:rPr>
+          <w:b w:val="false"/>
+          <w:bCs w:val="false"/>
+        </w:rPr>
+        <w:t xml:space="preserve">Librespot </w:t>
+      </w:r>
+      <w:r>
+        <w:rPr>
+          <w:b w:val="false"/>
+          <w:bCs w:val="false"/>
+        </w:rPr>
+        <w:t xml:space="preserve">then fetches and plays the audio </w:t>
+      </w:r>
+      <w:r>
+        <w:rPr>
+          <w:rStyle w:val="Strong"/>
+          <w:b w:val="false"/>
+          <w:bCs w:val="false"/>
+        </w:rPr>
+        <w:t>directly from Spotify servers</w:t>
+      </w:r>
+      <w:r>
+        <w:rPr>
+          <w:b w:val="false"/>
+          <w:bCs w:val="false"/>
+        </w:rPr>
+        <w:t>.</w:t>
+      </w:r>
+    </w:p>
+    <w:p>
+      <w:pPr>
+        <w:pStyle w:val="Normal"/>
+        <w:bidi w:val="0"/>
+        <w:jc w:val="start"/>
+        <w:rPr>
+          <w:b/>
+          <w:bCs/>
+          <w:u w:val="single"/>
+        </w:rPr>
+      </w:pPr>
+      <w:r>
+        <w:rPr>
+          <w:b/>
+          <w:bCs/>
+          <w:u w:val="single"/>
+        </w:rPr>
+        <w:t>Librespot Service</w:t>
+      </w:r>
+    </w:p>
+    <w:p>
+      <w:pPr>
+        <w:pStyle w:val="Normal"/>
+        <w:bidi w:val="0"/>
+        <w:jc w:val="start"/>
+        <w:rPr>
+          <w:b w:val="false"/>
+          <w:bCs w:val="false"/>
+          <w:u w:val="none"/>
+        </w:rPr>
+      </w:pPr>
+      <w:r>
+        <w:rPr>
+          <w:b w:val="false"/>
+          <w:bCs w:val="false"/>
+          <w:u w:val="none"/>
+        </w:rPr>
+        <w:t xml:space="preserve">After receiving a </w:t>
+      </w:r>
+      <w:r>
+        <w:rPr>
+          <w:rStyle w:val="Strong"/>
+          <w:u w:val="none"/>
+        </w:rPr>
+        <w:t>play command</w:t>
+      </w:r>
+      <w:r>
+        <w:rPr>
+          <w:b w:val="false"/>
+          <w:bCs w:val="false"/>
+          <w:u w:val="none"/>
+        </w:rPr>
+        <w:t xml:space="preserve">, </w:t>
+      </w:r>
+      <w:r>
+        <w:rPr>
+          <w:b w:val="false"/>
+          <w:bCs w:val="false"/>
+          <w:u w:val="none"/>
+        </w:rPr>
+        <w:t>Librespot</w:t>
+      </w:r>
+      <w:r>
+        <w:rPr>
+          <w:b w:val="false"/>
+          <w:bCs w:val="false"/>
+          <w:u w:val="none"/>
+        </w:rPr>
+        <w:t>:</w:t>
       </w:r>
     </w:p>
     <w:p>
@@ -894,24 +805,19 @@
           <w:ilvl w:val="0"/>
           <w:numId w:val="5"/>
         </w:numPr>
-        <w:bidi w:val="0"/>
-        <w:spacing w:lineRule="auto" w:line="240" w:before="0" w:after="26"/>
-        <w:jc w:val="start"/>
-        <w:rPr/>
-      </w:pPr>
-      <w:r>
-        <w:rPr/>
-        <w:t xml:space="preserve">It re-registers itself with </w:t>
-      </w:r>
-      <w:r>
-        <w:rPr>
-          <w:rStyle w:val="SourceText"/>
-        </w:rPr>
-        <w:t>avahi-daemon</w:t>
-      </w:r>
-      <w:r>
-        <w:rPr/>
-        <w:t>.</w:t>
+        <w:tabs>
+          <w:tab w:val="clear" w:pos="709"/>
+          <w:tab w:val="left" w:pos="709" w:leader="none"/>
+        </w:tabs>
+        <w:bidi w:val="0"/>
+        <w:spacing w:before="0" w:after="0"/>
+        <w:ind w:hanging="283" w:start="709"/>
+        <w:jc w:val="start"/>
+        <w:rPr/>
+      </w:pPr>
+      <w:r>
+        <w:rPr/>
+        <w:t>Authenticates with Spotify servers.</w:t>
       </w:r>
     </w:p>
     <w:p>
@@ -921,116 +827,53 @@
           <w:ilvl w:val="0"/>
           <w:numId w:val="5"/>
         </w:numPr>
-        <w:bidi w:val="0"/>
-        <w:spacing w:lineRule="auto" w:line="240" w:before="0" w:after="26"/>
-        <w:jc w:val="start"/>
-        <w:rPr/>
-      </w:pPr>
-      <w:r>
-        <w:rPr/>
-        <w:t>If the Raspberry Pi’s IP address changes:</w:t>
+        <w:tabs>
+          <w:tab w:val="clear" w:pos="709"/>
+          <w:tab w:val="left" w:pos="709" w:leader="none"/>
+        </w:tabs>
+        <w:bidi w:val="0"/>
+        <w:spacing w:before="0" w:after="0"/>
+        <w:ind w:hanging="283" w:start="709"/>
+        <w:jc w:val="start"/>
+        <w:rPr/>
+      </w:pPr>
+      <w:r>
+        <w:rPr/>
+        <w:t>Retrieves the requested audio stream.</w:t>
       </w:r>
     </w:p>
     <w:p>
       <w:pPr>
         <w:pStyle w:val="BodyText"/>
         <w:numPr>
-          <w:ilvl w:val="1"/>
+          <w:ilvl w:val="0"/>
           <w:numId w:val="5"/>
         </w:numPr>
+        <w:tabs>
+          <w:tab w:val="clear" w:pos="709"/>
+          <w:tab w:val="left" w:pos="709" w:leader="none"/>
+        </w:tabs>
+        <w:bidi w:val="0"/>
+        <w:ind w:hanging="283" w:start="709"/>
+        <w:jc w:val="start"/>
+        <w:rPr/>
+      </w:pPr>
+      <w:r>
+        <w:rPr/>
+        <w:t>Decodes and outputs the audio to the Raspberry Pi’s sound card or external DAC.</w:t>
+      </w:r>
+    </w:p>
+    <w:p>
+      <w:pPr>
+        <w:pStyle w:val="BodyText"/>
         <w:bidi w:val="0"/>
         <w:spacing w:lineRule="auto" w:line="240" w:before="0" w:after="26"/>
         <w:jc w:val="start"/>
         <w:rPr/>
       </w:pPr>
       <w:r>
-        <w:rPr>
-          <w:rStyle w:val="SourceText"/>
-        </w:rPr>
-        <w:t>avahi-daemon</w:t>
-      </w:r>
-      <w:r>
-        <w:rPr/>
-        <w:t xml:space="preserve"> updates the mDNS records dynamically.</w:t>
-      </w:r>
-    </w:p>
-    <w:p>
-      <w:pPr>
-        <w:pStyle w:val="Normal"/>
-        <w:bidi w:val="0"/>
-        <w:jc w:val="start"/>
-        <w:rPr>
-          <w:b w:val="false"/>
-          <w:bCs w:val="false"/>
-          <w:u w:val="none"/>
-        </w:rPr>
-      </w:pPr>
-      <w:r>
-        <w:rPr>
-          <w:b w:val="false"/>
-          <w:bCs w:val="false"/>
-          <w:u w:val="none"/>
-        </w:rPr>
-      </w:r>
-    </w:p>
-    <w:p>
-      <w:pPr>
-        <w:pStyle w:val="Normal"/>
-        <w:bidi w:val="0"/>
-        <w:jc w:val="start"/>
-        <w:rPr>
-          <w:b/>
-          <w:bCs/>
-          <w:u w:val="single"/>
-        </w:rPr>
-      </w:pPr>
-      <w:r>
-        <w:rPr>
-          <w:b/>
-          <w:bCs/>
-          <w:u w:val="single"/>
-        </w:rPr>
-        <w:t>Avahi-daemon:</w:t>
-      </w:r>
-    </w:p>
-    <w:p>
-      <w:pPr>
-        <w:pStyle w:val="BodyText"/>
-        <w:bidi w:val="0"/>
-        <w:jc w:val="start"/>
-        <w:rPr>
-          <w:b w:val="false"/>
-          <w:bCs w:val="false"/>
-          <w:u w:val="none"/>
-        </w:rPr>
-      </w:pPr>
-      <w:r>
-        <w:rPr>
-          <w:b w:val="false"/>
-          <w:bCs w:val="false"/>
-          <w:u w:val="none"/>
-        </w:rPr>
-        <w:t>Librespot uses the avahi-api to publish the Spotify Connect Service.</w:t>
-      </w:r>
-    </w:p>
-    <w:p>
-      <w:pPr>
-        <w:pStyle w:val="BodyText"/>
-        <w:bidi w:val="0"/>
-        <w:jc w:val="start"/>
-        <w:rPr>
-          <w:b w:val="false"/>
-          <w:bCs w:val="false"/>
-          <w:u w:val="none"/>
-        </w:rPr>
-      </w:pPr>
-      <w:r>
-        <w:rPr>
-          <w:b w:val="false"/>
-          <w:bCs w:val="false"/>
-          <w:u w:val="none"/>
-        </w:rPr>
-        <w:t>This service contains metadata (TXT records) such as:</w:t>
+        <w:rPr/>
+        <w:t>If Librespot stops or restarts:</w:t>
       </w:r>
     </w:p>
     <w:p>
@@ -1040,27 +883,24 @@
           <w:ilvl w:val="0"/>
           <w:numId w:val="6"/>
         </w:numPr>
-        <w:tabs>
-          <w:tab w:val="clear" w:pos="709"/>
-          <w:tab w:val="left" w:pos="709" w:leader="none"/>
-        </w:tabs>
-        <w:bidi w:val="0"/>
-        <w:spacing w:before="0" w:after="0"/>
-        <w:ind w:hanging="283" w:start="709"/>
-        <w:jc w:val="start"/>
-        <w:rPr/>
-      </w:pPr>
-      <w:r>
-        <w:rPr/>
-        <w:t>Device name (e.g., “</w:t>
-      </w:r>
-      <w:r>
-        <w:rPr/>
-        <w:t>Oradio-luidspreker”</w:t>
-      </w:r>
-      <w:r>
-        <w:rPr/>
-        <w:t xml:space="preserve"> )</w:t>
+        <w:bidi w:val="0"/>
+        <w:spacing w:lineRule="auto" w:line="240" w:before="0" w:after="26"/>
+        <w:jc w:val="start"/>
+        <w:rPr/>
+      </w:pPr>
+      <w:r>
+        <w:rPr/>
+        <w:t xml:space="preserve">It re-registers itself with </w:t>
+      </w:r>
+      <w:r>
+        <w:rPr>
+          <w:rStyle w:val="SourceText"/>
+        </w:rPr>
+        <w:t>avahi-daemon</w:t>
+      </w:r>
+      <w:r>
+        <w:rPr/>
+        <w:t>.</w:t>
       </w:r>
     </w:p>
     <w:p>
@@ -1070,40 +910,37 @@
           <w:ilvl w:val="0"/>
           <w:numId w:val="6"/>
         </w:numPr>
-        <w:tabs>
-          <w:tab w:val="clear" w:pos="709"/>
-          <w:tab w:val="left" w:pos="709" w:leader="none"/>
-        </w:tabs>
-        <w:bidi w:val="0"/>
-        <w:spacing w:before="0" w:after="0"/>
-        <w:ind w:hanging="283" w:start="709"/>
-        <w:jc w:val="start"/>
-        <w:rPr/>
-      </w:pPr>
-      <w:r>
-        <w:rPr/>
-        <w:t>Supported sample rate, bit depth, and codec</w:t>
+        <w:bidi w:val="0"/>
+        <w:spacing w:lineRule="auto" w:line="240" w:before="0" w:after="26"/>
+        <w:jc w:val="start"/>
+        <w:rPr/>
+      </w:pPr>
+      <w:r>
+        <w:rPr/>
+        <w:t>If the Raspberry Pi’s IP address changes:</w:t>
       </w:r>
     </w:p>
     <w:p>
       <w:pPr>
         <w:pStyle w:val="BodyText"/>
         <w:numPr>
-          <w:ilvl w:val="0"/>
+          <w:ilvl w:val="1"/>
           <w:numId w:val="6"/>
         </w:numPr>
-        <w:tabs>
-          <w:tab w:val="clear" w:pos="709"/>
-          <w:tab w:val="left" w:pos="709" w:leader="none"/>
-        </w:tabs>
-        <w:bidi w:val="0"/>
-        <w:ind w:hanging="283" w:start="709"/>
-        <w:jc w:val="start"/>
-        <w:rPr/>
-      </w:pPr>
-      <w:r>
-        <w:rPr/>
-        <w:t>A unique device ID for Spotify authentication</w:t>
+        <w:bidi w:val="0"/>
+        <w:spacing w:lineRule="auto" w:line="240" w:before="0" w:after="26"/>
+        <w:jc w:val="start"/>
+        <w:rPr/>
+      </w:pPr>
+      <w:r>
+        <w:rPr>
+          <w:rStyle w:val="SourceText"/>
+        </w:rPr>
+        <w:t>avahi-daemon</w:t>
+      </w:r>
+      <w:r>
+        <w:rPr/>
+        <w:t xml:space="preserve"> updates the mDNS records dynamically.</w:t>
       </w:r>
     </w:p>
     <w:p>
@@ -1127,7 +964,7 @@
     </w:p>
     <w:p>
       <w:pPr>
-        <w:pStyle w:val="BodyText"/>
+        <w:pStyle w:val="Normal"/>
         <w:bidi w:val="0"/>
         <w:jc w:val="start"/>
         <w:rPr>
@@ -1142,6 +979,158 @@
           <w:bCs/>
           <w:u w:val="single"/>
         </w:rPr>
+        <w:t>Avahi-daemon:</w:t>
+      </w:r>
+    </w:p>
+    <w:p>
+      <w:pPr>
+        <w:pStyle w:val="BodyText"/>
+        <w:bidi w:val="0"/>
+        <w:jc w:val="start"/>
+        <w:rPr>
+          <w:b w:val="false"/>
+          <w:bCs w:val="false"/>
+          <w:u w:val="none"/>
+        </w:rPr>
+      </w:pPr>
+      <w:r>
+        <w:rPr>
+          <w:b w:val="false"/>
+          <w:bCs w:val="false"/>
+          <w:u w:val="none"/>
+        </w:rPr>
+        <w:t>Librespot uses the avahi-api to publish the Spotify Connect Service.</w:t>
+      </w:r>
+    </w:p>
+    <w:p>
+      <w:pPr>
+        <w:pStyle w:val="BodyText"/>
+        <w:bidi w:val="0"/>
+        <w:jc w:val="start"/>
+        <w:rPr>
+          <w:b w:val="false"/>
+          <w:bCs w:val="false"/>
+          <w:u w:val="none"/>
+        </w:rPr>
+      </w:pPr>
+      <w:r>
+        <w:rPr>
+          <w:b w:val="false"/>
+          <w:bCs w:val="false"/>
+          <w:u w:val="none"/>
+        </w:rPr>
+        <w:t>This service contains metadata (TXT records) such as:</w:t>
+      </w:r>
+    </w:p>
+    <w:p>
+      <w:pPr>
+        <w:pStyle w:val="BodyText"/>
+        <w:numPr>
+          <w:ilvl w:val="0"/>
+          <w:numId w:val="7"/>
+        </w:numPr>
+        <w:tabs>
+          <w:tab w:val="clear" w:pos="709"/>
+          <w:tab w:val="left" w:pos="709" w:leader="none"/>
+        </w:tabs>
+        <w:bidi w:val="0"/>
+        <w:spacing w:before="0" w:after="0"/>
+        <w:ind w:hanging="283" w:start="709"/>
+        <w:jc w:val="start"/>
+        <w:rPr/>
+      </w:pPr>
+      <w:r>
+        <w:rPr/>
+        <w:t>Device name (e.g., “</w:t>
+      </w:r>
+      <w:r>
+        <w:rPr/>
+        <w:t>Oradio-luidspreker”</w:t>
+      </w:r>
+      <w:r>
+        <w:rPr/>
+        <w:t xml:space="preserve"> )</w:t>
+      </w:r>
+    </w:p>
+    <w:p>
+      <w:pPr>
+        <w:pStyle w:val="BodyText"/>
+        <w:numPr>
+          <w:ilvl w:val="0"/>
+          <w:numId w:val="7"/>
+        </w:numPr>
+        <w:tabs>
+          <w:tab w:val="clear" w:pos="709"/>
+          <w:tab w:val="left" w:pos="709" w:leader="none"/>
+        </w:tabs>
+        <w:bidi w:val="0"/>
+        <w:spacing w:before="0" w:after="0"/>
+        <w:ind w:hanging="283" w:start="709"/>
+        <w:jc w:val="start"/>
+        <w:rPr/>
+      </w:pPr>
+      <w:r>
+        <w:rPr/>
+        <w:t>Supported sample rate, bit depth, and codec</w:t>
+      </w:r>
+    </w:p>
+    <w:p>
+      <w:pPr>
+        <w:pStyle w:val="BodyText"/>
+        <w:numPr>
+          <w:ilvl w:val="0"/>
+          <w:numId w:val="7"/>
+        </w:numPr>
+        <w:tabs>
+          <w:tab w:val="clear" w:pos="709"/>
+          <w:tab w:val="left" w:pos="709" w:leader="none"/>
+        </w:tabs>
+        <w:bidi w:val="0"/>
+        <w:ind w:hanging="283" w:start="709"/>
+        <w:jc w:val="start"/>
+        <w:rPr/>
+      </w:pPr>
+      <w:r>
+        <w:rPr/>
+        <w:t>A unique device ID for Spotify authentication</w:t>
+      </w:r>
+    </w:p>
+    <w:p>
+      <w:pPr>
+        <w:pStyle w:val="Normal"/>
+        <w:bidi w:val="0"/>
+        <w:jc w:val="start"/>
+        <w:rPr>
+          <w:b w:val="false"/>
+          <w:bCs w:val="false"/>
+          <w:u w:val="none"/>
+        </w:rPr>
+      </w:pPr>
+      <w:r>
+        <w:rPr>
+          <w:b w:val="false"/>
+          <w:bCs w:val="false"/>
+          <w:u w:val="none"/>
+        </w:rPr>
+      </w:r>
+    </w:p>
+    <w:p>
+      <w:pPr>
+        <w:pStyle w:val="BodyText"/>
+        <w:bidi w:val="0"/>
+        <w:jc w:val="start"/>
+        <w:rPr>
+          <w:b/>
+          <w:bCs/>
+          <w:u w:val="single"/>
+        </w:rPr>
+      </w:pPr>
+      <w:r>
+        <w:rPr>
+          <w:b/>
+          <w:bCs/>
+          <w:u w:val="single"/>
+        </w:rPr>
         <w:t>Librespot event handling:</w:t>
       </w:r>
     </w:p>
@@ -1154,7 +1143,6 @@
       </w:pPr>
       <w:r>
         <w:rPr>
-          <w:rFonts w:ascii="Liberation Serif" w:hAnsi="Liberation Serif"/>
           <w:b w:val="false"/>
           <w:bCs w:val="false"/>
           <w:u w:val="none"/>
@@ -1164,7 +1152,6 @@
       <w:r>
         <w:rPr>
           <w:rStyle w:val="SourceText"/>
-          <w:rFonts w:ascii="Liberation Serif" w:hAnsi="Liberation Serif"/>
           <w:b w:val="false"/>
           <w:bCs w:val="false"/>
           <w:u w:val="none"/>
@@ -1173,7 +1160,6 @@
       </w:r>
       <w:r>
         <w:rPr>
-          <w:rFonts w:ascii="Liberation Serif" w:hAnsi="Liberation Serif"/>
           <w:b w:val="false"/>
           <w:bCs w:val="false"/>
           <w:u w:val="none"/>
@@ -1181,35 +1167,27 @@
         <w:t xml:space="preserve"> users can subscribe to non-blocking events. </w:t>
       </w:r>
       <w:r>
-        <w:rPr>
-          <w:rFonts w:ascii="Liberation Serif" w:hAnsi="Liberation Serif"/>
-        </w:rPr>
+        <w:rPr/>
         <w:t xml:space="preserve">The type of script/program you use to handle events is completely up to you, </w:t>
       </w:r>
       <w:r>
         <w:rPr>
           <w:rStyle w:val="SourceText"/>
-          <w:rFonts w:ascii="Liberation Serif" w:hAnsi="Liberation Serif"/>
         </w:rPr>
         <w:t>librespot</w:t>
       </w:r>
       <w:r>
-        <w:rPr>
-          <w:rFonts w:ascii="Liberation Serif" w:hAnsi="Liberation Serif"/>
-        </w:rPr>
+        <w:rPr/>
         <w:t xml:space="preserve"> simply runs the script/program every time an event is fired and passes events via environment variables. </w:t>
       </w:r>
       <w:r>
-        <w:rPr>
-          <w:rFonts w:ascii="Liberation Serif" w:hAnsi="Liberation Serif"/>
-        </w:rPr>
+        <w:rPr/>
         <w:t xml:space="preserve">See for event handling: </w:t>
       </w:r>
       <w:hyperlink r:id="rId3">
         <w:r>
           <w:rPr>
             <w:rStyle w:val="Hyperlink"/>
-            <w:rFonts w:ascii="Liberation Serif" w:hAnsi="Liberation Serif"/>
           </w:rPr>
           <w:t>librespot-events</w:t>
         </w:r>
@@ -1332,19 +1310,21 @@
         <w:bidi w:val="0"/>
         <w:jc w:val="start"/>
         <w:rPr>
-          <w:b w:val="false"/>
-          <w:bCs w:val="false"/>
-          <w:u w:val="none"/>
-        </w:rPr>
-      </w:pPr>
-      <w:r>
-        <w:rPr>
           <w:rFonts w:ascii="Monospace" w:hAnsi="Monospace"/>
           <w:b w:val="false"/>
           <w:bCs w:val="false"/>
           <w:sz w:val="20"/>
           <w:u w:val="none"/>
         </w:rPr>
+      </w:pPr>
+      <w:r>
+        <w:rPr>
+          <w:rFonts w:ascii="Monospace" w:hAnsi="Monospace"/>
+          <w:b w:val="false"/>
+          <w:bCs w:val="false"/>
+          <w:sz w:val="20"/>
+          <w:u w:val="none"/>
+        </w:rPr>
         <w:t>}</w:t>
       </w:r>
     </w:p>
@@ -1364,6 +1344,540 @@
           <w:b w:val="false"/>
           <w:bCs w:val="false"/>
           <w:u w:val="none"/>
+        </w:rPr>
+      </w:r>
+    </w:p>
+    <w:p>
+      <w:pPr>
+        <w:pStyle w:val="Normal"/>
+        <w:bidi w:val="0"/>
+        <w:jc w:val="start"/>
+        <w:rPr>
+          <w:b/>
+          <w:bCs/>
+          <w:u w:val="single"/>
+        </w:rPr>
+      </w:pPr>
+      <w:r>
+        <w:rPr>
+          <w:b/>
+          <w:bCs/>
+          <w:u w:val="single"/>
+        </w:rPr>
+        <w:t>Librespot playlist handling</w:t>
+      </w:r>
+    </w:p>
+    <w:p>
+      <w:pPr>
+        <w:pStyle w:val="Heading3"/>
+        <w:bidi w:val="0"/>
+        <w:jc w:val="start"/>
+        <w:rPr/>
+      </w:pPr>
+      <w:r>
+        <w:rPr>
+          <w:rStyle w:val="Strong"/>
+          <w:rFonts w:ascii="Liberation Serif" w:hAnsi="Liberation Serif"/>
+          <w:b w:val="false"/>
+          <w:bCs w:val="false"/>
+          <w:sz w:val="24"/>
+          <w:szCs w:val="24"/>
+          <w:u w:val="none"/>
+        </w:rPr>
+        <w:t>The Playback State is Managed by Spotify's Cloud. When the playback is started from the Spotify App the Spotify servers:</w:t>
+      </w:r>
+    </w:p>
+    <w:p>
+      <w:pPr>
+        <w:pStyle w:val="BodyText"/>
+        <w:numPr>
+          <w:ilvl w:val="0"/>
+          <w:numId w:val="9"/>
+        </w:numPr>
+        <w:bidi w:val="0"/>
+        <w:spacing w:lineRule="auto" w:line="240" w:before="0" w:after="26"/>
+        <w:jc w:val="start"/>
+        <w:rPr/>
+      </w:pPr>
+      <w:r>
+        <w:rPr>
+          <w:rStyle w:val="Strong"/>
+          <w:rFonts w:ascii="Liberation Serif" w:hAnsi="Liberation Serif"/>
+          <w:b w:val="false"/>
+          <w:bCs w:val="false"/>
+          <w:sz w:val="24"/>
+          <w:szCs w:val="24"/>
+          <w:u w:val="none"/>
+        </w:rPr>
+        <w:t>Store the current track and playlist/queue</w:t>
+      </w:r>
+    </w:p>
+    <w:p>
+      <w:pPr>
+        <w:pStyle w:val="BodyText"/>
+        <w:numPr>
+          <w:ilvl w:val="0"/>
+          <w:numId w:val="9"/>
+        </w:numPr>
+        <w:bidi w:val="0"/>
+        <w:spacing w:lineRule="auto" w:line="240" w:before="0" w:after="26"/>
+        <w:jc w:val="start"/>
+        <w:rPr/>
+      </w:pPr>
+      <w:r>
+        <w:rPr>
+          <w:rFonts w:ascii="Liberation Serif" w:hAnsi="Liberation Serif"/>
+          <w:b w:val="false"/>
+          <w:bCs w:val="false"/>
+          <w:sz w:val="24"/>
+          <w:szCs w:val="24"/>
+          <w:u w:val="none"/>
+        </w:rPr>
+        <w:t xml:space="preserve">Maintain the </w:t>
+      </w:r>
+      <w:r>
+        <w:rPr>
+          <w:rStyle w:val="Strong"/>
+          <w:rFonts w:ascii="Liberation Serif" w:hAnsi="Liberation Serif"/>
+          <w:b w:val="false"/>
+          <w:bCs w:val="false"/>
+          <w:sz w:val="24"/>
+          <w:szCs w:val="24"/>
+          <w:u w:val="none"/>
+        </w:rPr>
+        <w:t>playback progress</w:t>
+      </w:r>
+      <w:r>
+        <w:rPr>
+          <w:rFonts w:ascii="Liberation Serif" w:hAnsi="Liberation Serif"/>
+          <w:b w:val="false"/>
+          <w:bCs w:val="false"/>
+          <w:sz w:val="24"/>
+          <w:szCs w:val="24"/>
+          <w:u w:val="none"/>
+        </w:rPr>
+        <w:t xml:space="preserve"> (current timestamp in song).</w:t>
+      </w:r>
+    </w:p>
+    <w:p>
+      <w:pPr>
+        <w:pStyle w:val="BodyText"/>
+        <w:numPr>
+          <w:ilvl w:val="0"/>
+          <w:numId w:val="9"/>
+        </w:numPr>
+        <w:bidi w:val="0"/>
+        <w:spacing w:lineRule="auto" w:line="240" w:before="0" w:after="26"/>
+        <w:jc w:val="start"/>
+        <w:rPr/>
+      </w:pPr>
+      <w:r>
+        <w:rPr>
+          <w:rFonts w:ascii="Liberation Serif" w:hAnsi="Liberation Serif"/>
+          <w:b w:val="false"/>
+          <w:bCs w:val="false"/>
+          <w:sz w:val="24"/>
+          <w:szCs w:val="24"/>
+          <w:u w:val="none"/>
+        </w:rPr>
+        <w:t>Track which device is currently active.</w:t>
+      </w:r>
+    </w:p>
+    <w:p>
+      <w:pPr>
+        <w:pStyle w:val="BodyText"/>
+        <w:numPr>
+          <w:ilvl w:val="0"/>
+          <w:numId w:val="8"/>
+        </w:numPr>
+        <w:tabs>
+          <w:tab w:val="clear" w:pos="709"/>
+          <w:tab w:val="left" w:pos="709" w:leader="none"/>
+        </w:tabs>
+        <w:bidi w:val="0"/>
+        <w:spacing w:lineRule="auto" w:line="240" w:before="0" w:after="26"/>
+        <w:ind w:hanging="283" w:start="709"/>
+        <w:jc w:val="start"/>
+        <w:rPr/>
+      </w:pPr>
+      <w:r>
+        <w:rPr>
+          <w:rFonts w:ascii="Liberation Serif" w:hAnsi="Liberation Serif"/>
+          <w:b w:val="false"/>
+          <w:bCs w:val="false"/>
+          <w:sz w:val="24"/>
+          <w:szCs w:val="24"/>
+          <w:u w:val="none"/>
+        </w:rPr>
+        <w:t xml:space="preserve">Even if the Spotify app disconnects, </w:t>
+      </w:r>
+      <w:r>
+        <w:rPr>
+          <w:rStyle w:val="SourceText"/>
+          <w:rFonts w:ascii="Liberation Serif" w:hAnsi="Liberation Serif"/>
+          <w:b w:val="false"/>
+          <w:bCs w:val="false"/>
+          <w:sz w:val="24"/>
+          <w:szCs w:val="24"/>
+          <w:u w:val="none"/>
+        </w:rPr>
+        <w:t>librespot</w:t>
+      </w:r>
+      <w:r>
+        <w:rPr>
+          <w:rFonts w:ascii="Liberation Serif" w:hAnsi="Liberation Serif"/>
+          <w:b w:val="false"/>
+          <w:bCs w:val="false"/>
+          <w:sz w:val="24"/>
+          <w:szCs w:val="24"/>
+          <w:u w:val="none"/>
+        </w:rPr>
+        <w:t xml:space="preserve"> keeps playing because it </w:t>
+      </w:r>
+      <w:r>
+        <w:rPr>
+          <w:rStyle w:val="Strong"/>
+          <w:rFonts w:ascii="Liberation Serif" w:hAnsi="Liberation Serif"/>
+          <w:b w:val="false"/>
+          <w:bCs w:val="false"/>
+          <w:sz w:val="24"/>
+          <w:szCs w:val="24"/>
+          <w:u w:val="none"/>
+        </w:rPr>
+        <w:t>receives streaming data directly from Spotify’s cloud</w:t>
+      </w:r>
+      <w:r>
+        <w:rPr>
+          <w:rFonts w:ascii="Liberation Serif" w:hAnsi="Liberation Serif"/>
+          <w:b w:val="false"/>
+          <w:bCs w:val="false"/>
+          <w:sz w:val="24"/>
+          <w:szCs w:val="24"/>
+          <w:u w:val="none"/>
+        </w:rPr>
+        <w:t>.</w:t>
+      </w:r>
+    </w:p>
+    <w:p>
+      <w:pPr>
+        <w:pStyle w:val="BodyText"/>
+        <w:bidi w:val="0"/>
+        <w:spacing w:lineRule="auto" w:line="240" w:before="0" w:after="26"/>
+        <w:jc w:val="start"/>
+        <w:rPr>
+          <w:b w:val="false"/>
+          <w:bCs w:val="false"/>
+        </w:rPr>
+      </w:pPr>
+      <w:r>
+        <w:rPr>
+          <w:rFonts w:ascii="Liberation Serif" w:hAnsi="Liberation Serif"/>
+          <w:b w:val="false"/>
+          <w:bCs w:val="false"/>
+          <w:sz w:val="24"/>
+          <w:szCs w:val="24"/>
+          <w:u w:val="none"/>
+        </w:rPr>
+        <w:t>Reconnecting to Spotify restores the playback.</w:t>
+      </w:r>
+    </w:p>
+    <w:p>
+      <w:pPr>
+        <w:pStyle w:val="BodyText"/>
+        <w:bidi w:val="0"/>
+        <w:spacing w:lineRule="auto" w:line="240" w:before="0" w:after="26"/>
+        <w:jc w:val="start"/>
+        <w:rPr/>
+      </w:pPr>
+      <w:r>
+        <w:rPr>
+          <w:rFonts w:ascii="Liberation Serif" w:hAnsi="Liberation Serif"/>
+          <w:b w:val="false"/>
+          <w:bCs w:val="false"/>
+          <w:sz w:val="24"/>
+          <w:szCs w:val="24"/>
+          <w:u w:val="none"/>
+        </w:rPr>
+        <w:t xml:space="preserve">If </w:t>
+      </w:r>
+      <w:r>
+        <w:rPr>
+          <w:rStyle w:val="Strong"/>
+          <w:rFonts w:ascii="Liberation Serif" w:hAnsi="Liberation Serif"/>
+          <w:b w:val="false"/>
+          <w:bCs w:val="false"/>
+          <w:sz w:val="24"/>
+          <w:szCs w:val="24"/>
+          <w:u w:val="none"/>
+        </w:rPr>
+        <w:t>the Spotify app is closed and reopen it</w:t>
+      </w:r>
+      <w:r>
+        <w:rPr>
+          <w:rFonts w:ascii="Liberation Serif" w:hAnsi="Liberation Serif"/>
+          <w:b w:val="false"/>
+          <w:bCs w:val="false"/>
+          <w:sz w:val="24"/>
+          <w:szCs w:val="24"/>
+          <w:u w:val="none"/>
+        </w:rPr>
+        <w:t>, the app queries Spotify’s servers to check:</w:t>
+      </w:r>
+    </w:p>
+    <w:p>
+      <w:pPr>
+        <w:pStyle w:val="BodyText"/>
+        <w:numPr>
+          <w:ilvl w:val="0"/>
+          <w:numId w:val="10"/>
+        </w:numPr>
+        <w:tabs>
+          <w:tab w:val="clear" w:pos="709"/>
+          <w:tab w:val="left" w:pos="709" w:leader="none"/>
+        </w:tabs>
+        <w:bidi w:val="0"/>
+        <w:spacing w:lineRule="auto" w:line="240" w:before="0" w:after="0"/>
+        <w:ind w:hanging="283" w:start="709"/>
+        <w:jc w:val="start"/>
+        <w:rPr/>
+      </w:pPr>
+      <w:r>
+        <w:rPr>
+          <w:rFonts w:ascii="Liberation Serif" w:hAnsi="Liberation Serif"/>
+          <w:b w:val="false"/>
+          <w:bCs w:val="false"/>
+        </w:rPr>
+        <w:t>The last active device (</w:t>
+      </w:r>
+      <w:r>
+        <w:rPr>
+          <w:rStyle w:val="SourceText"/>
+          <w:rFonts w:ascii="Liberation Serif" w:hAnsi="Liberation Serif"/>
+          <w:b w:val="false"/>
+          <w:bCs w:val="false"/>
+        </w:rPr>
+        <w:t>librespot</w:t>
+      </w:r>
+      <w:r>
+        <w:rPr>
+          <w:rFonts w:ascii="Liberation Serif" w:hAnsi="Liberation Serif"/>
+          <w:b w:val="false"/>
+          <w:bCs w:val="false"/>
+        </w:rPr>
+        <w:t xml:space="preserve"> on the Raspberry Pi).</w:t>
+      </w:r>
+    </w:p>
+    <w:p>
+      <w:pPr>
+        <w:pStyle w:val="BodyText"/>
+        <w:numPr>
+          <w:ilvl w:val="0"/>
+          <w:numId w:val="10"/>
+        </w:numPr>
+        <w:tabs>
+          <w:tab w:val="clear" w:pos="709"/>
+          <w:tab w:val="left" w:pos="709" w:leader="none"/>
+        </w:tabs>
+        <w:bidi w:val="0"/>
+        <w:spacing w:lineRule="auto" w:line="240"/>
+        <w:ind w:hanging="283" w:start="709"/>
+        <w:jc w:val="start"/>
+        <w:rPr>
+          <w:rFonts w:ascii="Liberation Serif" w:hAnsi="Liberation Serif"/>
+          <w:b w:val="false"/>
+          <w:bCs w:val="false"/>
+        </w:rPr>
+      </w:pPr>
+      <w:r>
+        <w:rPr>
+          <w:rFonts w:ascii="Liberation Serif" w:hAnsi="Liberation Serif"/>
+          <w:b w:val="false"/>
+          <w:bCs w:val="false"/>
+        </w:rPr>
+        <w:t>The current song, playlist, and progress.</w:t>
+      </w:r>
+    </w:p>
+    <w:p>
+      <w:pPr>
+        <w:pStyle w:val="BodyText"/>
+        <w:numPr>
+          <w:ilvl w:val="0"/>
+          <w:numId w:val="11"/>
+        </w:numPr>
+        <w:tabs>
+          <w:tab w:val="clear" w:pos="709"/>
+          <w:tab w:val="left" w:pos="720" w:leader="none"/>
+        </w:tabs>
+        <w:bidi w:val="0"/>
+        <w:spacing w:lineRule="auto" w:line="240"/>
+        <w:ind w:hanging="283" w:start="720"/>
+        <w:jc w:val="start"/>
+        <w:rPr/>
+      </w:pPr>
+      <w:r>
+        <w:rPr>
+          <w:rFonts w:ascii="Liberation Serif" w:hAnsi="Liberation Serif"/>
+          <w:b w:val="false"/>
+          <w:bCs w:val="false"/>
+        </w:rPr>
+        <w:t xml:space="preserve">The app then </w:t>
+      </w:r>
+      <w:r>
+        <w:rPr>
+          <w:rStyle w:val="Strong"/>
+          <w:rFonts w:ascii="Liberation Serif" w:hAnsi="Liberation Serif"/>
+          <w:b w:val="false"/>
+          <w:bCs w:val="false"/>
+        </w:rPr>
+        <w:t>syncs back</w:t>
+      </w:r>
+      <w:r>
+        <w:rPr>
+          <w:rFonts w:ascii="Liberation Serif" w:hAnsi="Liberation Serif"/>
+          <w:b w:val="false"/>
+          <w:bCs w:val="false"/>
+        </w:rPr>
+        <w:t xml:space="preserve"> to the </w:t>
+      </w:r>
+      <w:r>
+        <w:rPr>
+          <w:rFonts w:ascii="Liberation Serif" w:hAnsi="Liberation Serif"/>
+          <w:b w:val="false"/>
+          <w:bCs w:val="false"/>
+        </w:rPr>
+        <w:t>Oradio</w:t>
+      </w:r>
+      <w:r>
+        <w:rPr>
+          <w:rFonts w:ascii="Liberation Serif" w:hAnsi="Liberation Serif"/>
+          <w:b w:val="false"/>
+          <w:bCs w:val="false"/>
+        </w:rPr>
+        <w:t>'s playback state.</w:t>
+      </w:r>
+    </w:p>
+    <w:p>
+      <w:pPr>
+        <w:pStyle w:val="BodyText"/>
+        <w:numPr>
+          <w:ilvl w:val="0"/>
+          <w:numId w:val="12"/>
+        </w:numPr>
+        <w:tabs>
+          <w:tab w:val="clear" w:pos="709"/>
+          <w:tab w:val="left" w:pos="720" w:leader="none"/>
+        </w:tabs>
+        <w:bidi w:val="0"/>
+        <w:spacing w:lineRule="auto" w:line="240"/>
+        <w:ind w:hanging="283" w:start="720"/>
+        <w:jc w:val="start"/>
+        <w:rPr/>
+      </w:pPr>
+      <w:r>
+        <w:rPr>
+          <w:rFonts w:ascii="Liberation Serif" w:hAnsi="Liberation Serif"/>
+          <w:b w:val="false"/>
+          <w:bCs w:val="false"/>
+        </w:rPr>
+        <w:t>This is why when you open Spotify, it might show:</w:t>
+        <w:br/>
+      </w:r>
+      <w:r>
+        <w:rPr>
+          <w:rStyle w:val="Emphasis"/>
+          <w:rFonts w:ascii="Liberation Serif" w:hAnsi="Liberation Serif"/>
+          <w:b w:val="false"/>
+          <w:bCs w:val="false"/>
+        </w:rPr>
+        <w:t xml:space="preserve">"Playing on </w:t>
+      </w:r>
+      <w:r>
+        <w:rPr>
+          <w:rStyle w:val="Emphasis"/>
+          <w:rFonts w:ascii="Liberation Serif" w:hAnsi="Liberation Serif"/>
+          <w:b w:val="false"/>
+          <w:bCs w:val="false"/>
+        </w:rPr>
+        <w:t>the Oradio-luidspreker</w:t>
+      </w:r>
+      <w:r>
+        <w:rPr>
+          <w:rStyle w:val="Emphasis"/>
+          <w:rFonts w:ascii="Liberation Serif" w:hAnsi="Liberation Serif"/>
+          <w:b w:val="false"/>
+          <w:bCs w:val="false"/>
+        </w:rPr>
+        <w:t>"</w:t>
+      </w:r>
+      <w:r>
+        <w:rPr>
+          <w:rFonts w:ascii="Liberation Serif" w:hAnsi="Liberation Serif"/>
+          <w:b w:val="false"/>
+          <w:bCs w:val="false"/>
+        </w:rPr>
+        <w:t>, even if you left it playing earlier.</w:t>
+      </w:r>
+    </w:p>
+    <w:p>
+      <w:pPr>
+        <w:pStyle w:val="BodyText"/>
+        <w:bidi w:val="0"/>
+        <w:spacing w:lineRule="auto" w:line="240" w:before="0" w:after="26"/>
+        <w:jc w:val="start"/>
+        <w:rPr>
+          <w:b w:val="false"/>
+          <w:bCs w:val="false"/>
+        </w:rPr>
+      </w:pPr>
+      <w:r>
+        <w:rPr>
+          <w:rFonts w:ascii="Liberation Serif" w:hAnsi="Liberation Serif"/>
+          <w:b w:val="false"/>
+          <w:bCs w:val="false"/>
+          <w:sz w:val="24"/>
+          <w:szCs w:val="24"/>
+          <w:u w:val="none"/>
+        </w:rPr>
+        <w:t>Librespot does not store playlist locally. When restarted librespot will reconnect to Spotify. If spotify detects that librespot was the last device it may resume playback where it left off.</w:t>
+      </w:r>
+    </w:p>
+    <w:p>
+      <w:pPr>
+        <w:pStyle w:val="BodyText"/>
+        <w:bidi w:val="0"/>
+        <w:spacing w:lineRule="auto" w:line="240" w:before="0" w:after="26"/>
+        <w:jc w:val="start"/>
+        <w:rPr>
+          <w:rFonts w:ascii="Liberation Serif" w:hAnsi="Liberation Serif"/>
+          <w:sz w:val="24"/>
+          <w:szCs w:val="24"/>
+          <w:u w:val="none"/>
+        </w:rPr>
+      </w:pPr>
+      <w:r>
+        <w:rPr>
+          <w:b w:val="false"/>
+          <w:bCs w:val="false"/>
+        </w:rPr>
+      </w:r>
+    </w:p>
+    <w:p>
+      <w:pPr>
+        <w:pStyle w:val="BodyText"/>
+        <w:bidi w:val="0"/>
+        <w:spacing w:lineRule="auto" w:line="240" w:before="0" w:after="26"/>
+        <w:jc w:val="start"/>
+        <w:rPr>
+          <w:rFonts w:ascii="Liberation Serif" w:hAnsi="Liberation Serif"/>
+          <w:sz w:val="24"/>
+          <w:szCs w:val="24"/>
+          <w:u w:val="none"/>
+        </w:rPr>
+      </w:pPr>
+      <w:r>
+        <w:rPr>
+          <w:b w:val="false"/>
+          <w:bCs w:val="false"/>
         </w:rPr>
       </w:r>
     </w:p>
@@ -1385,138 +1899,120 @@
   <w:abstractNum w:abstractNumId="1">
     <w:lvl w:ilvl="0">
       <w:start w:val="1"/>
-      <w:numFmt w:val="bullet"/>
-      <w:lvlText w:val=""/>
-      <w:lvlJc w:val="start"/>
-      <w:pPr>
-        <w:tabs>
-          <w:tab w:val="num" w:pos="720"/>
-        </w:tabs>
-        <w:ind w:start="720" w:hanging="360"/>
-      </w:pPr>
-      <w:rPr>
-        <w:rFonts w:ascii="Symbol" w:hAnsi="Symbol" w:cs="Symbol" w:hint="default"/>
-      </w:rPr>
+      <w:numFmt w:val="none"/>
+      <w:suff w:val="nothing"/>
+      <w:lvlText w:val="%1"/>
+      <w:lvlJc w:val="start"/>
+      <w:pPr>
+        <w:tabs>
+          <w:tab w:val="num" w:pos="0"/>
+        </w:tabs>
+        <w:ind w:start="0" w:hanging="0"/>
+      </w:pPr>
     </w:lvl>
     <w:lvl w:ilvl="1">
       <w:start w:val="1"/>
-      <w:numFmt w:val="bullet"/>
-      <w:lvlText w:val="◦"/>
-      <w:lvlJc w:val="start"/>
-      <w:pPr>
-        <w:tabs>
-          <w:tab w:val="num" w:pos="1080"/>
-        </w:tabs>
-        <w:ind w:start="1080" w:hanging="360"/>
-      </w:pPr>
-      <w:rPr>
-        <w:rFonts w:ascii="OpenSymbol" w:hAnsi="OpenSymbol" w:cs="OpenSymbol" w:hint="default"/>
-      </w:rPr>
+      <w:numFmt w:val="none"/>
+      <w:suff w:val="nothing"/>
+      <w:lvlText w:val="%2"/>
+      <w:lvlJc w:val="start"/>
+      <w:pPr>
+        <w:tabs>
+          <w:tab w:val="num" w:pos="0"/>
+        </w:tabs>
+        <w:ind w:start="0" w:hanging="0"/>
+      </w:pPr>
     </w:lvl>
     <w:lvl w:ilvl="2">
       <w:start w:val="1"/>
-      <w:numFmt w:val="bullet"/>
-      <w:lvlText w:val="▪"/>
-      <w:lvlJc w:val="start"/>
-      <w:pPr>
-        <w:tabs>
-          <w:tab w:val="num" w:pos="1440"/>
-        </w:tabs>
-        <w:ind w:start="1440" w:hanging="360"/>
-      </w:pPr>
-      <w:rPr>
-        <w:rFonts w:ascii="OpenSymbol" w:hAnsi="OpenSymbol" w:cs="OpenSymbol" w:hint="default"/>
-      </w:rPr>
+      <w:numFmt w:val="none"/>
+      <w:suff w:val="nothing"/>
+      <w:lvlText w:val="%3"/>
+      <w:lvlJc w:val="start"/>
+      <w:pPr>
+        <w:tabs>
+          <w:tab w:val="num" w:pos="0"/>
+        </w:tabs>
+        <w:ind w:start="0" w:hanging="0"/>
+      </w:pPr>
     </w:lvl>
     <w:lvl w:ilvl="3">
       <w:start w:val="1"/>
-      <w:numFmt w:val="bullet"/>
-      <w:lvlText w:val=""/>
-      <w:lvlJc w:val="start"/>
-      <w:pPr>
-        <w:tabs>
-          <w:tab w:val="num" w:pos="1800"/>
-        </w:tabs>
-        <w:ind w:start="1800" w:hanging="360"/>
-      </w:pPr>
-      <w:rPr>
-        <w:rFonts w:ascii="Symbol" w:hAnsi="Symbol" w:cs="Symbol" w:hint="default"/>
-      </w:rPr>
+      <w:numFmt w:val="none"/>
+      <w:suff w:val="nothing"/>
+      <w:lvlText w:val="%4"/>
+      <w:lvlJc w:val="start"/>
+      <w:pPr>
+        <w:tabs>
+          <w:tab w:val="num" w:pos="0"/>
+        </w:tabs>
+        <w:ind w:start="0" w:hanging="0"/>
+      </w:pPr>
     </w:lvl>
     <w:lvl w:ilvl="4">
       <w:start w:val="1"/>
-      <w:numFmt w:val="bullet"/>
-      <w:lvlText w:val="◦"/>
-      <w:lvlJc w:val="start"/>
-      <w:pPr>
-        <w:tabs>
-          <w:tab w:val="num" w:pos="2160"/>
-        </w:tabs>
-        <w:ind w:start="2160" w:hanging="360"/>
-      </w:pPr>
-      <w:rPr>
-        <w:rFonts w:ascii="OpenSymbol" w:hAnsi="OpenSymbol" w:cs="OpenSymbol" w:hint="default"/>
-      </w:rPr>
+      <w:numFmt w:val="none"/>
+      <w:suff w:val="nothing"/>
+      <w:lvlText w:val="%5"/>
+      <w:lvlJc w:val="start"/>
+      <w:pPr>
+        <w:tabs>
+          <w:tab w:val="num" w:pos="0"/>
+        </w:tabs>
+        <w:ind w:start="0" w:hanging="0"/>
+      </w:pPr>
     </w:lvl>
     <w:lvl w:ilvl="5">
       <w:start w:val="1"/>
-      <w:numFmt w:val="bullet"/>
-      <w:lvlText w:val="▪"/>
-      <w:lvlJc w:val="start"/>
-      <w:pPr>
-        <w:tabs>
-          <w:tab w:val="num" w:pos="2520"/>
-        </w:tabs>
-        <w:ind w:start="2520" w:hanging="360"/>
-      </w:pPr>
-      <w:rPr>
-        <w:rFonts w:ascii="OpenSymbol" w:hAnsi="OpenSymbol" w:cs="OpenSymbol" w:hint="default"/>
-      </w:rPr>
+      <w:numFmt w:val="none"/>
+      <w:suff w:val="nothing"/>
+      <w:lvlText w:val="%6"/>
+      <w:lvlJc w:val="start"/>
+      <w:pPr>
+        <w:tabs>
+          <w:tab w:val="num" w:pos="0"/>
+        </w:tabs>
+        <w:ind w:start="0" w:hanging="0"/>
+      </w:pPr>
     </w:lvl>
     <w:lvl w:ilvl="6">
       <w:start w:val="1"/>
-      <w:numFmt w:val="bullet"/>
-      <w:lvlText w:val=""/>
-      <w:lvlJc w:val="start"/>
-      <w:pPr>
-        <w:tabs>
-          <w:tab w:val="num" w:pos="2880"/>
-        </w:tabs>
-        <w:ind w:start="2880" w:hanging="360"/>
-      </w:pPr>
-      <w:rPr>
-        <w:rFonts w:ascii="Symbol" w:hAnsi="Symbol" w:cs="Symbol" w:hint="default"/>
-      </w:rPr>
+      <w:numFmt w:val="none"/>
+      <w:suff w:val="nothing"/>
+      <w:lvlText w:val="%7"/>
+      <w:lvlJc w:val="start"/>
+      <w:pPr>
+        <w:tabs>
+          <w:tab w:val="num" w:pos="0"/>
+        </w:tabs>
+        <w:ind w:start="0" w:hanging="0"/>
+      </w:pPr>
     </w:lvl>
     <w:lvl w:ilvl="7">
       <w:start w:val="1"/>
-      <w:numFmt w:val="bullet"/>
-      <w:lvlText w:val="◦"/>
-      <w:lvlJc w:val="start"/>
-      <w:pPr>
-        <w:tabs>
-          <w:tab w:val="num" w:pos="3240"/>
-        </w:tabs>
-        <w:ind w:start="3240" w:hanging="360"/>
-      </w:pPr>
-      <w:rPr>
-        <w:rFonts w:ascii="OpenSymbol" w:hAnsi="OpenSymbol" w:cs="OpenSymbol" w:hint="default"/>
-      </w:rPr>
+      <w:numFmt w:val="none"/>
+      <w:suff w:val="nothing"/>
+      <w:lvlText w:val="%8"/>
+      <w:lvlJc w:val="start"/>
+      <w:pPr>
+        <w:tabs>
+          <w:tab w:val="num" w:pos="0"/>
+        </w:tabs>
+        <w:ind w:start="0" w:hanging="0"/>
+      </w:pPr>
     </w:lvl>
     <w:lvl w:ilvl="8">
       <w:start w:val="1"/>
-      <w:numFmt w:val="bullet"/>
-      <w:lvlText w:val="▪"/>
-      <w:lvlJc w:val="start"/>
-      <w:pPr>
-        <w:tabs>
-          <w:tab w:val="num" w:pos="3600"/>
-        </w:tabs>
-        <w:ind w:start="3600" w:hanging="360"/>
-      </w:pPr>
-      <w:rPr>
-        <w:rFonts w:ascii="OpenSymbol" w:hAnsi="OpenSymbol" w:cs="OpenSymbol" w:hint="default"/>
-      </w:rPr>
+      <w:numFmt w:val="none"/>
+      <w:suff w:val="nothing"/>
+      <w:lvlText w:val="%9"/>
+      <w:lvlJc w:val="start"/>
+      <w:pPr>
+        <w:tabs>
+          <w:tab w:val="num" w:pos="0"/>
+        </w:tabs>
+        <w:ind w:start="0" w:hanging="0"/>
+      </w:pPr>
     </w:lvl>
   </w:abstractNum>
   <w:abstractNum w:abstractNumId="2">
@@ -1527,9 +2023,9 @@
       <w:lvlJc w:val="start"/>
       <w:pPr>
         <w:tabs>
-          <w:tab w:val="num" w:pos="709"/>
-        </w:tabs>
-        <w:ind w:start="709" w:hanging="283"/>
+          <w:tab w:val="num" w:pos="720"/>
+        </w:tabs>
+        <w:ind w:start="720" w:hanging="360"/>
       </w:pPr>
       <w:rPr>
         <w:rFonts w:ascii="Symbol" w:hAnsi="Symbol" w:cs="Symbol" w:hint="default"/>
@@ -1538,31 +2034,31 @@
     <w:lvl w:ilvl="1">
       <w:start w:val="1"/>
       <w:numFmt w:val="bullet"/>
-      <w:lvlText w:val=""/>
-      <w:lvlJc w:val="start"/>
-      <w:pPr>
-        <w:tabs>
-          <w:tab w:val="num" w:pos="1418"/>
-        </w:tabs>
-        <w:ind w:start="1418" w:hanging="283"/>
-      </w:pPr>
-      <w:rPr>
-        <w:rFonts w:ascii="Symbol" w:hAnsi="Symbol" w:cs="Symbol" w:hint="default"/>
+      <w:lvlText w:val="◦"/>
+      <w:lvlJc w:val="start"/>
+      <w:pPr>
+        <w:tabs>
+          <w:tab w:val="num" w:pos="1080"/>
+        </w:tabs>
+        <w:ind w:start="1080" w:hanging="360"/>
+      </w:pPr>
+      <w:rPr>
+        <w:rFonts w:ascii="OpenSymbol" w:hAnsi="OpenSymbol" w:cs="OpenSymbol" w:hint="default"/>
       </w:rPr>
     </w:lvl>
     <w:lvl w:ilvl="2">
       <w:start w:val="1"/>
       <w:numFmt w:val="bullet"/>
-      <w:lvlText w:val=""/>
-      <w:lvlJc w:val="start"/>
-      <w:pPr>
-        <w:tabs>
-          <w:tab w:val="num" w:pos="2127"/>
-        </w:tabs>
-        <w:ind w:start="2127" w:hanging="283"/>
-      </w:pPr>
-      <w:rPr>
-        <w:rFonts w:ascii="Symbol" w:hAnsi="Symbol" w:cs="Symbol" w:hint="default"/>
+      <w:lvlText w:val="▪"/>
+      <w:lvlJc w:val="start"/>
+      <w:pPr>
+        <w:tabs>
+          <w:tab w:val="num" w:pos="1440"/>
+        </w:tabs>
+        <w:ind w:start="1440" w:hanging="360"/>
+      </w:pPr>
+      <w:rPr>
+        <w:rFonts w:ascii="OpenSymbol" w:hAnsi="OpenSymbol" w:cs="OpenSymbol" w:hint="default"/>
       </w:rPr>
     </w:lvl>
     <w:lvl w:ilvl="3">
@@ -1572,9 +2068,9 @@
       <w:lvlJc w:val="start"/>
       <w:pPr>
         <w:tabs>
-          <w:tab w:val="num" w:pos="2836"/>
-        </w:tabs>
-        <w:ind w:start="2836" w:hanging="283"/>
+          <w:tab w:val="num" w:pos="1800"/>
+        </w:tabs>
+        <w:ind w:start="1800" w:hanging="360"/>
       </w:pPr>
       <w:rPr>
         <w:rFonts w:ascii="Symbol" w:hAnsi="Symbol" w:cs="Symbol" w:hint="default"/>
@@ -1583,31 +2079,31 @@
     <w:lvl w:ilvl="4">
       <w:start w:val="1"/>
       <w:numFmt w:val="bullet"/>
-      <w:lvlText w:val=""/>
-      <w:lvlJc w:val="start"/>
-      <w:pPr>
-        <w:tabs>
-          <w:tab w:val="num" w:pos="3545"/>
-        </w:tabs>
-        <w:ind w:start="3545" w:hanging="283"/>
-      </w:pPr>
-      <w:rPr>
-        <w:rFonts w:ascii="Symbol" w:hAnsi="Symbol" w:cs="Symbol" w:hint="default"/>
+      <w:lvlText w:val="◦"/>
+      <w:lvlJc w:val="start"/>
+      <w:pPr>
+        <w:tabs>
+          <w:tab w:val="num" w:pos="2160"/>
+        </w:tabs>
+        <w:ind w:start="2160" w:hanging="360"/>
+      </w:pPr>
+      <w:rPr>
+        <w:rFonts w:ascii="OpenSymbol" w:hAnsi="OpenSymbol" w:cs="OpenSymbol" w:hint="default"/>
       </w:rPr>
     </w:lvl>
     <w:lvl w:ilvl="5">
       <w:start w:val="1"/>
       <w:numFmt w:val="bullet"/>
-      <w:lvlText w:val=""/>
-      <w:lvlJc w:val="start"/>
-      <w:pPr>
-        <w:tabs>
-          <w:tab w:val="num" w:pos="4254"/>
-        </w:tabs>
-        <w:ind w:start="4254" w:hanging="283"/>
-      </w:pPr>
-      <w:rPr>
-        <w:rFonts w:ascii="Symbol" w:hAnsi="Symbol" w:cs="Symbol" w:hint="default"/>
+      <w:lvlText w:val="▪"/>
+      <w:lvlJc w:val="start"/>
+      <w:pPr>
+        <w:tabs>
+          <w:tab w:val="num" w:pos="2520"/>
+        </w:tabs>
+        <w:ind w:start="2520" w:hanging="360"/>
+      </w:pPr>
+      <w:rPr>
+        <w:rFonts w:ascii="OpenSymbol" w:hAnsi="OpenSymbol" w:cs="OpenSymbol" w:hint="default"/>
       </w:rPr>
     </w:lvl>
     <w:lvl w:ilvl="6">
@@ -1617,9 +2113,9 @@
       <w:lvlJc w:val="start"/>
       <w:pPr>
         <w:tabs>
-          <w:tab w:val="num" w:pos="4963"/>
-        </w:tabs>
-        <w:ind w:start="4963" w:hanging="283"/>
+          <w:tab w:val="num" w:pos="2880"/>
+        </w:tabs>
+        <w:ind w:start="2880" w:hanging="360"/>
       </w:pPr>
       <w:rPr>
         <w:rFonts w:ascii="Symbol" w:hAnsi="Symbol" w:cs="Symbol" w:hint="default"/>
@@ -1628,31 +2124,31 @@
     <w:lvl w:ilvl="7">
       <w:start w:val="1"/>
       <w:numFmt w:val="bullet"/>
-      <w:lvlText w:val=""/>
-      <w:lvlJc w:val="start"/>
-      <w:pPr>
-        <w:tabs>
-          <w:tab w:val="num" w:pos="5672"/>
-        </w:tabs>
-        <w:ind w:start="5672" w:hanging="283"/>
-      </w:pPr>
-      <w:rPr>
-        <w:rFonts w:ascii="Symbol" w:hAnsi="Symbol" w:cs="Symbol" w:hint="default"/>
+      <w:lvlText w:val="◦"/>
+      <w:lvlJc w:val="start"/>
+      <w:pPr>
+        <w:tabs>
+          <w:tab w:val="num" w:pos="3240"/>
+        </w:tabs>
+        <w:ind w:start="3240" w:hanging="360"/>
+      </w:pPr>
+      <w:rPr>
+        <w:rFonts w:ascii="OpenSymbol" w:hAnsi="OpenSymbol" w:cs="OpenSymbol" w:hint="default"/>
       </w:rPr>
     </w:lvl>
     <w:lvl w:ilvl="8">
       <w:start w:val="1"/>
       <w:numFmt w:val="bullet"/>
-      <w:lvlText w:val=""/>
-      <w:lvlJc w:val="start"/>
-      <w:pPr>
-        <w:tabs>
-          <w:tab w:val="num" w:pos="6381"/>
-        </w:tabs>
-        <w:ind w:start="6381" w:hanging="283"/>
-      </w:pPr>
-      <w:rPr>
-        <w:rFonts w:ascii="Symbol" w:hAnsi="Symbol" w:cs="Symbol" w:hint="default"/>
+      <w:lvlText w:val="▪"/>
+      <w:lvlJc w:val="start"/>
+      <w:pPr>
+        <w:tabs>
+          <w:tab w:val="num" w:pos="3600"/>
+        </w:tabs>
+        <w:ind w:start="3600" w:hanging="360"/>
+      </w:pPr>
+      <w:rPr>
+        <w:rFonts w:ascii="OpenSymbol" w:hAnsi="OpenSymbol" w:cs="OpenSymbol" w:hint="default"/>
       </w:rPr>
     </w:lvl>
   </w:abstractNum>
@@ -1938,9 +2434,9 @@
       <w:lvlJc w:val="start"/>
       <w:pPr>
         <w:tabs>
-          <w:tab w:val="num" w:pos="720"/>
-        </w:tabs>
-        <w:ind w:start="720" w:hanging="360"/>
+          <w:tab w:val="num" w:pos="709"/>
+        </w:tabs>
+        <w:ind w:start="709" w:hanging="283"/>
       </w:pPr>
       <w:rPr>
         <w:rFonts w:ascii="Symbol" w:hAnsi="Symbol" w:cs="Symbol" w:hint="default"/>
@@ -1949,31 +2445,31 @@
     <w:lvl w:ilvl="1">
       <w:start w:val="1"/>
       <w:numFmt w:val="bullet"/>
-      <w:lvlText w:val="◦"/>
-      <w:lvlJc w:val="start"/>
-      <w:pPr>
-        <w:tabs>
-          <w:tab w:val="num" w:pos="1080"/>
-        </w:tabs>
-        <w:ind w:start="1080" w:hanging="360"/>
-      </w:pPr>
-      <w:rPr>
-        <w:rFonts w:ascii="OpenSymbol" w:hAnsi="OpenSymbol" w:cs="OpenSymbol" w:hint="default"/>
+      <w:lvlText w:val=""/>
+      <w:lvlJc w:val="start"/>
+      <w:pPr>
+        <w:tabs>
+          <w:tab w:val="num" w:pos="1418"/>
+        </w:tabs>
+        <w:ind w:start="1418" w:hanging="283"/>
+      </w:pPr>
+      <w:rPr>
+        <w:rFonts w:ascii="Symbol" w:hAnsi="Symbol" w:cs="Symbol" w:hint="default"/>
       </w:rPr>
     </w:lvl>
     <w:lvl w:ilvl="2">
       <w:start w:val="1"/>
       <w:numFmt w:val="bullet"/>
-      <w:lvlText w:val="▪"/>
-      <w:lvlJc w:val="start"/>
-      <w:pPr>
-        <w:tabs>
-          <w:tab w:val="num" w:pos="1440"/>
-        </w:tabs>
-        <w:ind w:start="1440" w:hanging="360"/>
-      </w:pPr>
-      <w:rPr>
-        <w:rFonts w:ascii="OpenSymbol" w:hAnsi="OpenSymbol" w:cs="OpenSymbol" w:hint="default"/>
+      <w:lvlText w:val=""/>
+      <w:lvlJc w:val="start"/>
+      <w:pPr>
+        <w:tabs>
+          <w:tab w:val="num" w:pos="2127"/>
+        </w:tabs>
+        <w:ind w:start="2127" w:hanging="283"/>
+      </w:pPr>
+      <w:rPr>
+        <w:rFonts w:ascii="Symbol" w:hAnsi="Symbol" w:cs="Symbol" w:hint="default"/>
       </w:rPr>
     </w:lvl>
     <w:lvl w:ilvl="3">
@@ -1983,9 +2479,9 @@
       <w:lvlJc w:val="start"/>
       <w:pPr>
         <w:tabs>
-          <w:tab w:val="num" w:pos="1800"/>
-        </w:tabs>
-        <w:ind w:start="1800" w:hanging="360"/>
+          <w:tab w:val="num" w:pos="2836"/>
+        </w:tabs>
+        <w:ind w:start="2836" w:hanging="283"/>
       </w:pPr>
       <w:rPr>
         <w:rFonts w:ascii="Symbol" w:hAnsi="Symbol" w:cs="Symbol" w:hint="default"/>
@@ -1994,31 +2490,31 @@
     <w:lvl w:ilvl="4">
       <w:start w:val="1"/>
       <w:numFmt w:val="bullet"/>
-      <w:lvlText w:val="◦"/>
-      <w:lvlJc w:val="start"/>
-      <w:pPr>
-        <w:tabs>
-          <w:tab w:val="num" w:pos="2160"/>
-        </w:tabs>
-        <w:ind w:start="2160" w:hanging="360"/>
-      </w:pPr>
-      <w:rPr>
-        <w:rFonts w:ascii="OpenSymbol" w:hAnsi="OpenSymbol" w:cs="OpenSymbol" w:hint="default"/>
+      <w:lvlText w:val=""/>
+      <w:lvlJc w:val="start"/>
+      <w:pPr>
+        <w:tabs>
+          <w:tab w:val="num" w:pos="3545"/>
+        </w:tabs>
+        <w:ind w:start="3545" w:hanging="283"/>
+      </w:pPr>
+      <w:rPr>
+        <w:rFonts w:ascii="Symbol" w:hAnsi="Symbol" w:cs="Symbol" w:hint="default"/>
       </w:rPr>
     </w:lvl>
     <w:lvl w:ilvl="5">
       <w:start w:val="1"/>
       <w:numFmt w:val="bullet"/>
-      <w:lvlText w:val="▪"/>
-      <w:lvlJc w:val="start"/>
-      <w:pPr>
-        <w:tabs>
-          <w:tab w:val="num" w:pos="2520"/>
-        </w:tabs>
-        <w:ind w:start="2520" w:hanging="360"/>
-      </w:pPr>
-      <w:rPr>
-        <w:rFonts w:ascii="OpenSymbol" w:hAnsi="OpenSymbol" w:cs="OpenSymbol" w:hint="default"/>
+      <w:lvlText w:val=""/>
+      <w:lvlJc w:val="start"/>
+      <w:pPr>
+        <w:tabs>
+          <w:tab w:val="num" w:pos="4254"/>
+        </w:tabs>
+        <w:ind w:start="4254" w:hanging="283"/>
+      </w:pPr>
+      <w:rPr>
+        <w:rFonts w:ascii="Symbol" w:hAnsi="Symbol" w:cs="Symbol" w:hint="default"/>
       </w:rPr>
     </w:lvl>
     <w:lvl w:ilvl="6">
@@ -2028,9 +2524,9 @@
       <w:lvlJc w:val="start"/>
       <w:pPr>
         <w:tabs>
-          <w:tab w:val="num" w:pos="2880"/>
-        </w:tabs>
-        <w:ind w:start="2880" w:hanging="360"/>
+          <w:tab w:val="num" w:pos="4963"/>
+        </w:tabs>
+        <w:ind w:start="4963" w:hanging="283"/>
       </w:pPr>
       <w:rPr>
         <w:rFonts w:ascii="Symbol" w:hAnsi="Symbol" w:cs="Symbol" w:hint="default"/>
@@ -2039,31 +2535,31 @@
     <w:lvl w:ilvl="7">
       <w:start w:val="1"/>
       <w:numFmt w:val="bullet"/>
-      <w:lvlText w:val="◦"/>
-      <w:lvlJc w:val="start"/>
-      <w:pPr>
-        <w:tabs>
-          <w:tab w:val="num" w:pos="3240"/>
-        </w:tabs>
-        <w:ind w:start="3240" w:hanging="360"/>
-      </w:pPr>
-      <w:rPr>
-        <w:rFonts w:ascii="OpenSymbol" w:hAnsi="OpenSymbol" w:cs="OpenSymbol" w:hint="default"/>
+      <w:lvlText w:val=""/>
+      <w:lvlJc w:val="start"/>
+      <w:pPr>
+        <w:tabs>
+          <w:tab w:val="num" w:pos="5672"/>
+        </w:tabs>
+        <w:ind w:start="5672" w:hanging="283"/>
+      </w:pPr>
+      <w:rPr>
+        <w:rFonts w:ascii="Symbol" w:hAnsi="Symbol" w:cs="Symbol" w:hint="default"/>
       </w:rPr>
     </w:lvl>
     <w:lvl w:ilvl="8">
       <w:start w:val="1"/>
       <w:numFmt w:val="bullet"/>
-      <w:lvlText w:val="▪"/>
-      <w:lvlJc w:val="start"/>
-      <w:pPr>
-        <w:tabs>
-          <w:tab w:val="num" w:pos="3600"/>
-        </w:tabs>
-        <w:ind w:start="3600" w:hanging="360"/>
-      </w:pPr>
-      <w:rPr>
-        <w:rFonts w:ascii="OpenSymbol" w:hAnsi="OpenSymbol" w:cs="OpenSymbol" w:hint="default"/>
+      <w:lvlText w:val=""/>
+      <w:lvlJc w:val="start"/>
+      <w:pPr>
+        <w:tabs>
+          <w:tab w:val="num" w:pos="6381"/>
+        </w:tabs>
+        <w:ind w:start="6381" w:hanging="283"/>
+      </w:pPr>
+      <w:rPr>
+        <w:rFonts w:ascii="Symbol" w:hAnsi="Symbol" w:cs="Symbol" w:hint="default"/>
       </w:rPr>
     </w:lvl>
   </w:abstractNum>
@@ -2075,9 +2571,9 @@
       <w:lvlJc w:val="start"/>
       <w:pPr>
         <w:tabs>
-          <w:tab w:val="num" w:pos="709"/>
-        </w:tabs>
-        <w:ind w:start="709" w:hanging="283"/>
+          <w:tab w:val="num" w:pos="720"/>
+        </w:tabs>
+        <w:ind w:start="720" w:hanging="360"/>
       </w:pPr>
       <w:rPr>
         <w:rFonts w:ascii="Symbol" w:hAnsi="Symbol" w:cs="Symbol" w:hint="default"/>
@@ -2086,31 +2582,31 @@
     <w:lvl w:ilvl="1">
       <w:start w:val="1"/>
       <w:numFmt w:val="bullet"/>
-      <w:lvlText w:val=""/>
-      <w:lvlJc w:val="start"/>
-      <w:pPr>
-        <w:tabs>
-          <w:tab w:val="num" w:pos="1418"/>
-        </w:tabs>
-        <w:ind w:start="1418" w:hanging="283"/>
-      </w:pPr>
-      <w:rPr>
-        <w:rFonts w:ascii="Symbol" w:hAnsi="Symbol" w:cs="Symbol" w:hint="default"/>
+      <w:lvlText w:val="◦"/>
+      <w:lvlJc w:val="start"/>
+      <w:pPr>
+        <w:tabs>
+          <w:tab w:val="num" w:pos="1080"/>
+        </w:tabs>
+        <w:ind w:start="1080" w:hanging="360"/>
+      </w:pPr>
+      <w:rPr>
+        <w:rFonts w:ascii="OpenSymbol" w:hAnsi="OpenSymbol" w:cs="OpenSymbol" w:hint="default"/>
       </w:rPr>
     </w:lvl>
     <w:lvl w:ilvl="2">
       <w:start w:val="1"/>
       <w:numFmt w:val="bullet"/>
-      <w:lvlText w:val=""/>
-      <w:lvlJc w:val="start"/>
-      <w:pPr>
-        <w:tabs>
-          <w:tab w:val="num" w:pos="2127"/>
-        </w:tabs>
-        <w:ind w:start="2127" w:hanging="283"/>
-      </w:pPr>
-      <w:rPr>
-        <w:rFonts w:ascii="Symbol" w:hAnsi="Symbol" w:cs="Symbol" w:hint="default"/>
+      <w:lvlText w:val="▪"/>
+      <w:lvlJc w:val="start"/>
+      <w:pPr>
+        <w:tabs>
+          <w:tab w:val="num" w:pos="1440"/>
+        </w:tabs>
+        <w:ind w:start="1440" w:hanging="360"/>
+      </w:pPr>
+      <w:rPr>
+        <w:rFonts w:ascii="OpenSymbol" w:hAnsi="OpenSymbol" w:cs="OpenSymbol" w:hint="default"/>
       </w:rPr>
     </w:lvl>
     <w:lvl w:ilvl="3">
@@ -2120,9 +2616,9 @@
       <w:lvlJc w:val="start"/>
       <w:pPr>
         <w:tabs>
-          <w:tab w:val="num" w:pos="2836"/>
-        </w:tabs>
-        <w:ind w:start="2836" w:hanging="283"/>
+          <w:tab w:val="num" w:pos="1800"/>
+        </w:tabs>
+        <w:ind w:start="1800" w:hanging="360"/>
       </w:pPr>
       <w:rPr>
         <w:rFonts w:ascii="Symbol" w:hAnsi="Symbol" w:cs="Symbol" w:hint="default"/>
@@ -2131,31 +2627,31 @@
     <w:lvl w:ilvl="4">
       <w:start w:val="1"/>
       <w:numFmt w:val="bullet"/>
-      <w:lvlText w:val=""/>
-      <w:lvlJc w:val="start"/>
-      <w:pPr>
-        <w:tabs>
-          <w:tab w:val="num" w:pos="3545"/>
-        </w:tabs>
-        <w:ind w:start="3545" w:hanging="283"/>
-      </w:pPr>
-      <w:rPr>
-        <w:rFonts w:ascii="Symbol" w:hAnsi="Symbol" w:cs="Symbol" w:hint="default"/>
+      <w:lvlText w:val="◦"/>
+      <w:lvlJc w:val="start"/>
+      <w:pPr>
+        <w:tabs>
+          <w:tab w:val="num" w:pos="2160"/>
+        </w:tabs>
+        <w:ind w:start="2160" w:hanging="360"/>
+      </w:pPr>
+      <w:rPr>
+        <w:rFonts w:ascii="OpenSymbol" w:hAnsi="OpenSymbol" w:cs="OpenSymbol" w:hint="default"/>
       </w:rPr>
     </w:lvl>
     <w:lvl w:ilvl="5">
       <w:start w:val="1"/>
       <w:numFmt w:val="bullet"/>
-      <w:lvlText w:val=""/>
-      <w:lvlJc w:val="start"/>
-      <w:pPr>
-        <w:tabs>
-          <w:tab w:val="num" w:pos="4254"/>
-        </w:tabs>
-        <w:ind w:start="4254" w:hanging="283"/>
-      </w:pPr>
-      <w:rPr>
-        <w:rFonts w:ascii="Symbol" w:hAnsi="Symbol" w:cs="Symbol" w:hint="default"/>
+      <w:lvlText w:val="▪"/>
+      <w:lvlJc w:val="start"/>
+      <w:pPr>
+        <w:tabs>
+          <w:tab w:val="num" w:pos="2520"/>
+        </w:tabs>
+        <w:ind w:start="2520" w:hanging="360"/>
+      </w:pPr>
+      <w:rPr>
+        <w:rFonts w:ascii="OpenSymbol" w:hAnsi="OpenSymbol" w:cs="OpenSymbol" w:hint="default"/>
       </w:rPr>
     </w:lvl>
     <w:lvl w:ilvl="6">
@@ -2165,9 +2661,9 @@
       <w:lvlJc w:val="start"/>
       <w:pPr>
         <w:tabs>
-          <w:tab w:val="num" w:pos="4963"/>
-        </w:tabs>
-        <w:ind w:start="4963" w:hanging="283"/>
+          <w:tab w:val="num" w:pos="2880"/>
+        </w:tabs>
+        <w:ind w:start="2880" w:hanging="360"/>
       </w:pPr>
       <w:rPr>
         <w:rFonts w:ascii="Symbol" w:hAnsi="Symbol" w:cs="Symbol" w:hint="default"/>
@@ -2176,152 +2672,805 @@
     <w:lvl w:ilvl="7">
       <w:start w:val="1"/>
       <w:numFmt w:val="bullet"/>
-      <w:lvlText w:val=""/>
-      <w:lvlJc w:val="start"/>
-      <w:pPr>
-        <w:tabs>
-          <w:tab w:val="num" w:pos="5672"/>
-        </w:tabs>
-        <w:ind w:start="5672" w:hanging="283"/>
-      </w:pPr>
-      <w:rPr>
-        <w:rFonts w:ascii="Symbol" w:hAnsi="Symbol" w:cs="Symbol" w:hint="default"/>
+      <w:lvlText w:val="◦"/>
+      <w:lvlJc w:val="start"/>
+      <w:pPr>
+        <w:tabs>
+          <w:tab w:val="num" w:pos="3240"/>
+        </w:tabs>
+        <w:ind w:start="3240" w:hanging="360"/>
+      </w:pPr>
+      <w:rPr>
+        <w:rFonts w:ascii="OpenSymbol" w:hAnsi="OpenSymbol" w:cs="OpenSymbol" w:hint="default"/>
       </w:rPr>
     </w:lvl>
     <w:lvl w:ilvl="8">
       <w:start w:val="1"/>
       <w:numFmt w:val="bullet"/>
-      <w:lvlText w:val=""/>
-      <w:lvlJc w:val="start"/>
-      <w:pPr>
-        <w:tabs>
-          <w:tab w:val="num" w:pos="6381"/>
-        </w:tabs>
-        <w:ind w:start="6381" w:hanging="283"/>
-      </w:pPr>
-      <w:rPr>
-        <w:rFonts w:ascii="Symbol" w:hAnsi="Symbol" w:cs="Symbol" w:hint="default"/>
+      <w:lvlText w:val="▪"/>
+      <w:lvlJc w:val="start"/>
+      <w:pPr>
+        <w:tabs>
+          <w:tab w:val="num" w:pos="3600"/>
+        </w:tabs>
+        <w:ind w:start="3600" w:hanging="360"/>
+      </w:pPr>
+      <w:rPr>
+        <w:rFonts w:ascii="OpenSymbol" w:hAnsi="OpenSymbol" w:cs="OpenSymbol" w:hint="default"/>
       </w:rPr>
     </w:lvl>
   </w:abstractNum>
   <w:abstractNum w:abstractNumId="7">
     <w:lvl w:ilvl="0">
       <w:start w:val="1"/>
-      <w:numFmt w:val="none"/>
-      <w:suff w:val="nothing"/>
-      <w:lvlText w:val=""/>
-      <w:lvlJc w:val="start"/>
-      <w:pPr>
-        <w:tabs>
-          <w:tab w:val="num" w:pos="0"/>
-        </w:tabs>
-        <w:ind w:start="0" w:hanging="0"/>
-      </w:pPr>
+      <w:numFmt w:val="bullet"/>
+      <w:lvlText w:val=""/>
+      <w:lvlJc w:val="start"/>
+      <w:pPr>
+        <w:tabs>
+          <w:tab w:val="num" w:pos="709"/>
+        </w:tabs>
+        <w:ind w:start="709" w:hanging="283"/>
+      </w:pPr>
+      <w:rPr>
+        <w:rFonts w:ascii="Symbol" w:hAnsi="Symbol" w:cs="Symbol" w:hint="default"/>
+      </w:rPr>
     </w:lvl>
     <w:lvl w:ilvl="1">
       <w:start w:val="1"/>
-      <w:pStyle w:val="Heading2"/>
-      <w:numFmt w:val="none"/>
-      <w:suff w:val="nothing"/>
-      <w:lvlText w:val=""/>
-      <w:lvlJc w:val="start"/>
-      <w:pPr>
-        <w:tabs>
-          <w:tab w:val="num" w:pos="0"/>
-        </w:tabs>
-        <w:ind w:start="0" w:hanging="0"/>
-      </w:pPr>
+      <w:numFmt w:val="bullet"/>
+      <w:lvlText w:val=""/>
+      <w:lvlJc w:val="start"/>
+      <w:pPr>
+        <w:tabs>
+          <w:tab w:val="num" w:pos="1418"/>
+        </w:tabs>
+        <w:ind w:start="1418" w:hanging="283"/>
+      </w:pPr>
+      <w:rPr>
+        <w:rFonts w:ascii="Symbol" w:hAnsi="Symbol" w:cs="Symbol" w:hint="default"/>
+      </w:rPr>
     </w:lvl>
     <w:lvl w:ilvl="2">
       <w:start w:val="1"/>
-      <w:pStyle w:val="Heading3"/>
-      <w:numFmt w:val="none"/>
-      <w:suff w:val="nothing"/>
-      <w:lvlText w:val=""/>
-      <w:lvlJc w:val="start"/>
-      <w:pPr>
-        <w:tabs>
-          <w:tab w:val="num" w:pos="0"/>
-        </w:tabs>
-        <w:ind w:start="0" w:hanging="0"/>
-      </w:pPr>
+      <w:numFmt w:val="bullet"/>
+      <w:lvlText w:val=""/>
+      <w:lvlJc w:val="start"/>
+      <w:pPr>
+        <w:tabs>
+          <w:tab w:val="num" w:pos="2127"/>
+        </w:tabs>
+        <w:ind w:start="2127" w:hanging="283"/>
+      </w:pPr>
+      <w:rPr>
+        <w:rFonts w:ascii="Symbol" w:hAnsi="Symbol" w:cs="Symbol" w:hint="default"/>
+      </w:rPr>
     </w:lvl>
     <w:lvl w:ilvl="3">
       <w:start w:val="1"/>
-      <w:numFmt w:val="none"/>
-      <w:suff w:val="nothing"/>
-      <w:lvlText w:val=""/>
-      <w:lvlJc w:val="start"/>
-      <w:pPr>
-        <w:tabs>
-          <w:tab w:val="num" w:pos="0"/>
-        </w:tabs>
-        <w:ind w:start="0" w:hanging="0"/>
-      </w:pPr>
+      <w:numFmt w:val="bullet"/>
+      <w:lvlText w:val=""/>
+      <w:lvlJc w:val="start"/>
+      <w:pPr>
+        <w:tabs>
+          <w:tab w:val="num" w:pos="2836"/>
+        </w:tabs>
+        <w:ind w:start="2836" w:hanging="283"/>
+      </w:pPr>
+      <w:rPr>
+        <w:rFonts w:ascii="Symbol" w:hAnsi="Symbol" w:cs="Symbol" w:hint="default"/>
+      </w:rPr>
     </w:lvl>
     <w:lvl w:ilvl="4">
       <w:start w:val="1"/>
-      <w:numFmt w:val="none"/>
-      <w:suff w:val="nothing"/>
-      <w:lvlText w:val=""/>
-      <w:lvlJc w:val="start"/>
-      <w:pPr>
-        <w:tabs>
-          <w:tab w:val="num" w:pos="0"/>
-        </w:tabs>
-        <w:ind w:start="0" w:hanging="0"/>
-      </w:pPr>
+      <w:numFmt w:val="bullet"/>
+      <w:lvlText w:val=""/>
+      <w:lvlJc w:val="start"/>
+      <w:pPr>
+        <w:tabs>
+          <w:tab w:val="num" w:pos="3545"/>
+        </w:tabs>
+        <w:ind w:start="3545" w:hanging="283"/>
+      </w:pPr>
+      <w:rPr>
+        <w:rFonts w:ascii="Symbol" w:hAnsi="Symbol" w:cs="Symbol" w:hint="default"/>
+      </w:rPr>
     </w:lvl>
     <w:lvl w:ilvl="5">
       <w:start w:val="1"/>
-      <w:numFmt w:val="none"/>
-      <w:suff w:val="nothing"/>
-      <w:lvlText w:val=""/>
-      <w:lvlJc w:val="start"/>
-      <w:pPr>
-        <w:tabs>
-          <w:tab w:val="num" w:pos="0"/>
-        </w:tabs>
-        <w:ind w:start="0" w:hanging="0"/>
-      </w:pPr>
+      <w:numFmt w:val="bullet"/>
+      <w:lvlText w:val=""/>
+      <w:lvlJc w:val="start"/>
+      <w:pPr>
+        <w:tabs>
+          <w:tab w:val="num" w:pos="4254"/>
+        </w:tabs>
+        <w:ind w:start="4254" w:hanging="283"/>
+      </w:pPr>
+      <w:rPr>
+        <w:rFonts w:ascii="Symbol" w:hAnsi="Symbol" w:cs="Symbol" w:hint="default"/>
+      </w:rPr>
     </w:lvl>
     <w:lvl w:ilvl="6">
       <w:start w:val="1"/>
-      <w:numFmt w:val="none"/>
-      <w:suff w:val="nothing"/>
-      <w:lvlText w:val=""/>
-      <w:lvlJc w:val="start"/>
-      <w:pPr>
-        <w:tabs>
-          <w:tab w:val="num" w:pos="0"/>
-        </w:tabs>
-        <w:ind w:start="0" w:hanging="0"/>
-      </w:pPr>
+      <w:numFmt w:val="bullet"/>
+      <w:lvlText w:val=""/>
+      <w:lvlJc w:val="start"/>
+      <w:pPr>
+        <w:tabs>
+          <w:tab w:val="num" w:pos="4963"/>
+        </w:tabs>
+        <w:ind w:start="4963" w:hanging="283"/>
+      </w:pPr>
+      <w:rPr>
+        <w:rFonts w:ascii="Symbol" w:hAnsi="Symbol" w:cs="Symbol" w:hint="default"/>
+      </w:rPr>
     </w:lvl>
     <w:lvl w:ilvl="7">
       <w:start w:val="1"/>
-      <w:numFmt w:val="none"/>
-      <w:suff w:val="nothing"/>
-      <w:lvlText w:val=""/>
-      <w:lvlJc w:val="start"/>
-      <w:pPr>
-        <w:tabs>
-          <w:tab w:val="num" w:pos="0"/>
-        </w:tabs>
-        <w:ind w:start="0" w:hanging="0"/>
-      </w:pPr>
+      <w:numFmt w:val="bullet"/>
+      <w:lvlText w:val=""/>
+      <w:lvlJc w:val="start"/>
+      <w:pPr>
+        <w:tabs>
+          <w:tab w:val="num" w:pos="5672"/>
+        </w:tabs>
+        <w:ind w:start="5672" w:hanging="283"/>
+      </w:pPr>
+      <w:rPr>
+        <w:rFonts w:ascii="Symbol" w:hAnsi="Symbol" w:cs="Symbol" w:hint="default"/>
+      </w:rPr>
     </w:lvl>
     <w:lvl w:ilvl="8">
       <w:start w:val="1"/>
-      <w:numFmt w:val="none"/>
-      <w:suff w:val="nothing"/>
-      <w:lvlText w:val=""/>
-      <w:lvlJc w:val="start"/>
-      <w:pPr>
-        <w:tabs>
-          <w:tab w:val="num" w:pos="0"/>
-        </w:tabs>
-        <w:ind w:start="0" w:hanging="0"/>
+      <w:numFmt w:val="bullet"/>
+      <w:lvlText w:val=""/>
+      <w:lvlJc w:val="start"/>
+      <w:pPr>
+        <w:tabs>
+          <w:tab w:val="num" w:pos="6381"/>
+        </w:tabs>
+        <w:ind w:start="6381" w:hanging="283"/>
+      </w:pPr>
+      <w:rPr>
+        <w:rFonts w:ascii="Symbol" w:hAnsi="Symbol" w:cs="Symbol" w:hint="default"/>
+      </w:rPr>
+    </w:lvl>
+  </w:abstractNum>
+  <w:abstractNum w:abstractNumId="8">
+    <w:lvl w:ilvl="0">
+      <w:start w:val="1"/>
+      <w:numFmt w:val="bullet"/>
+      <w:lvlText w:val=""/>
+      <w:lvlJc w:val="start"/>
+      <w:pPr>
+        <w:tabs>
+          <w:tab w:val="num" w:pos="709"/>
+        </w:tabs>
+        <w:ind w:start="709" w:hanging="283"/>
+      </w:pPr>
+      <w:rPr>
+        <w:rFonts w:ascii="Symbol" w:hAnsi="Symbol" w:cs="Symbol" w:hint="default"/>
+      </w:rPr>
+    </w:lvl>
+    <w:lvl w:ilvl="1">
+      <w:start w:val="1"/>
+      <w:numFmt w:val="bullet"/>
+      <w:lvlText w:val=""/>
+      <w:lvlJc w:val="start"/>
+      <w:pPr>
+        <w:tabs>
+          <w:tab w:val="num" w:pos="1418"/>
+        </w:tabs>
+        <w:ind w:start="1418" w:hanging="283"/>
+      </w:pPr>
+      <w:rPr>
+        <w:rFonts w:ascii="Symbol" w:hAnsi="Symbol" w:cs="Symbol" w:hint="default"/>
+      </w:rPr>
+    </w:lvl>
+    <w:lvl w:ilvl="2">
+      <w:start w:val="1"/>
+      <w:numFmt w:val="bullet"/>
+      <w:lvlText w:val=""/>
+      <w:lvlJc w:val="start"/>
+      <w:pPr>
+        <w:tabs>
+          <w:tab w:val="num" w:pos="2127"/>
+        </w:tabs>
+        <w:ind w:start="2127" w:hanging="283"/>
+      </w:pPr>
+      <w:rPr>
+        <w:rFonts w:ascii="Symbol" w:hAnsi="Symbol" w:cs="Symbol" w:hint="default"/>
+      </w:rPr>
+    </w:lvl>
+    <w:lvl w:ilvl="3">
+      <w:start w:val="1"/>
+      <w:numFmt w:val="bullet"/>
+      <w:lvlText w:val=""/>
+      <w:lvlJc w:val="start"/>
+      <w:pPr>
+        <w:tabs>
+          <w:tab w:val="num" w:pos="2836"/>
+        </w:tabs>
+        <w:ind w:start="2836" w:hanging="283"/>
+      </w:pPr>
+      <w:rPr>
+        <w:rFonts w:ascii="Symbol" w:hAnsi="Symbol" w:cs="Symbol" w:hint="default"/>
+      </w:rPr>
+    </w:lvl>
+    <w:lvl w:ilvl="4">
+      <w:start w:val="1"/>
+      <w:numFmt w:val="bullet"/>
+      <w:lvlText w:val=""/>
+      <w:lvlJc w:val="start"/>
+      <w:pPr>
+        <w:tabs>
+          <w:tab w:val="num" w:pos="3545"/>
+        </w:tabs>
+        <w:ind w:start="3545" w:hanging="283"/>
+      </w:pPr>
+      <w:rPr>
+        <w:rFonts w:ascii="Symbol" w:hAnsi="Symbol" w:cs="Symbol" w:hint="default"/>
+      </w:rPr>
+    </w:lvl>
+    <w:lvl w:ilvl="5">
+      <w:start w:val="1"/>
+      <w:numFmt w:val="bullet"/>
+      <w:lvlText w:val=""/>
+      <w:lvlJc w:val="start"/>
+      <w:pPr>
+        <w:tabs>
+          <w:tab w:val="num" w:pos="4254"/>
+        </w:tabs>
+        <w:ind w:start="4254" w:hanging="283"/>
+      </w:pPr>
+      <w:rPr>
+        <w:rFonts w:ascii="Symbol" w:hAnsi="Symbol" w:cs="Symbol" w:hint="default"/>
+      </w:rPr>
+    </w:lvl>
+    <w:lvl w:ilvl="6">
+      <w:start w:val="1"/>
+      <w:numFmt w:val="bullet"/>
+      <w:lvlText w:val=""/>
+      <w:lvlJc w:val="start"/>
+      <w:pPr>
+        <w:tabs>
+          <w:tab w:val="num" w:pos="4963"/>
+        </w:tabs>
+        <w:ind w:start="4963" w:hanging="283"/>
+      </w:pPr>
+      <w:rPr>
+        <w:rFonts w:ascii="Symbol" w:hAnsi="Symbol" w:cs="Symbol" w:hint="default"/>
+      </w:rPr>
+    </w:lvl>
+    <w:lvl w:ilvl="7">
+      <w:start w:val="1"/>
+      <w:numFmt w:val="bullet"/>
+      <w:lvlText w:val=""/>
+      <w:lvlJc w:val="start"/>
+      <w:pPr>
+        <w:tabs>
+          <w:tab w:val="num" w:pos="5672"/>
+        </w:tabs>
+        <w:ind w:start="5672" w:hanging="283"/>
+      </w:pPr>
+      <w:rPr>
+        <w:rFonts w:ascii="Symbol" w:hAnsi="Symbol" w:cs="Symbol" w:hint="default"/>
+      </w:rPr>
+    </w:lvl>
+    <w:lvl w:ilvl="8">
+      <w:start w:val="1"/>
+      <w:numFmt w:val="bullet"/>
+      <w:lvlText w:val=""/>
+      <w:lvlJc w:val="start"/>
+      <w:pPr>
+        <w:tabs>
+          <w:tab w:val="num" w:pos="6381"/>
+        </w:tabs>
+        <w:ind w:start="6381" w:hanging="283"/>
+      </w:pPr>
+      <w:rPr>
+        <w:rFonts w:ascii="Symbol" w:hAnsi="Symbol" w:cs="Symbol" w:hint="default"/>
+      </w:rPr>
+    </w:lvl>
+  </w:abstractNum>
+  <w:abstractNum w:abstractNumId="9">
+    <w:lvl w:ilvl="0">
+      <w:start w:val="1"/>
+      <w:numFmt w:val="bullet"/>
+      <w:lvlText w:val=""/>
+      <w:lvlJc w:val="start"/>
+      <w:pPr>
+        <w:tabs>
+          <w:tab w:val="num" w:pos="720"/>
+        </w:tabs>
+        <w:ind w:start="720" w:hanging="360"/>
+      </w:pPr>
+      <w:rPr>
+        <w:rFonts w:ascii="Symbol" w:hAnsi="Symbol" w:cs="Symbol" w:hint="default"/>
+      </w:rPr>
+    </w:lvl>
+    <w:lvl w:ilvl="1">
+      <w:start w:val="1"/>
+      <w:numFmt w:val="bullet"/>
+      <w:lvlText w:val="◦"/>
+      <w:lvlJc w:val="start"/>
+      <w:pPr>
+        <w:tabs>
+          <w:tab w:val="num" w:pos="1080"/>
+        </w:tabs>
+        <w:ind w:start="1080" w:hanging="360"/>
+      </w:pPr>
+      <w:rPr>
+        <w:rFonts w:ascii="OpenSymbol" w:hAnsi="OpenSymbol" w:cs="OpenSymbol" w:hint="default"/>
+      </w:rPr>
+    </w:lvl>
+    <w:lvl w:ilvl="2">
+      <w:start w:val="1"/>
+      <w:numFmt w:val="bullet"/>
+      <w:lvlText w:val="▪"/>
+      <w:lvlJc w:val="start"/>
+      <w:pPr>
+        <w:tabs>
+          <w:tab w:val="num" w:pos="1440"/>
+        </w:tabs>
+        <w:ind w:start="1440" w:hanging="360"/>
+      </w:pPr>
+      <w:rPr>
+        <w:rFonts w:ascii="OpenSymbol" w:hAnsi="OpenSymbol" w:cs="OpenSymbol" w:hint="default"/>
+      </w:rPr>
+    </w:lvl>
+    <w:lvl w:ilvl="3">
+      <w:start w:val="1"/>
+      <w:numFmt w:val="bullet"/>
+      <w:lvlText w:val=""/>
+      <w:lvlJc w:val="start"/>
+      <w:pPr>
+        <w:tabs>
+          <w:tab w:val="num" w:pos="1800"/>
+        </w:tabs>
+        <w:ind w:start="1800" w:hanging="360"/>
+      </w:pPr>
+      <w:rPr>
+        <w:rFonts w:ascii="Symbol" w:hAnsi="Symbol" w:cs="Symbol" w:hint="default"/>
+      </w:rPr>
+    </w:lvl>
+    <w:lvl w:ilvl="4">
+      <w:start w:val="1"/>
+      <w:numFmt w:val="bullet"/>
+      <w:lvlText w:val="◦"/>
+      <w:lvlJc w:val="start"/>
+      <w:pPr>
+        <w:tabs>
+          <w:tab w:val="num" w:pos="2160"/>
+        </w:tabs>
+        <w:ind w:start="2160" w:hanging="360"/>
+      </w:pPr>
+      <w:rPr>
+        <w:rFonts w:ascii="OpenSymbol" w:hAnsi="OpenSymbol" w:cs="OpenSymbol" w:hint="default"/>
+      </w:rPr>
+    </w:lvl>
+    <w:lvl w:ilvl="5">
+      <w:start w:val="1"/>
+      <w:numFmt w:val="bullet"/>
+      <w:lvlText w:val="▪"/>
+      <w:lvlJc w:val="start"/>
+      <w:pPr>
+        <w:tabs>
+          <w:tab w:val="num" w:pos="2520"/>
+        </w:tabs>
+        <w:ind w:start="2520" w:hanging="360"/>
+      </w:pPr>
+      <w:rPr>
+        <w:rFonts w:ascii="OpenSymbol" w:hAnsi="OpenSymbol" w:cs="OpenSymbol" w:hint="default"/>
+      </w:rPr>
+    </w:lvl>
+    <w:lvl w:ilvl="6">
+      <w:start w:val="1"/>
+      <w:numFmt w:val="bullet"/>
+      <w:lvlText w:val=""/>
+      <w:lvlJc w:val="start"/>
+      <w:pPr>
+        <w:tabs>
+          <w:tab w:val="num" w:pos="2880"/>
+        </w:tabs>
+        <w:ind w:start="2880" w:hanging="360"/>
+      </w:pPr>
+      <w:rPr>
+        <w:rFonts w:ascii="Symbol" w:hAnsi="Symbol" w:cs="Symbol" w:hint="default"/>
+      </w:rPr>
+    </w:lvl>
+    <w:lvl w:ilvl="7">
+      <w:start w:val="1"/>
+      <w:numFmt w:val="bullet"/>
+      <w:lvlText w:val="◦"/>
+      <w:lvlJc w:val="start"/>
+      <w:pPr>
+        <w:tabs>
+          <w:tab w:val="num" w:pos="3240"/>
+        </w:tabs>
+        <w:ind w:start="3240" w:hanging="360"/>
+      </w:pPr>
+      <w:rPr>
+        <w:rFonts w:ascii="OpenSymbol" w:hAnsi="OpenSymbol" w:cs="OpenSymbol" w:hint="default"/>
+      </w:rPr>
+    </w:lvl>
+    <w:lvl w:ilvl="8">
+      <w:start w:val="1"/>
+      <w:numFmt w:val="bullet"/>
+      <w:lvlText w:val="▪"/>
+      <w:lvlJc w:val="start"/>
+      <w:pPr>
+        <w:tabs>
+          <w:tab w:val="num" w:pos="3600"/>
+        </w:tabs>
+        <w:ind w:start="3600" w:hanging="360"/>
+      </w:pPr>
+      <w:rPr>
+        <w:rFonts w:ascii="OpenSymbol" w:hAnsi="OpenSymbol" w:cs="OpenSymbol" w:hint="default"/>
+      </w:rPr>
+    </w:lvl>
+  </w:abstractNum>
+  <w:abstractNum w:abstractNumId="10">
+    <w:lvl w:ilvl="0">
+      <w:start w:val="1"/>
+      <w:numFmt w:val="bullet"/>
+      <w:lvlText w:val=""/>
+      <w:lvlJc w:val="start"/>
+      <w:pPr>
+        <w:tabs>
+          <w:tab w:val="num" w:pos="709"/>
+        </w:tabs>
+        <w:ind w:start="709" w:hanging="283"/>
+      </w:pPr>
+      <w:rPr>
+        <w:rFonts w:ascii="Symbol" w:hAnsi="Symbol" w:cs="Symbol" w:hint="default"/>
+      </w:rPr>
+    </w:lvl>
+    <w:lvl w:ilvl="1">
+      <w:start w:val="1"/>
+      <w:numFmt w:val="bullet"/>
+      <w:lvlText w:val=""/>
+      <w:lvlJc w:val="start"/>
+      <w:pPr>
+        <w:tabs>
+          <w:tab w:val="num" w:pos="1418"/>
+        </w:tabs>
+        <w:ind w:start="1418" w:hanging="283"/>
+      </w:pPr>
+      <w:rPr>
+        <w:rFonts w:ascii="Symbol" w:hAnsi="Symbol" w:cs="Symbol" w:hint="default"/>
+      </w:rPr>
+    </w:lvl>
+    <w:lvl w:ilvl="2">
+      <w:start w:val="1"/>
+      <w:numFmt w:val="bullet"/>
+      <w:lvlText w:val=""/>
+      <w:lvlJc w:val="start"/>
+      <w:pPr>
+        <w:tabs>
+          <w:tab w:val="num" w:pos="2127"/>
+        </w:tabs>
+        <w:ind w:start="2127" w:hanging="283"/>
+      </w:pPr>
+      <w:rPr>
+        <w:rFonts w:ascii="Symbol" w:hAnsi="Symbol" w:cs="Symbol" w:hint="default"/>
+      </w:rPr>
+    </w:lvl>
+    <w:lvl w:ilvl="3">
+      <w:start w:val="1"/>
+      <w:numFmt w:val="bullet"/>
+      <w:lvlText w:val=""/>
+      <w:lvlJc w:val="start"/>
+      <w:pPr>
+        <w:tabs>
+          <w:tab w:val="num" w:pos="2836"/>
+        </w:tabs>
+        <w:ind w:start="2836" w:hanging="283"/>
+      </w:pPr>
+      <w:rPr>
+        <w:rFonts w:ascii="Symbol" w:hAnsi="Symbol" w:cs="Symbol" w:hint="default"/>
+      </w:rPr>
+    </w:lvl>
+    <w:lvl w:ilvl="4">
+      <w:start w:val="1"/>
+      <w:numFmt w:val="bullet"/>
+      <w:lvlText w:val=""/>
+      <w:lvlJc w:val="start"/>
+      <w:pPr>
+        <w:tabs>
+          <w:tab w:val="num" w:pos="3545"/>
+        </w:tabs>
+        <w:ind w:start="3545" w:hanging="283"/>
+      </w:pPr>
+      <w:rPr>
+        <w:rFonts w:ascii="Symbol" w:hAnsi="Symbol" w:cs="Symbol" w:hint="default"/>
+      </w:rPr>
+    </w:lvl>
+    <w:lvl w:ilvl="5">
+      <w:start w:val="1"/>
+      <w:numFmt w:val="bullet"/>
+      <w:lvlText w:val=""/>
+      <w:lvlJc w:val="start"/>
+      <w:pPr>
+        <w:tabs>
+          <w:tab w:val="num" w:pos="4254"/>
+        </w:tabs>
+        <w:ind w:start="4254" w:hanging="283"/>
+      </w:pPr>
+      <w:rPr>
+        <w:rFonts w:ascii="Symbol" w:hAnsi="Symbol" w:cs="Symbol" w:hint="default"/>
+      </w:rPr>
+    </w:lvl>
+    <w:lvl w:ilvl="6">
+      <w:start w:val="1"/>
+      <w:numFmt w:val="bullet"/>
+      <w:lvlText w:val=""/>
+      <w:lvlJc w:val="start"/>
+      <w:pPr>
+        <w:tabs>
+          <w:tab w:val="num" w:pos="4963"/>
+        </w:tabs>
+        <w:ind w:start="4963" w:hanging="283"/>
+      </w:pPr>
+      <w:rPr>
+        <w:rFonts w:ascii="Symbol" w:hAnsi="Symbol" w:cs="Symbol" w:hint="default"/>
+      </w:rPr>
+    </w:lvl>
+    <w:lvl w:ilvl="7">
+      <w:start w:val="1"/>
+      <w:numFmt w:val="bullet"/>
+      <w:lvlText w:val=""/>
+      <w:lvlJc w:val="start"/>
+      <w:pPr>
+        <w:tabs>
+          <w:tab w:val="num" w:pos="5672"/>
+        </w:tabs>
+        <w:ind w:start="5672" w:hanging="283"/>
+      </w:pPr>
+      <w:rPr>
+        <w:rFonts w:ascii="Symbol" w:hAnsi="Symbol" w:cs="Symbol" w:hint="default"/>
+      </w:rPr>
+    </w:lvl>
+    <w:lvl w:ilvl="8">
+      <w:start w:val="1"/>
+      <w:numFmt w:val="bullet"/>
+      <w:lvlText w:val=""/>
+      <w:lvlJc w:val="start"/>
+      <w:pPr>
+        <w:tabs>
+          <w:tab w:val="num" w:pos="6381"/>
+        </w:tabs>
+        <w:ind w:start="6381" w:hanging="283"/>
+      </w:pPr>
+      <w:rPr>
+        <w:rFonts w:ascii="Symbol" w:hAnsi="Symbol" w:cs="Symbol" w:hint="default"/>
+      </w:rPr>
+    </w:lvl>
+  </w:abstractNum>
+  <w:abstractNum w:abstractNumId="11">
+    <w:lvl w:ilvl="0">
+      <w:start w:val="1"/>
+      <w:numFmt w:val="bullet"/>
+      <w:lvlText w:val=""/>
+      <w:lvlJc w:val="start"/>
+      <w:pPr>
+        <w:tabs>
+          <w:tab w:val="num" w:pos="720"/>
+        </w:tabs>
+        <w:ind w:start="720" w:hanging="283"/>
+      </w:pPr>
+      <w:rPr>
+        <w:rFonts w:ascii="Symbol" w:hAnsi="Symbol" w:cs="Symbol" w:hint="default"/>
+      </w:rPr>
+    </w:lvl>
+    <w:lvl w:ilvl="1">
+      <w:start w:val="1"/>
+      <w:numFmt w:val="decimal"/>
+      <w:lvlText w:val="%2."/>
+      <w:lvlJc w:val="start"/>
+      <w:pPr>
+        <w:tabs>
+          <w:tab w:val="num" w:pos="1080"/>
+        </w:tabs>
+        <w:ind w:start="1080" w:hanging="360"/>
+      </w:pPr>
+    </w:lvl>
+    <w:lvl w:ilvl="2">
+      <w:start w:val="1"/>
+      <w:numFmt w:val="decimal"/>
+      <w:lvlText w:val="%3."/>
+      <w:lvlJc w:val="start"/>
+      <w:pPr>
+        <w:tabs>
+          <w:tab w:val="num" w:pos="1440"/>
+        </w:tabs>
+        <w:ind w:start="1440" w:hanging="360"/>
+      </w:pPr>
+    </w:lvl>
+    <w:lvl w:ilvl="3">
+      <w:start w:val="1"/>
+      <w:numFmt w:val="decimal"/>
+      <w:lvlText w:val="%4."/>
+      <w:lvlJc w:val="start"/>
+      <w:pPr>
+        <w:tabs>
+          <w:tab w:val="num" w:pos="1800"/>
+        </w:tabs>
+        <w:ind w:start="1800" w:hanging="360"/>
+      </w:pPr>
+    </w:lvl>
+    <w:lvl w:ilvl="4">
+      <w:start w:val="1"/>
+      <w:numFmt w:val="decimal"/>
+      <w:lvlText w:val="%5."/>
+      <w:lvlJc w:val="start"/>
+      <w:pPr>
+        <w:tabs>
+          <w:tab w:val="num" w:pos="2160"/>
+        </w:tabs>
+        <w:ind w:start="2160" w:hanging="360"/>
+      </w:pPr>
+    </w:lvl>
+    <w:lvl w:ilvl="5">
+      <w:start w:val="1"/>
+      <w:numFmt w:val="decimal"/>
+      <w:lvlText w:val="%6."/>
+      <w:lvlJc w:val="start"/>
+      <w:pPr>
+        <w:tabs>
+          <w:tab w:val="num" w:pos="2520"/>
+        </w:tabs>
+        <w:ind w:start="2520" w:hanging="360"/>
+      </w:pPr>
+    </w:lvl>
+    <w:lvl w:ilvl="6">
+      <w:start w:val="1"/>
+      <w:numFmt w:val="decimal"/>
+      <w:lvlText w:val="%7."/>
+      <w:lvlJc w:val="start"/>
+      <w:pPr>
+        <w:tabs>
+          <w:tab w:val="num" w:pos="2880"/>
+        </w:tabs>
+        <w:ind w:start="2880" w:hanging="360"/>
+      </w:pPr>
+    </w:lvl>
+    <w:lvl w:ilvl="7">
+      <w:start w:val="1"/>
+      <w:numFmt w:val="decimal"/>
+      <w:lvlText w:val="%8."/>
+      <w:lvlJc w:val="start"/>
+      <w:pPr>
+        <w:tabs>
+          <w:tab w:val="num" w:pos="3240"/>
+        </w:tabs>
+        <w:ind w:start="3240" w:hanging="360"/>
+      </w:pPr>
+    </w:lvl>
+    <w:lvl w:ilvl="8">
+      <w:start w:val="1"/>
+      <w:numFmt w:val="decimal"/>
+      <w:lvlText w:val="%9."/>
+      <w:lvlJc w:val="start"/>
+      <w:pPr>
+        <w:tabs>
+          <w:tab w:val="num" w:pos="3600"/>
+        </w:tabs>
+        <w:ind w:start="3600" w:hanging="360"/>
+      </w:pPr>
+    </w:lvl>
+  </w:abstractNum>
+  <w:abstractNum w:abstractNumId="12">
+    <w:lvl w:ilvl="0">
+      <w:start w:val="1"/>
+      <w:numFmt w:val="bullet"/>
+      <w:lvlText w:val=""/>
+      <w:lvlJc w:val="start"/>
+      <w:pPr>
+        <w:tabs>
+          <w:tab w:val="num" w:pos="720"/>
+        </w:tabs>
+        <w:ind w:start="720" w:hanging="283"/>
+      </w:pPr>
+      <w:rPr>
+        <w:rFonts w:ascii="Symbol" w:hAnsi="Symbol" w:cs="Symbol" w:hint="default"/>
+      </w:rPr>
+    </w:lvl>
+    <w:lvl w:ilvl="1">
+      <w:start w:val="1"/>
+      <w:numFmt w:val="decimal"/>
+      <w:lvlText w:val="%2."/>
+      <w:lvlJc w:val="start"/>
+      <w:pPr>
+        <w:tabs>
+          <w:tab w:val="num" w:pos="1080"/>
+        </w:tabs>
+        <w:ind w:start="1080" w:hanging="360"/>
+      </w:pPr>
+    </w:lvl>
+    <w:lvl w:ilvl="2">
+      <w:start w:val="1"/>
+      <w:numFmt w:val="decimal"/>
+      <w:lvlText w:val="%3."/>
+      <w:lvlJc w:val="start"/>
+      <w:pPr>
+        <w:tabs>
+          <w:tab w:val="num" w:pos="1440"/>
+        </w:tabs>
+        <w:ind w:start="1440" w:hanging="360"/>
+      </w:pPr>
+    </w:lvl>
+    <w:lvl w:ilvl="3">
+      <w:start w:val="1"/>
+      <w:numFmt w:val="decimal"/>
+      <w:lvlText w:val="%4."/>
+      <w:lvlJc w:val="start"/>
+      <w:pPr>
+        <w:tabs>
+          <w:tab w:val="num" w:pos="1800"/>
+        </w:tabs>
+        <w:ind w:start="1800" w:hanging="360"/>
+      </w:pPr>
+    </w:lvl>
+    <w:lvl w:ilvl="4">
+      <w:start w:val="1"/>
+      <w:numFmt w:val="decimal"/>
+      <w:lvlText w:val="%5."/>
+      <w:lvlJc w:val="start"/>
+      <w:pPr>
+        <w:tabs>
+          <w:tab w:val="num" w:pos="2160"/>
+        </w:tabs>
+        <w:ind w:start="2160" w:hanging="360"/>
+      </w:pPr>
+    </w:lvl>
+    <w:lvl w:ilvl="5">
+      <w:start w:val="1"/>
+      <w:numFmt w:val="decimal"/>
+      <w:lvlText w:val="%6."/>
+      <w:lvlJc w:val="start"/>
+      <w:pPr>
+        <w:tabs>
+          <w:tab w:val="num" w:pos="2520"/>
+        </w:tabs>
+        <w:ind w:start="2520" w:hanging="360"/>
+      </w:pPr>
+    </w:lvl>
+    <w:lvl w:ilvl="6">
+      <w:start w:val="1"/>
+      <w:numFmt w:val="decimal"/>
+      <w:lvlText w:val="%7."/>
+      <w:lvlJc w:val="start"/>
+      <w:pPr>
+        <w:tabs>
+          <w:tab w:val="num" w:pos="2880"/>
+        </w:tabs>
+        <w:ind w:start="2880" w:hanging="360"/>
+      </w:pPr>
+    </w:lvl>
+    <w:lvl w:ilvl="7">
+      <w:start w:val="1"/>
+      <w:numFmt w:val="decimal"/>
+      <w:lvlText w:val="%8."/>
+      <w:lvlJc w:val="start"/>
+      <w:pPr>
+        <w:tabs>
+          <w:tab w:val="num" w:pos="3240"/>
+        </w:tabs>
+        <w:ind w:start="3240" w:hanging="360"/>
+      </w:pPr>
+    </w:lvl>
+    <w:lvl w:ilvl="8">
+      <w:start w:val="1"/>
+      <w:numFmt w:val="decimal"/>
+      <w:lvlText w:val="%9."/>
+      <w:lvlJc w:val="start"/>
+      <w:pPr>
+        <w:tabs>
+          <w:tab w:val="num" w:pos="3600"/>
+        </w:tabs>
+        <w:ind w:start="3600" w:hanging="360"/>
       </w:pPr>
     </w:lvl>
   </w:abstractNum>
@@ -2346,6 +3495,21 @@
   <w:num w:numId="7">
     <w:abstractNumId w:val="7"/>
   </w:num>
+  <w:num w:numId="8">
+    <w:abstractNumId w:val="8"/>
+  </w:num>
+  <w:num w:numId="9">
+    <w:abstractNumId w:val="9"/>
+  </w:num>
+  <w:num w:numId="10">
+    <w:abstractNumId w:val="10"/>
+  </w:num>
+  <w:num w:numId="11">
+    <w:abstractNumId w:val="11"/>
+  </w:num>
+  <w:num w:numId="12">
+    <w:abstractNumId w:val="12"/>
+  </w:num>
 </w:numbering>
 </file>
 
@@ -2373,6 +3537,9 @@
     <w:qFormat/>
     <w:pPr>
       <w:widowControl/>
+      <w:kinsoku w:val="true"/>
+      <w:overflowPunct w:val="true"/>
+      <w:autoSpaceDE w:val="true"/>
       <w:bidi w:val="0"/>
     </w:pPr>
     <w:rPr>
@@ -2390,6 +3557,10 @@
     <w:next w:val="BodyText"/>
     <w:qFormat/>
     <w:pPr>
+      <w:numPr>
+        <w:ilvl w:val="0"/>
+        <w:numId w:val="0"/>
+      </w:numPr>
       <w:spacing w:before="200" w:after="120"/>
       <w:outlineLvl w:val="1"/>
     </w:pPr>
@@ -2407,6 +3578,10 @@
     <w:next w:val="BodyText"/>
     <w:qFormat/>
     <w:pPr>
+      <w:numPr>
+        <w:ilvl w:val="0"/>
+        <w:numId w:val="0"/>
+      </w:numPr>
       <w:spacing w:before="140" w:after="120"/>
       <w:outlineLvl w:val="2"/>
     </w:pPr>
@@ -2450,6 +3625,14 @@
     <w:qFormat/>
     <w:rPr>
       <w:rFonts w:ascii="OpenSymbol" w:hAnsi="OpenSymbol" w:eastAsia="OpenSymbol" w:cs="OpenSymbol"/>
+    </w:rPr>
+  </w:style>
+  <w:style w:type="character" w:styleId="Emphasis">
+    <w:name w:val="Emphasis"/>
+    <w:qFormat/>
+    <w:rPr>
+      <w:i/>
+      <w:iCs/>
     </w:rPr>
   </w:style>
   <w:style w:type="paragraph" w:styleId="Heading">

</xml_diff>

<commit_message>
Update Spotify Connect design.docx, Spotify Connect design.odt, and 3 more files...
</commit_message>
<xml_diff>
--- a/Documents/Spotify/Spotify Connect design.docx
+++ b/Documents/Spotify/Spotify Connect design.docx
@@ -5,8 +5,6 @@
     <w:p>
       <w:pPr>
         <w:pStyle w:val="Normal"/>
-        <w:bidi w:val="0"/>
-        <w:jc w:val="start"/>
         <w:rPr>
           <w:b/>
           <w:bCs/>
@@ -23,19 +21,15 @@
     <w:p>
       <w:pPr>
         <w:pStyle w:val="Normal"/>
-        <w:bidi w:val="0"/>
-        <w:jc w:val="start"/>
-        <w:rPr/>
-      </w:pPr>
-      <w:r>
-        <w:rPr/>
-      </w:r>
-    </w:p>
-    <w:p>
-      <w:pPr>
-        <w:pStyle w:val="BodyText"/>
-        <w:bidi w:val="0"/>
-        <w:jc w:val="start"/>
+        <w:rPr/>
+      </w:pPr>
+      <w:r>
+        <w:rPr/>
+      </w:r>
+    </w:p>
+    <w:p>
+      <w:pPr>
+        <w:pStyle w:val="BodyText"/>
         <w:rPr>
           <w:b/>
           <w:bCs/>
@@ -54,8 +48,6 @@
     <w:p>
       <w:pPr>
         <w:pStyle w:val="BodyText"/>
-        <w:bidi w:val="0"/>
-        <w:jc w:val="start"/>
         <w:rPr/>
       </w:pPr>
       <w:r>
@@ -66,9 +58,6 @@
     <w:p>
       <w:pPr>
         <w:pStyle w:val="BodyText"/>
-        <w:bidi w:val="0"/>
-        <w:spacing w:lineRule="auto" w:line="276" w:before="0" w:after="140"/>
-        <w:jc w:val="start"/>
         <w:rPr/>
       </w:pPr>
       <w:r>
@@ -79,9 +68,6 @@
     <w:p>
       <w:pPr>
         <w:pStyle w:val="BodyText"/>
-        <w:bidi w:val="0"/>
-        <w:spacing w:lineRule="auto" w:line="276" w:before="0" w:after="140"/>
-        <w:jc w:val="start"/>
         <w:rPr/>
       </w:pPr>
       <w:r>
@@ -92,9 +78,6 @@
     <w:p>
       <w:pPr>
         <w:pStyle w:val="BodyText"/>
-        <w:bidi w:val="0"/>
-        <w:spacing w:lineRule="auto" w:line="276" w:before="0" w:after="140"/>
-        <w:jc w:val="start"/>
         <w:rPr/>
       </w:pPr>
       <w:r>
@@ -105,19 +88,15 @@
     <w:p>
       <w:pPr>
         <w:pStyle w:val="BodyText"/>
-        <w:bidi w:val="0"/>
-        <w:jc w:val="start"/>
-        <w:rPr/>
-      </w:pPr>
-      <w:r>
-        <w:rPr/>
-      </w:r>
-    </w:p>
-    <w:p>
-      <w:pPr>
-        <w:pStyle w:val="BodyText"/>
-        <w:bidi w:val="0"/>
-        <w:jc w:val="start"/>
+        <w:rPr/>
+      </w:pPr>
+      <w:r>
+        <w:rPr/>
+      </w:r>
+    </w:p>
+    <w:p>
+      <w:pPr>
+        <w:pStyle w:val="BodyText"/>
         <w:rPr>
           <w:b/>
           <w:bCs/>
@@ -136,8 +115,6 @@
     <w:p>
       <w:pPr>
         <w:pStyle w:val="BodyText"/>
-        <w:bidi w:val="0"/>
-        <w:jc w:val="start"/>
         <w:rPr/>
       </w:pPr>
       <w:r>
@@ -156,8 +133,6 @@
           <w:ilvl w:val="0"/>
           <w:numId w:val="2"/>
         </w:numPr>
-        <w:bidi w:val="0"/>
-        <w:jc w:val="start"/>
         <w:rPr/>
       </w:pPr>
       <w:r>
@@ -176,8 +151,6 @@
           <w:ilvl w:val="0"/>
           <w:numId w:val="2"/>
         </w:numPr>
-        <w:bidi w:val="0"/>
-        <w:jc w:val="start"/>
         <w:rPr/>
       </w:pPr>
       <w:r>
@@ -188,9 +161,6 @@
     <w:p>
       <w:pPr>
         <w:pStyle w:val="BodyText"/>
-        <w:bidi w:val="0"/>
-        <w:spacing w:lineRule="auto" w:line="276" w:before="0" w:after="140"/>
-        <w:jc w:val="start"/>
         <w:rPr/>
       </w:pPr>
       <w:r>
@@ -201,8 +171,6 @@
     <w:p>
       <w:pPr>
         <w:pStyle w:val="BodyText"/>
-        <w:bidi w:val="0"/>
-        <w:jc w:val="start"/>
         <w:rPr/>
       </w:pPr>
       <w:r>
@@ -229,10 +197,8 @@
           <w:tab w:val="clear" w:pos="709"/>
           <w:tab w:val="left" w:pos="709" w:leader="none"/>
         </w:tabs>
-        <w:bidi w:val="0"/>
         <w:spacing w:before="0" w:after="0"/>
         <w:ind w:hanging="283" w:start="709"/>
-        <w:jc w:val="start"/>
         <w:rPr/>
       </w:pPr>
       <w:r>
@@ -251,9 +217,7 @@
           <w:tab w:val="clear" w:pos="709"/>
           <w:tab w:val="left" w:pos="709" w:leader="none"/>
         </w:tabs>
-        <w:bidi w:val="0"/>
         <w:ind w:hanging="283" w:start="709"/>
-        <w:jc w:val="start"/>
         <w:rPr/>
       </w:pPr>
       <w:r>
@@ -272,9 +236,7 @@
           <w:tab w:val="clear" w:pos="709"/>
           <w:tab w:val="left" w:pos="709" w:leader="none"/>
         </w:tabs>
-        <w:bidi w:val="0"/>
         <w:ind w:hanging="283" w:start="709"/>
-        <w:jc w:val="start"/>
         <w:rPr/>
       </w:pPr>
       <w:r>
@@ -285,8 +247,6 @@
     <w:p>
       <w:pPr>
         <w:pStyle w:val="BodyText"/>
-        <w:bidi w:val="0"/>
-        <w:jc w:val="start"/>
         <w:rPr/>
       </w:pPr>
       <w:r>
@@ -296,8 +256,6 @@
     <w:p>
       <w:pPr>
         <w:pStyle w:val="Normal"/>
-        <w:bidi w:val="0"/>
-        <w:jc w:val="start"/>
         <w:rPr/>
       </w:pPr>
       <w:r>
@@ -310,8 +268,6 @@
     <w:p>
       <w:pPr>
         <w:pStyle w:val="Normal"/>
-        <w:bidi w:val="0"/>
-        <w:jc w:val="start"/>
         <w:rPr>
           <w:b/>
           <w:bCs/>
@@ -330,8 +286,6 @@
     <w:p>
       <w:pPr>
         <w:pStyle w:val="Normal"/>
-        <w:bidi w:val="0"/>
-        <w:jc w:val="start"/>
         <w:rPr>
           <w:b/>
           <w:bCs/>
@@ -339,6 +293,11 @@
         </w:rPr>
       </w:pPr>
       <w:r>
+        <w:rPr>
+          <w:b/>
+          <w:bCs/>
+          <w:u w:val="none"/>
+        </w:rPr>
         <w:drawing>
           <wp:anchor behindDoc="0" distT="0" distB="0" distL="0" distR="0" simplePos="0" locked="0" layoutInCell="0" allowOverlap="1" relativeHeight="2">
             <wp:simplePos x="0" y="0"/>
@@ -348,7 +307,7 @@
             <wp:positionV relativeFrom="paragraph">
               <wp:posOffset>635</wp:posOffset>
             </wp:positionV>
-            <wp:extent cx="6120130" cy="7213600"/>
+            <wp:extent cx="6120130" cy="8655685"/>
             <wp:effectExtent l="0" t="0" r="0" b="0"/>
             <wp:wrapSquare wrapText="largest"/>
             <wp:docPr id="1" name="Image1" descr="" title=""/>
@@ -373,7 +332,7 @@
                   <pic:spPr bwMode="auto">
                     <a:xfrm>
                       <a:off x="0" y="0"/>
-                      <a:ext cx="6120130" cy="7213600"/>
+                      <a:ext cx="6120130" cy="8655685"/>
                     </a:xfrm>
                     <a:prstGeom prst="rect">
                       <a:avLst/>
@@ -385,20 +344,45 @@
           </wp:anchor>
         </w:drawing>
       </w:r>
-      <w:r>
+    </w:p>
+    <w:p>
+      <w:pPr>
+        <w:pStyle w:val="Normal"/>
         <w:rPr>
           <w:b/>
           <w:bCs/>
           <w:u w:val="none"/>
         </w:rPr>
+      </w:pPr>
+      <w:r>
+        <w:rPr>
+          <w:b/>
+          <w:bCs/>
+          <w:u w:val="none"/>
+        </w:rPr>
+      </w:r>
+    </w:p>
+    <w:p>
+      <w:pPr>
+        <w:pStyle w:val="Normal"/>
+        <w:rPr>
+          <w:b/>
+          <w:bCs/>
+          <w:u w:val="none"/>
+        </w:rPr>
+      </w:pPr>
+      <w:r>
+        <w:rPr>
+          <w:b/>
+          <w:bCs/>
+          <w:u w:val="none"/>
+        </w:rPr>
         <w:t>Spotify App</w:t>
       </w:r>
     </w:p>
     <w:p>
       <w:pPr>
         <w:pStyle w:val="Normal"/>
-        <w:bidi w:val="0"/>
-        <w:jc w:val="start"/>
         <w:rPr>
           <w:rFonts w:ascii="Liberation Serif" w:hAnsi="Liberation Serif"/>
         </w:rPr>
@@ -411,9 +395,7 @@
     <w:p>
       <w:pPr>
         <w:pStyle w:val="BodyText"/>
-        <w:bidi w:val="0"/>
         <w:spacing w:before="0" w:after="0"/>
-        <w:jc w:val="start"/>
         <w:rPr/>
       </w:pPr>
       <w:r>
@@ -442,9 +424,7 @@
     <w:p>
       <w:pPr>
         <w:pStyle w:val="BodyText"/>
-        <w:bidi w:val="0"/>
         <w:spacing w:before="0" w:after="0"/>
-        <w:jc w:val="start"/>
         <w:rPr/>
       </w:pPr>
       <w:r>
@@ -525,9 +505,6 @@
     <w:p>
       <w:pPr>
         <w:pStyle w:val="BodyText"/>
-        <w:bidi w:val="0"/>
-        <w:spacing w:lineRule="auto" w:line="276" w:before="0" w:after="140"/>
-        <w:jc w:val="start"/>
         <w:rPr/>
       </w:pPr>
       <w:r>
@@ -570,8 +547,6 @@
     <w:p>
       <w:pPr>
         <w:pStyle w:val="Normal"/>
-        <w:bidi w:val="0"/>
-        <w:jc w:val="start"/>
         <w:rPr/>
       </w:pPr>
       <w:r>
@@ -598,10 +573,8 @@
           <w:tab w:val="clear" w:pos="709"/>
           <w:tab w:val="left" w:pos="709" w:leader="none"/>
         </w:tabs>
-        <w:bidi w:val="0"/>
         <w:spacing w:before="0" w:after="0"/>
         <w:ind w:hanging="283" w:start="709"/>
-        <w:jc w:val="start"/>
         <w:rPr/>
       </w:pPr>
       <w:r>
@@ -652,10 +625,8 @@
           <w:tab w:val="clear" w:pos="709"/>
           <w:tab w:val="left" w:pos="709" w:leader="none"/>
         </w:tabs>
-        <w:bidi w:val="0"/>
         <w:spacing w:before="0" w:after="0"/>
         <w:ind w:hanging="283" w:start="709"/>
-        <w:jc w:val="start"/>
         <w:rPr/>
       </w:pPr>
       <w:r>
@@ -692,9 +663,7 @@
           <w:tab w:val="clear" w:pos="709"/>
           <w:tab w:val="left" w:pos="709" w:leader="none"/>
         </w:tabs>
-        <w:bidi w:val="0"/>
         <w:ind w:hanging="283" w:start="709"/>
-        <w:jc w:val="start"/>
         <w:rPr/>
       </w:pPr>
       <w:r>
@@ -730,8 +699,6 @@
     <w:p>
       <w:pPr>
         <w:pStyle w:val="Normal"/>
-        <w:bidi w:val="0"/>
-        <w:jc w:val="start"/>
         <w:rPr>
           <w:b/>
           <w:bCs/>
@@ -750,8 +717,6 @@
     <w:p>
       <w:pPr>
         <w:pStyle w:val="Normal"/>
-        <w:bidi w:val="0"/>
-        <w:jc w:val="start"/>
         <w:rPr>
           <w:b w:val="false"/>
           <w:bCs w:val="false"/>
@@ -809,10 +774,8 @@
           <w:tab w:val="clear" w:pos="709"/>
           <w:tab w:val="left" w:pos="709" w:leader="none"/>
         </w:tabs>
-        <w:bidi w:val="0"/>
         <w:spacing w:before="0" w:after="0"/>
         <w:ind w:hanging="283" w:start="709"/>
-        <w:jc w:val="start"/>
         <w:rPr/>
       </w:pPr>
       <w:r>
@@ -831,10 +794,8 @@
           <w:tab w:val="clear" w:pos="709"/>
           <w:tab w:val="left" w:pos="709" w:leader="none"/>
         </w:tabs>
-        <w:bidi w:val="0"/>
         <w:spacing w:before="0" w:after="0"/>
         <w:ind w:hanging="283" w:start="709"/>
-        <w:jc w:val="start"/>
         <w:rPr/>
       </w:pPr>
       <w:r>
@@ -853,9 +814,7 @@
           <w:tab w:val="clear" w:pos="709"/>
           <w:tab w:val="left" w:pos="709" w:leader="none"/>
         </w:tabs>
-        <w:bidi w:val="0"/>
         <w:ind w:hanging="283" w:start="709"/>
-        <w:jc w:val="start"/>
         <w:rPr/>
       </w:pPr>
       <w:r>
@@ -866,9 +825,7 @@
     <w:p>
       <w:pPr>
         <w:pStyle w:val="BodyText"/>
-        <w:bidi w:val="0"/>
         <w:spacing w:lineRule="auto" w:line="240" w:before="0" w:after="26"/>
-        <w:jc w:val="start"/>
         <w:rPr/>
       </w:pPr>
       <w:r>
@@ -883,9 +840,7 @@
           <w:ilvl w:val="0"/>
           <w:numId w:val="6"/>
         </w:numPr>
-        <w:bidi w:val="0"/>
         <w:spacing w:lineRule="auto" w:line="240" w:before="0" w:after="26"/>
-        <w:jc w:val="start"/>
         <w:rPr/>
       </w:pPr>
       <w:r>
@@ -910,9 +865,7 @@
           <w:ilvl w:val="0"/>
           <w:numId w:val="6"/>
         </w:numPr>
-        <w:bidi w:val="0"/>
         <w:spacing w:lineRule="auto" w:line="240" w:before="0" w:after="26"/>
-        <w:jc w:val="start"/>
         <w:rPr/>
       </w:pPr>
       <w:r>
@@ -927,9 +880,7 @@
           <w:ilvl w:val="1"/>
           <w:numId w:val="6"/>
         </w:numPr>
-        <w:bidi w:val="0"/>
         <w:spacing w:lineRule="auto" w:line="240" w:before="0" w:after="26"/>
-        <w:jc w:val="start"/>
         <w:rPr/>
       </w:pPr>
       <w:r>
@@ -946,8 +897,6 @@
     <w:p>
       <w:pPr>
         <w:pStyle w:val="Normal"/>
-        <w:bidi w:val="0"/>
-        <w:jc w:val="start"/>
         <w:rPr>
           <w:b w:val="false"/>
           <w:bCs w:val="false"/>
@@ -965,8 +914,41 @@
     <w:p>
       <w:pPr>
         <w:pStyle w:val="Normal"/>
-        <w:bidi w:val="0"/>
-        <w:jc w:val="start"/>
+        <w:rPr>
+          <w:b w:val="false"/>
+          <w:bCs w:val="false"/>
+          <w:u w:val="none"/>
+        </w:rPr>
+      </w:pPr>
+      <w:r>
+        <w:rPr>
+          <w:b w:val="false"/>
+          <w:bCs w:val="false"/>
+          <w:u w:val="none"/>
+        </w:rPr>
+        <w:t>Librespot provides an audio-pipe to the MPV player.</w:t>
+      </w:r>
+    </w:p>
+    <w:p>
+      <w:pPr>
+        <w:pStyle w:val="Normal"/>
+        <w:rPr>
+          <w:b w:val="false"/>
+          <w:bCs w:val="false"/>
+          <w:u w:val="none"/>
+        </w:rPr>
+      </w:pPr>
+      <w:r>
+        <w:rPr>
+          <w:b w:val="false"/>
+          <w:bCs w:val="false"/>
+          <w:u w:val="none"/>
+        </w:rPr>
+      </w:r>
+    </w:p>
+    <w:p>
+      <w:pPr>
+        <w:pStyle w:val="Normal"/>
         <w:rPr>
           <w:b/>
           <w:bCs/>
@@ -985,8 +967,6 @@
     <w:p>
       <w:pPr>
         <w:pStyle w:val="BodyText"/>
-        <w:bidi w:val="0"/>
-        <w:jc w:val="start"/>
         <w:rPr>
           <w:b w:val="false"/>
           <w:bCs w:val="false"/>
@@ -1005,8 +985,6 @@
     <w:p>
       <w:pPr>
         <w:pStyle w:val="BodyText"/>
-        <w:bidi w:val="0"/>
-        <w:jc w:val="start"/>
         <w:rPr>
           <w:b w:val="false"/>
           <w:bCs w:val="false"/>
@@ -1033,10 +1011,8 @@
           <w:tab w:val="clear" w:pos="709"/>
           <w:tab w:val="left" w:pos="709" w:leader="none"/>
         </w:tabs>
-        <w:bidi w:val="0"/>
         <w:spacing w:before="0" w:after="0"/>
         <w:ind w:hanging="283" w:start="709"/>
-        <w:jc w:val="start"/>
         <w:rPr/>
       </w:pPr>
       <w:r>
@@ -1063,10 +1039,8 @@
           <w:tab w:val="clear" w:pos="709"/>
           <w:tab w:val="left" w:pos="709" w:leader="none"/>
         </w:tabs>
-        <w:bidi w:val="0"/>
         <w:spacing w:before="0" w:after="0"/>
         <w:ind w:hanging="283" w:start="709"/>
-        <w:jc w:val="start"/>
         <w:rPr/>
       </w:pPr>
       <w:r>
@@ -1085,9 +1059,7 @@
           <w:tab w:val="clear" w:pos="709"/>
           <w:tab w:val="left" w:pos="709" w:leader="none"/>
         </w:tabs>
-        <w:bidi w:val="0"/>
         <w:ind w:hanging="283" w:start="709"/>
-        <w:jc w:val="start"/>
         <w:rPr/>
       </w:pPr>
       <w:r>
@@ -1098,27 +1070,23 @@
     <w:p>
       <w:pPr>
         <w:pStyle w:val="Normal"/>
-        <w:bidi w:val="0"/>
-        <w:jc w:val="start"/>
-        <w:rPr>
-          <w:b w:val="false"/>
-          <w:bCs w:val="false"/>
-          <w:u w:val="none"/>
-        </w:rPr>
-      </w:pPr>
-      <w:r>
-        <w:rPr>
-          <w:b w:val="false"/>
-          <w:bCs w:val="false"/>
-          <w:u w:val="none"/>
-        </w:rPr>
-      </w:r>
-    </w:p>
-    <w:p>
-      <w:pPr>
-        <w:pStyle w:val="BodyText"/>
-        <w:bidi w:val="0"/>
-        <w:jc w:val="start"/>
+        <w:rPr>
+          <w:b w:val="false"/>
+          <w:bCs w:val="false"/>
+          <w:u w:val="none"/>
+        </w:rPr>
+      </w:pPr>
+      <w:r>
+        <w:rPr>
+          <w:b w:val="false"/>
+          <w:bCs w:val="false"/>
+          <w:u w:val="none"/>
+        </w:rPr>
+      </w:r>
+    </w:p>
+    <w:p>
+      <w:pPr>
+        <w:pStyle w:val="BodyText"/>
         <w:rPr>
           <w:b/>
           <w:bCs/>
@@ -1137,8 +1105,6 @@
     <w:p>
       <w:pPr>
         <w:pStyle w:val="BodyText"/>
-        <w:bidi w:val="0"/>
-        <w:jc w:val="start"/>
         <w:rPr/>
       </w:pPr>
       <w:r>
@@ -1182,22 +1148,20 @@
       </w:r>
       <w:r>
         <w:rPr/>
-        <w:t xml:space="preserve">See for event handling: </w:t>
+        <w:t xml:space="preserve">See for </w:t>
       </w:r>
       <w:hyperlink r:id="rId3">
         <w:r>
           <w:rPr>
             <w:rStyle w:val="Hyperlink"/>
           </w:rPr>
-          <w:t>librespot-events</w:t>
+          <w:t>events</w:t>
         </w:r>
       </w:hyperlink>
     </w:p>
     <w:p>
       <w:pPr>
-        <w:pStyle w:val="BodyText"/>
-        <w:bidi w:val="0"/>
-        <w:jc w:val="start"/>
+        <w:pStyle w:val="Heading3"/>
         <w:rPr>
           <w:b/>
           <w:bCs/>
@@ -1210,174 +1174,2027 @@
           <w:bCs/>
           <w:u w:val="single"/>
         </w:rPr>
-        <w:t>Alsa-sound:</w:t>
-      </w:r>
-    </w:p>
-    <w:p>
-      <w:pPr>
-        <w:pStyle w:val="BodyText"/>
-        <w:bidi w:val="0"/>
-        <w:jc w:val="start"/>
-        <w:rPr>
-          <w:b w:val="false"/>
-          <w:bCs w:val="false"/>
-          <w:u w:val="none"/>
-        </w:rPr>
-      </w:pPr>
-      <w:r>
-        <w:rPr>
-          <w:b w:val="false"/>
-          <w:bCs w:val="false"/>
-          <w:u w:val="none"/>
-        </w:rPr>
-        <w:t>Alsa-sound offers a sound device to be assigined to Librespot.</w:t>
-      </w:r>
-    </w:p>
-    <w:p>
-      <w:pPr>
-        <w:pStyle w:val="Normal"/>
-        <w:bidi w:val="0"/>
-        <w:ind w:hanging="0"/>
-        <w:jc w:val="start"/>
-        <w:rPr>
-          <w:rFonts w:ascii="Monospace" w:hAnsi="Monospace"/>
-          <w:sz w:val="20"/>
-        </w:rPr>
-      </w:pPr>
-      <w:r>
-        <w:rPr>
-          <w:rFonts w:ascii="Monospace" w:hAnsi="Monospace"/>
-          <w:sz w:val="20"/>
-        </w:rPr>
-        <w:t>pcm.SpotCon_in {</w:t>
-      </w:r>
-    </w:p>
-    <w:p>
-      <w:pPr>
-        <w:pStyle w:val="Normal"/>
-        <w:bidi w:val="0"/>
-        <w:ind w:hanging="0"/>
-        <w:jc w:val="start"/>
-        <w:rPr>
-          <w:rFonts w:ascii="Monospace" w:hAnsi="Monospace"/>
-          <w:sz w:val="20"/>
-        </w:rPr>
-      </w:pPr>
-      <w:r>
-        <w:rPr>
-          <w:rFonts w:ascii="Monospace" w:hAnsi="Monospace"/>
-          <w:sz w:val="20"/>
-        </w:rPr>
-        <w:t xml:space="preserve">    </w:t>
-      </w:r>
-      <w:r>
-        <w:rPr>
-          <w:rFonts w:ascii="Monospace" w:hAnsi="Monospace"/>
-          <w:sz w:val="20"/>
-        </w:rPr>
-        <w:t>type plug</w:t>
-      </w:r>
-    </w:p>
-    <w:p>
-      <w:pPr>
-        <w:pStyle w:val="Normal"/>
-        <w:bidi w:val="0"/>
-        <w:ind w:hanging="0"/>
-        <w:jc w:val="start"/>
-        <w:rPr>
-          <w:rFonts w:ascii="Monospace" w:hAnsi="Monospace"/>
-          <w:sz w:val="20"/>
-        </w:rPr>
-      </w:pPr>
-      <w:r>
-        <w:rPr>
-          <w:rFonts w:ascii="Monospace" w:hAnsi="Monospace"/>
-          <w:sz w:val="20"/>
-        </w:rPr>
-        <w:t xml:space="preserve">    </w:t>
-      </w:r>
-      <w:r>
-        <w:rPr>
-          <w:rFonts w:ascii="Monospace" w:hAnsi="Monospace"/>
-          <w:sz w:val="20"/>
-        </w:rPr>
-        <w:t>slave.pcm "SpotCon_VolControl"</w:t>
-      </w:r>
-    </w:p>
-    <w:p>
-      <w:pPr>
-        <w:pStyle w:val="Normal"/>
-        <w:bidi w:val="0"/>
-        <w:jc w:val="start"/>
-        <w:rPr>
-          <w:rFonts w:ascii="Monospace" w:hAnsi="Monospace"/>
-          <w:b w:val="false"/>
-          <w:bCs w:val="false"/>
-          <w:sz w:val="20"/>
-          <w:u w:val="none"/>
-        </w:rPr>
-      </w:pPr>
-      <w:r>
-        <w:rPr>
-          <w:rFonts w:ascii="Monospace" w:hAnsi="Monospace"/>
-          <w:b w:val="false"/>
-          <w:bCs w:val="false"/>
-          <w:sz w:val="20"/>
-          <w:u w:val="none"/>
-        </w:rPr>
-        <w:t>}</w:t>
-      </w:r>
-    </w:p>
-    <w:p>
-      <w:pPr>
-        <w:pStyle w:val="Normal"/>
-        <w:bidi w:val="0"/>
-        <w:jc w:val="start"/>
-        <w:rPr>
-          <w:b w:val="false"/>
-          <w:bCs w:val="false"/>
-          <w:u w:val="none"/>
-        </w:rPr>
-      </w:pPr>
-      <w:r>
-        <w:rPr>
-          <w:b w:val="false"/>
-          <w:bCs w:val="false"/>
-          <w:u w:val="none"/>
-        </w:rPr>
-      </w:r>
-    </w:p>
-    <w:p>
-      <w:pPr>
-        <w:pStyle w:val="Normal"/>
-        <w:bidi w:val="0"/>
-        <w:jc w:val="start"/>
+        <w:t>librespot n</w:t>
+      </w:r>
+      <w:r>
         <w:rPr>
           <w:b/>
           <w:bCs/>
           <w:u w:val="single"/>
         </w:rPr>
-      </w:pPr>
+        <w:t xml:space="preserve">on-blocking </w:t>
+      </w:r>
       <w:r>
         <w:rPr>
           <w:b/>
           <w:bCs/>
           <w:u w:val="single"/>
         </w:rPr>
+        <w:t>e</w:t>
+      </w:r>
+      <w:r>
+        <w:rPr>
+          <w:b/>
+          <w:bCs/>
+          <w:u w:val="single"/>
+        </w:rPr>
+        <w:t>vents</w:t>
+      </w:r>
+    </w:p>
+    <w:p>
+      <w:pPr>
+        <w:pStyle w:val="BodyText"/>
+        <w:ind w:hanging="0" w:start="0" w:end="0"/>
+        <w:rPr/>
+      </w:pPr>
+      <w:bookmarkStart w:id="0" w:name="user-content-non-blocking-events-1"/>
+      <w:bookmarkEnd w:id="0"/>
+      <w:r>
+        <w:rPr/>
+        <w:t xml:space="preserve">Non-blocking events are non-blocking in every sense. They do not block </w:t>
+      </w:r>
+      <w:r>
+        <w:rPr>
+          <w:rStyle w:val="SourceText"/>
+        </w:rPr>
+        <w:t>librespot</w:t>
+      </w:r>
+      <w:r>
+        <w:rPr/>
+        <w:t xml:space="preserve"> threads in any way and the event script/program is run in it's own separate thread for each and every event. </w:t>
+      </w:r>
+      <w:r>
+        <w:rPr>
+          <w:rStyle w:val="SourceText"/>
+        </w:rPr>
+        <w:t>librespot</w:t>
+      </w:r>
+      <w:r>
+        <w:rPr/>
+        <w:t>'s event handler does not wait for event scripts/programs to exit before it fires the next event.</w:t>
+      </w:r>
+    </w:p>
+    <w:p>
+      <w:pPr>
+        <w:pStyle w:val="Heading4"/>
+        <w:rPr/>
+      </w:pPr>
+      <w:r>
+        <w:rPr/>
+        <w:t>Changed</w:t>
+      </w:r>
+    </w:p>
+    <w:p>
+      <w:pPr>
+        <w:pStyle w:val="Normal"/>
+        <w:spacing w:before="0" w:after="0"/>
+        <w:ind w:hanging="0" w:start="0" w:end="0"/>
+        <w:rPr>
+          <w:sz w:val="4"/>
+          <w:szCs w:val="4"/>
+        </w:rPr>
+      </w:pPr>
+      <w:r>
+        <w:rPr>
+          <w:sz w:val="4"/>
+          <w:szCs w:val="4"/>
+        </w:rPr>
+      </w:r>
+      <w:bookmarkStart w:id="1" w:name="user-content-changed"/>
+      <w:bookmarkStart w:id="2" w:name="user-content-changed"/>
+      <w:bookmarkEnd w:id="2"/>
+    </w:p>
+    <w:tbl>
+      <w:tblPr>
+        <w:tblW w:w="6190" w:type="dxa"/>
+        <w:jc w:val="start"/>
+        <w:tblInd w:w="0" w:type="dxa"/>
+        <w:tblLayout w:type="fixed"/>
+        <w:tblCellMar>
+          <w:top w:w="28" w:type="dxa"/>
+          <w:start w:w="28" w:type="dxa"/>
+          <w:bottom w:w="28" w:type="dxa"/>
+          <w:end w:w="28" w:type="dxa"/>
+        </w:tblCellMar>
+      </w:tblPr>
+      <w:tblGrid>
+        <w:gridCol w:w="1938"/>
+        <w:gridCol w:w="1737"/>
+        <w:gridCol w:w="2515"/>
+      </w:tblGrid>
+      <w:tr>
+        <w:trPr>
+          <w:tblHeader w:val="true"/>
+        </w:trPr>
+        <w:tc>
+          <w:tcPr>
+            <w:tcW w:w="1938" w:type="dxa"/>
+            <w:tcBorders/>
+            <w:vAlign w:val="center"/>
+          </w:tcPr>
+          <w:p>
+            <w:pPr>
+              <w:pStyle w:val="TableHeading"/>
+              <w:rPr/>
+            </w:pPr>
+            <w:r>
+              <w:rPr/>
+              <w:t>Key</w:t>
+            </w:r>
+          </w:p>
+        </w:tc>
+        <w:tc>
+          <w:tcPr>
+            <w:tcW w:w="1737" w:type="dxa"/>
+            <w:tcBorders/>
+            <w:vAlign w:val="center"/>
+          </w:tcPr>
+          <w:p>
+            <w:pPr>
+              <w:pStyle w:val="TableHeading"/>
+              <w:rPr/>
+            </w:pPr>
+            <w:r>
+              <w:rPr/>
+              <w:t>Value</w:t>
+            </w:r>
+          </w:p>
+        </w:tc>
+        <w:tc>
+          <w:tcPr>
+            <w:tcW w:w="2515" w:type="dxa"/>
+            <w:tcBorders/>
+            <w:vAlign w:val="center"/>
+          </w:tcPr>
+          <w:p>
+            <w:pPr>
+              <w:pStyle w:val="TableHeading"/>
+              <w:rPr/>
+            </w:pPr>
+            <w:r>
+              <w:rPr/>
+              <w:t>Description</w:t>
+            </w:r>
+          </w:p>
+        </w:tc>
+      </w:tr>
+      <w:tr>
+        <w:trPr/>
+        <w:tc>
+          <w:tcPr>
+            <w:tcW w:w="1938" w:type="dxa"/>
+            <w:tcBorders/>
+            <w:vAlign w:val="center"/>
+          </w:tcPr>
+          <w:p>
+            <w:pPr>
+              <w:pStyle w:val="TableContents"/>
+              <w:rPr/>
+            </w:pPr>
+            <w:r>
+              <w:rPr/>
+              <w:t>PLAYER_EVENT</w:t>
+            </w:r>
+          </w:p>
+        </w:tc>
+        <w:tc>
+          <w:tcPr>
+            <w:tcW w:w="1737" w:type="dxa"/>
+            <w:tcBorders/>
+            <w:vAlign w:val="center"/>
+          </w:tcPr>
+          <w:p>
+            <w:pPr>
+              <w:pStyle w:val="TableContents"/>
+              <w:rPr/>
+            </w:pPr>
+            <w:r>
+              <w:rPr>
+                <w:rStyle w:val="SourceText"/>
+              </w:rPr>
+              <w:t>changed</w:t>
+            </w:r>
+          </w:p>
+        </w:tc>
+        <w:tc>
+          <w:tcPr>
+            <w:tcW w:w="2515" w:type="dxa"/>
+            <w:tcBorders/>
+            <w:vAlign w:val="center"/>
+          </w:tcPr>
+          <w:p>
+            <w:pPr>
+              <w:pStyle w:val="TableContents"/>
+              <w:rPr/>
+            </w:pPr>
+            <w:r>
+              <w:rPr/>
+              <w:t>Name of the Event</w:t>
+            </w:r>
+          </w:p>
+        </w:tc>
+      </w:tr>
+      <w:tr>
+        <w:trPr/>
+        <w:tc>
+          <w:tcPr>
+            <w:tcW w:w="1938" w:type="dxa"/>
+            <w:tcBorders/>
+            <w:vAlign w:val="center"/>
+          </w:tcPr>
+          <w:p>
+            <w:pPr>
+              <w:pStyle w:val="TableContents"/>
+              <w:rPr/>
+            </w:pPr>
+            <w:r>
+              <w:rPr/>
+              <w:t>OLD_TRACK_ID</w:t>
+            </w:r>
+          </w:p>
+        </w:tc>
+        <w:tc>
+          <w:tcPr>
+            <w:tcW w:w="1737" w:type="dxa"/>
+            <w:tcBorders/>
+            <w:vAlign w:val="center"/>
+          </w:tcPr>
+          <w:p>
+            <w:pPr>
+              <w:pStyle w:val="TableContents"/>
+              <w:rPr/>
+            </w:pPr>
+            <w:r>
+              <w:rPr/>
+              <w:t>Spotify Track ID</w:t>
+            </w:r>
+          </w:p>
+        </w:tc>
+        <w:tc>
+          <w:tcPr>
+            <w:tcW w:w="2515" w:type="dxa"/>
+            <w:tcBorders/>
+            <w:vAlign w:val="center"/>
+          </w:tcPr>
+          <w:p>
+            <w:pPr>
+              <w:pStyle w:val="TableContents"/>
+              <w:rPr/>
+            </w:pPr>
+            <w:r>
+              <w:rPr/>
+              <w:t>ID of the previous Track</w:t>
+            </w:r>
+          </w:p>
+        </w:tc>
+      </w:tr>
+      <w:tr>
+        <w:trPr/>
+        <w:tc>
+          <w:tcPr>
+            <w:tcW w:w="1938" w:type="dxa"/>
+            <w:tcBorders/>
+            <w:vAlign w:val="center"/>
+          </w:tcPr>
+          <w:p>
+            <w:pPr>
+              <w:pStyle w:val="TableContents"/>
+              <w:rPr/>
+            </w:pPr>
+            <w:r>
+              <w:rPr/>
+              <w:t>TRACK_ID</w:t>
+            </w:r>
+          </w:p>
+        </w:tc>
+        <w:tc>
+          <w:tcPr>
+            <w:tcW w:w="1737" w:type="dxa"/>
+            <w:tcBorders/>
+            <w:vAlign w:val="center"/>
+          </w:tcPr>
+          <w:p>
+            <w:pPr>
+              <w:pStyle w:val="TableContents"/>
+              <w:rPr/>
+            </w:pPr>
+            <w:r>
+              <w:rPr/>
+              <w:t>Spotify Track ID</w:t>
+            </w:r>
+          </w:p>
+        </w:tc>
+        <w:tc>
+          <w:tcPr>
+            <w:tcW w:w="2515" w:type="dxa"/>
+            <w:tcBorders/>
+            <w:vAlign w:val="center"/>
+          </w:tcPr>
+          <w:p>
+            <w:pPr>
+              <w:pStyle w:val="TableContents"/>
+              <w:rPr/>
+            </w:pPr>
+            <w:r>
+              <w:rPr/>
+              <w:t>ID of the new Track</w:t>
+            </w:r>
+          </w:p>
+        </w:tc>
+      </w:tr>
+    </w:tbl>
+    <w:p>
+      <w:pPr>
+        <w:pStyle w:val="Heading4"/>
+        <w:rPr/>
+      </w:pPr>
+      <w:r>
+        <w:rPr/>
+        <w:t>Started</w:t>
+      </w:r>
+    </w:p>
+    <w:p>
+      <w:pPr>
+        <w:pStyle w:val="Normal"/>
+        <w:spacing w:before="0" w:after="0"/>
+        <w:ind w:hanging="0" w:start="0" w:end="0"/>
+        <w:rPr>
+          <w:sz w:val="4"/>
+          <w:szCs w:val="4"/>
+        </w:rPr>
+      </w:pPr>
+      <w:r>
+        <w:rPr>
+          <w:sz w:val="4"/>
+          <w:szCs w:val="4"/>
+        </w:rPr>
+      </w:r>
+      <w:bookmarkStart w:id="3" w:name="user-content-started"/>
+      <w:bookmarkStart w:id="4" w:name="user-content-started"/>
+      <w:bookmarkEnd w:id="4"/>
+    </w:p>
+    <w:tbl>
+      <w:tblPr>
+        <w:tblW w:w="5632" w:type="dxa"/>
+        <w:jc w:val="start"/>
+        <w:tblInd w:w="0" w:type="dxa"/>
+        <w:tblLayout w:type="fixed"/>
+        <w:tblCellMar>
+          <w:top w:w="28" w:type="dxa"/>
+          <w:start w:w="28" w:type="dxa"/>
+          <w:bottom w:w="28" w:type="dxa"/>
+          <w:end w:w="28" w:type="dxa"/>
+        </w:tblCellMar>
+      </w:tblPr>
+      <w:tblGrid>
+        <w:gridCol w:w="1938"/>
+        <w:gridCol w:w="1737"/>
+        <w:gridCol w:w="1957"/>
+      </w:tblGrid>
+      <w:tr>
+        <w:trPr>
+          <w:tblHeader w:val="true"/>
+        </w:trPr>
+        <w:tc>
+          <w:tcPr>
+            <w:tcW w:w="1938" w:type="dxa"/>
+            <w:tcBorders/>
+            <w:vAlign w:val="center"/>
+          </w:tcPr>
+          <w:p>
+            <w:pPr>
+              <w:pStyle w:val="TableHeading"/>
+              <w:rPr/>
+            </w:pPr>
+            <w:r>
+              <w:rPr/>
+              <w:t>Key</w:t>
+            </w:r>
+          </w:p>
+        </w:tc>
+        <w:tc>
+          <w:tcPr>
+            <w:tcW w:w="1737" w:type="dxa"/>
+            <w:tcBorders/>
+            <w:vAlign w:val="center"/>
+          </w:tcPr>
+          <w:p>
+            <w:pPr>
+              <w:pStyle w:val="TableHeading"/>
+              <w:rPr/>
+            </w:pPr>
+            <w:r>
+              <w:rPr/>
+              <w:t>Value</w:t>
+            </w:r>
+          </w:p>
+        </w:tc>
+        <w:tc>
+          <w:tcPr>
+            <w:tcW w:w="1957" w:type="dxa"/>
+            <w:tcBorders/>
+            <w:vAlign w:val="center"/>
+          </w:tcPr>
+          <w:p>
+            <w:pPr>
+              <w:pStyle w:val="TableHeading"/>
+              <w:rPr/>
+            </w:pPr>
+            <w:r>
+              <w:rPr/>
+              <w:t>Description</w:t>
+            </w:r>
+          </w:p>
+        </w:tc>
+      </w:tr>
+      <w:tr>
+        <w:trPr/>
+        <w:tc>
+          <w:tcPr>
+            <w:tcW w:w="1938" w:type="dxa"/>
+            <w:tcBorders/>
+            <w:vAlign w:val="center"/>
+          </w:tcPr>
+          <w:p>
+            <w:pPr>
+              <w:pStyle w:val="TableContents"/>
+              <w:rPr/>
+            </w:pPr>
+            <w:r>
+              <w:rPr/>
+              <w:t>PLAYER_EVENT</w:t>
+            </w:r>
+          </w:p>
+        </w:tc>
+        <w:tc>
+          <w:tcPr>
+            <w:tcW w:w="1737" w:type="dxa"/>
+            <w:tcBorders/>
+            <w:vAlign w:val="center"/>
+          </w:tcPr>
+          <w:p>
+            <w:pPr>
+              <w:pStyle w:val="TableContents"/>
+              <w:rPr/>
+            </w:pPr>
+            <w:r>
+              <w:rPr>
+                <w:rStyle w:val="SourceText"/>
+              </w:rPr>
+              <w:t>started</w:t>
+            </w:r>
+          </w:p>
+        </w:tc>
+        <w:tc>
+          <w:tcPr>
+            <w:tcW w:w="1957" w:type="dxa"/>
+            <w:tcBorders/>
+            <w:vAlign w:val="center"/>
+          </w:tcPr>
+          <w:p>
+            <w:pPr>
+              <w:pStyle w:val="TableContents"/>
+              <w:rPr/>
+            </w:pPr>
+            <w:r>
+              <w:rPr/>
+              <w:t>Name of the Event</w:t>
+            </w:r>
+          </w:p>
+        </w:tc>
+      </w:tr>
+      <w:tr>
+        <w:trPr/>
+        <w:tc>
+          <w:tcPr>
+            <w:tcW w:w="1938" w:type="dxa"/>
+            <w:tcBorders/>
+            <w:vAlign w:val="center"/>
+          </w:tcPr>
+          <w:p>
+            <w:pPr>
+              <w:pStyle w:val="TableContents"/>
+              <w:rPr/>
+            </w:pPr>
+            <w:r>
+              <w:rPr/>
+              <w:t>TRACK_ID</w:t>
+            </w:r>
+          </w:p>
+        </w:tc>
+        <w:tc>
+          <w:tcPr>
+            <w:tcW w:w="1737" w:type="dxa"/>
+            <w:tcBorders/>
+            <w:vAlign w:val="center"/>
+          </w:tcPr>
+          <w:p>
+            <w:pPr>
+              <w:pStyle w:val="TableContents"/>
+              <w:rPr/>
+            </w:pPr>
+            <w:r>
+              <w:rPr/>
+              <w:t>Spotify Track ID</w:t>
+            </w:r>
+          </w:p>
+        </w:tc>
+        <w:tc>
+          <w:tcPr>
+            <w:tcW w:w="1957" w:type="dxa"/>
+            <w:tcBorders/>
+            <w:vAlign w:val="center"/>
+          </w:tcPr>
+          <w:p>
+            <w:pPr>
+              <w:pStyle w:val="TableContents"/>
+              <w:rPr/>
+            </w:pPr>
+            <w:r>
+              <w:rPr/>
+              <w:t>ID of the Track</w:t>
+            </w:r>
+          </w:p>
+        </w:tc>
+      </w:tr>
+    </w:tbl>
+    <w:p>
+      <w:pPr>
+        <w:pStyle w:val="Heading4"/>
+        <w:rPr/>
+      </w:pPr>
+      <w:r>
+        <w:rPr/>
+        <w:t>Stopped</w:t>
+      </w:r>
+    </w:p>
+    <w:p>
+      <w:pPr>
+        <w:pStyle w:val="Normal"/>
+        <w:spacing w:before="0" w:after="0"/>
+        <w:ind w:hanging="0" w:start="0" w:end="0"/>
+        <w:rPr>
+          <w:sz w:val="4"/>
+          <w:szCs w:val="4"/>
+        </w:rPr>
+      </w:pPr>
+      <w:r>
+        <w:rPr>
+          <w:sz w:val="4"/>
+          <w:szCs w:val="4"/>
+        </w:rPr>
+      </w:r>
+      <w:bookmarkStart w:id="5" w:name="user-content-stopped"/>
+      <w:bookmarkStart w:id="6" w:name="user-content-stopped"/>
+      <w:bookmarkEnd w:id="6"/>
+    </w:p>
+    <w:tbl>
+      <w:tblPr>
+        <w:tblW w:w="5632" w:type="dxa"/>
+        <w:jc w:val="start"/>
+        <w:tblInd w:w="0" w:type="dxa"/>
+        <w:tblLayout w:type="fixed"/>
+        <w:tblCellMar>
+          <w:top w:w="28" w:type="dxa"/>
+          <w:start w:w="28" w:type="dxa"/>
+          <w:bottom w:w="28" w:type="dxa"/>
+          <w:end w:w="28" w:type="dxa"/>
+        </w:tblCellMar>
+      </w:tblPr>
+      <w:tblGrid>
+        <w:gridCol w:w="1938"/>
+        <w:gridCol w:w="1737"/>
+        <w:gridCol w:w="1957"/>
+      </w:tblGrid>
+      <w:tr>
+        <w:trPr>
+          <w:tblHeader w:val="true"/>
+        </w:trPr>
+        <w:tc>
+          <w:tcPr>
+            <w:tcW w:w="1938" w:type="dxa"/>
+            <w:tcBorders/>
+            <w:vAlign w:val="center"/>
+          </w:tcPr>
+          <w:p>
+            <w:pPr>
+              <w:pStyle w:val="TableHeading"/>
+              <w:rPr/>
+            </w:pPr>
+            <w:r>
+              <w:rPr/>
+              <w:t>Key</w:t>
+            </w:r>
+          </w:p>
+        </w:tc>
+        <w:tc>
+          <w:tcPr>
+            <w:tcW w:w="1737" w:type="dxa"/>
+            <w:tcBorders/>
+            <w:vAlign w:val="center"/>
+          </w:tcPr>
+          <w:p>
+            <w:pPr>
+              <w:pStyle w:val="TableHeading"/>
+              <w:rPr/>
+            </w:pPr>
+            <w:r>
+              <w:rPr/>
+              <w:t>Value</w:t>
+            </w:r>
+          </w:p>
+        </w:tc>
+        <w:tc>
+          <w:tcPr>
+            <w:tcW w:w="1957" w:type="dxa"/>
+            <w:tcBorders/>
+            <w:vAlign w:val="center"/>
+          </w:tcPr>
+          <w:p>
+            <w:pPr>
+              <w:pStyle w:val="TableHeading"/>
+              <w:rPr/>
+            </w:pPr>
+            <w:r>
+              <w:rPr/>
+              <w:t>Description</w:t>
+            </w:r>
+          </w:p>
+        </w:tc>
+      </w:tr>
+      <w:tr>
+        <w:trPr/>
+        <w:tc>
+          <w:tcPr>
+            <w:tcW w:w="1938" w:type="dxa"/>
+            <w:tcBorders/>
+            <w:vAlign w:val="center"/>
+          </w:tcPr>
+          <w:p>
+            <w:pPr>
+              <w:pStyle w:val="TableContents"/>
+              <w:rPr/>
+            </w:pPr>
+            <w:r>
+              <w:rPr/>
+              <w:t>PLAYER_EVENT</w:t>
+            </w:r>
+          </w:p>
+        </w:tc>
+        <w:tc>
+          <w:tcPr>
+            <w:tcW w:w="1737" w:type="dxa"/>
+            <w:tcBorders/>
+            <w:vAlign w:val="center"/>
+          </w:tcPr>
+          <w:p>
+            <w:pPr>
+              <w:pStyle w:val="TableContents"/>
+              <w:rPr/>
+            </w:pPr>
+            <w:r>
+              <w:rPr>
+                <w:rStyle w:val="SourceText"/>
+              </w:rPr>
+              <w:t>stopped</w:t>
+            </w:r>
+          </w:p>
+        </w:tc>
+        <w:tc>
+          <w:tcPr>
+            <w:tcW w:w="1957" w:type="dxa"/>
+            <w:tcBorders/>
+            <w:vAlign w:val="center"/>
+          </w:tcPr>
+          <w:p>
+            <w:pPr>
+              <w:pStyle w:val="TableContents"/>
+              <w:rPr/>
+            </w:pPr>
+            <w:r>
+              <w:rPr/>
+              <w:t>Name of the Event</w:t>
+            </w:r>
+          </w:p>
+        </w:tc>
+      </w:tr>
+      <w:tr>
+        <w:trPr/>
+        <w:tc>
+          <w:tcPr>
+            <w:tcW w:w="1938" w:type="dxa"/>
+            <w:tcBorders/>
+            <w:vAlign w:val="center"/>
+          </w:tcPr>
+          <w:p>
+            <w:pPr>
+              <w:pStyle w:val="TableContents"/>
+              <w:rPr/>
+            </w:pPr>
+            <w:r>
+              <w:rPr/>
+              <w:t>TRACK_ID</w:t>
+            </w:r>
+          </w:p>
+        </w:tc>
+        <w:tc>
+          <w:tcPr>
+            <w:tcW w:w="1737" w:type="dxa"/>
+            <w:tcBorders/>
+            <w:vAlign w:val="center"/>
+          </w:tcPr>
+          <w:p>
+            <w:pPr>
+              <w:pStyle w:val="TableContents"/>
+              <w:rPr/>
+            </w:pPr>
+            <w:r>
+              <w:rPr/>
+              <w:t>Spotify Track ID</w:t>
+            </w:r>
+          </w:p>
+        </w:tc>
+        <w:tc>
+          <w:tcPr>
+            <w:tcW w:w="1957" w:type="dxa"/>
+            <w:tcBorders/>
+            <w:vAlign w:val="center"/>
+          </w:tcPr>
+          <w:p>
+            <w:pPr>
+              <w:pStyle w:val="TableContents"/>
+              <w:rPr/>
+            </w:pPr>
+            <w:r>
+              <w:rPr/>
+              <w:t>ID of the Track</w:t>
+            </w:r>
+          </w:p>
+        </w:tc>
+      </w:tr>
+    </w:tbl>
+    <w:p>
+      <w:pPr>
+        <w:pStyle w:val="Heading4"/>
+        <w:rPr/>
+      </w:pPr>
+      <w:r>
+        <w:rPr/>
+        <w:t>Playing</w:t>
+      </w:r>
+    </w:p>
+    <w:p>
+      <w:pPr>
+        <w:pStyle w:val="Normal"/>
+        <w:spacing w:before="0" w:after="0"/>
+        <w:ind w:hanging="0" w:start="0" w:end="0"/>
+        <w:rPr>
+          <w:sz w:val="4"/>
+          <w:szCs w:val="4"/>
+        </w:rPr>
+      </w:pPr>
+      <w:r>
+        <w:rPr>
+          <w:sz w:val="4"/>
+          <w:szCs w:val="4"/>
+        </w:rPr>
+      </w:r>
+      <w:bookmarkStart w:id="7" w:name="user-content-playing"/>
+      <w:bookmarkStart w:id="8" w:name="user-content-playing"/>
+      <w:bookmarkEnd w:id="8"/>
+    </w:p>
+    <w:tbl>
+      <w:tblPr>
+        <w:tblW w:w="5632" w:type="dxa"/>
+        <w:jc w:val="start"/>
+        <w:tblInd w:w="0" w:type="dxa"/>
+        <w:tblLayout w:type="fixed"/>
+        <w:tblCellMar>
+          <w:top w:w="28" w:type="dxa"/>
+          <w:start w:w="28" w:type="dxa"/>
+          <w:bottom w:w="28" w:type="dxa"/>
+          <w:end w:w="28" w:type="dxa"/>
+        </w:tblCellMar>
+      </w:tblPr>
+      <w:tblGrid>
+        <w:gridCol w:w="1938"/>
+        <w:gridCol w:w="1737"/>
+        <w:gridCol w:w="1957"/>
+      </w:tblGrid>
+      <w:tr>
+        <w:trPr>
+          <w:tblHeader w:val="true"/>
+        </w:trPr>
+        <w:tc>
+          <w:tcPr>
+            <w:tcW w:w="1938" w:type="dxa"/>
+            <w:tcBorders/>
+            <w:vAlign w:val="center"/>
+          </w:tcPr>
+          <w:p>
+            <w:pPr>
+              <w:pStyle w:val="TableHeading"/>
+              <w:rPr/>
+            </w:pPr>
+            <w:r>
+              <w:rPr/>
+              <w:t>Key</w:t>
+            </w:r>
+          </w:p>
+        </w:tc>
+        <w:tc>
+          <w:tcPr>
+            <w:tcW w:w="1737" w:type="dxa"/>
+            <w:tcBorders/>
+            <w:vAlign w:val="center"/>
+          </w:tcPr>
+          <w:p>
+            <w:pPr>
+              <w:pStyle w:val="TableHeading"/>
+              <w:rPr/>
+            </w:pPr>
+            <w:r>
+              <w:rPr/>
+              <w:t>Value</w:t>
+            </w:r>
+          </w:p>
+        </w:tc>
+        <w:tc>
+          <w:tcPr>
+            <w:tcW w:w="1957" w:type="dxa"/>
+            <w:tcBorders/>
+            <w:vAlign w:val="center"/>
+          </w:tcPr>
+          <w:p>
+            <w:pPr>
+              <w:pStyle w:val="TableHeading"/>
+              <w:rPr/>
+            </w:pPr>
+            <w:r>
+              <w:rPr/>
+              <w:t>Description</w:t>
+            </w:r>
+          </w:p>
+        </w:tc>
+      </w:tr>
+      <w:tr>
+        <w:trPr/>
+        <w:tc>
+          <w:tcPr>
+            <w:tcW w:w="1938" w:type="dxa"/>
+            <w:tcBorders/>
+            <w:vAlign w:val="center"/>
+          </w:tcPr>
+          <w:p>
+            <w:pPr>
+              <w:pStyle w:val="TableContents"/>
+              <w:rPr/>
+            </w:pPr>
+            <w:r>
+              <w:rPr/>
+              <w:t>PLAYER_EVENT</w:t>
+            </w:r>
+          </w:p>
+        </w:tc>
+        <w:tc>
+          <w:tcPr>
+            <w:tcW w:w="1737" w:type="dxa"/>
+            <w:tcBorders/>
+            <w:vAlign w:val="center"/>
+          </w:tcPr>
+          <w:p>
+            <w:pPr>
+              <w:pStyle w:val="TableContents"/>
+              <w:rPr/>
+            </w:pPr>
+            <w:r>
+              <w:rPr>
+                <w:rStyle w:val="SourceText"/>
+              </w:rPr>
+              <w:t>playing</w:t>
+            </w:r>
+          </w:p>
+        </w:tc>
+        <w:tc>
+          <w:tcPr>
+            <w:tcW w:w="1957" w:type="dxa"/>
+            <w:tcBorders/>
+            <w:vAlign w:val="center"/>
+          </w:tcPr>
+          <w:p>
+            <w:pPr>
+              <w:pStyle w:val="TableContents"/>
+              <w:rPr/>
+            </w:pPr>
+            <w:r>
+              <w:rPr/>
+              <w:t>Name of the Event</w:t>
+            </w:r>
+          </w:p>
+        </w:tc>
+      </w:tr>
+      <w:tr>
+        <w:trPr/>
+        <w:tc>
+          <w:tcPr>
+            <w:tcW w:w="1938" w:type="dxa"/>
+            <w:tcBorders/>
+            <w:vAlign w:val="center"/>
+          </w:tcPr>
+          <w:p>
+            <w:pPr>
+              <w:pStyle w:val="TableContents"/>
+              <w:rPr/>
+            </w:pPr>
+            <w:r>
+              <w:rPr/>
+              <w:t>TRACK_ID</w:t>
+            </w:r>
+          </w:p>
+        </w:tc>
+        <w:tc>
+          <w:tcPr>
+            <w:tcW w:w="1737" w:type="dxa"/>
+            <w:tcBorders/>
+            <w:vAlign w:val="center"/>
+          </w:tcPr>
+          <w:p>
+            <w:pPr>
+              <w:pStyle w:val="TableContents"/>
+              <w:rPr/>
+            </w:pPr>
+            <w:r>
+              <w:rPr/>
+              <w:t>Spotify Track ID</w:t>
+            </w:r>
+          </w:p>
+        </w:tc>
+        <w:tc>
+          <w:tcPr>
+            <w:tcW w:w="1957" w:type="dxa"/>
+            <w:tcBorders/>
+            <w:vAlign w:val="center"/>
+          </w:tcPr>
+          <w:p>
+            <w:pPr>
+              <w:pStyle w:val="TableContents"/>
+              <w:rPr/>
+            </w:pPr>
+            <w:r>
+              <w:rPr/>
+              <w:t>ID of the Track</w:t>
+            </w:r>
+          </w:p>
+        </w:tc>
+      </w:tr>
+      <w:tr>
+        <w:trPr/>
+        <w:tc>
+          <w:tcPr>
+            <w:tcW w:w="1938" w:type="dxa"/>
+            <w:tcBorders/>
+            <w:vAlign w:val="center"/>
+          </w:tcPr>
+          <w:p>
+            <w:pPr>
+              <w:pStyle w:val="TableContents"/>
+              <w:rPr/>
+            </w:pPr>
+            <w:r>
+              <w:rPr/>
+              <w:t>DURATION_MS</w:t>
+            </w:r>
+          </w:p>
+        </w:tc>
+        <w:tc>
+          <w:tcPr>
+            <w:tcW w:w="1737" w:type="dxa"/>
+            <w:tcBorders/>
+            <w:vAlign w:val="center"/>
+          </w:tcPr>
+          <w:p>
+            <w:pPr>
+              <w:pStyle w:val="TableContents"/>
+              <w:rPr/>
+            </w:pPr>
+            <w:r>
+              <w:rPr/>
+              <w:t>Milliseconds</w:t>
+            </w:r>
+          </w:p>
+        </w:tc>
+        <w:tc>
+          <w:tcPr>
+            <w:tcW w:w="1957" w:type="dxa"/>
+            <w:tcBorders/>
+            <w:vAlign w:val="center"/>
+          </w:tcPr>
+          <w:p>
+            <w:pPr>
+              <w:pStyle w:val="TableContents"/>
+              <w:rPr/>
+            </w:pPr>
+            <w:r>
+              <w:rPr/>
+              <w:t>Duration in ms</w:t>
+            </w:r>
+          </w:p>
+        </w:tc>
+      </w:tr>
+      <w:tr>
+        <w:trPr/>
+        <w:tc>
+          <w:tcPr>
+            <w:tcW w:w="1938" w:type="dxa"/>
+            <w:tcBorders/>
+            <w:vAlign w:val="center"/>
+          </w:tcPr>
+          <w:p>
+            <w:pPr>
+              <w:pStyle w:val="TableContents"/>
+              <w:rPr/>
+            </w:pPr>
+            <w:r>
+              <w:rPr/>
+              <w:t>POSITION_MS</w:t>
+            </w:r>
+          </w:p>
+        </w:tc>
+        <w:tc>
+          <w:tcPr>
+            <w:tcW w:w="1737" w:type="dxa"/>
+            <w:tcBorders/>
+            <w:vAlign w:val="center"/>
+          </w:tcPr>
+          <w:p>
+            <w:pPr>
+              <w:pStyle w:val="TableContents"/>
+              <w:rPr/>
+            </w:pPr>
+            <w:r>
+              <w:rPr/>
+              <w:t>Milliseconds</w:t>
+            </w:r>
+          </w:p>
+        </w:tc>
+        <w:tc>
+          <w:tcPr>
+            <w:tcW w:w="1957" w:type="dxa"/>
+            <w:tcBorders/>
+            <w:vAlign w:val="center"/>
+          </w:tcPr>
+          <w:p>
+            <w:pPr>
+              <w:pStyle w:val="TableContents"/>
+              <w:rPr/>
+            </w:pPr>
+            <w:r>
+              <w:rPr/>
+              <w:t>Position in ms</w:t>
+            </w:r>
+          </w:p>
+        </w:tc>
+      </w:tr>
+    </w:tbl>
+    <w:p>
+      <w:pPr>
+        <w:pStyle w:val="Heading4"/>
+        <w:rPr/>
+      </w:pPr>
+      <w:r>
+        <w:rPr/>
+        <w:t>Paused</w:t>
+      </w:r>
+    </w:p>
+    <w:p>
+      <w:pPr>
+        <w:pStyle w:val="Normal"/>
+        <w:spacing w:before="0" w:after="0"/>
+        <w:ind w:hanging="0" w:start="0" w:end="0"/>
+        <w:rPr>
+          <w:sz w:val="4"/>
+          <w:szCs w:val="4"/>
+        </w:rPr>
+      </w:pPr>
+      <w:r>
+        <w:rPr>
+          <w:sz w:val="4"/>
+          <w:szCs w:val="4"/>
+        </w:rPr>
+      </w:r>
+      <w:bookmarkStart w:id="9" w:name="user-content-paused"/>
+      <w:bookmarkStart w:id="10" w:name="user-content-paused"/>
+      <w:bookmarkEnd w:id="10"/>
+    </w:p>
+    <w:tbl>
+      <w:tblPr>
+        <w:tblW w:w="5632" w:type="dxa"/>
+        <w:jc w:val="start"/>
+        <w:tblInd w:w="0" w:type="dxa"/>
+        <w:tblLayout w:type="fixed"/>
+        <w:tblCellMar>
+          <w:top w:w="28" w:type="dxa"/>
+          <w:start w:w="28" w:type="dxa"/>
+          <w:bottom w:w="28" w:type="dxa"/>
+          <w:end w:w="28" w:type="dxa"/>
+        </w:tblCellMar>
+      </w:tblPr>
+      <w:tblGrid>
+        <w:gridCol w:w="1938"/>
+        <w:gridCol w:w="1737"/>
+        <w:gridCol w:w="1957"/>
+      </w:tblGrid>
+      <w:tr>
+        <w:trPr>
+          <w:tblHeader w:val="true"/>
+        </w:trPr>
+        <w:tc>
+          <w:tcPr>
+            <w:tcW w:w="1938" w:type="dxa"/>
+            <w:tcBorders/>
+            <w:vAlign w:val="center"/>
+          </w:tcPr>
+          <w:p>
+            <w:pPr>
+              <w:pStyle w:val="TableHeading"/>
+              <w:rPr/>
+            </w:pPr>
+            <w:r>
+              <w:rPr/>
+              <w:t>Key</w:t>
+            </w:r>
+          </w:p>
+        </w:tc>
+        <w:tc>
+          <w:tcPr>
+            <w:tcW w:w="1737" w:type="dxa"/>
+            <w:tcBorders/>
+            <w:vAlign w:val="center"/>
+          </w:tcPr>
+          <w:p>
+            <w:pPr>
+              <w:pStyle w:val="TableHeading"/>
+              <w:rPr/>
+            </w:pPr>
+            <w:r>
+              <w:rPr/>
+              <w:t>Value</w:t>
+            </w:r>
+          </w:p>
+        </w:tc>
+        <w:tc>
+          <w:tcPr>
+            <w:tcW w:w="1957" w:type="dxa"/>
+            <w:tcBorders/>
+            <w:vAlign w:val="center"/>
+          </w:tcPr>
+          <w:p>
+            <w:pPr>
+              <w:pStyle w:val="TableHeading"/>
+              <w:rPr/>
+            </w:pPr>
+            <w:r>
+              <w:rPr/>
+              <w:t>Description</w:t>
+            </w:r>
+          </w:p>
+        </w:tc>
+      </w:tr>
+      <w:tr>
+        <w:trPr/>
+        <w:tc>
+          <w:tcPr>
+            <w:tcW w:w="1938" w:type="dxa"/>
+            <w:tcBorders/>
+            <w:vAlign w:val="center"/>
+          </w:tcPr>
+          <w:p>
+            <w:pPr>
+              <w:pStyle w:val="TableContents"/>
+              <w:rPr/>
+            </w:pPr>
+            <w:r>
+              <w:rPr/>
+              <w:t>PLAYER_EVENT</w:t>
+            </w:r>
+          </w:p>
+        </w:tc>
+        <w:tc>
+          <w:tcPr>
+            <w:tcW w:w="1737" w:type="dxa"/>
+            <w:tcBorders/>
+            <w:vAlign w:val="center"/>
+          </w:tcPr>
+          <w:p>
+            <w:pPr>
+              <w:pStyle w:val="TableContents"/>
+              <w:rPr/>
+            </w:pPr>
+            <w:r>
+              <w:rPr>
+                <w:rStyle w:val="SourceText"/>
+              </w:rPr>
+              <w:t>paused</w:t>
+            </w:r>
+          </w:p>
+        </w:tc>
+        <w:tc>
+          <w:tcPr>
+            <w:tcW w:w="1957" w:type="dxa"/>
+            <w:tcBorders/>
+            <w:vAlign w:val="center"/>
+          </w:tcPr>
+          <w:p>
+            <w:pPr>
+              <w:pStyle w:val="TableContents"/>
+              <w:rPr/>
+            </w:pPr>
+            <w:r>
+              <w:rPr/>
+              <w:t>Name of the Event</w:t>
+            </w:r>
+          </w:p>
+        </w:tc>
+      </w:tr>
+      <w:tr>
+        <w:trPr/>
+        <w:tc>
+          <w:tcPr>
+            <w:tcW w:w="1938" w:type="dxa"/>
+            <w:tcBorders/>
+            <w:vAlign w:val="center"/>
+          </w:tcPr>
+          <w:p>
+            <w:pPr>
+              <w:pStyle w:val="TableContents"/>
+              <w:rPr/>
+            </w:pPr>
+            <w:r>
+              <w:rPr/>
+              <w:t>TRACK_ID</w:t>
+            </w:r>
+          </w:p>
+        </w:tc>
+        <w:tc>
+          <w:tcPr>
+            <w:tcW w:w="1737" w:type="dxa"/>
+            <w:tcBorders/>
+            <w:vAlign w:val="center"/>
+          </w:tcPr>
+          <w:p>
+            <w:pPr>
+              <w:pStyle w:val="TableContents"/>
+              <w:rPr/>
+            </w:pPr>
+            <w:r>
+              <w:rPr/>
+              <w:t>Spotify Track ID</w:t>
+            </w:r>
+          </w:p>
+        </w:tc>
+        <w:tc>
+          <w:tcPr>
+            <w:tcW w:w="1957" w:type="dxa"/>
+            <w:tcBorders/>
+            <w:vAlign w:val="center"/>
+          </w:tcPr>
+          <w:p>
+            <w:pPr>
+              <w:pStyle w:val="TableContents"/>
+              <w:rPr/>
+            </w:pPr>
+            <w:r>
+              <w:rPr/>
+              <w:t>ID of the Track</w:t>
+            </w:r>
+          </w:p>
+        </w:tc>
+      </w:tr>
+      <w:tr>
+        <w:trPr/>
+        <w:tc>
+          <w:tcPr>
+            <w:tcW w:w="1938" w:type="dxa"/>
+            <w:tcBorders/>
+            <w:vAlign w:val="center"/>
+          </w:tcPr>
+          <w:p>
+            <w:pPr>
+              <w:pStyle w:val="TableContents"/>
+              <w:rPr/>
+            </w:pPr>
+            <w:r>
+              <w:rPr/>
+              <w:t>DURATION_MS</w:t>
+            </w:r>
+          </w:p>
+        </w:tc>
+        <w:tc>
+          <w:tcPr>
+            <w:tcW w:w="1737" w:type="dxa"/>
+            <w:tcBorders/>
+            <w:vAlign w:val="center"/>
+          </w:tcPr>
+          <w:p>
+            <w:pPr>
+              <w:pStyle w:val="TableContents"/>
+              <w:rPr/>
+            </w:pPr>
+            <w:r>
+              <w:rPr/>
+              <w:t>Milliseconds</w:t>
+            </w:r>
+          </w:p>
+        </w:tc>
+        <w:tc>
+          <w:tcPr>
+            <w:tcW w:w="1957" w:type="dxa"/>
+            <w:tcBorders/>
+            <w:vAlign w:val="center"/>
+          </w:tcPr>
+          <w:p>
+            <w:pPr>
+              <w:pStyle w:val="TableContents"/>
+              <w:rPr/>
+            </w:pPr>
+            <w:r>
+              <w:rPr/>
+              <w:t>Duration in ms</w:t>
+            </w:r>
+          </w:p>
+        </w:tc>
+      </w:tr>
+      <w:tr>
+        <w:trPr/>
+        <w:tc>
+          <w:tcPr>
+            <w:tcW w:w="1938" w:type="dxa"/>
+            <w:tcBorders/>
+            <w:vAlign w:val="center"/>
+          </w:tcPr>
+          <w:p>
+            <w:pPr>
+              <w:pStyle w:val="TableContents"/>
+              <w:rPr/>
+            </w:pPr>
+            <w:r>
+              <w:rPr/>
+              <w:t>POSITION_MS</w:t>
+            </w:r>
+          </w:p>
+        </w:tc>
+        <w:tc>
+          <w:tcPr>
+            <w:tcW w:w="1737" w:type="dxa"/>
+            <w:tcBorders/>
+            <w:vAlign w:val="center"/>
+          </w:tcPr>
+          <w:p>
+            <w:pPr>
+              <w:pStyle w:val="TableContents"/>
+              <w:rPr/>
+            </w:pPr>
+            <w:r>
+              <w:rPr/>
+              <w:t>Milliseconds</w:t>
+            </w:r>
+          </w:p>
+        </w:tc>
+        <w:tc>
+          <w:tcPr>
+            <w:tcW w:w="1957" w:type="dxa"/>
+            <w:tcBorders/>
+            <w:vAlign w:val="center"/>
+          </w:tcPr>
+          <w:p>
+            <w:pPr>
+              <w:pStyle w:val="TableContents"/>
+              <w:rPr/>
+            </w:pPr>
+            <w:r>
+              <w:rPr/>
+              <w:t>Position in ms</w:t>
+            </w:r>
+          </w:p>
+        </w:tc>
+      </w:tr>
+    </w:tbl>
+    <w:p>
+      <w:pPr>
+        <w:pStyle w:val="Heading4"/>
+        <w:rPr/>
+      </w:pPr>
+      <w:r>
+        <w:rPr/>
+        <w:t>Preloading</w:t>
+      </w:r>
+    </w:p>
+    <w:p>
+      <w:pPr>
+        <w:pStyle w:val="Normal"/>
+        <w:spacing w:before="0" w:after="0"/>
+        <w:ind w:hanging="0" w:start="0" w:end="0"/>
+        <w:rPr>
+          <w:sz w:val="4"/>
+          <w:szCs w:val="4"/>
+        </w:rPr>
+      </w:pPr>
+      <w:r>
+        <w:rPr>
+          <w:sz w:val="4"/>
+          <w:szCs w:val="4"/>
+        </w:rPr>
+      </w:r>
+      <w:bookmarkStart w:id="11" w:name="user-content-preloading"/>
+      <w:bookmarkStart w:id="12" w:name="user-content-preloading"/>
+      <w:bookmarkEnd w:id="12"/>
+    </w:p>
+    <w:tbl>
+      <w:tblPr>
+        <w:tblW w:w="5632" w:type="dxa"/>
+        <w:jc w:val="start"/>
+        <w:tblInd w:w="0" w:type="dxa"/>
+        <w:tblLayout w:type="fixed"/>
+        <w:tblCellMar>
+          <w:top w:w="28" w:type="dxa"/>
+          <w:start w:w="28" w:type="dxa"/>
+          <w:bottom w:w="28" w:type="dxa"/>
+          <w:end w:w="28" w:type="dxa"/>
+        </w:tblCellMar>
+      </w:tblPr>
+      <w:tblGrid>
+        <w:gridCol w:w="1938"/>
+        <w:gridCol w:w="1737"/>
+        <w:gridCol w:w="1957"/>
+      </w:tblGrid>
+      <w:tr>
+        <w:trPr>
+          <w:tblHeader w:val="true"/>
+        </w:trPr>
+        <w:tc>
+          <w:tcPr>
+            <w:tcW w:w="1938" w:type="dxa"/>
+            <w:tcBorders/>
+            <w:vAlign w:val="center"/>
+          </w:tcPr>
+          <w:p>
+            <w:pPr>
+              <w:pStyle w:val="TableHeading"/>
+              <w:rPr/>
+            </w:pPr>
+            <w:r>
+              <w:rPr/>
+              <w:t>Key</w:t>
+            </w:r>
+          </w:p>
+        </w:tc>
+        <w:tc>
+          <w:tcPr>
+            <w:tcW w:w="1737" w:type="dxa"/>
+            <w:tcBorders/>
+            <w:vAlign w:val="center"/>
+          </w:tcPr>
+          <w:p>
+            <w:pPr>
+              <w:pStyle w:val="TableHeading"/>
+              <w:rPr/>
+            </w:pPr>
+            <w:r>
+              <w:rPr/>
+              <w:t>Value</w:t>
+            </w:r>
+          </w:p>
+        </w:tc>
+        <w:tc>
+          <w:tcPr>
+            <w:tcW w:w="1957" w:type="dxa"/>
+            <w:tcBorders/>
+            <w:vAlign w:val="center"/>
+          </w:tcPr>
+          <w:p>
+            <w:pPr>
+              <w:pStyle w:val="TableHeading"/>
+              <w:rPr/>
+            </w:pPr>
+            <w:r>
+              <w:rPr/>
+              <w:t>Description</w:t>
+            </w:r>
+          </w:p>
+        </w:tc>
+      </w:tr>
+      <w:tr>
+        <w:trPr/>
+        <w:tc>
+          <w:tcPr>
+            <w:tcW w:w="1938" w:type="dxa"/>
+            <w:tcBorders/>
+            <w:vAlign w:val="center"/>
+          </w:tcPr>
+          <w:p>
+            <w:pPr>
+              <w:pStyle w:val="TableContents"/>
+              <w:rPr/>
+            </w:pPr>
+            <w:r>
+              <w:rPr/>
+              <w:t>PLAYER_EVENT</w:t>
+            </w:r>
+          </w:p>
+        </w:tc>
+        <w:tc>
+          <w:tcPr>
+            <w:tcW w:w="1737" w:type="dxa"/>
+            <w:tcBorders/>
+            <w:vAlign w:val="center"/>
+          </w:tcPr>
+          <w:p>
+            <w:pPr>
+              <w:pStyle w:val="TableContents"/>
+              <w:rPr/>
+            </w:pPr>
+            <w:r>
+              <w:rPr>
+                <w:rStyle w:val="SourceText"/>
+              </w:rPr>
+              <w:t>preloading</w:t>
+            </w:r>
+          </w:p>
+        </w:tc>
+        <w:tc>
+          <w:tcPr>
+            <w:tcW w:w="1957" w:type="dxa"/>
+            <w:tcBorders/>
+            <w:vAlign w:val="center"/>
+          </w:tcPr>
+          <w:p>
+            <w:pPr>
+              <w:pStyle w:val="TableContents"/>
+              <w:rPr/>
+            </w:pPr>
+            <w:r>
+              <w:rPr/>
+              <w:t>Name of the Event</w:t>
+            </w:r>
+          </w:p>
+        </w:tc>
+      </w:tr>
+      <w:tr>
+        <w:trPr/>
+        <w:tc>
+          <w:tcPr>
+            <w:tcW w:w="1938" w:type="dxa"/>
+            <w:tcBorders/>
+            <w:vAlign w:val="center"/>
+          </w:tcPr>
+          <w:p>
+            <w:pPr>
+              <w:pStyle w:val="TableContents"/>
+              <w:rPr/>
+            </w:pPr>
+            <w:r>
+              <w:rPr/>
+              <w:t>TRACK_ID</w:t>
+            </w:r>
+          </w:p>
+        </w:tc>
+        <w:tc>
+          <w:tcPr>
+            <w:tcW w:w="1737" w:type="dxa"/>
+            <w:tcBorders/>
+            <w:vAlign w:val="center"/>
+          </w:tcPr>
+          <w:p>
+            <w:pPr>
+              <w:pStyle w:val="TableContents"/>
+              <w:rPr/>
+            </w:pPr>
+            <w:r>
+              <w:rPr/>
+              <w:t>Spotify Track ID</w:t>
+            </w:r>
+          </w:p>
+        </w:tc>
+        <w:tc>
+          <w:tcPr>
+            <w:tcW w:w="1957" w:type="dxa"/>
+            <w:tcBorders/>
+            <w:vAlign w:val="center"/>
+          </w:tcPr>
+          <w:p>
+            <w:pPr>
+              <w:pStyle w:val="TableContents"/>
+              <w:rPr/>
+            </w:pPr>
+            <w:r>
+              <w:rPr/>
+              <w:t>ID of the Track</w:t>
+            </w:r>
+          </w:p>
+        </w:tc>
+      </w:tr>
+    </w:tbl>
+    <w:p>
+      <w:pPr>
+        <w:pStyle w:val="Heading4"/>
+        <w:rPr/>
+      </w:pPr>
+      <w:r>
+        <w:rPr/>
+        <w:t>Volume Set</w:t>
+      </w:r>
+    </w:p>
+    <w:p>
+      <w:pPr>
+        <w:pStyle w:val="Normal"/>
+        <w:spacing w:before="0" w:after="0"/>
+        <w:ind w:hanging="0" w:start="0" w:end="0"/>
+        <w:rPr>
+          <w:sz w:val="4"/>
+          <w:szCs w:val="4"/>
+        </w:rPr>
+      </w:pPr>
+      <w:r>
+        <w:rPr>
+          <w:sz w:val="4"/>
+          <w:szCs w:val="4"/>
+        </w:rPr>
+      </w:r>
+      <w:bookmarkStart w:id="13" w:name="user-content-volume-set"/>
+      <w:bookmarkStart w:id="14" w:name="user-content-volume-set"/>
+      <w:bookmarkEnd w:id="14"/>
+    </w:p>
+    <w:tbl>
+      <w:tblPr>
+        <w:tblW w:w="5441" w:type="dxa"/>
+        <w:jc w:val="start"/>
+        <w:tblInd w:w="0" w:type="dxa"/>
+        <w:tblLayout w:type="fixed"/>
+        <w:tblCellMar>
+          <w:top w:w="28" w:type="dxa"/>
+          <w:start w:w="28" w:type="dxa"/>
+          <w:bottom w:w="28" w:type="dxa"/>
+          <w:end w:w="28" w:type="dxa"/>
+        </w:tblCellMar>
+      </w:tblPr>
+      <w:tblGrid>
+        <w:gridCol w:w="1938"/>
+        <w:gridCol w:w="1546"/>
+        <w:gridCol w:w="1957"/>
+      </w:tblGrid>
+      <w:tr>
+        <w:trPr>
+          <w:tblHeader w:val="true"/>
+        </w:trPr>
+        <w:tc>
+          <w:tcPr>
+            <w:tcW w:w="1938" w:type="dxa"/>
+            <w:tcBorders/>
+            <w:vAlign w:val="center"/>
+          </w:tcPr>
+          <w:p>
+            <w:pPr>
+              <w:pStyle w:val="TableHeading"/>
+              <w:rPr/>
+            </w:pPr>
+            <w:r>
+              <w:rPr/>
+              <w:t>Key</w:t>
+            </w:r>
+          </w:p>
+        </w:tc>
+        <w:tc>
+          <w:tcPr>
+            <w:tcW w:w="1546" w:type="dxa"/>
+            <w:tcBorders/>
+            <w:vAlign w:val="center"/>
+          </w:tcPr>
+          <w:p>
+            <w:pPr>
+              <w:pStyle w:val="TableHeading"/>
+              <w:rPr/>
+            </w:pPr>
+            <w:r>
+              <w:rPr/>
+              <w:t>Value</w:t>
+            </w:r>
+          </w:p>
+        </w:tc>
+        <w:tc>
+          <w:tcPr>
+            <w:tcW w:w="1957" w:type="dxa"/>
+            <w:tcBorders/>
+            <w:vAlign w:val="center"/>
+          </w:tcPr>
+          <w:p>
+            <w:pPr>
+              <w:pStyle w:val="TableHeading"/>
+              <w:rPr/>
+            </w:pPr>
+            <w:r>
+              <w:rPr/>
+              <w:t>Description</w:t>
+            </w:r>
+          </w:p>
+        </w:tc>
+      </w:tr>
+      <w:tr>
+        <w:trPr/>
+        <w:tc>
+          <w:tcPr>
+            <w:tcW w:w="1938" w:type="dxa"/>
+            <w:tcBorders/>
+            <w:vAlign w:val="center"/>
+          </w:tcPr>
+          <w:p>
+            <w:pPr>
+              <w:pStyle w:val="TableContents"/>
+              <w:rPr/>
+            </w:pPr>
+            <w:r>
+              <w:rPr/>
+              <w:t>PLAYER_EVENT</w:t>
+            </w:r>
+          </w:p>
+        </w:tc>
+        <w:tc>
+          <w:tcPr>
+            <w:tcW w:w="1546" w:type="dxa"/>
+            <w:tcBorders/>
+            <w:vAlign w:val="center"/>
+          </w:tcPr>
+          <w:p>
+            <w:pPr>
+              <w:pStyle w:val="TableContents"/>
+              <w:rPr/>
+            </w:pPr>
+            <w:r>
+              <w:rPr>
+                <w:rStyle w:val="SourceText"/>
+              </w:rPr>
+              <w:t>volume_set</w:t>
+            </w:r>
+          </w:p>
+        </w:tc>
+        <w:tc>
+          <w:tcPr>
+            <w:tcW w:w="1957" w:type="dxa"/>
+            <w:tcBorders/>
+            <w:vAlign w:val="center"/>
+          </w:tcPr>
+          <w:p>
+            <w:pPr>
+              <w:pStyle w:val="TableContents"/>
+              <w:rPr/>
+            </w:pPr>
+            <w:r>
+              <w:rPr/>
+              <w:t>Name of the Event</w:t>
+            </w:r>
+          </w:p>
+        </w:tc>
+      </w:tr>
+      <w:tr>
+        <w:trPr/>
+        <w:tc>
+          <w:tcPr>
+            <w:tcW w:w="1938" w:type="dxa"/>
+            <w:tcBorders/>
+            <w:vAlign w:val="center"/>
+          </w:tcPr>
+          <w:p>
+            <w:pPr>
+              <w:pStyle w:val="TableContents"/>
+              <w:rPr/>
+            </w:pPr>
+            <w:r>
+              <w:rPr/>
+              <w:t>VOLUME</w:t>
+            </w:r>
+          </w:p>
+        </w:tc>
+        <w:tc>
+          <w:tcPr>
+            <w:tcW w:w="1546" w:type="dxa"/>
+            <w:tcBorders/>
+            <w:vAlign w:val="center"/>
+          </w:tcPr>
+          <w:p>
+            <w:pPr>
+              <w:pStyle w:val="TableContents"/>
+              <w:rPr/>
+            </w:pPr>
+            <w:r>
+              <w:rPr/>
+              <w:t>volume</w:t>
+            </w:r>
+          </w:p>
+        </w:tc>
+        <w:tc>
+          <w:tcPr>
+            <w:tcW w:w="1957" w:type="dxa"/>
+            <w:tcBorders/>
+            <w:vAlign w:val="center"/>
+          </w:tcPr>
+          <w:p>
+            <w:pPr>
+              <w:pStyle w:val="TableContents"/>
+              <w:rPr/>
+            </w:pPr>
+            <w:r>
+              <w:rPr/>
+              <w:t>Volume 0 - 65535</w:t>
+            </w:r>
+          </w:p>
+        </w:tc>
+      </w:tr>
+    </w:tbl>
+    <w:p>
+      <w:pPr>
+        <w:pStyle w:val="BodyText"/>
+        <w:rPr>
+          <w:b/>
+          <w:bCs/>
+          <w:u w:val="single"/>
+        </w:rPr>
+      </w:pPr>
+      <w:r>
+        <w:rPr>
+          <w:b/>
+          <w:bCs/>
+          <w:u w:val="single"/>
+        </w:rPr>
+      </w:r>
+    </w:p>
+    <w:p>
+      <w:pPr>
+        <w:pStyle w:val="BodyText"/>
+        <w:rPr>
+          <w:b/>
+          <w:bCs/>
+          <w:u w:val="single"/>
+        </w:rPr>
+      </w:pPr>
+      <w:r>
+        <w:rPr>
+          <w:b/>
+          <w:bCs/>
+          <w:u w:val="single"/>
+        </w:rPr>
+        <w:t>Alsa-sound:</w:t>
+      </w:r>
+    </w:p>
+    <w:p>
+      <w:pPr>
+        <w:pStyle w:val="BodyText"/>
+        <w:rPr>
+          <w:b w:val="false"/>
+          <w:bCs w:val="false"/>
+          <w:u w:val="none"/>
+        </w:rPr>
+      </w:pPr>
+      <w:r>
+        <w:rPr>
+          <w:b w:val="false"/>
+          <w:bCs w:val="false"/>
+          <w:u w:val="none"/>
+        </w:rPr>
+        <w:t>Alsa-sound offers a sound device to be assigined to Librespot.</w:t>
+      </w:r>
+    </w:p>
+    <w:p>
+      <w:pPr>
+        <w:pStyle w:val="Normal"/>
+        <w:ind w:hanging="0"/>
+        <w:jc w:val="start"/>
+        <w:rPr>
+          <w:rFonts w:ascii="Monospace" w:hAnsi="Monospace"/>
+          <w:sz w:val="20"/>
+        </w:rPr>
+      </w:pPr>
+      <w:r>
+        <w:rPr>
+          <w:rFonts w:ascii="Monospace" w:hAnsi="Monospace"/>
+          <w:sz w:val="20"/>
+        </w:rPr>
+        <w:t>pcm.SpotCon_in {</w:t>
+      </w:r>
+    </w:p>
+    <w:p>
+      <w:pPr>
+        <w:pStyle w:val="Normal"/>
+        <w:ind w:hanging="0"/>
+        <w:jc w:val="start"/>
+        <w:rPr>
+          <w:rFonts w:ascii="Monospace" w:hAnsi="Monospace"/>
+          <w:sz w:val="20"/>
+        </w:rPr>
+      </w:pPr>
+      <w:r>
+        <w:rPr>
+          <w:rFonts w:ascii="Monospace" w:hAnsi="Monospace"/>
+          <w:sz w:val="20"/>
+        </w:rPr>
+        <w:t xml:space="preserve">    </w:t>
+      </w:r>
+      <w:r>
+        <w:rPr>
+          <w:rFonts w:ascii="Monospace" w:hAnsi="Monospace"/>
+          <w:sz w:val="20"/>
+        </w:rPr>
+        <w:t>type plug</w:t>
+      </w:r>
+    </w:p>
+    <w:p>
+      <w:pPr>
+        <w:pStyle w:val="Normal"/>
+        <w:ind w:hanging="0"/>
+        <w:jc w:val="start"/>
+        <w:rPr>
+          <w:rFonts w:ascii="Monospace" w:hAnsi="Monospace"/>
+          <w:sz w:val="20"/>
+        </w:rPr>
+      </w:pPr>
+      <w:r>
+        <w:rPr>
+          <w:rFonts w:ascii="Monospace" w:hAnsi="Monospace"/>
+          <w:sz w:val="20"/>
+        </w:rPr>
+        <w:t xml:space="preserve">    </w:t>
+      </w:r>
+      <w:r>
+        <w:rPr>
+          <w:rFonts w:ascii="Monospace" w:hAnsi="Monospace"/>
+          <w:sz w:val="20"/>
+        </w:rPr>
+        <w:t>slave.pcm "SpotCon_VolControl"</w:t>
+      </w:r>
+    </w:p>
+    <w:p>
+      <w:pPr>
+        <w:pStyle w:val="Normal"/>
+        <w:rPr>
+          <w:rFonts w:ascii="Monospace" w:hAnsi="Monospace"/>
+          <w:b w:val="false"/>
+          <w:bCs w:val="false"/>
+          <w:sz w:val="20"/>
+          <w:u w:val="none"/>
+        </w:rPr>
+      </w:pPr>
+      <w:r>
+        <w:rPr>
+          <w:rFonts w:ascii="Monospace" w:hAnsi="Monospace"/>
+          <w:b w:val="false"/>
+          <w:bCs w:val="false"/>
+          <w:sz w:val="20"/>
+          <w:u w:val="none"/>
+        </w:rPr>
+        <w:t>}</w:t>
+      </w:r>
+    </w:p>
+    <w:p>
+      <w:pPr>
+        <w:pStyle w:val="Normal"/>
+        <w:rPr>
+          <w:b w:val="false"/>
+          <w:bCs w:val="false"/>
+          <w:u w:val="none"/>
+        </w:rPr>
+      </w:pPr>
+      <w:r>
+        <w:rPr>
+          <w:b w:val="false"/>
+          <w:bCs w:val="false"/>
+          <w:u w:val="none"/>
+        </w:rPr>
+      </w:r>
+    </w:p>
+    <w:p>
+      <w:pPr>
+        <w:pStyle w:val="Normal"/>
+        <w:rPr>
+          <w:b/>
+          <w:bCs/>
+          <w:u w:val="single"/>
+        </w:rPr>
+      </w:pPr>
+      <w:r>
+        <w:rPr>
+          <w:b/>
+          <w:bCs/>
+          <w:u w:val="single"/>
+        </w:rPr>
         <w:t>Librespot playlist handling</w:t>
       </w:r>
     </w:p>
     <w:p>
       <w:pPr>
         <w:pStyle w:val="Heading3"/>
-        <w:bidi w:val="0"/>
-        <w:jc w:val="start"/>
         <w:rPr/>
       </w:pPr>
       <w:r>
         <w:rPr>
           <w:rStyle w:val="Strong"/>
-          <w:rFonts w:ascii="Liberation Serif" w:hAnsi="Liberation Serif"/>
           <w:b w:val="false"/>
           <w:bCs w:val="false"/>
           <w:sz w:val="24"/>
@@ -1385,6 +3202,98 @@
           <w:u w:val="none"/>
         </w:rPr>
         <w:t>The Playback State is Managed by Spotify's Cloud. When the playback is started from the Spotify App the Spotify servers:</w:t>
+      </w:r>
+    </w:p>
+    <w:p>
+      <w:pPr>
+        <w:pStyle w:val="BodyText"/>
+        <w:numPr>
+          <w:ilvl w:val="0"/>
+          <w:numId w:val="8"/>
+        </w:numPr>
+        <w:spacing w:lineRule="auto" w:line="240" w:before="0" w:after="26"/>
+        <w:rPr/>
+      </w:pPr>
+      <w:r>
+        <w:rPr>
+          <w:rStyle w:val="Strong"/>
+          <w:b w:val="false"/>
+          <w:bCs w:val="false"/>
+          <w:sz w:val="24"/>
+          <w:szCs w:val="24"/>
+          <w:u w:val="none"/>
+        </w:rPr>
+        <w:t>Store the current track and playlist/queue</w:t>
+      </w:r>
+    </w:p>
+    <w:p>
+      <w:pPr>
+        <w:pStyle w:val="BodyText"/>
+        <w:numPr>
+          <w:ilvl w:val="0"/>
+          <w:numId w:val="8"/>
+        </w:numPr>
+        <w:spacing w:lineRule="auto" w:line="240" w:before="0" w:after="26"/>
+        <w:rPr/>
+      </w:pPr>
+      <w:r>
+        <w:rPr>
+          <w:b w:val="false"/>
+          <w:bCs w:val="false"/>
+          <w:sz w:val="24"/>
+          <w:szCs w:val="24"/>
+          <w:u w:val="none"/>
+        </w:rPr>
+        <w:t xml:space="preserve">Maintain the </w:t>
+      </w:r>
+      <w:r>
+        <w:rPr>
+          <w:rStyle w:val="Strong"/>
+          <w:b w:val="false"/>
+          <w:bCs w:val="false"/>
+          <w:sz w:val="24"/>
+          <w:szCs w:val="24"/>
+          <w:u w:val="none"/>
+        </w:rPr>
+        <w:t>playback progress</w:t>
+      </w:r>
+      <w:r>
+        <w:rPr>
+          <w:b w:val="false"/>
+          <w:bCs w:val="false"/>
+          <w:sz w:val="24"/>
+          <w:szCs w:val="24"/>
+          <w:u w:val="none"/>
+        </w:rPr>
+        <w:t xml:space="preserve"> (current timestamp in song).</w:t>
+      </w:r>
+    </w:p>
+    <w:p>
+      <w:pPr>
+        <w:pStyle w:val="BodyText"/>
+        <w:numPr>
+          <w:ilvl w:val="0"/>
+          <w:numId w:val="8"/>
+        </w:numPr>
+        <w:spacing w:lineRule="auto" w:line="240" w:before="0" w:after="26"/>
+        <w:rPr>
+          <w:rFonts w:ascii="Liberation Serif" w:hAnsi="Liberation Serif"/>
+          <w:b w:val="false"/>
+          <w:bCs w:val="false"/>
+          <w:sz w:val="24"/>
+          <w:szCs w:val="24"/>
+          <w:u w:val="none"/>
+        </w:rPr>
+      </w:pPr>
+      <w:r>
+        <w:rPr>
+          <w:b w:val="false"/>
+          <w:bCs w:val="false"/>
+          <w:sz w:val="24"/>
+          <w:szCs w:val="24"/>
+          <w:u w:val="none"/>
+        </w:rPr>
+        <w:t>Track which device is currently active.</w:t>
       </w:r>
     </w:p>
     <w:p>
@@ -1394,113 +3303,71 @@
           <w:ilvl w:val="0"/>
           <w:numId w:val="9"/>
         </w:numPr>
-        <w:bidi w:val="0"/>
+        <w:tabs>
+          <w:tab w:val="clear" w:pos="709"/>
+          <w:tab w:val="left" w:pos="709" w:leader="none"/>
+        </w:tabs>
         <w:spacing w:lineRule="auto" w:line="240" w:before="0" w:after="26"/>
-        <w:jc w:val="start"/>
-        <w:rPr/>
-      </w:pPr>
-      <w:r>
-        <w:rPr>
-          <w:rStyle w:val="Strong"/>
-          <w:rFonts w:ascii="Liberation Serif" w:hAnsi="Liberation Serif"/>
+        <w:ind w:hanging="283" w:start="709"/>
+        <w:rPr/>
+      </w:pPr>
+      <w:r>
+        <w:rPr>
           <w:b w:val="false"/>
           <w:bCs w:val="false"/>
           <w:sz w:val="24"/>
           <w:szCs w:val="24"/>
           <w:u w:val="none"/>
         </w:rPr>
-        <w:t>Store the current track and playlist/queue</w:t>
-      </w:r>
-    </w:p>
-    <w:p>
-      <w:pPr>
-        <w:pStyle w:val="BodyText"/>
-        <w:numPr>
-          <w:ilvl w:val="0"/>
-          <w:numId w:val="9"/>
-        </w:numPr>
-        <w:bidi w:val="0"/>
-        <w:spacing w:lineRule="auto" w:line="240" w:before="0" w:after="26"/>
-        <w:jc w:val="start"/>
-        <w:rPr/>
-      </w:pPr>
-      <w:r>
-        <w:rPr>
-          <w:rFonts w:ascii="Liberation Serif" w:hAnsi="Liberation Serif"/>
+        <w:t xml:space="preserve">Even if the Spotify app disconnects, </w:t>
+      </w:r>
+      <w:r>
+        <w:rPr>
+          <w:rStyle w:val="SourceText"/>
           <w:b w:val="false"/>
           <w:bCs w:val="false"/>
           <w:sz w:val="24"/>
           <w:szCs w:val="24"/>
           <w:u w:val="none"/>
         </w:rPr>
-        <w:t xml:space="preserve">Maintain the </w:t>
-      </w:r>
-      <w:r>
-        <w:rPr>
-          <w:rStyle w:val="Strong"/>
-          <w:rFonts w:ascii="Liberation Serif" w:hAnsi="Liberation Serif"/>
+        <w:t>librespot</w:t>
+      </w:r>
+      <w:r>
+        <w:rPr>
           <w:b w:val="false"/>
           <w:bCs w:val="false"/>
           <w:sz w:val="24"/>
           <w:szCs w:val="24"/>
           <w:u w:val="none"/>
         </w:rPr>
-        <w:t>playback progress</w:t>
-      </w:r>
-      <w:r>
-        <w:rPr>
-          <w:rFonts w:ascii="Liberation Serif" w:hAnsi="Liberation Serif"/>
+        <w:t xml:space="preserve"> keeps playing because it </w:t>
+      </w:r>
+      <w:r>
+        <w:rPr>
+          <w:rStyle w:val="Strong"/>
           <w:b w:val="false"/>
           <w:bCs w:val="false"/>
           <w:sz w:val="24"/>
           <w:szCs w:val="24"/>
           <w:u w:val="none"/>
         </w:rPr>
-        <w:t xml:space="preserve"> (current timestamp in song).</w:t>
-      </w:r>
-    </w:p>
-    <w:p>
-      <w:pPr>
-        <w:pStyle w:val="BodyText"/>
-        <w:numPr>
-          <w:ilvl w:val="0"/>
-          <w:numId w:val="9"/>
-        </w:numPr>
-        <w:bidi w:val="0"/>
-        <w:spacing w:lineRule="auto" w:line="240" w:before="0" w:after="26"/>
-        <w:jc w:val="start"/>
-        <w:rPr/>
-      </w:pPr>
-      <w:r>
-        <w:rPr>
-          <w:rFonts w:ascii="Liberation Serif" w:hAnsi="Liberation Serif"/>
+        <w:t>receives streaming data directly from Spotify’s cloud</w:t>
+      </w:r>
+      <w:r>
+        <w:rPr>
           <w:b w:val="false"/>
           <w:bCs w:val="false"/>
           <w:sz w:val="24"/>
           <w:szCs w:val="24"/>
           <w:u w:val="none"/>
         </w:rPr>
-        <w:t>Track which device is currently active.</w:t>
-      </w:r>
-    </w:p>
-    <w:p>
-      <w:pPr>
-        <w:pStyle w:val="BodyText"/>
-        <w:numPr>
-          <w:ilvl w:val="0"/>
-          <w:numId w:val="8"/>
-        </w:numPr>
-        <w:tabs>
-          <w:tab w:val="clear" w:pos="709"/>
-          <w:tab w:val="left" w:pos="709" w:leader="none"/>
-        </w:tabs>
-        <w:bidi w:val="0"/>
+        <w:t>.</w:t>
+      </w:r>
+    </w:p>
+    <w:p>
+      <w:pPr>
+        <w:pStyle w:val="BodyText"/>
         <w:spacing w:lineRule="auto" w:line="240" w:before="0" w:after="26"/>
-        <w:ind w:hanging="283" w:start="709"/>
-        <w:jc w:val="start"/>
-        <w:rPr/>
-      </w:pPr>
-      <w:r>
         <w:rPr>
           <w:rFonts w:ascii="Liberation Serif" w:hAnsi="Liberation Serif"/>
           <w:b w:val="false"/>
@@ -1509,112 +3376,47 @@
           <w:szCs w:val="24"/>
           <w:u w:val="none"/>
         </w:rPr>
-        <w:t xml:space="preserve">Even if the Spotify app disconnects, </w:t>
-      </w:r>
-      <w:r>
-        <w:rPr>
-          <w:rStyle w:val="SourceText"/>
-          <w:rFonts w:ascii="Liberation Serif" w:hAnsi="Liberation Serif"/>
+      </w:pPr>
+      <w:r>
+        <w:rPr>
           <w:b w:val="false"/>
           <w:bCs w:val="false"/>
           <w:sz w:val="24"/>
           <w:szCs w:val="24"/>
           <w:u w:val="none"/>
         </w:rPr>
-        <w:t>librespot</w:t>
-      </w:r>
-      <w:r>
-        <w:rPr>
-          <w:rFonts w:ascii="Liberation Serif" w:hAnsi="Liberation Serif"/>
+        <w:t>Reconnecting to Spotify restores the playback.</w:t>
+      </w:r>
+    </w:p>
+    <w:p>
+      <w:pPr>
+        <w:pStyle w:val="BodyText"/>
+        <w:spacing w:lineRule="auto" w:line="240" w:before="0" w:after="26"/>
+        <w:rPr/>
+      </w:pPr>
+      <w:r>
+        <w:rPr>
           <w:b w:val="false"/>
           <w:bCs w:val="false"/>
           <w:sz w:val="24"/>
           <w:szCs w:val="24"/>
           <w:u w:val="none"/>
         </w:rPr>
-        <w:t xml:space="preserve"> keeps playing because it </w:t>
+        <w:t xml:space="preserve">If </w:t>
       </w:r>
       <w:r>
         <w:rPr>
           <w:rStyle w:val="Strong"/>
-          <w:rFonts w:ascii="Liberation Serif" w:hAnsi="Liberation Serif"/>
           <w:b w:val="false"/>
           <w:bCs w:val="false"/>
           <w:sz w:val="24"/>
           <w:szCs w:val="24"/>
           <w:u w:val="none"/>
         </w:rPr>
-        <w:t>receives streaming data directly from Spotify’s cloud</w:t>
-      </w:r>
-      <w:r>
-        <w:rPr>
-          <w:rFonts w:ascii="Liberation Serif" w:hAnsi="Liberation Serif"/>
-          <w:b w:val="false"/>
-          <w:bCs w:val="false"/>
-          <w:sz w:val="24"/>
-          <w:szCs w:val="24"/>
-          <w:u w:val="none"/>
-        </w:rPr>
-        <w:t>.</w:t>
-      </w:r>
-    </w:p>
-    <w:p>
-      <w:pPr>
-        <w:pStyle w:val="BodyText"/>
-        <w:bidi w:val="0"/>
-        <w:spacing w:lineRule="auto" w:line="240" w:before="0" w:after="26"/>
-        <w:jc w:val="start"/>
-        <w:rPr>
-          <w:b w:val="false"/>
-          <w:bCs w:val="false"/>
-        </w:rPr>
-      </w:pPr>
-      <w:r>
-        <w:rPr>
-          <w:rFonts w:ascii="Liberation Serif" w:hAnsi="Liberation Serif"/>
-          <w:b w:val="false"/>
-          <w:bCs w:val="false"/>
-          <w:sz w:val="24"/>
-          <w:szCs w:val="24"/>
-          <w:u w:val="none"/>
-        </w:rPr>
-        <w:t>Reconnecting to Spotify restores the playback.</w:t>
-      </w:r>
-    </w:p>
-    <w:p>
-      <w:pPr>
-        <w:pStyle w:val="BodyText"/>
-        <w:bidi w:val="0"/>
-        <w:spacing w:lineRule="auto" w:line="240" w:before="0" w:after="26"/>
-        <w:jc w:val="start"/>
-        <w:rPr/>
-      </w:pPr>
-      <w:r>
-        <w:rPr>
-          <w:rFonts w:ascii="Liberation Serif" w:hAnsi="Liberation Serif"/>
-          <w:b w:val="false"/>
-          <w:bCs w:val="false"/>
-          <w:sz w:val="24"/>
-          <w:szCs w:val="24"/>
-          <w:u w:val="none"/>
-        </w:rPr>
-        <w:t xml:space="preserve">If </w:t>
-      </w:r>
-      <w:r>
-        <w:rPr>
-          <w:rStyle w:val="Strong"/>
-          <w:rFonts w:ascii="Liberation Serif" w:hAnsi="Liberation Serif"/>
-          <w:b w:val="false"/>
-          <w:bCs w:val="false"/>
-          <w:sz w:val="24"/>
-          <w:szCs w:val="24"/>
-          <w:u w:val="none"/>
-        </w:rPr>
         <w:t>the Spotify app is closed and reopen it</w:t>
       </w:r>
       <w:r>
         <w:rPr>
-          <w:rFonts w:ascii="Liberation Serif" w:hAnsi="Liberation Serif"/>
           <w:b w:val="false"/>
           <w:bCs w:val="false"/>
           <w:sz w:val="24"/>
@@ -1635,15 +3437,12 @@
           <w:tab w:val="clear" w:pos="709"/>
           <w:tab w:val="left" w:pos="709" w:leader="none"/>
         </w:tabs>
-        <w:bidi w:val="0"/>
         <w:spacing w:lineRule="auto" w:line="240" w:before="0" w:after="0"/>
         <w:ind w:hanging="283" w:start="709"/>
-        <w:jc w:val="start"/>
-        <w:rPr/>
-      </w:pPr>
-      <w:r>
-        <w:rPr>
-          <w:rFonts w:ascii="Liberation Serif" w:hAnsi="Liberation Serif"/>
+        <w:rPr/>
+      </w:pPr>
+      <w:r>
+        <w:rPr>
           <w:b w:val="false"/>
           <w:bCs w:val="false"/>
         </w:rPr>
@@ -1652,7 +3451,6 @@
       <w:r>
         <w:rPr>
           <w:rStyle w:val="SourceText"/>
-          <w:rFonts w:ascii="Liberation Serif" w:hAnsi="Liberation Serif"/>
           <w:b w:val="false"/>
           <w:bCs w:val="false"/>
         </w:rPr>
@@ -1660,7 +3458,6 @@
       </w:r>
       <w:r>
         <w:rPr>
-          <w:rFonts w:ascii="Liberation Serif" w:hAnsi="Liberation Serif"/>
           <w:b w:val="false"/>
           <w:bCs w:val="false"/>
         </w:rPr>
@@ -1678,10 +3475,8 @@
           <w:tab w:val="clear" w:pos="709"/>
           <w:tab w:val="left" w:pos="709" w:leader="none"/>
         </w:tabs>
-        <w:bidi w:val="0"/>
         <w:spacing w:lineRule="auto" w:line="240"/>
         <w:ind w:hanging="283" w:start="709"/>
-        <w:jc w:val="start"/>
         <w:rPr>
           <w:rFonts w:ascii="Liberation Serif" w:hAnsi="Liberation Serif"/>
           <w:b w:val="false"/>
@@ -1690,7 +3485,6 @@
       </w:pPr>
       <w:r>
         <w:rPr>
-          <w:rFonts w:ascii="Liberation Serif" w:hAnsi="Liberation Serif"/>
           <w:b w:val="false"/>
           <w:bCs w:val="false"/>
         </w:rPr>
@@ -1708,15 +3502,12 @@
           <w:tab w:val="clear" w:pos="709"/>
           <w:tab w:val="left" w:pos="720" w:leader="none"/>
         </w:tabs>
-        <w:bidi w:val="0"/>
         <w:spacing w:lineRule="auto" w:line="240"/>
         <w:ind w:hanging="283" w:start="720"/>
-        <w:jc w:val="start"/>
-        <w:rPr/>
-      </w:pPr>
-      <w:r>
-        <w:rPr>
-          <w:rFonts w:ascii="Liberation Serif" w:hAnsi="Liberation Serif"/>
+        <w:rPr/>
+      </w:pPr>
+      <w:r>
+        <w:rPr>
           <w:b w:val="false"/>
           <w:bCs w:val="false"/>
         </w:rPr>
@@ -1725,7 +3516,6 @@
       <w:r>
         <w:rPr>
           <w:rStyle w:val="Strong"/>
-          <w:rFonts w:ascii="Liberation Serif" w:hAnsi="Liberation Serif"/>
           <w:b w:val="false"/>
           <w:bCs w:val="false"/>
         </w:rPr>
@@ -1733,7 +3523,6 @@
       </w:r>
       <w:r>
         <w:rPr>
-          <w:rFonts w:ascii="Liberation Serif" w:hAnsi="Liberation Serif"/>
           <w:b w:val="false"/>
           <w:bCs w:val="false"/>
         </w:rPr>
@@ -1741,7 +3530,6 @@
       </w:r>
       <w:r>
         <w:rPr>
-          <w:rFonts w:ascii="Liberation Serif" w:hAnsi="Liberation Serif"/>
           <w:b w:val="false"/>
           <w:bCs w:val="false"/>
         </w:rPr>
@@ -1749,7 +3537,6 @@
       </w:r>
       <w:r>
         <w:rPr>
-          <w:rFonts w:ascii="Liberation Serif" w:hAnsi="Liberation Serif"/>
           <w:b w:val="false"/>
           <w:bCs w:val="false"/>
         </w:rPr>
@@ -1767,15 +3554,12 @@
           <w:tab w:val="clear" w:pos="709"/>
           <w:tab w:val="left" w:pos="720" w:leader="none"/>
         </w:tabs>
-        <w:bidi w:val="0"/>
         <w:spacing w:lineRule="auto" w:line="240"/>
         <w:ind w:hanging="283" w:start="720"/>
-        <w:jc w:val="start"/>
-        <w:rPr/>
-      </w:pPr>
-      <w:r>
-        <w:rPr>
-          <w:rFonts w:ascii="Liberation Serif" w:hAnsi="Liberation Serif"/>
+        <w:rPr/>
+      </w:pPr>
+      <w:r>
+        <w:rPr>
           <w:b w:val="false"/>
           <w:bCs w:val="false"/>
         </w:rPr>
@@ -1785,7 +3569,6 @@
       <w:r>
         <w:rPr>
           <w:rStyle w:val="Emphasis"/>
-          <w:rFonts w:ascii="Liberation Serif" w:hAnsi="Liberation Serif"/>
           <w:b w:val="false"/>
           <w:bCs w:val="false"/>
         </w:rPr>
@@ -1794,7 +3577,6 @@
       <w:r>
         <w:rPr>
           <w:rStyle w:val="Emphasis"/>
-          <w:rFonts w:ascii="Liberation Serif" w:hAnsi="Liberation Serif"/>
           <w:b w:val="false"/>
           <w:bCs w:val="false"/>
         </w:rPr>
@@ -1803,7 +3585,6 @@
       <w:r>
         <w:rPr>
           <w:rStyle w:val="Emphasis"/>
-          <w:rFonts w:ascii="Liberation Serif" w:hAnsi="Liberation Serif"/>
           <w:b w:val="false"/>
           <w:bCs w:val="false"/>
         </w:rPr>
@@ -1811,7 +3592,6 @@
       </w:r>
       <w:r>
         <w:rPr>
-          <w:rFonts w:ascii="Liberation Serif" w:hAnsi="Liberation Serif"/>
           <w:b w:val="false"/>
           <w:bCs w:val="false"/>
         </w:rPr>
@@ -1821,15 +3601,7 @@
     <w:p>
       <w:pPr>
         <w:pStyle w:val="BodyText"/>
-        <w:bidi w:val="0"/>
         <w:spacing w:lineRule="auto" w:line="240" w:before="0" w:after="26"/>
-        <w:jc w:val="start"/>
-        <w:rPr>
-          <w:b w:val="false"/>
-          <w:bCs w:val="false"/>
-        </w:rPr>
-      </w:pPr>
-      <w:r>
         <w:rPr>
           <w:rFonts w:ascii="Liberation Serif" w:hAnsi="Liberation Serif"/>
           <w:b w:val="false"/>
@@ -1838,15 +3610,22 @@
           <w:szCs w:val="24"/>
           <w:u w:val="none"/>
         </w:rPr>
+      </w:pPr>
+      <w:r>
+        <w:rPr>
+          <w:b w:val="false"/>
+          <w:bCs w:val="false"/>
+          <w:sz w:val="24"/>
+          <w:szCs w:val="24"/>
+          <w:u w:val="none"/>
+        </w:rPr>
         <w:t>Librespot does not store playlist locally. When restarted librespot will reconnect to Spotify. If spotify detects that librespot was the last device it may resume playback where it left off.</w:t>
       </w:r>
     </w:p>
     <w:p>
       <w:pPr>
         <w:pStyle w:val="BodyText"/>
-        <w:bidi w:val="0"/>
         <w:spacing w:lineRule="auto" w:line="240" w:before="0" w:after="26"/>
-        <w:jc w:val="start"/>
         <w:rPr>
           <w:rFonts w:ascii="Liberation Serif" w:hAnsi="Liberation Serif"/>
           <w:sz w:val="24"/>
@@ -1864,9 +3643,91 @@
     <w:p>
       <w:pPr>
         <w:pStyle w:val="BodyText"/>
-        <w:bidi w:val="0"/>
         <w:spacing w:lineRule="auto" w:line="240" w:before="0" w:after="26"/>
-        <w:jc w:val="start"/>
+        <w:rPr>
+          <w:b/>
+          <w:bCs/>
+          <w:u w:val="single"/>
+        </w:rPr>
+      </w:pPr>
+      <w:r>
+        <w:rPr>
+          <w:b/>
+          <w:bCs/>
+          <w:sz w:val="24"/>
+          <w:szCs w:val="24"/>
+          <w:u w:val="single"/>
+        </w:rPr>
+        <w:t>MPV player:</w:t>
+      </w:r>
+    </w:p>
+    <w:p>
+      <w:pPr>
+        <w:pStyle w:val="BodyText"/>
+        <w:spacing w:lineRule="auto" w:line="240" w:before="0" w:after="26"/>
+        <w:rPr>
+          <w:b w:val="false"/>
+          <w:bCs w:val="false"/>
+        </w:rPr>
+      </w:pPr>
+      <w:r>
+        <w:rPr>
+          <w:b w:val="false"/>
+          <w:bCs w:val="false"/>
+          <w:sz w:val="24"/>
+          <w:szCs w:val="24"/>
+          <w:u w:val="none"/>
+        </w:rPr>
+        <w:t xml:space="preserve">mpv is a free and open-source media player software based on Mplayer, mplayer2 and Ffmpeg. </w:t>
+      </w:r>
+    </w:p>
+    <w:p>
+      <w:pPr>
+        <w:pStyle w:val="BodyText"/>
+        <w:spacing w:lineRule="auto" w:line="240" w:before="0" w:after="26"/>
+        <w:rPr/>
+      </w:pPr>
+      <w:r>
+        <w:rPr>
+          <w:rStyle w:val="SourceText"/>
+          <w:b w:val="false"/>
+          <w:bCs w:val="false"/>
+          <w:sz w:val="24"/>
+          <w:szCs w:val="24"/>
+          <w:u w:val="none"/>
+        </w:rPr>
+        <w:t>The mpv-mpri</w:t>
+      </w:r>
+      <w:r>
+        <w:rPr>
+          <w:rStyle w:val="SourceText"/>
+          <w:b w:val="false"/>
+          <w:bCs w:val="false"/>
+          <w:sz w:val="24"/>
+          <w:szCs w:val="24"/>
+          <w:u w:val="none"/>
+        </w:rPr>
+        <w:t>s i</w:t>
+      </w:r>
+      <w:r>
+        <w:rPr>
+          <w:b w:val="false"/>
+          <w:bCs w:val="false"/>
+          <w:sz w:val="24"/>
+          <w:szCs w:val="24"/>
+          <w:u w:val="none"/>
+        </w:rPr>
+        <w:t>s a plugin for mpv which allows control of the player using the</w:t>
+      </w:r>
+      <w:r>
+        <w:rPr/>
+        <w:t xml:space="preserve"> MPRIS D-Bus interface.</w:t>
+      </w:r>
+    </w:p>
+    <w:p>
+      <w:pPr>
+        <w:pStyle w:val="BodyText"/>
+        <w:spacing w:lineRule="auto" w:line="240" w:before="0" w:after="26"/>
         <w:rPr>
           <w:rFonts w:ascii="Liberation Serif" w:hAnsi="Liberation Serif"/>
           <w:sz w:val="24"/>
@@ -1879,6 +3740,518 @@
           <w:b w:val="false"/>
           <w:bCs w:val="false"/>
         </w:rPr>
+      </w:r>
+    </w:p>
+    <w:p>
+      <w:pPr>
+        <w:pStyle w:val="BodyText"/>
+        <w:spacing w:lineRule="auto" w:line="240" w:before="0" w:after="26"/>
+        <w:rPr>
+          <w:b/>
+          <w:bCs/>
+          <w:u w:val="single"/>
+        </w:rPr>
+      </w:pPr>
+      <w:r>
+        <w:rPr>
+          <w:b/>
+          <w:bCs/>
+          <w:sz w:val="24"/>
+          <w:szCs w:val="24"/>
+          <w:u w:val="single"/>
+        </w:rPr>
+        <w:t>MPRIS:</w:t>
+      </w:r>
+    </w:p>
+    <w:p>
+      <w:pPr>
+        <w:pStyle w:val="BodyText"/>
+        <w:spacing w:lineRule="auto" w:line="240" w:before="0" w:after="26"/>
+        <w:rPr>
+          <w:b/>
+          <w:bCs/>
+          <w:u w:val="single"/>
+        </w:rPr>
+      </w:pPr>
+      <w:r>
+        <w:rPr>
+          <w:b w:val="false"/>
+          <w:bCs w:val="false"/>
+          <w:sz w:val="24"/>
+          <w:szCs w:val="24"/>
+          <w:u w:val="none"/>
+        </w:rPr>
+        <w:t xml:space="preserve">MPRIS(Media Player Remote Interfacing Specification) is a standard D-Bus interface which aims to provide a common programmatic API for controlling media players. </w:t>
+      </w:r>
+    </w:p>
+    <w:p>
+      <w:pPr>
+        <w:pStyle w:val="BodyText"/>
+        <w:spacing w:lineRule="auto" w:line="240" w:before="0" w:after="26"/>
+        <w:rPr>
+          <w:b/>
+          <w:bCs/>
+          <w:u w:val="single"/>
+        </w:rPr>
+      </w:pPr>
+      <w:r>
+        <w:rPr>
+          <w:b w:val="false"/>
+          <w:bCs w:val="false"/>
+          <w:sz w:val="24"/>
+          <w:szCs w:val="24"/>
+          <w:u w:val="none"/>
+        </w:rPr>
+        <w:t>MPRIS provides following methods:</w:t>
+      </w:r>
+    </w:p>
+    <w:p>
+      <w:pPr>
+        <w:pStyle w:val="BodyText"/>
+        <w:numPr>
+          <w:ilvl w:val="0"/>
+          <w:numId w:val="13"/>
+        </w:numPr>
+        <w:spacing w:lineRule="auto" w:line="240" w:before="0" w:after="26"/>
+        <w:rPr>
+          <w:b/>
+          <w:bCs/>
+          <w:u w:val="single"/>
+        </w:rPr>
+      </w:pPr>
+      <w:r>
+        <w:rPr>
+          <w:b w:val="false"/>
+          <w:bCs w:val="false"/>
+          <w:sz w:val="24"/>
+          <w:szCs w:val="24"/>
+          <w:u w:val="none"/>
+        </w:rPr>
+        <w:t>next</w:t>
+      </w:r>
+    </w:p>
+    <w:p>
+      <w:pPr>
+        <w:pStyle w:val="BodyText"/>
+        <w:numPr>
+          <w:ilvl w:val="0"/>
+          <w:numId w:val="13"/>
+        </w:numPr>
+        <w:spacing w:lineRule="auto" w:line="240" w:before="0" w:after="26"/>
+        <w:rPr>
+          <w:b/>
+          <w:bCs/>
+          <w:u w:val="single"/>
+        </w:rPr>
+      </w:pPr>
+      <w:r>
+        <w:rPr>
+          <w:b w:val="false"/>
+          <w:bCs w:val="false"/>
+          <w:sz w:val="24"/>
+          <w:szCs w:val="24"/>
+          <w:u w:val="none"/>
+        </w:rPr>
+        <w:t>previous</w:t>
+      </w:r>
+    </w:p>
+    <w:p>
+      <w:pPr>
+        <w:pStyle w:val="BodyText"/>
+        <w:numPr>
+          <w:ilvl w:val="0"/>
+          <w:numId w:val="13"/>
+        </w:numPr>
+        <w:spacing w:lineRule="auto" w:line="240" w:before="0" w:after="26"/>
+        <w:rPr>
+          <w:b/>
+          <w:bCs/>
+          <w:u w:val="single"/>
+        </w:rPr>
+      </w:pPr>
+      <w:r>
+        <w:rPr>
+          <w:b w:val="false"/>
+          <w:bCs w:val="false"/>
+          <w:sz w:val="24"/>
+          <w:szCs w:val="24"/>
+          <w:u w:val="none"/>
+        </w:rPr>
+        <w:t>pause</w:t>
+      </w:r>
+    </w:p>
+    <w:p>
+      <w:pPr>
+        <w:pStyle w:val="BodyText"/>
+        <w:numPr>
+          <w:ilvl w:val="0"/>
+          <w:numId w:val="13"/>
+        </w:numPr>
+        <w:spacing w:lineRule="auto" w:line="240" w:before="0" w:after="26"/>
+        <w:rPr>
+          <w:b/>
+          <w:bCs/>
+          <w:u w:val="single"/>
+        </w:rPr>
+      </w:pPr>
+      <w:r>
+        <w:rPr>
+          <w:b w:val="false"/>
+          <w:bCs w:val="false"/>
+          <w:sz w:val="24"/>
+          <w:szCs w:val="24"/>
+          <w:u w:val="none"/>
+        </w:rPr>
+        <w:t>playpause</w:t>
+      </w:r>
+    </w:p>
+    <w:p>
+      <w:pPr>
+        <w:pStyle w:val="BodyText"/>
+        <w:numPr>
+          <w:ilvl w:val="0"/>
+          <w:numId w:val="13"/>
+        </w:numPr>
+        <w:spacing w:lineRule="auto" w:line="240" w:before="0" w:after="26"/>
+        <w:rPr>
+          <w:b/>
+          <w:bCs/>
+          <w:u w:val="single"/>
+        </w:rPr>
+      </w:pPr>
+      <w:r>
+        <w:rPr>
+          <w:b w:val="false"/>
+          <w:bCs w:val="false"/>
+          <w:sz w:val="24"/>
+          <w:szCs w:val="24"/>
+          <w:u w:val="none"/>
+        </w:rPr>
+        <w:t>stop</w:t>
+      </w:r>
+    </w:p>
+    <w:p>
+      <w:pPr>
+        <w:pStyle w:val="BodyText"/>
+        <w:numPr>
+          <w:ilvl w:val="0"/>
+          <w:numId w:val="13"/>
+        </w:numPr>
+        <w:spacing w:lineRule="auto" w:line="240" w:before="0" w:after="26"/>
+        <w:rPr>
+          <w:b/>
+          <w:bCs/>
+          <w:u w:val="single"/>
+        </w:rPr>
+      </w:pPr>
+      <w:r>
+        <w:rPr>
+          <w:b w:val="false"/>
+          <w:bCs w:val="false"/>
+          <w:sz w:val="24"/>
+          <w:szCs w:val="24"/>
+          <w:u w:val="none"/>
+        </w:rPr>
+        <w:t>play</w:t>
+      </w:r>
+    </w:p>
+    <w:p>
+      <w:pPr>
+        <w:pStyle w:val="BodyText"/>
+        <w:numPr>
+          <w:ilvl w:val="0"/>
+          <w:numId w:val="13"/>
+        </w:numPr>
+        <w:spacing w:lineRule="auto" w:line="240" w:before="0" w:after="26"/>
+        <w:rPr>
+          <w:b/>
+          <w:bCs/>
+          <w:u w:val="single"/>
+        </w:rPr>
+      </w:pPr>
+      <w:r>
+        <w:rPr>
+          <w:b w:val="false"/>
+          <w:bCs w:val="false"/>
+          <w:sz w:val="24"/>
+          <w:szCs w:val="24"/>
+          <w:u w:val="none"/>
+        </w:rPr>
+        <w:t>seek</w:t>
+      </w:r>
+    </w:p>
+    <w:p>
+      <w:pPr>
+        <w:pStyle w:val="BodyText"/>
+        <w:numPr>
+          <w:ilvl w:val="0"/>
+          <w:numId w:val="13"/>
+        </w:numPr>
+        <w:spacing w:lineRule="auto" w:line="240" w:before="0" w:after="26"/>
+        <w:rPr>
+          <w:b/>
+          <w:bCs/>
+          <w:u w:val="single"/>
+        </w:rPr>
+      </w:pPr>
+      <w:r>
+        <w:rPr>
+          <w:b w:val="false"/>
+          <w:bCs w:val="false"/>
+          <w:sz w:val="24"/>
+          <w:szCs w:val="24"/>
+          <w:u w:val="none"/>
+        </w:rPr>
+        <w:t>setposition</w:t>
+      </w:r>
+    </w:p>
+    <w:p>
+      <w:pPr>
+        <w:pStyle w:val="BodyText"/>
+        <w:spacing w:lineRule="auto" w:line="240" w:before="0" w:after="26"/>
+        <w:rPr>
+          <w:rFonts w:ascii="Liberation Serif" w:hAnsi="Liberation Serif"/>
+          <w:sz w:val="24"/>
+          <w:szCs w:val="24"/>
+        </w:rPr>
+      </w:pPr>
+      <w:r>
+        <w:rPr>
+          <w:b/>
+          <w:bCs/>
+          <w:u w:val="single"/>
+        </w:rPr>
+      </w:r>
+    </w:p>
+    <w:p>
+      <w:pPr>
+        <w:pStyle w:val="BodyText"/>
+        <w:spacing w:lineRule="auto" w:line="240" w:before="0" w:after="26"/>
+        <w:rPr>
+          <w:b/>
+          <w:bCs/>
+          <w:u w:val="single"/>
+        </w:rPr>
+      </w:pPr>
+      <w:r>
+        <w:rPr>
+          <w:b/>
+          <w:bCs/>
+          <w:sz w:val="24"/>
+          <w:szCs w:val="24"/>
+          <w:u w:val="single"/>
+        </w:rPr>
+        <w:t>Spotify_connect</w:t>
+      </w:r>
+    </w:p>
+    <w:p>
+      <w:pPr>
+        <w:pStyle w:val="BodyText"/>
+        <w:spacing w:lineRule="auto" w:line="240" w:before="0" w:after="26"/>
+        <w:rPr>
+          <w:b w:val="false"/>
+          <w:bCs w:val="false"/>
+          <w:u w:val="none"/>
+        </w:rPr>
+      </w:pPr>
+      <w:r>
+        <w:rPr>
+          <w:b w:val="false"/>
+          <w:bCs w:val="false"/>
+          <w:sz w:val="24"/>
+          <w:szCs w:val="24"/>
+          <w:u w:val="none"/>
+        </w:rPr>
+        <w:t>A spotify_connect class to provide methods to control the MPV player via MPRID-player-ctl. Following method will be provided:</w:t>
+      </w:r>
+    </w:p>
+    <w:p>
+      <w:pPr>
+        <w:pStyle w:val="BodyText"/>
+        <w:numPr>
+          <w:ilvl w:val="0"/>
+          <w:numId w:val="15"/>
+        </w:numPr>
+        <w:spacing w:lineRule="auto" w:line="240" w:before="0" w:after="26"/>
+        <w:rPr>
+          <w:b w:val="false"/>
+          <w:bCs w:val="false"/>
+          <w:u w:val="none"/>
+        </w:rPr>
+      </w:pPr>
+      <w:r>
+        <w:rPr>
+          <w:b w:val="false"/>
+          <w:bCs w:val="false"/>
+          <w:sz w:val="24"/>
+          <w:szCs w:val="24"/>
+          <w:u w:val="none"/>
+        </w:rPr>
+        <w:t>start_playing</w:t>
+      </w:r>
+    </w:p>
+    <w:p>
+      <w:pPr>
+        <w:pStyle w:val="BodyText"/>
+        <w:numPr>
+          <w:ilvl w:val="0"/>
+          <w:numId w:val="15"/>
+        </w:numPr>
+        <w:spacing w:lineRule="auto" w:line="240" w:before="0" w:after="26"/>
+        <w:rPr>
+          <w:b w:val="false"/>
+          <w:bCs w:val="false"/>
+          <w:u w:val="none"/>
+        </w:rPr>
+      </w:pPr>
+      <w:r>
+        <w:rPr>
+          <w:b w:val="false"/>
+          <w:bCs w:val="false"/>
+          <w:sz w:val="24"/>
+          <w:szCs w:val="24"/>
+          <w:u w:val="none"/>
+        </w:rPr>
+        <w:t>stop_playing</w:t>
+      </w:r>
+    </w:p>
+    <w:p>
+      <w:pPr>
+        <w:pStyle w:val="BodyText"/>
+        <w:numPr>
+          <w:ilvl w:val="0"/>
+          <w:numId w:val="15"/>
+        </w:numPr>
+        <w:spacing w:lineRule="auto" w:line="240" w:before="0" w:after="26"/>
+        <w:rPr>
+          <w:b w:val="false"/>
+          <w:bCs w:val="false"/>
+          <w:u w:val="none"/>
+        </w:rPr>
+      </w:pPr>
+      <w:r>
+        <w:rPr>
+          <w:b w:val="false"/>
+          <w:bCs w:val="false"/>
+          <w:sz w:val="24"/>
+          <w:szCs w:val="24"/>
+          <w:u w:val="none"/>
+        </w:rPr>
+        <w:t>pause_playing</w:t>
+      </w:r>
+    </w:p>
+    <w:p>
+      <w:pPr>
+        <w:pStyle w:val="BodyText"/>
+        <w:spacing w:lineRule="auto" w:line="240" w:before="0" w:after="26"/>
+        <w:rPr>
+          <w:rFonts w:ascii="Liberation Serif" w:hAnsi="Liberation Serif"/>
+          <w:sz w:val="24"/>
+          <w:szCs w:val="24"/>
+        </w:rPr>
+      </w:pPr>
+      <w:r>
+        <w:rPr>
+          <w:b/>
+          <w:bCs/>
+          <w:u w:val="single"/>
+        </w:rPr>
+      </w:r>
+    </w:p>
+    <w:p>
+      <w:pPr>
+        <w:pStyle w:val="BodyText"/>
+        <w:spacing w:lineRule="auto" w:line="240" w:before="0" w:after="26"/>
+        <w:rPr>
+          <w:b w:val="false"/>
+          <w:bCs w:val="false"/>
+          <w:u w:val="none"/>
+        </w:rPr>
+      </w:pPr>
+      <w:r>
+        <w:rPr>
+          <w:b w:val="false"/>
+          <w:bCs w:val="false"/>
+          <w:sz w:val="24"/>
+          <w:szCs w:val="24"/>
+          <w:u w:val="none"/>
+        </w:rPr>
+        <w:t>Spotify_connect has an observer to monitor new events coming from the spotify_event_handler socket. The events are listed in above section. There are 3 events which will be put in the message-queue for the statehandler in oradio_control:</w:t>
+      </w:r>
+    </w:p>
+    <w:p>
+      <w:pPr>
+        <w:pStyle w:val="BodyText"/>
+        <w:numPr>
+          <w:ilvl w:val="0"/>
+          <w:numId w:val="14"/>
+        </w:numPr>
+        <w:spacing w:lineRule="auto" w:line="240" w:before="0" w:after="26"/>
+        <w:rPr>
+          <w:b w:val="false"/>
+          <w:bCs w:val="false"/>
+          <w:u w:val="none"/>
+        </w:rPr>
+      </w:pPr>
+      <w:r>
+        <w:rPr>
+          <w:b w:val="false"/>
+          <w:bCs w:val="false"/>
+          <w:sz w:val="24"/>
+          <w:szCs w:val="24"/>
+          <w:u w:val="none"/>
+        </w:rPr>
+        <w:t>play: can be used to start the mpv player using the method provided by the class</w:t>
+      </w:r>
+    </w:p>
+    <w:p>
+      <w:pPr>
+        <w:pStyle w:val="BodyText"/>
+        <w:numPr>
+          <w:ilvl w:val="0"/>
+          <w:numId w:val="14"/>
+        </w:numPr>
+        <w:spacing w:lineRule="auto" w:line="240" w:before="0" w:after="26"/>
+        <w:rPr>
+          <w:b w:val="false"/>
+          <w:bCs w:val="false"/>
+          <w:u w:val="none"/>
+        </w:rPr>
+      </w:pPr>
+      <w:r>
+        <w:rPr>
+          <w:b w:val="false"/>
+          <w:bCs w:val="false"/>
+          <w:sz w:val="24"/>
+          <w:szCs w:val="24"/>
+          <w:u w:val="none"/>
+        </w:rPr>
+        <w:t>pause: can be used to pause the mpv player using the method provided by the class</w:t>
+      </w:r>
+    </w:p>
+    <w:p>
+      <w:pPr>
+        <w:pStyle w:val="BodyText"/>
+        <w:numPr>
+          <w:ilvl w:val="0"/>
+          <w:numId w:val="14"/>
+        </w:numPr>
+        <w:spacing w:lineRule="auto" w:line="240" w:before="0" w:after="26"/>
+        <w:rPr>
+          <w:b w:val="false"/>
+          <w:bCs w:val="false"/>
+          <w:u w:val="none"/>
+        </w:rPr>
+      </w:pPr>
+      <w:r>
+        <w:rPr>
+          <w:b w:val="false"/>
+          <w:bCs w:val="false"/>
+          <w:sz w:val="24"/>
+          <w:szCs w:val="24"/>
+          <w:u w:val="none"/>
+        </w:rPr>
+        <w:t>stop:can be used to stop the mpv player using the method provided by the class</w:t>
       </w:r>
     </w:p>
     <w:sectPr>
@@ -1938,6 +4311,7 @@
     </w:lvl>
     <w:lvl w:ilvl="3">
       <w:start w:val="1"/>
+      <w:pStyle w:val="Heading4"/>
       <w:numFmt w:val="none"/>
       <w:suff w:val="nothing"/>
       <w:lvlText w:val="%4"/>
@@ -2845,9 +5219,9 @@
       <w:lvlJc w:val="start"/>
       <w:pPr>
         <w:tabs>
-          <w:tab w:val="num" w:pos="709"/>
-        </w:tabs>
-        <w:ind w:start="709" w:hanging="283"/>
+          <w:tab w:val="num" w:pos="720"/>
+        </w:tabs>
+        <w:ind w:start="720" w:hanging="360"/>
       </w:pPr>
       <w:rPr>
         <w:rFonts w:ascii="Symbol" w:hAnsi="Symbol" w:cs="Symbol" w:hint="default"/>
@@ -2856,31 +5230,31 @@
     <w:lvl w:ilvl="1">
       <w:start w:val="1"/>
       <w:numFmt w:val="bullet"/>
-      <w:lvlText w:val=""/>
-      <w:lvlJc w:val="start"/>
-      <w:pPr>
-        <w:tabs>
-          <w:tab w:val="num" w:pos="1418"/>
-        </w:tabs>
-        <w:ind w:start="1418" w:hanging="283"/>
-      </w:pPr>
-      <w:rPr>
-        <w:rFonts w:ascii="Symbol" w:hAnsi="Symbol" w:cs="Symbol" w:hint="default"/>
+      <w:lvlText w:val="◦"/>
+      <w:lvlJc w:val="start"/>
+      <w:pPr>
+        <w:tabs>
+          <w:tab w:val="num" w:pos="1080"/>
+        </w:tabs>
+        <w:ind w:start="1080" w:hanging="360"/>
+      </w:pPr>
+      <w:rPr>
+        <w:rFonts w:ascii="OpenSymbol" w:hAnsi="OpenSymbol" w:cs="OpenSymbol" w:hint="default"/>
       </w:rPr>
     </w:lvl>
     <w:lvl w:ilvl="2">
       <w:start w:val="1"/>
       <w:numFmt w:val="bullet"/>
-      <w:lvlText w:val=""/>
-      <w:lvlJc w:val="start"/>
-      <w:pPr>
-        <w:tabs>
-          <w:tab w:val="num" w:pos="2127"/>
-        </w:tabs>
-        <w:ind w:start="2127" w:hanging="283"/>
-      </w:pPr>
-      <w:rPr>
-        <w:rFonts w:ascii="Symbol" w:hAnsi="Symbol" w:cs="Symbol" w:hint="default"/>
+      <w:lvlText w:val="▪"/>
+      <w:lvlJc w:val="start"/>
+      <w:pPr>
+        <w:tabs>
+          <w:tab w:val="num" w:pos="1440"/>
+        </w:tabs>
+        <w:ind w:start="1440" w:hanging="360"/>
+      </w:pPr>
+      <w:rPr>
+        <w:rFonts w:ascii="OpenSymbol" w:hAnsi="OpenSymbol" w:cs="OpenSymbol" w:hint="default"/>
       </w:rPr>
     </w:lvl>
     <w:lvl w:ilvl="3">
@@ -2890,9 +5264,9 @@
       <w:lvlJc w:val="start"/>
       <w:pPr>
         <w:tabs>
-          <w:tab w:val="num" w:pos="2836"/>
-        </w:tabs>
-        <w:ind w:start="2836" w:hanging="283"/>
+          <w:tab w:val="num" w:pos="1800"/>
+        </w:tabs>
+        <w:ind w:start="1800" w:hanging="360"/>
       </w:pPr>
       <w:rPr>
         <w:rFonts w:ascii="Symbol" w:hAnsi="Symbol" w:cs="Symbol" w:hint="default"/>
@@ -2901,31 +5275,31 @@
     <w:lvl w:ilvl="4">
       <w:start w:val="1"/>
       <w:numFmt w:val="bullet"/>
-      <w:lvlText w:val=""/>
-      <w:lvlJc w:val="start"/>
-      <w:pPr>
-        <w:tabs>
-          <w:tab w:val="num" w:pos="3545"/>
-        </w:tabs>
-        <w:ind w:start="3545" w:hanging="283"/>
-      </w:pPr>
-      <w:rPr>
-        <w:rFonts w:ascii="Symbol" w:hAnsi="Symbol" w:cs="Symbol" w:hint="default"/>
+      <w:lvlText w:val="◦"/>
+      <w:lvlJc w:val="start"/>
+      <w:pPr>
+        <w:tabs>
+          <w:tab w:val="num" w:pos="2160"/>
+        </w:tabs>
+        <w:ind w:start="2160" w:hanging="360"/>
+      </w:pPr>
+      <w:rPr>
+        <w:rFonts w:ascii="OpenSymbol" w:hAnsi="OpenSymbol" w:cs="OpenSymbol" w:hint="default"/>
       </w:rPr>
     </w:lvl>
     <w:lvl w:ilvl="5">
       <w:start w:val="1"/>
       <w:numFmt w:val="bullet"/>
-      <w:lvlText w:val=""/>
-      <w:lvlJc w:val="start"/>
-      <w:pPr>
-        <w:tabs>
-          <w:tab w:val="num" w:pos="4254"/>
-        </w:tabs>
-        <w:ind w:start="4254" w:hanging="283"/>
-      </w:pPr>
-      <w:rPr>
-        <w:rFonts w:ascii="Symbol" w:hAnsi="Symbol" w:cs="Symbol" w:hint="default"/>
+      <w:lvlText w:val="▪"/>
+      <w:lvlJc w:val="start"/>
+      <w:pPr>
+        <w:tabs>
+          <w:tab w:val="num" w:pos="2520"/>
+        </w:tabs>
+        <w:ind w:start="2520" w:hanging="360"/>
+      </w:pPr>
+      <w:rPr>
+        <w:rFonts w:ascii="OpenSymbol" w:hAnsi="OpenSymbol" w:cs="OpenSymbol" w:hint="default"/>
       </w:rPr>
     </w:lvl>
     <w:lvl w:ilvl="6">
@@ -2935,9 +5309,9 @@
       <w:lvlJc w:val="start"/>
       <w:pPr>
         <w:tabs>
-          <w:tab w:val="num" w:pos="4963"/>
-        </w:tabs>
-        <w:ind w:start="4963" w:hanging="283"/>
+          <w:tab w:val="num" w:pos="2880"/>
+        </w:tabs>
+        <w:ind w:start="2880" w:hanging="360"/>
       </w:pPr>
       <w:rPr>
         <w:rFonts w:ascii="Symbol" w:hAnsi="Symbol" w:cs="Symbol" w:hint="default"/>
@@ -2946,31 +5320,31 @@
     <w:lvl w:ilvl="7">
       <w:start w:val="1"/>
       <w:numFmt w:val="bullet"/>
-      <w:lvlText w:val=""/>
-      <w:lvlJc w:val="start"/>
-      <w:pPr>
-        <w:tabs>
-          <w:tab w:val="num" w:pos="5672"/>
-        </w:tabs>
-        <w:ind w:start="5672" w:hanging="283"/>
-      </w:pPr>
-      <w:rPr>
-        <w:rFonts w:ascii="Symbol" w:hAnsi="Symbol" w:cs="Symbol" w:hint="default"/>
+      <w:lvlText w:val="◦"/>
+      <w:lvlJc w:val="start"/>
+      <w:pPr>
+        <w:tabs>
+          <w:tab w:val="num" w:pos="3240"/>
+        </w:tabs>
+        <w:ind w:start="3240" w:hanging="360"/>
+      </w:pPr>
+      <w:rPr>
+        <w:rFonts w:ascii="OpenSymbol" w:hAnsi="OpenSymbol" w:cs="OpenSymbol" w:hint="default"/>
       </w:rPr>
     </w:lvl>
     <w:lvl w:ilvl="8">
       <w:start w:val="1"/>
       <w:numFmt w:val="bullet"/>
-      <w:lvlText w:val=""/>
-      <w:lvlJc w:val="start"/>
-      <w:pPr>
-        <w:tabs>
-          <w:tab w:val="num" w:pos="6381"/>
-        </w:tabs>
-        <w:ind w:start="6381" w:hanging="283"/>
-      </w:pPr>
-      <w:rPr>
-        <w:rFonts w:ascii="Symbol" w:hAnsi="Symbol" w:cs="Symbol" w:hint="default"/>
+      <w:lvlText w:val="▪"/>
+      <w:lvlJc w:val="start"/>
+      <w:pPr>
+        <w:tabs>
+          <w:tab w:val="num" w:pos="3600"/>
+        </w:tabs>
+        <w:ind w:start="3600" w:hanging="360"/>
+      </w:pPr>
+      <w:rPr>
+        <w:rFonts w:ascii="OpenSymbol" w:hAnsi="OpenSymbol" w:cs="OpenSymbol" w:hint="default"/>
       </w:rPr>
     </w:lvl>
   </w:abstractNum>
@@ -2982,9 +5356,9 @@
       <w:lvlJc w:val="start"/>
       <w:pPr>
         <w:tabs>
-          <w:tab w:val="num" w:pos="720"/>
-        </w:tabs>
-        <w:ind w:start="720" w:hanging="360"/>
+          <w:tab w:val="num" w:pos="709"/>
+        </w:tabs>
+        <w:ind w:start="709" w:hanging="283"/>
       </w:pPr>
       <w:rPr>
         <w:rFonts w:ascii="Symbol" w:hAnsi="Symbol" w:cs="Symbol" w:hint="default"/>
@@ -2993,31 +5367,31 @@
     <w:lvl w:ilvl="1">
       <w:start w:val="1"/>
       <w:numFmt w:val="bullet"/>
-      <w:lvlText w:val="◦"/>
-      <w:lvlJc w:val="start"/>
-      <w:pPr>
-        <w:tabs>
-          <w:tab w:val="num" w:pos="1080"/>
-        </w:tabs>
-        <w:ind w:start="1080" w:hanging="360"/>
-      </w:pPr>
-      <w:rPr>
-        <w:rFonts w:ascii="OpenSymbol" w:hAnsi="OpenSymbol" w:cs="OpenSymbol" w:hint="default"/>
+      <w:lvlText w:val=""/>
+      <w:lvlJc w:val="start"/>
+      <w:pPr>
+        <w:tabs>
+          <w:tab w:val="num" w:pos="1418"/>
+        </w:tabs>
+        <w:ind w:start="1418" w:hanging="283"/>
+      </w:pPr>
+      <w:rPr>
+        <w:rFonts w:ascii="Symbol" w:hAnsi="Symbol" w:cs="Symbol" w:hint="default"/>
       </w:rPr>
     </w:lvl>
     <w:lvl w:ilvl="2">
       <w:start w:val="1"/>
       <w:numFmt w:val="bullet"/>
-      <w:lvlText w:val="▪"/>
-      <w:lvlJc w:val="start"/>
-      <w:pPr>
-        <w:tabs>
-          <w:tab w:val="num" w:pos="1440"/>
-        </w:tabs>
-        <w:ind w:start="1440" w:hanging="360"/>
-      </w:pPr>
-      <w:rPr>
-        <w:rFonts w:ascii="OpenSymbol" w:hAnsi="OpenSymbol" w:cs="OpenSymbol" w:hint="default"/>
+      <w:lvlText w:val=""/>
+      <w:lvlJc w:val="start"/>
+      <w:pPr>
+        <w:tabs>
+          <w:tab w:val="num" w:pos="2127"/>
+        </w:tabs>
+        <w:ind w:start="2127" w:hanging="283"/>
+      </w:pPr>
+      <w:rPr>
+        <w:rFonts w:ascii="Symbol" w:hAnsi="Symbol" w:cs="Symbol" w:hint="default"/>
       </w:rPr>
     </w:lvl>
     <w:lvl w:ilvl="3">
@@ -3027,9 +5401,9 @@
       <w:lvlJc w:val="start"/>
       <w:pPr>
         <w:tabs>
-          <w:tab w:val="num" w:pos="1800"/>
-        </w:tabs>
-        <w:ind w:start="1800" w:hanging="360"/>
+          <w:tab w:val="num" w:pos="2836"/>
+        </w:tabs>
+        <w:ind w:start="2836" w:hanging="283"/>
       </w:pPr>
       <w:rPr>
         <w:rFonts w:ascii="Symbol" w:hAnsi="Symbol" w:cs="Symbol" w:hint="default"/>
@@ -3038,31 +5412,31 @@
     <w:lvl w:ilvl="4">
       <w:start w:val="1"/>
       <w:numFmt w:val="bullet"/>
-      <w:lvlText w:val="◦"/>
-      <w:lvlJc w:val="start"/>
-      <w:pPr>
-        <w:tabs>
-          <w:tab w:val="num" w:pos="2160"/>
-        </w:tabs>
-        <w:ind w:start="2160" w:hanging="360"/>
-      </w:pPr>
-      <w:rPr>
-        <w:rFonts w:ascii="OpenSymbol" w:hAnsi="OpenSymbol" w:cs="OpenSymbol" w:hint="default"/>
+      <w:lvlText w:val=""/>
+      <w:lvlJc w:val="start"/>
+      <w:pPr>
+        <w:tabs>
+          <w:tab w:val="num" w:pos="3545"/>
+        </w:tabs>
+        <w:ind w:start="3545" w:hanging="283"/>
+      </w:pPr>
+      <w:rPr>
+        <w:rFonts w:ascii="Symbol" w:hAnsi="Symbol" w:cs="Symbol" w:hint="default"/>
       </w:rPr>
     </w:lvl>
     <w:lvl w:ilvl="5">
       <w:start w:val="1"/>
       <w:numFmt w:val="bullet"/>
-      <w:lvlText w:val="▪"/>
-      <w:lvlJc w:val="start"/>
-      <w:pPr>
-        <w:tabs>
-          <w:tab w:val="num" w:pos="2520"/>
-        </w:tabs>
-        <w:ind w:start="2520" w:hanging="360"/>
-      </w:pPr>
-      <w:rPr>
-        <w:rFonts w:ascii="OpenSymbol" w:hAnsi="OpenSymbol" w:cs="OpenSymbol" w:hint="default"/>
+      <w:lvlText w:val=""/>
+      <w:lvlJc w:val="start"/>
+      <w:pPr>
+        <w:tabs>
+          <w:tab w:val="num" w:pos="4254"/>
+        </w:tabs>
+        <w:ind w:start="4254" w:hanging="283"/>
+      </w:pPr>
+      <w:rPr>
+        <w:rFonts w:ascii="Symbol" w:hAnsi="Symbol" w:cs="Symbol" w:hint="default"/>
       </w:rPr>
     </w:lvl>
     <w:lvl w:ilvl="6">
@@ -3072,9 +5446,9 @@
       <w:lvlJc w:val="start"/>
       <w:pPr>
         <w:tabs>
-          <w:tab w:val="num" w:pos="2880"/>
-        </w:tabs>
-        <w:ind w:start="2880" w:hanging="360"/>
+          <w:tab w:val="num" w:pos="4963"/>
+        </w:tabs>
+        <w:ind w:start="4963" w:hanging="283"/>
       </w:pPr>
       <w:rPr>
         <w:rFonts w:ascii="Symbol" w:hAnsi="Symbol" w:cs="Symbol" w:hint="default"/>
@@ -3083,31 +5457,31 @@
     <w:lvl w:ilvl="7">
       <w:start w:val="1"/>
       <w:numFmt w:val="bullet"/>
-      <w:lvlText w:val="◦"/>
-      <w:lvlJc w:val="start"/>
-      <w:pPr>
-        <w:tabs>
-          <w:tab w:val="num" w:pos="3240"/>
-        </w:tabs>
-        <w:ind w:start="3240" w:hanging="360"/>
-      </w:pPr>
-      <w:rPr>
-        <w:rFonts w:ascii="OpenSymbol" w:hAnsi="OpenSymbol" w:cs="OpenSymbol" w:hint="default"/>
+      <w:lvlText w:val=""/>
+      <w:lvlJc w:val="start"/>
+      <w:pPr>
+        <w:tabs>
+          <w:tab w:val="num" w:pos="5672"/>
+        </w:tabs>
+        <w:ind w:start="5672" w:hanging="283"/>
+      </w:pPr>
+      <w:rPr>
+        <w:rFonts w:ascii="Symbol" w:hAnsi="Symbol" w:cs="Symbol" w:hint="default"/>
       </w:rPr>
     </w:lvl>
     <w:lvl w:ilvl="8">
       <w:start w:val="1"/>
       <w:numFmt w:val="bullet"/>
-      <w:lvlText w:val="▪"/>
-      <w:lvlJc w:val="start"/>
-      <w:pPr>
-        <w:tabs>
-          <w:tab w:val="num" w:pos="3600"/>
-        </w:tabs>
-        <w:ind w:start="3600" w:hanging="360"/>
-      </w:pPr>
-      <w:rPr>
-        <w:rFonts w:ascii="OpenSymbol" w:hAnsi="OpenSymbol" w:cs="OpenSymbol" w:hint="default"/>
+      <w:lvlText w:val=""/>
+      <w:lvlJc w:val="start"/>
+      <w:pPr>
+        <w:tabs>
+          <w:tab w:val="num" w:pos="6381"/>
+        </w:tabs>
+        <w:ind w:start="6381" w:hanging="283"/>
+      </w:pPr>
+      <w:rPr>
+        <w:rFonts w:ascii="Symbol" w:hAnsi="Symbol" w:cs="Symbol" w:hint="default"/>
       </w:rPr>
     </w:lvl>
   </w:abstractNum>
@@ -3472,6 +5846,417 @@
         </w:tabs>
         <w:ind w:start="3600" w:hanging="360"/>
       </w:pPr>
+    </w:lvl>
+  </w:abstractNum>
+  <w:abstractNum w:abstractNumId="13">
+    <w:lvl w:ilvl="0">
+      <w:start w:val="1"/>
+      <w:numFmt w:val="bullet"/>
+      <w:lvlText w:val=""/>
+      <w:lvlJc w:val="start"/>
+      <w:pPr>
+        <w:tabs>
+          <w:tab w:val="num" w:pos="720"/>
+        </w:tabs>
+        <w:ind w:start="720" w:hanging="360"/>
+      </w:pPr>
+      <w:rPr>
+        <w:rFonts w:ascii="Symbol" w:hAnsi="Symbol" w:cs="Symbol" w:hint="default"/>
+      </w:rPr>
+    </w:lvl>
+    <w:lvl w:ilvl="1">
+      <w:start w:val="1"/>
+      <w:numFmt w:val="bullet"/>
+      <w:lvlText w:val="◦"/>
+      <w:lvlJc w:val="start"/>
+      <w:pPr>
+        <w:tabs>
+          <w:tab w:val="num" w:pos="1080"/>
+        </w:tabs>
+        <w:ind w:start="1080" w:hanging="360"/>
+      </w:pPr>
+      <w:rPr>
+        <w:rFonts w:ascii="OpenSymbol" w:hAnsi="OpenSymbol" w:cs="OpenSymbol" w:hint="default"/>
+      </w:rPr>
+    </w:lvl>
+    <w:lvl w:ilvl="2">
+      <w:start w:val="1"/>
+      <w:numFmt w:val="bullet"/>
+      <w:lvlText w:val="▪"/>
+      <w:lvlJc w:val="start"/>
+      <w:pPr>
+        <w:tabs>
+          <w:tab w:val="num" w:pos="1440"/>
+        </w:tabs>
+        <w:ind w:start="1440" w:hanging="360"/>
+      </w:pPr>
+      <w:rPr>
+        <w:rFonts w:ascii="OpenSymbol" w:hAnsi="OpenSymbol" w:cs="OpenSymbol" w:hint="default"/>
+      </w:rPr>
+    </w:lvl>
+    <w:lvl w:ilvl="3">
+      <w:start w:val="1"/>
+      <w:numFmt w:val="bullet"/>
+      <w:lvlText w:val=""/>
+      <w:lvlJc w:val="start"/>
+      <w:pPr>
+        <w:tabs>
+          <w:tab w:val="num" w:pos="1800"/>
+        </w:tabs>
+        <w:ind w:start="1800" w:hanging="360"/>
+      </w:pPr>
+      <w:rPr>
+        <w:rFonts w:ascii="Symbol" w:hAnsi="Symbol" w:cs="Symbol" w:hint="default"/>
+      </w:rPr>
+    </w:lvl>
+    <w:lvl w:ilvl="4">
+      <w:start w:val="1"/>
+      <w:numFmt w:val="bullet"/>
+      <w:lvlText w:val="◦"/>
+      <w:lvlJc w:val="start"/>
+      <w:pPr>
+        <w:tabs>
+          <w:tab w:val="num" w:pos="2160"/>
+        </w:tabs>
+        <w:ind w:start="2160" w:hanging="360"/>
+      </w:pPr>
+      <w:rPr>
+        <w:rFonts w:ascii="OpenSymbol" w:hAnsi="OpenSymbol" w:cs="OpenSymbol" w:hint="default"/>
+      </w:rPr>
+    </w:lvl>
+    <w:lvl w:ilvl="5">
+      <w:start w:val="1"/>
+      <w:numFmt w:val="bullet"/>
+      <w:lvlText w:val="▪"/>
+      <w:lvlJc w:val="start"/>
+      <w:pPr>
+        <w:tabs>
+          <w:tab w:val="num" w:pos="2520"/>
+        </w:tabs>
+        <w:ind w:start="2520" w:hanging="360"/>
+      </w:pPr>
+      <w:rPr>
+        <w:rFonts w:ascii="OpenSymbol" w:hAnsi="OpenSymbol" w:cs="OpenSymbol" w:hint="default"/>
+      </w:rPr>
+    </w:lvl>
+    <w:lvl w:ilvl="6">
+      <w:start w:val="1"/>
+      <w:numFmt w:val="bullet"/>
+      <w:lvlText w:val=""/>
+      <w:lvlJc w:val="start"/>
+      <w:pPr>
+        <w:tabs>
+          <w:tab w:val="num" w:pos="2880"/>
+        </w:tabs>
+        <w:ind w:start="2880" w:hanging="360"/>
+      </w:pPr>
+      <w:rPr>
+        <w:rFonts w:ascii="Symbol" w:hAnsi="Symbol" w:cs="Symbol" w:hint="default"/>
+      </w:rPr>
+    </w:lvl>
+    <w:lvl w:ilvl="7">
+      <w:start w:val="1"/>
+      <w:numFmt w:val="bullet"/>
+      <w:lvlText w:val="◦"/>
+      <w:lvlJc w:val="start"/>
+      <w:pPr>
+        <w:tabs>
+          <w:tab w:val="num" w:pos="3240"/>
+        </w:tabs>
+        <w:ind w:start="3240" w:hanging="360"/>
+      </w:pPr>
+      <w:rPr>
+        <w:rFonts w:ascii="OpenSymbol" w:hAnsi="OpenSymbol" w:cs="OpenSymbol" w:hint="default"/>
+      </w:rPr>
+    </w:lvl>
+    <w:lvl w:ilvl="8">
+      <w:start w:val="1"/>
+      <w:numFmt w:val="bullet"/>
+      <w:lvlText w:val="▪"/>
+      <w:lvlJc w:val="start"/>
+      <w:pPr>
+        <w:tabs>
+          <w:tab w:val="num" w:pos="3600"/>
+        </w:tabs>
+        <w:ind w:start="3600" w:hanging="360"/>
+      </w:pPr>
+      <w:rPr>
+        <w:rFonts w:ascii="OpenSymbol" w:hAnsi="OpenSymbol" w:cs="OpenSymbol" w:hint="default"/>
+      </w:rPr>
+    </w:lvl>
+  </w:abstractNum>
+  <w:abstractNum w:abstractNumId="14">
+    <w:lvl w:ilvl="0">
+      <w:start w:val="1"/>
+      <w:numFmt w:val="bullet"/>
+      <w:lvlText w:val=""/>
+      <w:lvlJc w:val="start"/>
+      <w:pPr>
+        <w:tabs>
+          <w:tab w:val="num" w:pos="720"/>
+        </w:tabs>
+        <w:ind w:start="720" w:hanging="360"/>
+      </w:pPr>
+      <w:rPr>
+        <w:rFonts w:ascii="Symbol" w:hAnsi="Symbol" w:cs="Symbol" w:hint="default"/>
+      </w:rPr>
+    </w:lvl>
+    <w:lvl w:ilvl="1">
+      <w:start w:val="1"/>
+      <w:numFmt w:val="bullet"/>
+      <w:lvlText w:val="◦"/>
+      <w:lvlJc w:val="start"/>
+      <w:pPr>
+        <w:tabs>
+          <w:tab w:val="num" w:pos="1080"/>
+        </w:tabs>
+        <w:ind w:start="1080" w:hanging="360"/>
+      </w:pPr>
+      <w:rPr>
+        <w:rFonts w:ascii="OpenSymbol" w:hAnsi="OpenSymbol" w:cs="OpenSymbol" w:hint="default"/>
+      </w:rPr>
+    </w:lvl>
+    <w:lvl w:ilvl="2">
+      <w:start w:val="1"/>
+      <w:numFmt w:val="bullet"/>
+      <w:lvlText w:val="▪"/>
+      <w:lvlJc w:val="start"/>
+      <w:pPr>
+        <w:tabs>
+          <w:tab w:val="num" w:pos="1440"/>
+        </w:tabs>
+        <w:ind w:start="1440" w:hanging="360"/>
+      </w:pPr>
+      <w:rPr>
+        <w:rFonts w:ascii="OpenSymbol" w:hAnsi="OpenSymbol" w:cs="OpenSymbol" w:hint="default"/>
+      </w:rPr>
+    </w:lvl>
+    <w:lvl w:ilvl="3">
+      <w:start w:val="1"/>
+      <w:numFmt w:val="bullet"/>
+      <w:lvlText w:val=""/>
+      <w:lvlJc w:val="start"/>
+      <w:pPr>
+        <w:tabs>
+          <w:tab w:val="num" w:pos="1800"/>
+        </w:tabs>
+        <w:ind w:start="1800" w:hanging="360"/>
+      </w:pPr>
+      <w:rPr>
+        <w:rFonts w:ascii="Symbol" w:hAnsi="Symbol" w:cs="Symbol" w:hint="default"/>
+      </w:rPr>
+    </w:lvl>
+    <w:lvl w:ilvl="4">
+      <w:start w:val="1"/>
+      <w:numFmt w:val="bullet"/>
+      <w:lvlText w:val="◦"/>
+      <w:lvlJc w:val="start"/>
+      <w:pPr>
+        <w:tabs>
+          <w:tab w:val="num" w:pos="2160"/>
+        </w:tabs>
+        <w:ind w:start="2160" w:hanging="360"/>
+      </w:pPr>
+      <w:rPr>
+        <w:rFonts w:ascii="OpenSymbol" w:hAnsi="OpenSymbol" w:cs="OpenSymbol" w:hint="default"/>
+      </w:rPr>
+    </w:lvl>
+    <w:lvl w:ilvl="5">
+      <w:start w:val="1"/>
+      <w:numFmt w:val="bullet"/>
+      <w:lvlText w:val="▪"/>
+      <w:lvlJc w:val="start"/>
+      <w:pPr>
+        <w:tabs>
+          <w:tab w:val="num" w:pos="2520"/>
+        </w:tabs>
+        <w:ind w:start="2520" w:hanging="360"/>
+      </w:pPr>
+      <w:rPr>
+        <w:rFonts w:ascii="OpenSymbol" w:hAnsi="OpenSymbol" w:cs="OpenSymbol" w:hint="default"/>
+      </w:rPr>
+    </w:lvl>
+    <w:lvl w:ilvl="6">
+      <w:start w:val="1"/>
+      <w:numFmt w:val="bullet"/>
+      <w:lvlText w:val=""/>
+      <w:lvlJc w:val="start"/>
+      <w:pPr>
+        <w:tabs>
+          <w:tab w:val="num" w:pos="2880"/>
+        </w:tabs>
+        <w:ind w:start="2880" w:hanging="360"/>
+      </w:pPr>
+      <w:rPr>
+        <w:rFonts w:ascii="Symbol" w:hAnsi="Symbol" w:cs="Symbol" w:hint="default"/>
+      </w:rPr>
+    </w:lvl>
+    <w:lvl w:ilvl="7">
+      <w:start w:val="1"/>
+      <w:numFmt w:val="bullet"/>
+      <w:lvlText w:val="◦"/>
+      <w:lvlJc w:val="start"/>
+      <w:pPr>
+        <w:tabs>
+          <w:tab w:val="num" w:pos="3240"/>
+        </w:tabs>
+        <w:ind w:start="3240" w:hanging="360"/>
+      </w:pPr>
+      <w:rPr>
+        <w:rFonts w:ascii="OpenSymbol" w:hAnsi="OpenSymbol" w:cs="OpenSymbol" w:hint="default"/>
+      </w:rPr>
+    </w:lvl>
+    <w:lvl w:ilvl="8">
+      <w:start w:val="1"/>
+      <w:numFmt w:val="bullet"/>
+      <w:lvlText w:val="▪"/>
+      <w:lvlJc w:val="start"/>
+      <w:pPr>
+        <w:tabs>
+          <w:tab w:val="num" w:pos="3600"/>
+        </w:tabs>
+        <w:ind w:start="3600" w:hanging="360"/>
+      </w:pPr>
+      <w:rPr>
+        <w:rFonts w:ascii="OpenSymbol" w:hAnsi="OpenSymbol" w:cs="OpenSymbol" w:hint="default"/>
+      </w:rPr>
+    </w:lvl>
+  </w:abstractNum>
+  <w:abstractNum w:abstractNumId="15">
+    <w:lvl w:ilvl="0">
+      <w:start w:val="1"/>
+      <w:numFmt w:val="bullet"/>
+      <w:lvlText w:val=""/>
+      <w:lvlJc w:val="start"/>
+      <w:pPr>
+        <w:tabs>
+          <w:tab w:val="num" w:pos="720"/>
+        </w:tabs>
+        <w:ind w:start="720" w:hanging="360"/>
+      </w:pPr>
+      <w:rPr>
+        <w:rFonts w:ascii="Symbol" w:hAnsi="Symbol" w:cs="Symbol" w:hint="default"/>
+      </w:rPr>
+    </w:lvl>
+    <w:lvl w:ilvl="1">
+      <w:start w:val="1"/>
+      <w:numFmt w:val="bullet"/>
+      <w:lvlText w:val="◦"/>
+      <w:lvlJc w:val="start"/>
+      <w:pPr>
+        <w:tabs>
+          <w:tab w:val="num" w:pos="1080"/>
+        </w:tabs>
+        <w:ind w:start="1080" w:hanging="360"/>
+      </w:pPr>
+      <w:rPr>
+        <w:rFonts w:ascii="OpenSymbol" w:hAnsi="OpenSymbol" w:cs="OpenSymbol" w:hint="default"/>
+      </w:rPr>
+    </w:lvl>
+    <w:lvl w:ilvl="2">
+      <w:start w:val="1"/>
+      <w:numFmt w:val="bullet"/>
+      <w:lvlText w:val="▪"/>
+      <w:lvlJc w:val="start"/>
+      <w:pPr>
+        <w:tabs>
+          <w:tab w:val="num" w:pos="1440"/>
+        </w:tabs>
+        <w:ind w:start="1440" w:hanging="360"/>
+      </w:pPr>
+      <w:rPr>
+        <w:rFonts w:ascii="OpenSymbol" w:hAnsi="OpenSymbol" w:cs="OpenSymbol" w:hint="default"/>
+      </w:rPr>
+    </w:lvl>
+    <w:lvl w:ilvl="3">
+      <w:start w:val="1"/>
+      <w:numFmt w:val="bullet"/>
+      <w:lvlText w:val=""/>
+      <w:lvlJc w:val="start"/>
+      <w:pPr>
+        <w:tabs>
+          <w:tab w:val="num" w:pos="1800"/>
+        </w:tabs>
+        <w:ind w:start="1800" w:hanging="360"/>
+      </w:pPr>
+      <w:rPr>
+        <w:rFonts w:ascii="Symbol" w:hAnsi="Symbol" w:cs="Symbol" w:hint="default"/>
+      </w:rPr>
+    </w:lvl>
+    <w:lvl w:ilvl="4">
+      <w:start w:val="1"/>
+      <w:numFmt w:val="bullet"/>
+      <w:lvlText w:val="◦"/>
+      <w:lvlJc w:val="start"/>
+      <w:pPr>
+        <w:tabs>
+          <w:tab w:val="num" w:pos="2160"/>
+        </w:tabs>
+        <w:ind w:start="2160" w:hanging="360"/>
+      </w:pPr>
+      <w:rPr>
+        <w:rFonts w:ascii="OpenSymbol" w:hAnsi="OpenSymbol" w:cs="OpenSymbol" w:hint="default"/>
+      </w:rPr>
+    </w:lvl>
+    <w:lvl w:ilvl="5">
+      <w:start w:val="1"/>
+      <w:numFmt w:val="bullet"/>
+      <w:lvlText w:val="▪"/>
+      <w:lvlJc w:val="start"/>
+      <w:pPr>
+        <w:tabs>
+          <w:tab w:val="num" w:pos="2520"/>
+        </w:tabs>
+        <w:ind w:start="2520" w:hanging="360"/>
+      </w:pPr>
+      <w:rPr>
+        <w:rFonts w:ascii="OpenSymbol" w:hAnsi="OpenSymbol" w:cs="OpenSymbol" w:hint="default"/>
+      </w:rPr>
+    </w:lvl>
+    <w:lvl w:ilvl="6">
+      <w:start w:val="1"/>
+      <w:numFmt w:val="bullet"/>
+      <w:lvlText w:val=""/>
+      <w:lvlJc w:val="start"/>
+      <w:pPr>
+        <w:tabs>
+          <w:tab w:val="num" w:pos="2880"/>
+        </w:tabs>
+        <w:ind w:start="2880" w:hanging="360"/>
+      </w:pPr>
+      <w:rPr>
+        <w:rFonts w:ascii="Symbol" w:hAnsi="Symbol" w:cs="Symbol" w:hint="default"/>
+      </w:rPr>
+    </w:lvl>
+    <w:lvl w:ilvl="7">
+      <w:start w:val="1"/>
+      <w:numFmt w:val="bullet"/>
+      <w:lvlText w:val="◦"/>
+      <w:lvlJc w:val="start"/>
+      <w:pPr>
+        <w:tabs>
+          <w:tab w:val="num" w:pos="3240"/>
+        </w:tabs>
+        <w:ind w:start="3240" w:hanging="360"/>
+      </w:pPr>
+      <w:rPr>
+        <w:rFonts w:ascii="OpenSymbol" w:hAnsi="OpenSymbol" w:cs="OpenSymbol" w:hint="default"/>
+      </w:rPr>
+    </w:lvl>
+    <w:lvl w:ilvl="8">
+      <w:start w:val="1"/>
+      <w:numFmt w:val="bullet"/>
+      <w:lvlText w:val="▪"/>
+      <w:lvlJc w:val="start"/>
+      <w:pPr>
+        <w:tabs>
+          <w:tab w:val="num" w:pos="3600"/>
+        </w:tabs>
+        <w:ind w:start="3600" w:hanging="360"/>
+      </w:pPr>
+      <w:rPr>
+        <w:rFonts w:ascii="OpenSymbol" w:hAnsi="OpenSymbol" w:cs="OpenSymbol" w:hint="default"/>
+      </w:rPr>
     </w:lvl>
   </w:abstractNum>
   <w:num w:numId="1">
@@ -3509,6 +6294,15 @@
   </w:num>
   <w:num w:numId="12">
     <w:abstractNumId w:val="12"/>
+  </w:num>
+  <w:num w:numId="13">
+    <w:abstractNumId w:val="13"/>
+  </w:num>
+  <w:num w:numId="14">
+    <w:abstractNumId w:val="14"/>
+  </w:num>
+  <w:num w:numId="15">
+    <w:abstractNumId w:val="15"/>
   </w:num>
 </w:numbering>
 </file>
@@ -3593,6 +6387,23 @@
       <w:szCs w:val="28"/>
     </w:rPr>
   </w:style>
+  <w:style w:type="paragraph" w:styleId="Heading4">
+    <w:name w:val="Heading 4"/>
+    <w:basedOn w:val="Heading"/>
+    <w:next w:val="BodyText"/>
+    <w:qFormat/>
+    <w:pPr>
+      <w:spacing w:before="120" w:after="120"/>
+      <w:outlineLvl w:val="3"/>
+    </w:pPr>
+    <w:rPr>
+      <w:rFonts w:ascii="Liberation Serif" w:hAnsi="Liberation Serif" w:eastAsia="Noto Serif CJK SC" w:cs="Noto Sans Devanagari"/>
+      <w:b/>
+      <w:bCs/>
+      <w:sz w:val="24"/>
+      <w:szCs w:val="24"/>
+    </w:rPr>
+  </w:style>
   <w:style w:type="character" w:styleId="Hyperlink">
     <w:name w:val="Hyperlink"/>
     <w:rPr>
@@ -3633,6 +6444,13 @@
     <w:rPr>
       <w:i/>
       <w:iCs/>
+    </w:rPr>
+  </w:style>
+  <w:style w:type="character" w:styleId="FollowedHyperlink">
+    <w:name w:val="FollowedHyperlink"/>
+    <w:rPr>
+      <w:color w:val="800000"/>
+      <w:u w:val="single"/>
     </w:rPr>
   </w:style>
   <w:style w:type="paragraph" w:styleId="Heading">
@@ -3704,6 +6522,29 @@
       <w:rFonts w:ascii="Liberation Mono" w:hAnsi="Liberation Mono" w:eastAsia="Noto Sans Mono CJK SC" w:cs="Liberation Mono"/>
       <w:sz w:val="20"/>
       <w:szCs w:val="20"/>
+    </w:rPr>
+  </w:style>
+  <w:style w:type="paragraph" w:styleId="TableContents">
+    <w:name w:val="Table Contents"/>
+    <w:basedOn w:val="Normal"/>
+    <w:qFormat/>
+    <w:pPr>
+      <w:widowControl w:val="false"/>
+      <w:suppressLineNumbers/>
+    </w:pPr>
+    <w:rPr/>
+  </w:style>
+  <w:style w:type="paragraph" w:styleId="TableHeading">
+    <w:name w:val="Table Heading"/>
+    <w:basedOn w:val="TableContents"/>
+    <w:qFormat/>
+    <w:pPr>
+      <w:suppressLineNumbers/>
+      <w:jc w:val="center"/>
+    </w:pPr>
+    <w:rPr>
+      <w:b/>
+      <w:bCs/>
     </w:rPr>
   </w:style>
 </w:styles>

</xml_diff>

<commit_message>
Update Spotify Connect design.docx, Spotify Connect design.odt, and 5 more files...
</commit_message>
<xml_diff>
--- a/Documents/Spotify/Spotify Connect design.docx
+++ b/Documents/Spotify/Spotify Connect design.docx
@@ -915,41 +915,6 @@
       <w:pPr>
         <w:pStyle w:val="Normal"/>
         <w:rPr>
-          <w:b w:val="false"/>
-          <w:bCs w:val="false"/>
-          <w:u w:val="none"/>
-        </w:rPr>
-      </w:pPr>
-      <w:r>
-        <w:rPr>
-          <w:b w:val="false"/>
-          <w:bCs w:val="false"/>
-          <w:u w:val="none"/>
-        </w:rPr>
-        <w:t>Librespot provides an audio-pipe to the MPV player.</w:t>
-      </w:r>
-    </w:p>
-    <w:p>
-      <w:pPr>
-        <w:pStyle w:val="Normal"/>
-        <w:rPr>
-          <w:b w:val="false"/>
-          <w:bCs w:val="false"/>
-          <w:u w:val="none"/>
-        </w:rPr>
-      </w:pPr>
-      <w:r>
-        <w:rPr>
-          <w:b w:val="false"/>
-          <w:bCs w:val="false"/>
-          <w:u w:val="none"/>
-        </w:rPr>
-      </w:r>
-    </w:p>
-    <w:p>
-      <w:pPr>
-        <w:pStyle w:val="Normal"/>
-        <w:rPr>
           <w:b/>
           <w:bCs/>
           <w:u w:val="single"/>
@@ -961,43 +926,107 @@
           <w:bCs/>
           <w:u w:val="single"/>
         </w:rPr>
-        <w:t>Avahi-daemon:</w:t>
-      </w:r>
-    </w:p>
-    <w:p>
-      <w:pPr>
-        <w:pStyle w:val="BodyText"/>
-        <w:rPr>
-          <w:b w:val="false"/>
-          <w:bCs w:val="false"/>
-          <w:u w:val="none"/>
-        </w:rPr>
-      </w:pPr>
-      <w:r>
-        <w:rPr>
-          <w:b w:val="false"/>
-          <w:bCs w:val="false"/>
-          <w:u w:val="none"/>
-        </w:rPr>
-        <w:t>Librespot uses the avahi-api to publish the Spotify Connect Service.</w:t>
-      </w:r>
-    </w:p>
-    <w:p>
-      <w:pPr>
-        <w:pStyle w:val="BodyText"/>
-        <w:rPr>
-          <w:b w:val="false"/>
-          <w:bCs w:val="false"/>
-          <w:u w:val="none"/>
-        </w:rPr>
-      </w:pPr>
-      <w:r>
-        <w:rPr>
-          <w:b w:val="false"/>
-          <w:bCs w:val="false"/>
-          <w:u w:val="none"/>
-        </w:rPr>
-        <w:t>This service contains metadata (TXT records) such as:</w:t>
+        <w:t>Librespot keep-alive mechanism</w:t>
+      </w:r>
+    </w:p>
+    <w:p>
+      <w:pPr>
+        <w:pStyle w:val="Normal"/>
+        <w:rPr>
+          <w:b/>
+          <w:bCs/>
+          <w:u w:val="single"/>
+        </w:rPr>
+      </w:pPr>
+      <w:r>
+        <w:rPr>
+          <w:b/>
+          <w:bCs/>
+          <w:u w:val="single"/>
+        </w:rPr>
+      </w:r>
+    </w:p>
+    <w:p>
+      <w:pPr>
+        <w:pStyle w:val="BodyText"/>
+        <w:rPr>
+          <w:b w:val="false"/>
+          <w:bCs w:val="false"/>
+          <w:u w:val="none"/>
+        </w:rPr>
+      </w:pPr>
+      <w:r>
+        <w:rPr>
+          <w:b w:val="false"/>
+          <w:bCs w:val="false"/>
+          <w:sz w:val="24"/>
+          <w:szCs w:val="24"/>
+          <w:u w:val="none"/>
+        </w:rPr>
+        <w:t xml:space="preserve">The </w:t>
+      </w:r>
+      <w:r>
+        <w:rPr>
+          <w:rStyle w:val="Strong"/>
+          <w:b w:val="false"/>
+          <w:bCs w:val="false"/>
+          <w:sz w:val="24"/>
+          <w:szCs w:val="24"/>
+          <w:u w:val="none"/>
+        </w:rPr>
+        <w:t>Pong</w:t>
+      </w:r>
+      <w:r>
+        <w:rPr>
+          <w:b w:val="false"/>
+          <w:bCs w:val="false"/>
+          <w:sz w:val="24"/>
+          <w:szCs w:val="24"/>
+          <w:u w:val="none"/>
+        </w:rPr>
+        <w:t xml:space="preserve"> messages in </w:t>
+      </w:r>
+      <w:r>
+        <w:rPr>
+          <w:rStyle w:val="Strong"/>
+          <w:b w:val="false"/>
+          <w:bCs w:val="false"/>
+          <w:sz w:val="24"/>
+          <w:szCs w:val="24"/>
+          <w:u w:val="none"/>
+        </w:rPr>
+        <w:t>librespot</w:t>
+      </w:r>
+      <w:r>
+        <w:rPr>
+          <w:b w:val="false"/>
+          <w:bCs w:val="false"/>
+          <w:sz w:val="24"/>
+          <w:szCs w:val="24"/>
+          <w:u w:val="none"/>
+        </w:rPr>
+        <w:t xml:space="preserve"> are part of a </w:t>
+      </w:r>
+      <w:r>
+        <w:rPr>
+          <w:rStyle w:val="Strong"/>
+          <w:b w:val="false"/>
+          <w:bCs w:val="false"/>
+          <w:sz w:val="24"/>
+          <w:szCs w:val="24"/>
+          <w:u w:val="none"/>
+        </w:rPr>
+        <w:t>keep-alive mechanism</w:t>
+      </w:r>
+      <w:r>
+        <w:rPr>
+          <w:b w:val="false"/>
+          <w:bCs w:val="false"/>
+          <w:sz w:val="24"/>
+          <w:szCs w:val="24"/>
+          <w:u w:val="none"/>
+        </w:rPr>
+        <w:t xml:space="preserve"> to maintain the connection with Spotify's servers. Here's what's happening:</w:t>
       </w:r>
     </w:p>
     <w:p>
@@ -1016,16 +1045,25 @@
         <w:rPr/>
       </w:pPr>
       <w:r>
-        <w:rPr/>
-        <w:t>Device name (e.g., “</w:t>
-      </w:r>
-      <w:r>
-        <w:rPr/>
-        <w:t>Oradio-luidspreker”</w:t>
-      </w:r>
-      <w:r>
-        <w:rPr/>
-        <w:t xml:space="preserve"> )</w:t>
+        <w:rPr>
+          <w:rStyle w:val="Strong"/>
+          <w:b w:val="false"/>
+          <w:bCs w:val="false"/>
+          <w:sz w:val="24"/>
+          <w:szCs w:val="24"/>
+          <w:u w:val="none"/>
+        </w:rPr>
+        <w:t>Sending Pong</w:t>
+      </w:r>
+      <w:r>
+        <w:rPr>
+          <w:b w:val="false"/>
+          <w:bCs w:val="false"/>
+          <w:sz w:val="24"/>
+          <w:szCs w:val="24"/>
+          <w:u w:val="none"/>
+        </w:rPr>
+        <w:t xml:space="preserve"> → librespot is responding to a "Ping" from Spotify’s server.</w:t>
       </w:r>
     </w:p>
     <w:p>
@@ -1044,8 +1082,67 @@
         <w:rPr/>
       </w:pPr>
       <w:r>
-        <w:rPr/>
-        <w:t>Supported sample rate, bit depth, and codec</w:t>
+        <w:rPr>
+          <w:rStyle w:val="Strong"/>
+          <w:b w:val="false"/>
+          <w:bCs w:val="false"/>
+          <w:sz w:val="24"/>
+          <w:szCs w:val="24"/>
+          <w:u w:val="none"/>
+        </w:rPr>
+        <w:t>ExpectingPongAck</w:t>
+      </w:r>
+      <w:r>
+        <w:rPr>
+          <w:b w:val="false"/>
+          <w:bCs w:val="false"/>
+          <w:sz w:val="24"/>
+          <w:szCs w:val="24"/>
+          <w:u w:val="none"/>
+        </w:rPr>
+        <w:t xml:space="preserve"> → librespot waits for an acknowledgment (</w:t>
+      </w:r>
+      <w:r>
+        <w:rPr>
+          <w:rStyle w:val="Strong"/>
+          <w:b w:val="false"/>
+          <w:bCs w:val="false"/>
+          <w:sz w:val="24"/>
+          <w:szCs w:val="24"/>
+          <w:u w:val="none"/>
+        </w:rPr>
+        <w:t>PongAck</w:t>
+      </w:r>
+      <w:r>
+        <w:rPr>
+          <w:b w:val="false"/>
+          <w:bCs w:val="false"/>
+          <w:sz w:val="24"/>
+          <w:szCs w:val="24"/>
+          <w:u w:val="none"/>
+        </w:rPr>
+        <w:t xml:space="preserve">) from Spotify, with a timeout of </w:t>
+      </w:r>
+      <w:r>
+        <w:rPr>
+          <w:rStyle w:val="Strong"/>
+          <w:b w:val="false"/>
+          <w:bCs w:val="false"/>
+          <w:sz w:val="24"/>
+          <w:szCs w:val="24"/>
+          <w:u w:val="none"/>
+        </w:rPr>
+        <w:t>20 seconds</w:t>
+      </w:r>
+      <w:r>
+        <w:rPr>
+          <w:b w:val="false"/>
+          <w:bCs w:val="false"/>
+          <w:sz w:val="24"/>
+          <w:szCs w:val="24"/>
+          <w:u w:val="none"/>
+        </w:rPr>
+        <w:t>.</w:t>
       </w:r>
     </w:p>
     <w:p>
@@ -1059,12 +1156,473 @@
           <w:tab w:val="clear" w:pos="709"/>
           <w:tab w:val="left" w:pos="709" w:leader="none"/>
         </w:tabs>
+        <w:spacing w:before="0" w:after="0"/>
         <w:ind w:hanging="283" w:start="709"/>
         <w:rPr/>
       </w:pPr>
       <w:r>
+        <w:rPr>
+          <w:rStyle w:val="Strong"/>
+          <w:b w:val="false"/>
+          <w:bCs w:val="false"/>
+          <w:sz w:val="24"/>
+          <w:szCs w:val="24"/>
+          <w:u w:val="none"/>
+        </w:rPr>
+        <w:t>Received PongAck</w:t>
+      </w:r>
+      <w:r>
+        <w:rPr>
+          <w:b w:val="false"/>
+          <w:bCs w:val="false"/>
+          <w:sz w:val="24"/>
+          <w:szCs w:val="24"/>
+          <w:u w:val="none"/>
+        </w:rPr>
+        <w:t xml:space="preserve"> → The acknowledgment arrives, confirming the connection is still active.</w:t>
+      </w:r>
+    </w:p>
+    <w:p>
+      <w:pPr>
+        <w:pStyle w:val="BodyText"/>
+        <w:numPr>
+          <w:ilvl w:val="0"/>
+          <w:numId w:val="7"/>
+        </w:numPr>
+        <w:tabs>
+          <w:tab w:val="clear" w:pos="709"/>
+          <w:tab w:val="left" w:pos="709" w:leader="none"/>
+        </w:tabs>
+        <w:ind w:hanging="283" w:start="709"/>
+        <w:rPr/>
+      </w:pPr>
+      <w:r>
+        <w:rPr>
+          <w:rStyle w:val="Strong"/>
+          <w:b w:val="false"/>
+          <w:bCs w:val="false"/>
+          <w:sz w:val="24"/>
+          <w:szCs w:val="24"/>
+          <w:u w:val="none"/>
+        </w:rPr>
+        <w:t>ExpectingPing</w:t>
+      </w:r>
+      <w:r>
+        <w:rPr>
+          <w:b w:val="false"/>
+          <w:bCs w:val="false"/>
+          <w:sz w:val="24"/>
+          <w:szCs w:val="24"/>
+          <w:u w:val="none"/>
+        </w:rPr>
+        <w:t xml:space="preserve"> → librespot now waits for another "Ping" from Spotify, with a timeout of </w:t>
+      </w:r>
+      <w:r>
+        <w:rPr>
+          <w:rStyle w:val="Strong"/>
+          <w:b w:val="false"/>
+          <w:bCs w:val="false"/>
+          <w:sz w:val="24"/>
+          <w:szCs w:val="24"/>
+          <w:u w:val="none"/>
+        </w:rPr>
+        <w:t>80 seconds</w:t>
+      </w:r>
+      <w:r>
+        <w:rPr>
+          <w:b w:val="false"/>
+          <w:bCs w:val="false"/>
+          <w:sz w:val="24"/>
+          <w:szCs w:val="24"/>
+          <w:u w:val="none"/>
+        </w:rPr>
+        <w:t xml:space="preserve"> before it assumes the connection is dead.</w:t>
+      </w:r>
+    </w:p>
+    <w:p>
+      <w:pPr>
+        <w:pStyle w:val="Heading3"/>
+        <w:rPr>
+          <w:b w:val="false"/>
+          <w:bCs w:val="false"/>
+          <w:sz w:val="24"/>
+          <w:szCs w:val="24"/>
+          <w:u w:val="none"/>
+        </w:rPr>
+      </w:pPr>
+      <w:r>
+        <w:rPr>
+          <w:b w:val="false"/>
+          <w:bCs w:val="false"/>
+          <w:sz w:val="24"/>
+          <w:szCs w:val="24"/>
+          <w:u w:val="none"/>
+        </w:rPr>
+        <w:t>Why is this happening?</w:t>
+      </w:r>
+    </w:p>
+    <w:p>
+      <w:pPr>
+        <w:pStyle w:val="BodyText"/>
+        <w:numPr>
+          <w:ilvl w:val="0"/>
+          <w:numId w:val="8"/>
+        </w:numPr>
+        <w:tabs>
+          <w:tab w:val="clear" w:pos="709"/>
+          <w:tab w:val="left" w:pos="709" w:leader="none"/>
+        </w:tabs>
+        <w:spacing w:before="0" w:after="0"/>
+        <w:ind w:hanging="283" w:start="709"/>
+        <w:rPr/>
+      </w:pPr>
+      <w:r>
+        <w:rPr>
+          <w:b w:val="false"/>
+          <w:bCs w:val="false"/>
+          <w:sz w:val="24"/>
+          <w:szCs w:val="24"/>
+          <w:u w:val="none"/>
+        </w:rPr>
+        <w:t xml:space="preserve">This is a </w:t>
+      </w:r>
+      <w:r>
+        <w:rPr>
+          <w:rStyle w:val="Strong"/>
+          <w:b w:val="false"/>
+          <w:bCs w:val="false"/>
+          <w:sz w:val="24"/>
+          <w:szCs w:val="24"/>
+          <w:u w:val="none"/>
+        </w:rPr>
+        <w:t>heartbeat mechanism</w:t>
+      </w:r>
+      <w:r>
+        <w:rPr>
+          <w:b w:val="false"/>
+          <w:bCs w:val="false"/>
+          <w:sz w:val="24"/>
+          <w:szCs w:val="24"/>
+          <w:u w:val="none"/>
+        </w:rPr>
+        <w:t xml:space="preserve"> used to detect connection drops and keep the session active.</w:t>
+      </w:r>
+    </w:p>
+    <w:p>
+      <w:pPr>
+        <w:pStyle w:val="BodyText"/>
+        <w:numPr>
+          <w:ilvl w:val="0"/>
+          <w:numId w:val="8"/>
+        </w:numPr>
+        <w:tabs>
+          <w:tab w:val="clear" w:pos="709"/>
+          <w:tab w:val="left" w:pos="709" w:leader="none"/>
+        </w:tabs>
+        <w:ind w:hanging="283" w:start="709"/>
+        <w:rPr/>
+      </w:pPr>
+      <w:r>
+        <w:rPr>
+          <w:b w:val="false"/>
+          <w:bCs w:val="false"/>
+          <w:sz w:val="24"/>
+          <w:szCs w:val="24"/>
+          <w:u w:val="none"/>
+        </w:rPr>
+        <w:t xml:space="preserve">If librespot doesn’t receive a </w:t>
+      </w:r>
+      <w:r>
+        <w:rPr>
+          <w:rStyle w:val="Strong"/>
+          <w:b w:val="false"/>
+          <w:bCs w:val="false"/>
+          <w:sz w:val="24"/>
+          <w:szCs w:val="24"/>
+          <w:u w:val="none"/>
+        </w:rPr>
+        <w:t>Ping</w:t>
+      </w:r>
+      <w:r>
+        <w:rPr>
+          <w:b w:val="false"/>
+          <w:bCs w:val="false"/>
+          <w:sz w:val="24"/>
+          <w:szCs w:val="24"/>
+          <w:u w:val="none"/>
+        </w:rPr>
+        <w:t xml:space="preserve"> or </w:t>
+      </w:r>
+      <w:r>
+        <w:rPr>
+          <w:rStyle w:val="Strong"/>
+          <w:b w:val="false"/>
+          <w:bCs w:val="false"/>
+          <w:sz w:val="24"/>
+          <w:szCs w:val="24"/>
+          <w:u w:val="none"/>
+        </w:rPr>
+        <w:t>PongAck</w:t>
+      </w:r>
+      <w:r>
+        <w:rPr>
+          <w:b w:val="false"/>
+          <w:bCs w:val="false"/>
+          <w:sz w:val="24"/>
+          <w:szCs w:val="24"/>
+          <w:u w:val="none"/>
+        </w:rPr>
+        <w:t xml:space="preserve"> within the expected time, it may assume the connection is lost and attempt a </w:t>
+      </w:r>
+      <w:r>
+        <w:rPr>
+          <w:rStyle w:val="Strong"/>
+          <w:b w:val="false"/>
+          <w:bCs w:val="false"/>
+          <w:sz w:val="24"/>
+          <w:szCs w:val="24"/>
+          <w:u w:val="none"/>
+        </w:rPr>
+        <w:t>reconnect</w:t>
+      </w:r>
+      <w:r>
+        <w:rPr>
+          <w:b w:val="false"/>
+          <w:bCs w:val="false"/>
+          <w:sz w:val="24"/>
+          <w:szCs w:val="24"/>
+          <w:u w:val="none"/>
+        </w:rPr>
+        <w:t>.</w:t>
+      </w:r>
+    </w:p>
+    <w:p>
+      <w:pPr>
+        <w:pStyle w:val="Normal"/>
+        <w:rPr>
+          <w:b/>
+          <w:bCs/>
+          <w:sz w:val="24"/>
+          <w:szCs w:val="24"/>
+          <w:u w:val="single"/>
+        </w:rPr>
+      </w:pPr>
+      <w:r>
+        <w:rPr>
+          <w:b/>
+          <w:bCs/>
+          <w:sz w:val="24"/>
+          <w:szCs w:val="24"/>
+          <w:u w:val="single"/>
+        </w:rPr>
+        <w:t>Audio-pipe</w:t>
+      </w:r>
+    </w:p>
+    <w:p>
+      <w:pPr>
+        <w:pStyle w:val="Normal"/>
+        <w:rPr>
+          <w:b w:val="false"/>
+          <w:bCs w:val="false"/>
+          <w:u w:val="none"/>
+        </w:rPr>
+      </w:pPr>
+      <w:r>
+        <w:rPr>
+          <w:b w:val="false"/>
+          <w:bCs w:val="false"/>
+          <w:u w:val="none"/>
+        </w:rPr>
+      </w:r>
+    </w:p>
+    <w:p>
+      <w:pPr>
+        <w:pStyle w:val="Normal"/>
+        <w:rPr>
+          <w:b w:val="false"/>
+          <w:bCs w:val="false"/>
+          <w:u w:val="none"/>
+        </w:rPr>
+      </w:pPr>
+      <w:r>
+        <w:rPr>
+          <w:b w:val="false"/>
+          <w:bCs w:val="false"/>
+          <w:u w:val="none"/>
+        </w:rPr>
+        <w:t>Librespot provides an audio-pipe to the MPV player.</w:t>
+      </w:r>
+    </w:p>
+    <w:p>
+      <w:pPr>
+        <w:pStyle w:val="Normal"/>
+        <w:rPr>
+          <w:b w:val="false"/>
+          <w:bCs w:val="false"/>
+          <w:u w:val="none"/>
+        </w:rPr>
+      </w:pPr>
+      <w:r>
+        <w:rPr>
+          <w:b w:val="false"/>
+          <w:bCs w:val="false"/>
+          <w:u w:val="none"/>
+        </w:rPr>
+      </w:r>
+    </w:p>
+    <w:p>
+      <w:pPr>
+        <w:pStyle w:val="Normal"/>
+        <w:rPr>
+          <w:b/>
+          <w:bCs/>
+          <w:u w:val="single"/>
+        </w:rPr>
+      </w:pPr>
+      <w:r>
+        <w:rPr>
+          <w:b/>
+          <w:bCs/>
+          <w:u w:val="single"/>
+        </w:rPr>
+        <w:t>Avahi-daemon:</w:t>
+      </w:r>
+    </w:p>
+    <w:p>
+      <w:pPr>
+        <w:pStyle w:val="BodyText"/>
+        <w:rPr>
+          <w:b w:val="false"/>
+          <w:bCs w:val="false"/>
+          <w:u w:val="none"/>
+        </w:rPr>
+      </w:pPr>
+      <w:r>
+        <w:rPr>
+          <w:b w:val="false"/>
+          <w:bCs w:val="false"/>
+          <w:u w:val="none"/>
+        </w:rPr>
+        <w:t>Librespot uses the avahi-api to publish the Spotify Connect Service.</w:t>
+      </w:r>
+    </w:p>
+    <w:p>
+      <w:pPr>
+        <w:pStyle w:val="BodyText"/>
+        <w:rPr>
+          <w:b w:val="false"/>
+          <w:bCs w:val="false"/>
+          <w:u w:val="none"/>
+        </w:rPr>
+      </w:pPr>
+      <w:r>
+        <w:rPr>
+          <w:b w:val="false"/>
+          <w:bCs w:val="false"/>
+          <w:u w:val="none"/>
+        </w:rPr>
+        <w:t>This service contains metadata (TXT records) such as:</w:t>
+      </w:r>
+    </w:p>
+    <w:p>
+      <w:pPr>
+        <w:pStyle w:val="BodyText"/>
+        <w:numPr>
+          <w:ilvl w:val="0"/>
+          <w:numId w:val="9"/>
+        </w:numPr>
+        <w:tabs>
+          <w:tab w:val="clear" w:pos="709"/>
+          <w:tab w:val="left" w:pos="709" w:leader="none"/>
+        </w:tabs>
+        <w:spacing w:before="0" w:after="0"/>
+        <w:ind w:hanging="283" w:start="709"/>
+        <w:rPr/>
+      </w:pPr>
+      <w:r>
+        <w:rPr/>
+        <w:t>Device name (e.g., “</w:t>
+      </w:r>
+      <w:r>
+        <w:rPr/>
+        <w:t>Oradio-luidspreker”</w:t>
+      </w:r>
+      <w:r>
+        <w:rPr/>
+        <w:t xml:space="preserve"> )</w:t>
+      </w:r>
+    </w:p>
+    <w:p>
+      <w:pPr>
+        <w:pStyle w:val="BodyText"/>
+        <w:numPr>
+          <w:ilvl w:val="0"/>
+          <w:numId w:val="9"/>
+        </w:numPr>
+        <w:tabs>
+          <w:tab w:val="clear" w:pos="709"/>
+          <w:tab w:val="left" w:pos="709" w:leader="none"/>
+        </w:tabs>
+        <w:spacing w:before="0" w:after="0"/>
+        <w:ind w:hanging="283" w:start="709"/>
+        <w:rPr/>
+      </w:pPr>
+      <w:r>
+        <w:rPr/>
+        <w:t>Supported sample rate, bit depth, and codec</w:t>
+      </w:r>
+    </w:p>
+    <w:p>
+      <w:pPr>
+        <w:pStyle w:val="BodyText"/>
+        <w:numPr>
+          <w:ilvl w:val="0"/>
+          <w:numId w:val="9"/>
+        </w:numPr>
+        <w:tabs>
+          <w:tab w:val="clear" w:pos="709"/>
+          <w:tab w:val="left" w:pos="709" w:leader="none"/>
+        </w:tabs>
+        <w:ind w:hanging="283" w:start="709"/>
+        <w:rPr/>
+      </w:pPr>
+      <w:r>
         <w:rPr/>
         <w:t>A unique device ID for Spotify authentication</w:t>
+      </w:r>
+    </w:p>
+    <w:p>
+      <w:pPr>
+        <w:pStyle w:val="Normal"/>
+        <w:rPr>
+          <w:b w:val="false"/>
+          <w:bCs w:val="false"/>
+          <w:u w:val="none"/>
+        </w:rPr>
+      </w:pPr>
+      <w:r>
+        <w:rPr>
+          <w:b w:val="false"/>
+          <w:bCs w:val="false"/>
+          <w:u w:val="none"/>
+        </w:rPr>
+      </w:r>
+    </w:p>
+    <w:p>
+      <w:pPr>
+        <w:pStyle w:val="Normal"/>
+        <w:rPr>
+          <w:b w:val="false"/>
+          <w:bCs w:val="false"/>
+          <w:u w:val="none"/>
+        </w:rPr>
+      </w:pPr>
+      <w:r>
+        <w:rPr>
+          <w:b w:val="false"/>
+          <w:bCs w:val="false"/>
+          <w:u w:val="none"/>
+        </w:rPr>
       </w:r>
     </w:p>
     <w:p>
@@ -3209,7 +3767,7 @@
         <w:pStyle w:val="BodyText"/>
         <w:numPr>
           <w:ilvl w:val="0"/>
-          <w:numId w:val="8"/>
+          <w:numId w:val="10"/>
         </w:numPr>
         <w:spacing w:lineRule="auto" w:line="240" w:before="0" w:after="26"/>
         <w:rPr/>
@@ -3224,206 +3782,6 @@
           <w:u w:val="none"/>
         </w:rPr>
         <w:t>Store the current track and playlist/queue</w:t>
-      </w:r>
-    </w:p>
-    <w:p>
-      <w:pPr>
-        <w:pStyle w:val="BodyText"/>
-        <w:numPr>
-          <w:ilvl w:val="0"/>
-          <w:numId w:val="8"/>
-        </w:numPr>
-        <w:spacing w:lineRule="auto" w:line="240" w:before="0" w:after="26"/>
-        <w:rPr/>
-      </w:pPr>
-      <w:r>
-        <w:rPr>
-          <w:b w:val="false"/>
-          <w:bCs w:val="false"/>
-          <w:sz w:val="24"/>
-          <w:szCs w:val="24"/>
-          <w:u w:val="none"/>
-        </w:rPr>
-        <w:t xml:space="preserve">Maintain the </w:t>
-      </w:r>
-      <w:r>
-        <w:rPr>
-          <w:rStyle w:val="Strong"/>
-          <w:b w:val="false"/>
-          <w:bCs w:val="false"/>
-          <w:sz w:val="24"/>
-          <w:szCs w:val="24"/>
-          <w:u w:val="none"/>
-        </w:rPr>
-        <w:t>playback progress</w:t>
-      </w:r>
-      <w:r>
-        <w:rPr>
-          <w:b w:val="false"/>
-          <w:bCs w:val="false"/>
-          <w:sz w:val="24"/>
-          <w:szCs w:val="24"/>
-          <w:u w:val="none"/>
-        </w:rPr>
-        <w:t xml:space="preserve"> (current timestamp in song).</w:t>
-      </w:r>
-    </w:p>
-    <w:p>
-      <w:pPr>
-        <w:pStyle w:val="BodyText"/>
-        <w:numPr>
-          <w:ilvl w:val="0"/>
-          <w:numId w:val="8"/>
-        </w:numPr>
-        <w:spacing w:lineRule="auto" w:line="240" w:before="0" w:after="26"/>
-        <w:rPr>
-          <w:rFonts w:ascii="Liberation Serif" w:hAnsi="Liberation Serif"/>
-          <w:b w:val="false"/>
-          <w:bCs w:val="false"/>
-          <w:sz w:val="24"/>
-          <w:szCs w:val="24"/>
-          <w:u w:val="none"/>
-        </w:rPr>
-      </w:pPr>
-      <w:r>
-        <w:rPr>
-          <w:b w:val="false"/>
-          <w:bCs w:val="false"/>
-          <w:sz w:val="24"/>
-          <w:szCs w:val="24"/>
-          <w:u w:val="none"/>
-        </w:rPr>
-        <w:t>Track which device is currently active.</w:t>
-      </w:r>
-    </w:p>
-    <w:p>
-      <w:pPr>
-        <w:pStyle w:val="BodyText"/>
-        <w:numPr>
-          <w:ilvl w:val="0"/>
-          <w:numId w:val="9"/>
-        </w:numPr>
-        <w:tabs>
-          <w:tab w:val="clear" w:pos="709"/>
-          <w:tab w:val="left" w:pos="709" w:leader="none"/>
-        </w:tabs>
-        <w:spacing w:lineRule="auto" w:line="240" w:before="0" w:after="26"/>
-        <w:ind w:hanging="283" w:start="709"/>
-        <w:rPr/>
-      </w:pPr>
-      <w:r>
-        <w:rPr>
-          <w:b w:val="false"/>
-          <w:bCs w:val="false"/>
-          <w:sz w:val="24"/>
-          <w:szCs w:val="24"/>
-          <w:u w:val="none"/>
-        </w:rPr>
-        <w:t xml:space="preserve">Even if the Spotify app disconnects, </w:t>
-      </w:r>
-      <w:r>
-        <w:rPr>
-          <w:rStyle w:val="SourceText"/>
-          <w:b w:val="false"/>
-          <w:bCs w:val="false"/>
-          <w:sz w:val="24"/>
-          <w:szCs w:val="24"/>
-          <w:u w:val="none"/>
-        </w:rPr>
-        <w:t>librespot</w:t>
-      </w:r>
-      <w:r>
-        <w:rPr>
-          <w:b w:val="false"/>
-          <w:bCs w:val="false"/>
-          <w:sz w:val="24"/>
-          <w:szCs w:val="24"/>
-          <w:u w:val="none"/>
-        </w:rPr>
-        <w:t xml:space="preserve"> keeps playing because it </w:t>
-      </w:r>
-      <w:r>
-        <w:rPr>
-          <w:rStyle w:val="Strong"/>
-          <w:b w:val="false"/>
-          <w:bCs w:val="false"/>
-          <w:sz w:val="24"/>
-          <w:szCs w:val="24"/>
-          <w:u w:val="none"/>
-        </w:rPr>
-        <w:t>receives streaming data directly from Spotify’s cloud</w:t>
-      </w:r>
-      <w:r>
-        <w:rPr>
-          <w:b w:val="false"/>
-          <w:bCs w:val="false"/>
-          <w:sz w:val="24"/>
-          <w:szCs w:val="24"/>
-          <w:u w:val="none"/>
-        </w:rPr>
-        <w:t>.</w:t>
-      </w:r>
-    </w:p>
-    <w:p>
-      <w:pPr>
-        <w:pStyle w:val="BodyText"/>
-        <w:spacing w:lineRule="auto" w:line="240" w:before="0" w:after="26"/>
-        <w:rPr>
-          <w:rFonts w:ascii="Liberation Serif" w:hAnsi="Liberation Serif"/>
-          <w:b w:val="false"/>
-          <w:bCs w:val="false"/>
-          <w:sz w:val="24"/>
-          <w:szCs w:val="24"/>
-          <w:u w:val="none"/>
-        </w:rPr>
-      </w:pPr>
-      <w:r>
-        <w:rPr>
-          <w:b w:val="false"/>
-          <w:bCs w:val="false"/>
-          <w:sz w:val="24"/>
-          <w:szCs w:val="24"/>
-          <w:u w:val="none"/>
-        </w:rPr>
-        <w:t>Reconnecting to Spotify restores the playback.</w:t>
-      </w:r>
-    </w:p>
-    <w:p>
-      <w:pPr>
-        <w:pStyle w:val="BodyText"/>
-        <w:spacing w:lineRule="auto" w:line="240" w:before="0" w:after="26"/>
-        <w:rPr/>
-      </w:pPr>
-      <w:r>
-        <w:rPr>
-          <w:b w:val="false"/>
-          <w:bCs w:val="false"/>
-          <w:sz w:val="24"/>
-          <w:szCs w:val="24"/>
-          <w:u w:val="none"/>
-        </w:rPr>
-        <w:t xml:space="preserve">If </w:t>
-      </w:r>
-      <w:r>
-        <w:rPr>
-          <w:rStyle w:val="Strong"/>
-          <w:b w:val="false"/>
-          <w:bCs w:val="false"/>
-          <w:sz w:val="24"/>
-          <w:szCs w:val="24"/>
-          <w:u w:val="none"/>
-        </w:rPr>
-        <w:t>the Spotify app is closed and reopen it</w:t>
-      </w:r>
-      <w:r>
-        <w:rPr>
-          <w:b w:val="false"/>
-          <w:bCs w:val="false"/>
-          <w:sz w:val="24"/>
-          <w:szCs w:val="24"/>
-          <w:u w:val="none"/>
-        </w:rPr>
-        <w:t>, the app queries Spotify’s servers to check:</w:t>
       </w:r>
     </w:p>
     <w:p>
@@ -3433,35 +3791,39 @@
           <w:ilvl w:val="0"/>
           <w:numId w:val="10"/>
         </w:numPr>
-        <w:tabs>
-          <w:tab w:val="clear" w:pos="709"/>
-          <w:tab w:val="left" w:pos="709" w:leader="none"/>
-        </w:tabs>
-        <w:spacing w:lineRule="auto" w:line="240" w:before="0" w:after="0"/>
-        <w:ind w:hanging="283" w:start="709"/>
-        <w:rPr/>
-      </w:pPr>
-      <w:r>
-        <w:rPr>
-          <w:b w:val="false"/>
-          <w:bCs w:val="false"/>
-        </w:rPr>
-        <w:t>The last active device (</w:t>
-      </w:r>
-      <w:r>
-        <w:rPr>
-          <w:rStyle w:val="SourceText"/>
-          <w:b w:val="false"/>
-          <w:bCs w:val="false"/>
-        </w:rPr>
-        <w:t>librespot</w:t>
-      </w:r>
-      <w:r>
-        <w:rPr>
-          <w:b w:val="false"/>
-          <w:bCs w:val="false"/>
-        </w:rPr>
-        <w:t xml:space="preserve"> on the Raspberry Pi).</w:t>
+        <w:spacing w:lineRule="auto" w:line="240" w:before="0" w:after="26"/>
+        <w:rPr/>
+      </w:pPr>
+      <w:r>
+        <w:rPr>
+          <w:b w:val="false"/>
+          <w:bCs w:val="false"/>
+          <w:sz w:val="24"/>
+          <w:szCs w:val="24"/>
+          <w:u w:val="none"/>
+        </w:rPr>
+        <w:t xml:space="preserve">Maintain the </w:t>
+      </w:r>
+      <w:r>
+        <w:rPr>
+          <w:rStyle w:val="Strong"/>
+          <w:b w:val="false"/>
+          <w:bCs w:val="false"/>
+          <w:sz w:val="24"/>
+          <w:szCs w:val="24"/>
+          <w:u w:val="none"/>
+        </w:rPr>
+        <w:t>playback progress</w:t>
+      </w:r>
+      <w:r>
+        <w:rPr>
+          <w:b w:val="false"/>
+          <w:bCs w:val="false"/>
+          <w:sz w:val="24"/>
+          <w:szCs w:val="24"/>
+          <w:u w:val="none"/>
+        </w:rPr>
+        <w:t xml:space="preserve"> (current timestamp in song).</w:t>
       </w:r>
     </w:p>
     <w:p>
@@ -3471,24 +3833,25 @@
           <w:ilvl w:val="0"/>
           <w:numId w:val="10"/>
         </w:numPr>
-        <w:tabs>
-          <w:tab w:val="clear" w:pos="709"/>
-          <w:tab w:val="left" w:pos="709" w:leader="none"/>
-        </w:tabs>
-        <w:spacing w:lineRule="auto" w:line="240"/>
-        <w:ind w:hanging="283" w:start="709"/>
+        <w:spacing w:lineRule="auto" w:line="240" w:before="0" w:after="26"/>
         <w:rPr>
           <w:rFonts w:ascii="Liberation Serif" w:hAnsi="Liberation Serif"/>
           <w:b w:val="false"/>
           <w:bCs w:val="false"/>
-        </w:rPr>
-      </w:pPr>
-      <w:r>
-        <w:rPr>
-          <w:b w:val="false"/>
-          <w:bCs w:val="false"/>
-        </w:rPr>
-        <w:t>The current song, playlist, and progress.</w:t>
+          <w:sz w:val="24"/>
+          <w:szCs w:val="24"/>
+          <w:u w:val="none"/>
+        </w:rPr>
+      </w:pPr>
+      <w:r>
+        <w:rPr>
+          <w:b w:val="false"/>
+          <w:bCs w:val="false"/>
+          <w:sz w:val="24"/>
+          <w:szCs w:val="24"/>
+          <w:u w:val="none"/>
+        </w:rPr>
+        <w:t>Track which device is currently active.</w:t>
       </w:r>
     </w:p>
     <w:p>
@@ -3500,47 +3863,125 @@
         </w:numPr>
         <w:tabs>
           <w:tab w:val="clear" w:pos="709"/>
-          <w:tab w:val="left" w:pos="720" w:leader="none"/>
-        </w:tabs>
-        <w:spacing w:lineRule="auto" w:line="240"/>
-        <w:ind w:hanging="283" w:start="720"/>
-        <w:rPr/>
-      </w:pPr>
-      <w:r>
-        <w:rPr>
-          <w:b w:val="false"/>
-          <w:bCs w:val="false"/>
-        </w:rPr>
-        <w:t xml:space="preserve">The app then </w:t>
+          <w:tab w:val="left" w:pos="709" w:leader="none"/>
+        </w:tabs>
+        <w:spacing w:lineRule="auto" w:line="240" w:before="0" w:after="26"/>
+        <w:ind w:hanging="283" w:start="709"/>
+        <w:rPr/>
+      </w:pPr>
+      <w:r>
+        <w:rPr>
+          <w:b w:val="false"/>
+          <w:bCs w:val="false"/>
+          <w:sz w:val="24"/>
+          <w:szCs w:val="24"/>
+          <w:u w:val="none"/>
+        </w:rPr>
+        <w:t xml:space="preserve">Even if the Spotify app disconnects, </w:t>
+      </w:r>
+      <w:r>
+        <w:rPr>
+          <w:rStyle w:val="SourceText"/>
+          <w:b w:val="false"/>
+          <w:bCs w:val="false"/>
+          <w:sz w:val="24"/>
+          <w:szCs w:val="24"/>
+          <w:u w:val="none"/>
+        </w:rPr>
+        <w:t>librespot</w:t>
+      </w:r>
+      <w:r>
+        <w:rPr>
+          <w:b w:val="false"/>
+          <w:bCs w:val="false"/>
+          <w:sz w:val="24"/>
+          <w:szCs w:val="24"/>
+          <w:u w:val="none"/>
+        </w:rPr>
+        <w:t xml:space="preserve"> keeps playing because it </w:t>
       </w:r>
       <w:r>
         <w:rPr>
           <w:rStyle w:val="Strong"/>
           <w:b w:val="false"/>
           <w:bCs w:val="false"/>
-        </w:rPr>
-        <w:t>syncs back</w:t>
-      </w:r>
-      <w:r>
-        <w:rPr>
-          <w:b w:val="false"/>
-          <w:bCs w:val="false"/>
-        </w:rPr>
-        <w:t xml:space="preserve"> to the </w:t>
-      </w:r>
-      <w:r>
-        <w:rPr>
-          <w:b w:val="false"/>
-          <w:bCs w:val="false"/>
-        </w:rPr>
-        <w:t>Oradio</w:t>
-      </w:r>
-      <w:r>
-        <w:rPr>
-          <w:b w:val="false"/>
-          <w:bCs w:val="false"/>
-        </w:rPr>
-        <w:t>'s playback state.</w:t>
+          <w:sz w:val="24"/>
+          <w:szCs w:val="24"/>
+          <w:u w:val="none"/>
+        </w:rPr>
+        <w:t>receives streaming data directly from Spotify’s cloud</w:t>
+      </w:r>
+      <w:r>
+        <w:rPr>
+          <w:b w:val="false"/>
+          <w:bCs w:val="false"/>
+          <w:sz w:val="24"/>
+          <w:szCs w:val="24"/>
+          <w:u w:val="none"/>
+        </w:rPr>
+        <w:t>.</w:t>
+      </w:r>
+    </w:p>
+    <w:p>
+      <w:pPr>
+        <w:pStyle w:val="BodyText"/>
+        <w:spacing w:lineRule="auto" w:line="240" w:before="0" w:after="26"/>
+        <w:rPr>
+          <w:rFonts w:ascii="Liberation Serif" w:hAnsi="Liberation Serif"/>
+          <w:b w:val="false"/>
+          <w:bCs w:val="false"/>
+          <w:sz w:val="24"/>
+          <w:szCs w:val="24"/>
+          <w:u w:val="none"/>
+        </w:rPr>
+      </w:pPr>
+      <w:r>
+        <w:rPr>
+          <w:b w:val="false"/>
+          <w:bCs w:val="false"/>
+          <w:sz w:val="24"/>
+          <w:szCs w:val="24"/>
+          <w:u w:val="none"/>
+        </w:rPr>
+        <w:t>Reconnecting to Spotify restores the playback.</w:t>
+      </w:r>
+    </w:p>
+    <w:p>
+      <w:pPr>
+        <w:pStyle w:val="BodyText"/>
+        <w:spacing w:lineRule="auto" w:line="240" w:before="0" w:after="26"/>
+        <w:rPr/>
+      </w:pPr>
+      <w:r>
+        <w:rPr>
+          <w:b w:val="false"/>
+          <w:bCs w:val="false"/>
+          <w:sz w:val="24"/>
+          <w:szCs w:val="24"/>
+          <w:u w:val="none"/>
+        </w:rPr>
+        <w:t xml:space="preserve">If </w:t>
+      </w:r>
+      <w:r>
+        <w:rPr>
+          <w:rStyle w:val="Strong"/>
+          <w:b w:val="false"/>
+          <w:bCs w:val="false"/>
+          <w:sz w:val="24"/>
+          <w:szCs w:val="24"/>
+          <w:u w:val="none"/>
+        </w:rPr>
+        <w:t>the Spotify app is closed and reopen it</w:t>
+      </w:r>
+      <w:r>
+        <w:rPr>
+          <w:b w:val="false"/>
+          <w:bCs w:val="false"/>
+          <w:sz w:val="24"/>
+          <w:szCs w:val="24"/>
+          <w:u w:val="none"/>
+        </w:rPr>
+        <w:t>, the app queries Spotify’s servers to check:</w:t>
       </w:r>
     </w:p>
     <w:p>
@@ -3552,257 +3993,60 @@
         </w:numPr>
         <w:tabs>
           <w:tab w:val="clear" w:pos="709"/>
-          <w:tab w:val="left" w:pos="720" w:leader="none"/>
+          <w:tab w:val="left" w:pos="709" w:leader="none"/>
+        </w:tabs>
+        <w:spacing w:lineRule="auto" w:line="240" w:before="0" w:after="0"/>
+        <w:ind w:hanging="283" w:start="709"/>
+        <w:rPr/>
+      </w:pPr>
+      <w:r>
+        <w:rPr>
+          <w:b w:val="false"/>
+          <w:bCs w:val="false"/>
+        </w:rPr>
+        <w:t>The last active device (</w:t>
+      </w:r>
+      <w:r>
+        <w:rPr>
+          <w:rStyle w:val="SourceText"/>
+          <w:b w:val="false"/>
+          <w:bCs w:val="false"/>
+        </w:rPr>
+        <w:t>librespot</w:t>
+      </w:r>
+      <w:r>
+        <w:rPr>
+          <w:b w:val="false"/>
+          <w:bCs w:val="false"/>
+        </w:rPr>
+        <w:t xml:space="preserve"> on the Raspberry Pi).</w:t>
+      </w:r>
+    </w:p>
+    <w:p>
+      <w:pPr>
+        <w:pStyle w:val="BodyText"/>
+        <w:numPr>
+          <w:ilvl w:val="0"/>
+          <w:numId w:val="12"/>
+        </w:numPr>
+        <w:tabs>
+          <w:tab w:val="clear" w:pos="709"/>
+          <w:tab w:val="left" w:pos="709" w:leader="none"/>
         </w:tabs>
         <w:spacing w:lineRule="auto" w:line="240"/>
-        <w:ind w:hanging="283" w:start="720"/>
-        <w:rPr/>
-      </w:pPr>
-      <w:r>
-        <w:rPr>
-          <w:b w:val="false"/>
-          <w:bCs w:val="false"/>
-        </w:rPr>
-        <w:t>This is why when you open Spotify, it might show:</w:t>
-        <w:br/>
-      </w:r>
-      <w:r>
-        <w:rPr>
-          <w:rStyle w:val="Emphasis"/>
-          <w:b w:val="false"/>
-          <w:bCs w:val="false"/>
-        </w:rPr>
-        <w:t xml:space="preserve">"Playing on </w:t>
-      </w:r>
-      <w:r>
-        <w:rPr>
-          <w:rStyle w:val="Emphasis"/>
-          <w:b w:val="false"/>
-          <w:bCs w:val="false"/>
-        </w:rPr>
-        <w:t>the Oradio-luidspreker</w:t>
-      </w:r>
-      <w:r>
-        <w:rPr>
-          <w:rStyle w:val="Emphasis"/>
-          <w:b w:val="false"/>
-          <w:bCs w:val="false"/>
-        </w:rPr>
-        <w:t>"</w:t>
-      </w:r>
-      <w:r>
-        <w:rPr>
-          <w:b w:val="false"/>
-          <w:bCs w:val="false"/>
-        </w:rPr>
-        <w:t>, even if you left it playing earlier.</w:t>
-      </w:r>
-    </w:p>
-    <w:p>
-      <w:pPr>
-        <w:pStyle w:val="BodyText"/>
-        <w:spacing w:lineRule="auto" w:line="240" w:before="0" w:after="26"/>
+        <w:ind w:hanging="283" w:start="709"/>
         <w:rPr>
           <w:rFonts w:ascii="Liberation Serif" w:hAnsi="Liberation Serif"/>
           <w:b w:val="false"/>
           <w:bCs w:val="false"/>
-          <w:sz w:val="24"/>
-          <w:szCs w:val="24"/>
-          <w:u w:val="none"/>
-        </w:rPr>
-      </w:pPr>
-      <w:r>
-        <w:rPr>
-          <w:b w:val="false"/>
-          <w:bCs w:val="false"/>
-          <w:sz w:val="24"/>
-          <w:szCs w:val="24"/>
-          <w:u w:val="none"/>
-        </w:rPr>
-        <w:t>Librespot does not store playlist locally. When restarted librespot will reconnect to Spotify. If spotify detects that librespot was the last device it may resume playback where it left off.</w:t>
-      </w:r>
-    </w:p>
-    <w:p>
-      <w:pPr>
-        <w:pStyle w:val="BodyText"/>
-        <w:spacing w:lineRule="auto" w:line="240" w:before="0" w:after="26"/>
-        <w:rPr>
-          <w:rFonts w:ascii="Liberation Serif" w:hAnsi="Liberation Serif"/>
-          <w:sz w:val="24"/>
-          <w:szCs w:val="24"/>
-          <w:u w:val="none"/>
-        </w:rPr>
-      </w:pPr>
-      <w:r>
-        <w:rPr>
-          <w:b w:val="false"/>
-          <w:bCs w:val="false"/>
-        </w:rPr>
-      </w:r>
-    </w:p>
-    <w:p>
-      <w:pPr>
-        <w:pStyle w:val="BodyText"/>
-        <w:spacing w:lineRule="auto" w:line="240" w:before="0" w:after="26"/>
-        <w:rPr>
-          <w:b/>
-          <w:bCs/>
-          <w:u w:val="single"/>
-        </w:rPr>
-      </w:pPr>
-      <w:r>
-        <w:rPr>
-          <w:b/>
-          <w:bCs/>
-          <w:sz w:val="24"/>
-          <w:szCs w:val="24"/>
-          <w:u w:val="single"/>
-        </w:rPr>
-        <w:t>MPV player:</w:t>
-      </w:r>
-    </w:p>
-    <w:p>
-      <w:pPr>
-        <w:pStyle w:val="BodyText"/>
-        <w:spacing w:lineRule="auto" w:line="240" w:before="0" w:after="26"/>
-        <w:rPr>
-          <w:b w:val="false"/>
-          <w:bCs w:val="false"/>
-        </w:rPr>
-      </w:pPr>
-      <w:r>
-        <w:rPr>
-          <w:b w:val="false"/>
-          <w:bCs w:val="false"/>
-          <w:sz w:val="24"/>
-          <w:szCs w:val="24"/>
-          <w:u w:val="none"/>
-        </w:rPr>
-        <w:t xml:space="preserve">mpv is a free and open-source media player software based on Mplayer, mplayer2 and Ffmpeg. </w:t>
-      </w:r>
-    </w:p>
-    <w:p>
-      <w:pPr>
-        <w:pStyle w:val="BodyText"/>
-        <w:spacing w:lineRule="auto" w:line="240" w:before="0" w:after="26"/>
-        <w:rPr/>
-      </w:pPr>
-      <w:r>
-        <w:rPr>
-          <w:rStyle w:val="SourceText"/>
-          <w:b w:val="false"/>
-          <w:bCs w:val="false"/>
-          <w:sz w:val="24"/>
-          <w:szCs w:val="24"/>
-          <w:u w:val="none"/>
-        </w:rPr>
-        <w:t>The mpv-mpri</w:t>
-      </w:r>
-      <w:r>
-        <w:rPr>
-          <w:rStyle w:val="SourceText"/>
-          <w:b w:val="false"/>
-          <w:bCs w:val="false"/>
-          <w:sz w:val="24"/>
-          <w:szCs w:val="24"/>
-          <w:u w:val="none"/>
-        </w:rPr>
-        <w:t>s i</w:t>
-      </w:r>
-      <w:r>
-        <w:rPr>
-          <w:b w:val="false"/>
-          <w:bCs w:val="false"/>
-          <w:sz w:val="24"/>
-          <w:szCs w:val="24"/>
-          <w:u w:val="none"/>
-        </w:rPr>
-        <w:t>s a plugin for mpv which allows control of the player using the</w:t>
-      </w:r>
-      <w:r>
-        <w:rPr/>
-        <w:t xml:space="preserve"> MPRIS D-Bus interface.</w:t>
-      </w:r>
-    </w:p>
-    <w:p>
-      <w:pPr>
-        <w:pStyle w:val="BodyText"/>
-        <w:spacing w:lineRule="auto" w:line="240" w:before="0" w:after="26"/>
-        <w:rPr>
-          <w:rFonts w:ascii="Liberation Serif" w:hAnsi="Liberation Serif"/>
-          <w:sz w:val="24"/>
-          <w:szCs w:val="24"/>
-          <w:u w:val="none"/>
-        </w:rPr>
-      </w:pPr>
-      <w:r>
-        <w:rPr>
-          <w:b w:val="false"/>
-          <w:bCs w:val="false"/>
-        </w:rPr>
-      </w:r>
-    </w:p>
-    <w:p>
-      <w:pPr>
-        <w:pStyle w:val="BodyText"/>
-        <w:spacing w:lineRule="auto" w:line="240" w:before="0" w:after="26"/>
-        <w:rPr>
-          <w:b/>
-          <w:bCs/>
-          <w:u w:val="single"/>
-        </w:rPr>
-      </w:pPr>
-      <w:r>
-        <w:rPr>
-          <w:b/>
-          <w:bCs/>
-          <w:sz w:val="24"/>
-          <w:szCs w:val="24"/>
-          <w:u w:val="single"/>
-        </w:rPr>
-        <w:t>MPRIS:</w:t>
-      </w:r>
-    </w:p>
-    <w:p>
-      <w:pPr>
-        <w:pStyle w:val="BodyText"/>
-        <w:spacing w:lineRule="auto" w:line="240" w:before="0" w:after="26"/>
-        <w:rPr>
-          <w:b/>
-          <w:bCs/>
-          <w:u w:val="single"/>
-        </w:rPr>
-      </w:pPr>
-      <w:r>
-        <w:rPr>
-          <w:b w:val="false"/>
-          <w:bCs w:val="false"/>
-          <w:sz w:val="24"/>
-          <w:szCs w:val="24"/>
-          <w:u w:val="none"/>
-        </w:rPr>
-        <w:t xml:space="preserve">MPRIS(Media Player Remote Interfacing Specification) is a standard D-Bus interface which aims to provide a common programmatic API for controlling media players. </w:t>
-      </w:r>
-    </w:p>
-    <w:p>
-      <w:pPr>
-        <w:pStyle w:val="BodyText"/>
-        <w:spacing w:lineRule="auto" w:line="240" w:before="0" w:after="26"/>
-        <w:rPr>
-          <w:b/>
-          <w:bCs/>
-          <w:u w:val="single"/>
-        </w:rPr>
-      </w:pPr>
-      <w:r>
-        <w:rPr>
-          <w:b w:val="false"/>
-          <w:bCs w:val="false"/>
-          <w:sz w:val="24"/>
-          <w:szCs w:val="24"/>
-          <w:u w:val="none"/>
-        </w:rPr>
-        <w:t>MPRIS provides following methods:</w:t>
+        </w:rPr>
+      </w:pPr>
+      <w:r>
+        <w:rPr>
+          <w:b w:val="false"/>
+          <w:bCs w:val="false"/>
+        </w:rPr>
+        <w:t>The current song, playlist, and progress.</w:t>
       </w:r>
     </w:p>
     <w:p>
@@ -3812,257 +4056,316 @@
           <w:ilvl w:val="0"/>
           <w:numId w:val="13"/>
         </w:numPr>
+        <w:tabs>
+          <w:tab w:val="clear" w:pos="709"/>
+          <w:tab w:val="left" w:pos="720" w:leader="none"/>
+        </w:tabs>
+        <w:spacing w:lineRule="auto" w:line="240"/>
+        <w:ind w:hanging="283" w:start="720"/>
+        <w:rPr/>
+      </w:pPr>
+      <w:r>
+        <w:rPr>
+          <w:b w:val="false"/>
+          <w:bCs w:val="false"/>
+        </w:rPr>
+        <w:t xml:space="preserve">The app then </w:t>
+      </w:r>
+      <w:r>
+        <w:rPr>
+          <w:rStyle w:val="Strong"/>
+          <w:b w:val="false"/>
+          <w:bCs w:val="false"/>
+        </w:rPr>
+        <w:t>syncs back</w:t>
+      </w:r>
+      <w:r>
+        <w:rPr>
+          <w:b w:val="false"/>
+          <w:bCs w:val="false"/>
+        </w:rPr>
+        <w:t xml:space="preserve"> to the </w:t>
+      </w:r>
+      <w:r>
+        <w:rPr>
+          <w:b w:val="false"/>
+          <w:bCs w:val="false"/>
+        </w:rPr>
+        <w:t>Oradio</w:t>
+      </w:r>
+      <w:r>
+        <w:rPr>
+          <w:b w:val="false"/>
+          <w:bCs w:val="false"/>
+        </w:rPr>
+        <w:t>'s playback state.</w:t>
+      </w:r>
+    </w:p>
+    <w:p>
+      <w:pPr>
+        <w:pStyle w:val="BodyText"/>
+        <w:numPr>
+          <w:ilvl w:val="0"/>
+          <w:numId w:val="14"/>
+        </w:numPr>
+        <w:tabs>
+          <w:tab w:val="clear" w:pos="709"/>
+          <w:tab w:val="left" w:pos="720" w:leader="none"/>
+        </w:tabs>
+        <w:spacing w:lineRule="auto" w:line="240"/>
+        <w:ind w:hanging="283" w:start="720"/>
+        <w:rPr/>
+      </w:pPr>
+      <w:r>
+        <w:rPr>
+          <w:b w:val="false"/>
+          <w:bCs w:val="false"/>
+        </w:rPr>
+        <w:t>This is why when you open Spotify, it might show:</w:t>
+        <w:br/>
+      </w:r>
+      <w:r>
+        <w:rPr>
+          <w:rStyle w:val="Emphasis"/>
+          <w:b w:val="false"/>
+          <w:bCs w:val="false"/>
+        </w:rPr>
+        <w:t xml:space="preserve">"Playing on </w:t>
+      </w:r>
+      <w:r>
+        <w:rPr>
+          <w:rStyle w:val="Emphasis"/>
+          <w:b w:val="false"/>
+          <w:bCs w:val="false"/>
+        </w:rPr>
+        <w:t>the Oradio-luidspreker</w:t>
+      </w:r>
+      <w:r>
+        <w:rPr>
+          <w:rStyle w:val="Emphasis"/>
+          <w:b w:val="false"/>
+          <w:bCs w:val="false"/>
+        </w:rPr>
+        <w:t>"</w:t>
+      </w:r>
+      <w:r>
+        <w:rPr>
+          <w:b w:val="false"/>
+          <w:bCs w:val="false"/>
+        </w:rPr>
+        <w:t>, even if you left it playing earlier.</w:t>
+      </w:r>
+    </w:p>
+    <w:p>
+      <w:pPr>
+        <w:pStyle w:val="BodyText"/>
         <w:spacing w:lineRule="auto" w:line="240" w:before="0" w:after="26"/>
         <w:rPr>
+          <w:rFonts w:ascii="Liberation Serif" w:hAnsi="Liberation Serif"/>
+          <w:b w:val="false"/>
+          <w:bCs w:val="false"/>
+          <w:sz w:val="24"/>
+          <w:szCs w:val="24"/>
+          <w:u w:val="none"/>
+        </w:rPr>
+      </w:pPr>
+      <w:r>
+        <w:rPr>
+          <w:b w:val="false"/>
+          <w:bCs w:val="false"/>
+          <w:sz w:val="24"/>
+          <w:szCs w:val="24"/>
+          <w:u w:val="none"/>
+        </w:rPr>
+        <w:t>Librespot does not store playlist locally. When restarted librespot will reconnect to Spotify. If spotify detects that librespot was the last device it may resume playback where it left off.</w:t>
+      </w:r>
+    </w:p>
+    <w:p>
+      <w:pPr>
+        <w:pStyle w:val="BodyText"/>
+        <w:spacing w:lineRule="auto" w:line="240" w:before="0" w:after="26"/>
+        <w:rPr>
+          <w:rFonts w:ascii="Liberation Serif" w:hAnsi="Liberation Serif"/>
+          <w:sz w:val="24"/>
+          <w:szCs w:val="24"/>
+          <w:u w:val="none"/>
+        </w:rPr>
+      </w:pPr>
+      <w:r>
+        <w:rPr>
+          <w:b w:val="false"/>
+          <w:bCs w:val="false"/>
+        </w:rPr>
+      </w:r>
+    </w:p>
+    <w:p>
+      <w:pPr>
+        <w:pStyle w:val="BodyText"/>
+        <w:spacing w:lineRule="auto" w:line="240" w:before="0" w:after="26"/>
+        <w:rPr>
+          <w:rFonts w:ascii="Liberation Serif" w:hAnsi="Liberation Serif"/>
           <w:b/>
           <w:bCs/>
+          <w:sz w:val="24"/>
+          <w:szCs w:val="24"/>
           <w:u w:val="single"/>
         </w:rPr>
       </w:pPr>
       <w:r>
-        <w:rPr>
-          <w:b w:val="false"/>
-          <w:bCs w:val="false"/>
-          <w:sz w:val="24"/>
-          <w:szCs w:val="24"/>
-          <w:u w:val="none"/>
-        </w:rPr>
-        <w:t>next</w:t>
-      </w:r>
-    </w:p>
-    <w:p>
-      <w:pPr>
-        <w:pStyle w:val="BodyText"/>
-        <w:numPr>
-          <w:ilvl w:val="0"/>
-          <w:numId w:val="13"/>
-        </w:numPr>
-        <w:spacing w:lineRule="auto" w:line="240" w:before="0" w:after="26"/>
         <w:rPr>
           <w:b/>
           <w:bCs/>
+          <w:sz w:val="24"/>
+          <w:szCs w:val="24"/>
           <w:u w:val="single"/>
         </w:rPr>
-      </w:pPr>
-      <w:r>
-        <w:rPr>
-          <w:b w:val="false"/>
-          <w:bCs w:val="false"/>
-          <w:sz w:val="24"/>
-          <w:szCs w:val="24"/>
-          <w:u w:val="none"/>
-        </w:rPr>
-        <w:t>previous</w:t>
-      </w:r>
-    </w:p>
-    <w:p>
-      <w:pPr>
-        <w:pStyle w:val="BodyText"/>
-        <w:numPr>
-          <w:ilvl w:val="0"/>
-          <w:numId w:val="13"/>
-        </w:numPr>
+        <w:t>MPV player:</w:t>
+      </w:r>
+    </w:p>
+    <w:p>
+      <w:pPr>
+        <w:pStyle w:val="BodyText"/>
         <w:spacing w:lineRule="auto" w:line="240" w:before="0" w:after="26"/>
         <w:rPr>
+          <w:rFonts w:ascii="Liberation Serif" w:hAnsi="Liberation Serif"/>
+          <w:b w:val="false"/>
+          <w:bCs w:val="false"/>
+          <w:sz w:val="24"/>
+          <w:szCs w:val="24"/>
+          <w:u w:val="none"/>
+        </w:rPr>
+      </w:pPr>
+      <w:r>
+        <w:rPr>
+          <w:b w:val="false"/>
+          <w:bCs w:val="false"/>
+          <w:sz w:val="24"/>
+          <w:szCs w:val="24"/>
+          <w:u w:val="none"/>
+        </w:rPr>
+        <w:t xml:space="preserve">mpv is a free and open-source media player software based on Mplayer, mplayer2 and Ffmpeg. </w:t>
+      </w:r>
+    </w:p>
+    <w:p>
+      <w:pPr>
+        <w:pStyle w:val="BodyText"/>
+        <w:spacing w:lineRule="auto" w:line="240" w:before="0" w:after="26"/>
+        <w:rPr/>
+      </w:pPr>
+      <w:r>
+        <w:rPr>
+          <w:rStyle w:val="SourceText"/>
+          <w:b w:val="false"/>
+          <w:bCs w:val="false"/>
+          <w:sz w:val="24"/>
+          <w:szCs w:val="24"/>
+          <w:u w:val="none"/>
+        </w:rPr>
+        <w:t>The mpv-mpris i</w:t>
+      </w:r>
+      <w:r>
+        <w:rPr>
+          <w:b w:val="false"/>
+          <w:bCs w:val="false"/>
+          <w:sz w:val="24"/>
+          <w:szCs w:val="24"/>
+          <w:u w:val="none"/>
+        </w:rPr>
+        <w:t>s a plugin for mpv which allows control of the player using the</w:t>
+      </w:r>
+      <w:r>
+        <w:rPr/>
+        <w:t xml:space="preserve"> MPRIS D-Bus interface.</w:t>
+      </w:r>
+    </w:p>
+    <w:p>
+      <w:pPr>
+        <w:pStyle w:val="BodyText"/>
+        <w:spacing w:lineRule="auto" w:line="240" w:before="0" w:after="26"/>
+        <w:rPr>
+          <w:rFonts w:ascii="Liberation Serif" w:hAnsi="Liberation Serif"/>
+          <w:sz w:val="24"/>
+          <w:szCs w:val="24"/>
+          <w:u w:val="none"/>
+        </w:rPr>
+      </w:pPr>
+      <w:r>
+        <w:rPr>
+          <w:b w:val="false"/>
+          <w:bCs w:val="false"/>
+        </w:rPr>
+      </w:r>
+    </w:p>
+    <w:p>
+      <w:pPr>
+        <w:pStyle w:val="BodyText"/>
+        <w:spacing w:lineRule="auto" w:line="240" w:before="0" w:after="26"/>
+        <w:rPr>
+          <w:rFonts w:ascii="Liberation Serif" w:hAnsi="Liberation Serif"/>
           <w:b/>
           <w:bCs/>
+          <w:sz w:val="24"/>
+          <w:szCs w:val="24"/>
           <w:u w:val="single"/>
         </w:rPr>
       </w:pPr>
       <w:r>
-        <w:rPr>
-          <w:b w:val="false"/>
-          <w:bCs w:val="false"/>
-          <w:sz w:val="24"/>
-          <w:szCs w:val="24"/>
-          <w:u w:val="none"/>
-        </w:rPr>
-        <w:t>pause</w:t>
-      </w:r>
-    </w:p>
-    <w:p>
-      <w:pPr>
-        <w:pStyle w:val="BodyText"/>
-        <w:numPr>
-          <w:ilvl w:val="0"/>
-          <w:numId w:val="13"/>
-        </w:numPr>
-        <w:spacing w:lineRule="auto" w:line="240" w:before="0" w:after="26"/>
         <w:rPr>
           <w:b/>
           <w:bCs/>
+          <w:sz w:val="24"/>
+          <w:szCs w:val="24"/>
           <w:u w:val="single"/>
         </w:rPr>
-      </w:pPr>
-      <w:r>
-        <w:rPr>
-          <w:b w:val="false"/>
-          <w:bCs w:val="false"/>
-          <w:sz w:val="24"/>
-          <w:szCs w:val="24"/>
-          <w:u w:val="none"/>
-        </w:rPr>
-        <w:t>playpause</w:t>
-      </w:r>
-    </w:p>
-    <w:p>
-      <w:pPr>
-        <w:pStyle w:val="BodyText"/>
-        <w:numPr>
-          <w:ilvl w:val="0"/>
-          <w:numId w:val="13"/>
-        </w:numPr>
+        <w:t>MPRIS:</w:t>
+      </w:r>
+    </w:p>
+    <w:p>
+      <w:pPr>
+        <w:pStyle w:val="BodyText"/>
         <w:spacing w:lineRule="auto" w:line="240" w:before="0" w:after="26"/>
         <w:rPr>
-          <w:b/>
-          <w:bCs/>
-          <w:u w:val="single"/>
-        </w:rPr>
-      </w:pPr>
-      <w:r>
-        <w:rPr>
-          <w:b w:val="false"/>
-          <w:bCs w:val="false"/>
-          <w:sz w:val="24"/>
-          <w:szCs w:val="24"/>
-          <w:u w:val="none"/>
-        </w:rPr>
-        <w:t>stop</w:t>
-      </w:r>
-    </w:p>
-    <w:p>
-      <w:pPr>
-        <w:pStyle w:val="BodyText"/>
-        <w:numPr>
-          <w:ilvl w:val="0"/>
-          <w:numId w:val="13"/>
-        </w:numPr>
+          <w:rFonts w:ascii="Liberation Serif" w:hAnsi="Liberation Serif"/>
+          <w:b w:val="false"/>
+          <w:bCs w:val="false"/>
+          <w:sz w:val="24"/>
+          <w:szCs w:val="24"/>
+          <w:u w:val="none"/>
+        </w:rPr>
+      </w:pPr>
+      <w:r>
+        <w:rPr>
+          <w:b w:val="false"/>
+          <w:bCs w:val="false"/>
+          <w:sz w:val="24"/>
+          <w:szCs w:val="24"/>
+          <w:u w:val="none"/>
+        </w:rPr>
+        <w:t xml:space="preserve">MPRIS(Media Player Remote Interfacing Specification) is a standard D-Bus interface which aims to provide a common programmatic API for controlling media players. </w:t>
+      </w:r>
+    </w:p>
+    <w:p>
+      <w:pPr>
+        <w:pStyle w:val="BodyText"/>
         <w:spacing w:lineRule="auto" w:line="240" w:before="0" w:after="26"/>
         <w:rPr>
-          <w:b/>
-          <w:bCs/>
-          <w:u w:val="single"/>
-        </w:rPr>
-      </w:pPr>
-      <w:r>
-        <w:rPr>
-          <w:b w:val="false"/>
-          <w:bCs w:val="false"/>
-          <w:sz w:val="24"/>
-          <w:szCs w:val="24"/>
-          <w:u w:val="none"/>
-        </w:rPr>
-        <w:t>play</w:t>
-      </w:r>
-    </w:p>
-    <w:p>
-      <w:pPr>
-        <w:pStyle w:val="BodyText"/>
-        <w:numPr>
-          <w:ilvl w:val="0"/>
-          <w:numId w:val="13"/>
-        </w:numPr>
-        <w:spacing w:lineRule="auto" w:line="240" w:before="0" w:after="26"/>
-        <w:rPr>
-          <w:b/>
-          <w:bCs/>
-          <w:u w:val="single"/>
-        </w:rPr>
-      </w:pPr>
-      <w:r>
-        <w:rPr>
-          <w:b w:val="false"/>
-          <w:bCs w:val="false"/>
-          <w:sz w:val="24"/>
-          <w:szCs w:val="24"/>
-          <w:u w:val="none"/>
-        </w:rPr>
-        <w:t>seek</w:t>
-      </w:r>
-    </w:p>
-    <w:p>
-      <w:pPr>
-        <w:pStyle w:val="BodyText"/>
-        <w:numPr>
-          <w:ilvl w:val="0"/>
-          <w:numId w:val="13"/>
-        </w:numPr>
-        <w:spacing w:lineRule="auto" w:line="240" w:before="0" w:after="26"/>
-        <w:rPr>
-          <w:b/>
-          <w:bCs/>
-          <w:u w:val="single"/>
-        </w:rPr>
-      </w:pPr>
-      <w:r>
-        <w:rPr>
-          <w:b w:val="false"/>
-          <w:bCs w:val="false"/>
-          <w:sz w:val="24"/>
-          <w:szCs w:val="24"/>
-          <w:u w:val="none"/>
-        </w:rPr>
-        <w:t>setposition</w:t>
-      </w:r>
-    </w:p>
-    <w:p>
-      <w:pPr>
-        <w:pStyle w:val="BodyText"/>
-        <w:spacing w:lineRule="auto" w:line="240" w:before="0" w:after="26"/>
-        <w:rPr>
           <w:rFonts w:ascii="Liberation Serif" w:hAnsi="Liberation Serif"/>
-          <w:sz w:val="24"/>
-          <w:szCs w:val="24"/>
-        </w:rPr>
-      </w:pPr>
-      <w:r>
-        <w:rPr>
-          <w:b/>
-          <w:bCs/>
-          <w:u w:val="single"/>
-        </w:rPr>
-      </w:r>
-    </w:p>
-    <w:p>
-      <w:pPr>
-        <w:pStyle w:val="BodyText"/>
-        <w:spacing w:lineRule="auto" w:line="240" w:before="0" w:after="26"/>
-        <w:rPr>
-          <w:b/>
-          <w:bCs/>
-          <w:u w:val="single"/>
-        </w:rPr>
-      </w:pPr>
-      <w:r>
-        <w:rPr>
-          <w:b/>
-          <w:bCs/>
-          <w:sz w:val="24"/>
-          <w:szCs w:val="24"/>
-          <w:u w:val="single"/>
-        </w:rPr>
-        <w:t>Spotify_connect</w:t>
-      </w:r>
-    </w:p>
-    <w:p>
-      <w:pPr>
-        <w:pStyle w:val="BodyText"/>
-        <w:spacing w:lineRule="auto" w:line="240" w:before="0" w:after="26"/>
-        <w:rPr>
-          <w:b w:val="false"/>
-          <w:bCs w:val="false"/>
-          <w:u w:val="none"/>
-        </w:rPr>
-      </w:pPr>
-      <w:r>
-        <w:rPr>
-          <w:b w:val="false"/>
-          <w:bCs w:val="false"/>
-          <w:sz w:val="24"/>
-          <w:szCs w:val="24"/>
-          <w:u w:val="none"/>
-        </w:rPr>
-        <w:t>A spotify_connect class to provide methods to control the MPV player via MPRID-player-ctl. Following method will be provided:</w:t>
+          <w:b w:val="false"/>
+          <w:bCs w:val="false"/>
+          <w:sz w:val="24"/>
+          <w:szCs w:val="24"/>
+          <w:u w:val="none"/>
+        </w:rPr>
+      </w:pPr>
+      <w:r>
+        <w:rPr>
+          <w:b w:val="false"/>
+          <w:bCs w:val="false"/>
+          <w:sz w:val="24"/>
+          <w:szCs w:val="24"/>
+          <w:u w:val="none"/>
+        </w:rPr>
+        <w:t>MPRIS provides following methods:</w:t>
       </w:r>
     </w:p>
     <w:p>
@@ -4074,20 +4377,23 @@
         </w:numPr>
         <w:spacing w:lineRule="auto" w:line="240" w:before="0" w:after="26"/>
         <w:rPr>
-          <w:b w:val="false"/>
-          <w:bCs w:val="false"/>
-          <w:u w:val="none"/>
-        </w:rPr>
-      </w:pPr>
-      <w:r>
-        <w:rPr>
-          <w:b w:val="false"/>
-          <w:bCs w:val="false"/>
-          <w:sz w:val="24"/>
-          <w:szCs w:val="24"/>
-          <w:u w:val="none"/>
-        </w:rPr>
-        <w:t>start_playing</w:t>
+          <w:rFonts w:ascii="Liberation Serif" w:hAnsi="Liberation Serif"/>
+          <w:b w:val="false"/>
+          <w:bCs w:val="false"/>
+          <w:sz w:val="24"/>
+          <w:szCs w:val="24"/>
+          <w:u w:val="none"/>
+        </w:rPr>
+      </w:pPr>
+      <w:r>
+        <w:rPr>
+          <w:b w:val="false"/>
+          <w:bCs w:val="false"/>
+          <w:sz w:val="24"/>
+          <w:szCs w:val="24"/>
+          <w:u w:val="none"/>
+        </w:rPr>
+        <w:t>next</w:t>
       </w:r>
     </w:p>
     <w:p>
@@ -4099,20 +4405,23 @@
         </w:numPr>
         <w:spacing w:lineRule="auto" w:line="240" w:before="0" w:after="26"/>
         <w:rPr>
-          <w:b w:val="false"/>
-          <w:bCs w:val="false"/>
-          <w:u w:val="none"/>
-        </w:rPr>
-      </w:pPr>
-      <w:r>
-        <w:rPr>
-          <w:b w:val="false"/>
-          <w:bCs w:val="false"/>
-          <w:sz w:val="24"/>
-          <w:szCs w:val="24"/>
-          <w:u w:val="none"/>
-        </w:rPr>
-        <w:t>stop_playing</w:t>
+          <w:rFonts w:ascii="Liberation Serif" w:hAnsi="Liberation Serif"/>
+          <w:b w:val="false"/>
+          <w:bCs w:val="false"/>
+          <w:sz w:val="24"/>
+          <w:szCs w:val="24"/>
+          <w:u w:val="none"/>
+        </w:rPr>
+      </w:pPr>
+      <w:r>
+        <w:rPr>
+          <w:b w:val="false"/>
+          <w:bCs w:val="false"/>
+          <w:sz w:val="24"/>
+          <w:szCs w:val="24"/>
+          <w:u w:val="none"/>
+        </w:rPr>
+        <w:t>previous</w:t>
       </w:r>
     </w:p>
     <w:p>
@@ -4124,20 +4433,163 @@
         </w:numPr>
         <w:spacing w:lineRule="auto" w:line="240" w:before="0" w:after="26"/>
         <w:rPr>
-          <w:b w:val="false"/>
-          <w:bCs w:val="false"/>
-          <w:u w:val="none"/>
-        </w:rPr>
-      </w:pPr>
-      <w:r>
-        <w:rPr>
-          <w:b w:val="false"/>
-          <w:bCs w:val="false"/>
-          <w:sz w:val="24"/>
-          <w:szCs w:val="24"/>
-          <w:u w:val="none"/>
-        </w:rPr>
-        <w:t>pause_playing</w:t>
+          <w:rFonts w:ascii="Liberation Serif" w:hAnsi="Liberation Serif"/>
+          <w:b w:val="false"/>
+          <w:bCs w:val="false"/>
+          <w:sz w:val="24"/>
+          <w:szCs w:val="24"/>
+          <w:u w:val="none"/>
+        </w:rPr>
+      </w:pPr>
+      <w:r>
+        <w:rPr>
+          <w:b w:val="false"/>
+          <w:bCs w:val="false"/>
+          <w:sz w:val="24"/>
+          <w:szCs w:val="24"/>
+          <w:u w:val="none"/>
+        </w:rPr>
+        <w:t>pause</w:t>
+      </w:r>
+    </w:p>
+    <w:p>
+      <w:pPr>
+        <w:pStyle w:val="BodyText"/>
+        <w:numPr>
+          <w:ilvl w:val="0"/>
+          <w:numId w:val="15"/>
+        </w:numPr>
+        <w:spacing w:lineRule="auto" w:line="240" w:before="0" w:after="26"/>
+        <w:rPr>
+          <w:rFonts w:ascii="Liberation Serif" w:hAnsi="Liberation Serif"/>
+          <w:b w:val="false"/>
+          <w:bCs w:val="false"/>
+          <w:sz w:val="24"/>
+          <w:szCs w:val="24"/>
+          <w:u w:val="none"/>
+        </w:rPr>
+      </w:pPr>
+      <w:r>
+        <w:rPr>
+          <w:b w:val="false"/>
+          <w:bCs w:val="false"/>
+          <w:sz w:val="24"/>
+          <w:szCs w:val="24"/>
+          <w:u w:val="none"/>
+        </w:rPr>
+        <w:t>playpause</w:t>
+      </w:r>
+    </w:p>
+    <w:p>
+      <w:pPr>
+        <w:pStyle w:val="BodyText"/>
+        <w:numPr>
+          <w:ilvl w:val="0"/>
+          <w:numId w:val="15"/>
+        </w:numPr>
+        <w:spacing w:lineRule="auto" w:line="240" w:before="0" w:after="26"/>
+        <w:rPr>
+          <w:rFonts w:ascii="Liberation Serif" w:hAnsi="Liberation Serif"/>
+          <w:b w:val="false"/>
+          <w:bCs w:val="false"/>
+          <w:sz w:val="24"/>
+          <w:szCs w:val="24"/>
+          <w:u w:val="none"/>
+        </w:rPr>
+      </w:pPr>
+      <w:r>
+        <w:rPr>
+          <w:b w:val="false"/>
+          <w:bCs w:val="false"/>
+          <w:sz w:val="24"/>
+          <w:szCs w:val="24"/>
+          <w:u w:val="none"/>
+        </w:rPr>
+        <w:t>stop</w:t>
+      </w:r>
+    </w:p>
+    <w:p>
+      <w:pPr>
+        <w:pStyle w:val="BodyText"/>
+        <w:numPr>
+          <w:ilvl w:val="0"/>
+          <w:numId w:val="15"/>
+        </w:numPr>
+        <w:spacing w:lineRule="auto" w:line="240" w:before="0" w:after="26"/>
+        <w:rPr>
+          <w:rFonts w:ascii="Liberation Serif" w:hAnsi="Liberation Serif"/>
+          <w:b w:val="false"/>
+          <w:bCs w:val="false"/>
+          <w:sz w:val="24"/>
+          <w:szCs w:val="24"/>
+          <w:u w:val="none"/>
+        </w:rPr>
+      </w:pPr>
+      <w:r>
+        <w:rPr>
+          <w:b w:val="false"/>
+          <w:bCs w:val="false"/>
+          <w:sz w:val="24"/>
+          <w:szCs w:val="24"/>
+          <w:u w:val="none"/>
+        </w:rPr>
+        <w:t>play</w:t>
+      </w:r>
+    </w:p>
+    <w:p>
+      <w:pPr>
+        <w:pStyle w:val="BodyText"/>
+        <w:numPr>
+          <w:ilvl w:val="0"/>
+          <w:numId w:val="15"/>
+        </w:numPr>
+        <w:spacing w:lineRule="auto" w:line="240" w:before="0" w:after="26"/>
+        <w:rPr>
+          <w:rFonts w:ascii="Liberation Serif" w:hAnsi="Liberation Serif"/>
+          <w:b w:val="false"/>
+          <w:bCs w:val="false"/>
+          <w:sz w:val="24"/>
+          <w:szCs w:val="24"/>
+          <w:u w:val="none"/>
+        </w:rPr>
+      </w:pPr>
+      <w:r>
+        <w:rPr>
+          <w:b w:val="false"/>
+          <w:bCs w:val="false"/>
+          <w:sz w:val="24"/>
+          <w:szCs w:val="24"/>
+          <w:u w:val="none"/>
+        </w:rPr>
+        <w:t>seek</w:t>
+      </w:r>
+    </w:p>
+    <w:p>
+      <w:pPr>
+        <w:pStyle w:val="BodyText"/>
+        <w:numPr>
+          <w:ilvl w:val="0"/>
+          <w:numId w:val="15"/>
+        </w:numPr>
+        <w:spacing w:lineRule="auto" w:line="240" w:before="0" w:after="26"/>
+        <w:rPr>
+          <w:rFonts w:ascii="Liberation Serif" w:hAnsi="Liberation Serif"/>
+          <w:b w:val="false"/>
+          <w:bCs w:val="false"/>
+          <w:sz w:val="24"/>
+          <w:szCs w:val="24"/>
+          <w:u w:val="none"/>
+        </w:rPr>
+      </w:pPr>
+      <w:r>
+        <w:rPr>
+          <w:b w:val="false"/>
+          <w:bCs w:val="false"/>
+          <w:sz w:val="24"/>
+          <w:szCs w:val="24"/>
+          <w:u w:val="none"/>
+        </w:rPr>
+        <w:t>setposition</w:t>
       </w:r>
     </w:p>
     <w:p>
@@ -4163,20 +4615,47 @@
         <w:pStyle w:val="BodyText"/>
         <w:spacing w:lineRule="auto" w:line="240" w:before="0" w:after="26"/>
         <w:rPr>
-          <w:b w:val="false"/>
-          <w:bCs w:val="false"/>
-          <w:u w:val="none"/>
-        </w:rPr>
-      </w:pPr>
-      <w:r>
-        <w:rPr>
-          <w:b w:val="false"/>
-          <w:bCs w:val="false"/>
-          <w:sz w:val="24"/>
-          <w:szCs w:val="24"/>
-          <w:u w:val="none"/>
-        </w:rPr>
-        <w:t>Spotify_connect has an observer to monitor new events coming from the spotify_event_handler socket. The events are listed in above section. There are 3 events which will be put in the message-queue for the statehandler in oradio_control:</w:t>
+          <w:rFonts w:ascii="Liberation Serif" w:hAnsi="Liberation Serif"/>
+          <w:b/>
+          <w:bCs/>
+          <w:sz w:val="24"/>
+          <w:szCs w:val="24"/>
+          <w:u w:val="single"/>
+        </w:rPr>
+      </w:pPr>
+      <w:r>
+        <w:rPr>
+          <w:b/>
+          <w:bCs/>
+          <w:sz w:val="24"/>
+          <w:szCs w:val="24"/>
+          <w:u w:val="single"/>
+        </w:rPr>
+        <w:t>Spotify_connect</w:t>
+      </w:r>
+    </w:p>
+    <w:p>
+      <w:pPr>
+        <w:pStyle w:val="BodyText"/>
+        <w:spacing w:lineRule="auto" w:line="240" w:before="0" w:after="26"/>
+        <w:rPr>
+          <w:rFonts w:ascii="Liberation Serif" w:hAnsi="Liberation Serif"/>
+          <w:b w:val="false"/>
+          <w:bCs w:val="false"/>
+          <w:sz w:val="24"/>
+          <w:szCs w:val="24"/>
+          <w:u w:val="none"/>
+        </w:rPr>
+      </w:pPr>
+      <w:r>
+        <w:rPr>
+          <w:b w:val="false"/>
+          <w:bCs w:val="false"/>
+          <w:sz w:val="24"/>
+          <w:szCs w:val="24"/>
+          <w:u w:val="none"/>
+        </w:rPr>
+        <w:t>A spotify_connect class to provide methods to control the MPV player via MPRID-player-ctl. Following method will be provided:</w:t>
       </w:r>
     </w:p>
     <w:p>
@@ -4184,24 +4663,27 @@
         <w:pStyle w:val="BodyText"/>
         <w:numPr>
           <w:ilvl w:val="0"/>
-          <w:numId w:val="14"/>
+          <w:numId w:val="16"/>
         </w:numPr>
         <w:spacing w:lineRule="auto" w:line="240" w:before="0" w:after="26"/>
         <w:rPr>
-          <w:b w:val="false"/>
-          <w:bCs w:val="false"/>
-          <w:u w:val="none"/>
-        </w:rPr>
-      </w:pPr>
-      <w:r>
-        <w:rPr>
-          <w:b w:val="false"/>
-          <w:bCs w:val="false"/>
-          <w:sz w:val="24"/>
-          <w:szCs w:val="24"/>
-          <w:u w:val="none"/>
-        </w:rPr>
-        <w:t>play: can be used to start the mpv player using the method provided by the class</w:t>
+          <w:rFonts w:ascii="Liberation Serif" w:hAnsi="Liberation Serif"/>
+          <w:b w:val="false"/>
+          <w:bCs w:val="false"/>
+          <w:sz w:val="24"/>
+          <w:szCs w:val="24"/>
+          <w:u w:val="none"/>
+        </w:rPr>
+      </w:pPr>
+      <w:r>
+        <w:rPr>
+          <w:b w:val="false"/>
+          <w:bCs w:val="false"/>
+          <w:sz w:val="24"/>
+          <w:szCs w:val="24"/>
+          <w:u w:val="none"/>
+        </w:rPr>
+        <w:t>start_playing</w:t>
       </w:r>
     </w:p>
     <w:p>
@@ -4209,24 +4691,27 @@
         <w:pStyle w:val="BodyText"/>
         <w:numPr>
           <w:ilvl w:val="0"/>
-          <w:numId w:val="14"/>
+          <w:numId w:val="16"/>
         </w:numPr>
         <w:spacing w:lineRule="auto" w:line="240" w:before="0" w:after="26"/>
         <w:rPr>
-          <w:b w:val="false"/>
-          <w:bCs w:val="false"/>
-          <w:u w:val="none"/>
-        </w:rPr>
-      </w:pPr>
-      <w:r>
-        <w:rPr>
-          <w:b w:val="false"/>
-          <w:bCs w:val="false"/>
-          <w:sz w:val="24"/>
-          <w:szCs w:val="24"/>
-          <w:u w:val="none"/>
-        </w:rPr>
-        <w:t>pause: can be used to pause the mpv player using the method provided by the class</w:t>
+          <w:rFonts w:ascii="Liberation Serif" w:hAnsi="Liberation Serif"/>
+          <w:b w:val="false"/>
+          <w:bCs w:val="false"/>
+          <w:sz w:val="24"/>
+          <w:szCs w:val="24"/>
+          <w:u w:val="none"/>
+        </w:rPr>
+      </w:pPr>
+      <w:r>
+        <w:rPr>
+          <w:b w:val="false"/>
+          <w:bCs w:val="false"/>
+          <w:sz w:val="24"/>
+          <w:szCs w:val="24"/>
+          <w:u w:val="none"/>
+        </w:rPr>
+        <w:t>stop_playing</w:t>
       </w:r>
     </w:p>
     <w:p>
@@ -4234,12 +4719,141 @@
         <w:pStyle w:val="BodyText"/>
         <w:numPr>
           <w:ilvl w:val="0"/>
-          <w:numId w:val="14"/>
+          <w:numId w:val="16"/>
         </w:numPr>
         <w:spacing w:lineRule="auto" w:line="240" w:before="0" w:after="26"/>
         <w:rPr>
-          <w:b w:val="false"/>
-          <w:bCs w:val="false"/>
+          <w:rFonts w:ascii="Liberation Serif" w:hAnsi="Liberation Serif"/>
+          <w:b w:val="false"/>
+          <w:bCs w:val="false"/>
+          <w:sz w:val="24"/>
+          <w:szCs w:val="24"/>
+          <w:u w:val="none"/>
+        </w:rPr>
+      </w:pPr>
+      <w:r>
+        <w:rPr>
+          <w:b w:val="false"/>
+          <w:bCs w:val="false"/>
+          <w:sz w:val="24"/>
+          <w:szCs w:val="24"/>
+          <w:u w:val="none"/>
+        </w:rPr>
+        <w:t>pause_playing</w:t>
+      </w:r>
+    </w:p>
+    <w:p>
+      <w:pPr>
+        <w:pStyle w:val="BodyText"/>
+        <w:spacing w:lineRule="auto" w:line="240" w:before="0" w:after="26"/>
+        <w:rPr>
+          <w:rFonts w:ascii="Liberation Serif" w:hAnsi="Liberation Serif"/>
+          <w:sz w:val="24"/>
+          <w:szCs w:val="24"/>
+        </w:rPr>
+      </w:pPr>
+      <w:r>
+        <w:rPr>
+          <w:b/>
+          <w:bCs/>
+          <w:u w:val="single"/>
+        </w:rPr>
+      </w:r>
+    </w:p>
+    <w:p>
+      <w:pPr>
+        <w:pStyle w:val="BodyText"/>
+        <w:spacing w:lineRule="auto" w:line="240" w:before="0" w:after="26"/>
+        <w:rPr>
+          <w:rFonts w:ascii="Liberation Serif" w:hAnsi="Liberation Serif"/>
+          <w:b w:val="false"/>
+          <w:bCs w:val="false"/>
+          <w:sz w:val="24"/>
+          <w:szCs w:val="24"/>
+          <w:u w:val="none"/>
+        </w:rPr>
+      </w:pPr>
+      <w:r>
+        <w:rPr>
+          <w:b w:val="false"/>
+          <w:bCs w:val="false"/>
+          <w:sz w:val="24"/>
+          <w:szCs w:val="24"/>
+          <w:u w:val="none"/>
+        </w:rPr>
+        <w:t>Spotify_connect has an observer to monitor new events coming from the spotify_event_handler socket. The events are listed in above section. There are 3 events which will be put in the message-queue for the statehandler in oradio_control:</w:t>
+      </w:r>
+    </w:p>
+    <w:p>
+      <w:pPr>
+        <w:pStyle w:val="BodyText"/>
+        <w:numPr>
+          <w:ilvl w:val="0"/>
+          <w:numId w:val="17"/>
+        </w:numPr>
+        <w:spacing w:lineRule="auto" w:line="240" w:before="0" w:after="26"/>
+        <w:rPr>
+          <w:rFonts w:ascii="Liberation Serif" w:hAnsi="Liberation Serif"/>
+          <w:b w:val="false"/>
+          <w:bCs w:val="false"/>
+          <w:sz w:val="24"/>
+          <w:szCs w:val="24"/>
+          <w:u w:val="none"/>
+        </w:rPr>
+      </w:pPr>
+      <w:r>
+        <w:rPr>
+          <w:b w:val="false"/>
+          <w:bCs w:val="false"/>
+          <w:sz w:val="24"/>
+          <w:szCs w:val="24"/>
+          <w:u w:val="none"/>
+        </w:rPr>
+        <w:t>play: can be used to start the mpv player using the method provided by the class</w:t>
+      </w:r>
+    </w:p>
+    <w:p>
+      <w:pPr>
+        <w:pStyle w:val="BodyText"/>
+        <w:numPr>
+          <w:ilvl w:val="0"/>
+          <w:numId w:val="17"/>
+        </w:numPr>
+        <w:spacing w:lineRule="auto" w:line="240" w:before="0" w:after="26"/>
+        <w:rPr>
+          <w:rFonts w:ascii="Liberation Serif" w:hAnsi="Liberation Serif"/>
+          <w:b w:val="false"/>
+          <w:bCs w:val="false"/>
+          <w:sz w:val="24"/>
+          <w:szCs w:val="24"/>
+          <w:u w:val="none"/>
+        </w:rPr>
+      </w:pPr>
+      <w:r>
+        <w:rPr>
+          <w:b w:val="false"/>
+          <w:bCs w:val="false"/>
+          <w:sz w:val="24"/>
+          <w:szCs w:val="24"/>
+          <w:u w:val="none"/>
+        </w:rPr>
+        <w:t>pause: can be used to pause the mpv player using the method provided by the class</w:t>
+      </w:r>
+    </w:p>
+    <w:p>
+      <w:pPr>
+        <w:pStyle w:val="BodyText"/>
+        <w:numPr>
+          <w:ilvl w:val="0"/>
+          <w:numId w:val="17"/>
+        </w:numPr>
+        <w:spacing w:lineRule="auto" w:line="240" w:before="0" w:after="26"/>
+        <w:rPr>
+          <w:rFonts w:ascii="Liberation Serif" w:hAnsi="Liberation Serif"/>
+          <w:b w:val="false"/>
+          <w:bCs w:val="false"/>
+          <w:sz w:val="24"/>
+          <w:szCs w:val="24"/>
           <w:u w:val="none"/>
         </w:rPr>
       </w:pPr>
@@ -4311,7 +4925,6 @@
     </w:lvl>
     <w:lvl w:ilvl="3">
       <w:start w:val="1"/>
-      <w:pStyle w:val="Heading4"/>
       <w:numFmt w:val="none"/>
       <w:suff w:val="nothing"/>
       <w:lvlText w:val="%4"/>
@@ -5077,8 +5690,8 @@
   <w:abstractNum w:abstractNumId="7">
     <w:lvl w:ilvl="0">
       <w:start w:val="1"/>
-      <w:numFmt w:val="bullet"/>
-      <w:lvlText w:val=""/>
+      <w:numFmt w:val="decimal"/>
+      <w:lvlText w:val="%1."/>
       <w:lvlJc w:val="start"/>
       <w:pPr>
         <w:tabs>
@@ -5086,14 +5699,12 @@
         </w:tabs>
         <w:ind w:start="709" w:hanging="283"/>
       </w:pPr>
-      <w:rPr>
-        <w:rFonts w:ascii="Symbol" w:hAnsi="Symbol" w:cs="Symbol" w:hint="default"/>
-      </w:rPr>
+      <w:rPr/>
     </w:lvl>
     <w:lvl w:ilvl="1">
       <w:start w:val="1"/>
-      <w:numFmt w:val="bullet"/>
-      <w:lvlText w:val=""/>
+      <w:numFmt w:val="decimal"/>
+      <w:lvlText w:val="%2."/>
       <w:lvlJc w:val="start"/>
       <w:pPr>
         <w:tabs>
@@ -5101,14 +5712,12 @@
         </w:tabs>
         <w:ind w:start="1418" w:hanging="283"/>
       </w:pPr>
-      <w:rPr>
-        <w:rFonts w:ascii="Symbol" w:hAnsi="Symbol" w:cs="Symbol" w:hint="default"/>
-      </w:rPr>
+      <w:rPr/>
     </w:lvl>
     <w:lvl w:ilvl="2">
       <w:start w:val="1"/>
-      <w:numFmt w:val="bullet"/>
-      <w:lvlText w:val=""/>
+      <w:numFmt w:val="decimal"/>
+      <w:lvlText w:val="%3."/>
       <w:lvlJc w:val="start"/>
       <w:pPr>
         <w:tabs>
@@ -5116,14 +5725,12 @@
         </w:tabs>
         <w:ind w:start="2127" w:hanging="283"/>
       </w:pPr>
-      <w:rPr>
-        <w:rFonts w:ascii="Symbol" w:hAnsi="Symbol" w:cs="Symbol" w:hint="default"/>
-      </w:rPr>
+      <w:rPr/>
     </w:lvl>
     <w:lvl w:ilvl="3">
       <w:start w:val="1"/>
-      <w:numFmt w:val="bullet"/>
-      <w:lvlText w:val=""/>
+      <w:numFmt w:val="decimal"/>
+      <w:lvlText w:val="%4."/>
       <w:lvlJc w:val="start"/>
       <w:pPr>
         <w:tabs>
@@ -5131,14 +5738,12 @@
         </w:tabs>
         <w:ind w:start="2836" w:hanging="283"/>
       </w:pPr>
-      <w:rPr>
-        <w:rFonts w:ascii="Symbol" w:hAnsi="Symbol" w:cs="Symbol" w:hint="default"/>
-      </w:rPr>
+      <w:rPr/>
     </w:lvl>
     <w:lvl w:ilvl="4">
       <w:start w:val="1"/>
-      <w:numFmt w:val="bullet"/>
-      <w:lvlText w:val=""/>
+      <w:numFmt w:val="decimal"/>
+      <w:lvlText w:val="%5."/>
       <w:lvlJc w:val="start"/>
       <w:pPr>
         <w:tabs>
@@ -5146,14 +5751,12 @@
         </w:tabs>
         <w:ind w:start="3545" w:hanging="283"/>
       </w:pPr>
-      <w:rPr>
-        <w:rFonts w:ascii="Symbol" w:hAnsi="Symbol" w:cs="Symbol" w:hint="default"/>
-      </w:rPr>
+      <w:rPr/>
     </w:lvl>
     <w:lvl w:ilvl="5">
       <w:start w:val="1"/>
-      <w:numFmt w:val="bullet"/>
-      <w:lvlText w:val=""/>
+      <w:numFmt w:val="decimal"/>
+      <w:lvlText w:val="%6."/>
       <w:lvlJc w:val="start"/>
       <w:pPr>
         <w:tabs>
@@ -5161,14 +5764,12 @@
         </w:tabs>
         <w:ind w:start="4254" w:hanging="283"/>
       </w:pPr>
-      <w:rPr>
-        <w:rFonts w:ascii="Symbol" w:hAnsi="Symbol" w:cs="Symbol" w:hint="default"/>
-      </w:rPr>
+      <w:rPr/>
     </w:lvl>
     <w:lvl w:ilvl="6">
       <w:start w:val="1"/>
-      <w:numFmt w:val="bullet"/>
-      <w:lvlText w:val=""/>
+      <w:numFmt w:val="decimal"/>
+      <w:lvlText w:val="%7."/>
       <w:lvlJc w:val="start"/>
       <w:pPr>
         <w:tabs>
@@ -5176,14 +5777,12 @@
         </w:tabs>
         <w:ind w:start="4963" w:hanging="283"/>
       </w:pPr>
-      <w:rPr>
-        <w:rFonts w:ascii="Symbol" w:hAnsi="Symbol" w:cs="Symbol" w:hint="default"/>
-      </w:rPr>
+      <w:rPr/>
     </w:lvl>
     <w:lvl w:ilvl="7">
       <w:start w:val="1"/>
-      <w:numFmt w:val="bullet"/>
-      <w:lvlText w:val=""/>
+      <w:numFmt w:val="decimal"/>
+      <w:lvlText w:val="%8."/>
       <w:lvlJc w:val="start"/>
       <w:pPr>
         <w:tabs>
@@ -5191,14 +5790,12 @@
         </w:tabs>
         <w:ind w:start="5672" w:hanging="283"/>
       </w:pPr>
-      <w:rPr>
-        <w:rFonts w:ascii="Symbol" w:hAnsi="Symbol" w:cs="Symbol" w:hint="default"/>
-      </w:rPr>
+      <w:rPr/>
     </w:lvl>
     <w:lvl w:ilvl="8">
       <w:start w:val="1"/>
-      <w:numFmt w:val="bullet"/>
-      <w:lvlText w:val=""/>
+      <w:numFmt w:val="decimal"/>
+      <w:lvlText w:val="%9."/>
       <w:lvlJc w:val="start"/>
       <w:pPr>
         <w:tabs>
@@ -5206,9 +5803,7 @@
         </w:tabs>
         <w:ind w:start="6381" w:hanging="283"/>
       </w:pPr>
-      <w:rPr>
-        <w:rFonts w:ascii="Symbol" w:hAnsi="Symbol" w:cs="Symbol" w:hint="default"/>
-      </w:rPr>
+      <w:rPr/>
     </w:lvl>
   </w:abstractNum>
   <w:abstractNum w:abstractNumId="8">
@@ -5219,9 +5814,9 @@
       <w:lvlJc w:val="start"/>
       <w:pPr>
         <w:tabs>
-          <w:tab w:val="num" w:pos="720"/>
-        </w:tabs>
-        <w:ind w:start="720" w:hanging="360"/>
+          <w:tab w:val="num" w:pos="709"/>
+        </w:tabs>
+        <w:ind w:start="709" w:hanging="283"/>
       </w:pPr>
       <w:rPr>
         <w:rFonts w:ascii="Symbol" w:hAnsi="Symbol" w:cs="Symbol" w:hint="default"/>
@@ -5230,31 +5825,31 @@
     <w:lvl w:ilvl="1">
       <w:start w:val="1"/>
       <w:numFmt w:val="bullet"/>
-      <w:lvlText w:val="◦"/>
-      <w:lvlJc w:val="start"/>
-      <w:pPr>
-        <w:tabs>
-          <w:tab w:val="num" w:pos="1080"/>
-        </w:tabs>
-        <w:ind w:start="1080" w:hanging="360"/>
-      </w:pPr>
-      <w:rPr>
-        <w:rFonts w:ascii="OpenSymbol" w:hAnsi="OpenSymbol" w:cs="OpenSymbol" w:hint="default"/>
+      <w:lvlText w:val=""/>
+      <w:lvlJc w:val="start"/>
+      <w:pPr>
+        <w:tabs>
+          <w:tab w:val="num" w:pos="1418"/>
+        </w:tabs>
+        <w:ind w:start="1418" w:hanging="283"/>
+      </w:pPr>
+      <w:rPr>
+        <w:rFonts w:ascii="Symbol" w:hAnsi="Symbol" w:cs="Symbol" w:hint="default"/>
       </w:rPr>
     </w:lvl>
     <w:lvl w:ilvl="2">
       <w:start w:val="1"/>
       <w:numFmt w:val="bullet"/>
-      <w:lvlText w:val="▪"/>
-      <w:lvlJc w:val="start"/>
-      <w:pPr>
-        <w:tabs>
-          <w:tab w:val="num" w:pos="1440"/>
-        </w:tabs>
-        <w:ind w:start="1440" w:hanging="360"/>
-      </w:pPr>
-      <w:rPr>
-        <w:rFonts w:ascii="OpenSymbol" w:hAnsi="OpenSymbol" w:cs="OpenSymbol" w:hint="default"/>
+      <w:lvlText w:val=""/>
+      <w:lvlJc w:val="start"/>
+      <w:pPr>
+        <w:tabs>
+          <w:tab w:val="num" w:pos="2127"/>
+        </w:tabs>
+        <w:ind w:start="2127" w:hanging="283"/>
+      </w:pPr>
+      <w:rPr>
+        <w:rFonts w:ascii="Symbol" w:hAnsi="Symbol" w:cs="Symbol" w:hint="default"/>
       </w:rPr>
     </w:lvl>
     <w:lvl w:ilvl="3">
@@ -5264,9 +5859,9 @@
       <w:lvlJc w:val="start"/>
       <w:pPr>
         <w:tabs>
-          <w:tab w:val="num" w:pos="1800"/>
-        </w:tabs>
-        <w:ind w:start="1800" w:hanging="360"/>
+          <w:tab w:val="num" w:pos="2836"/>
+        </w:tabs>
+        <w:ind w:start="2836" w:hanging="283"/>
       </w:pPr>
       <w:rPr>
         <w:rFonts w:ascii="Symbol" w:hAnsi="Symbol" w:cs="Symbol" w:hint="default"/>
@@ -5275,31 +5870,31 @@
     <w:lvl w:ilvl="4">
       <w:start w:val="1"/>
       <w:numFmt w:val="bullet"/>
-      <w:lvlText w:val="◦"/>
-      <w:lvlJc w:val="start"/>
-      <w:pPr>
-        <w:tabs>
-          <w:tab w:val="num" w:pos="2160"/>
-        </w:tabs>
-        <w:ind w:start="2160" w:hanging="360"/>
-      </w:pPr>
-      <w:rPr>
-        <w:rFonts w:ascii="OpenSymbol" w:hAnsi="OpenSymbol" w:cs="OpenSymbol" w:hint="default"/>
+      <w:lvlText w:val=""/>
+      <w:lvlJc w:val="start"/>
+      <w:pPr>
+        <w:tabs>
+          <w:tab w:val="num" w:pos="3545"/>
+        </w:tabs>
+        <w:ind w:start="3545" w:hanging="283"/>
+      </w:pPr>
+      <w:rPr>
+        <w:rFonts w:ascii="Symbol" w:hAnsi="Symbol" w:cs="Symbol" w:hint="default"/>
       </w:rPr>
     </w:lvl>
     <w:lvl w:ilvl="5">
       <w:start w:val="1"/>
       <w:numFmt w:val="bullet"/>
-      <w:lvlText w:val="▪"/>
-      <w:lvlJc w:val="start"/>
-      <w:pPr>
-        <w:tabs>
-          <w:tab w:val="num" w:pos="2520"/>
-        </w:tabs>
-        <w:ind w:start="2520" w:hanging="360"/>
-      </w:pPr>
-      <w:rPr>
-        <w:rFonts w:ascii="OpenSymbol" w:hAnsi="OpenSymbol" w:cs="OpenSymbol" w:hint="default"/>
+      <w:lvlText w:val=""/>
+      <w:lvlJc w:val="start"/>
+      <w:pPr>
+        <w:tabs>
+          <w:tab w:val="num" w:pos="4254"/>
+        </w:tabs>
+        <w:ind w:start="4254" w:hanging="283"/>
+      </w:pPr>
+      <w:rPr>
+        <w:rFonts w:ascii="Symbol" w:hAnsi="Symbol" w:cs="Symbol" w:hint="default"/>
       </w:rPr>
     </w:lvl>
     <w:lvl w:ilvl="6">
@@ -5309,9 +5904,9 @@
       <w:lvlJc w:val="start"/>
       <w:pPr>
         <w:tabs>
-          <w:tab w:val="num" w:pos="2880"/>
-        </w:tabs>
-        <w:ind w:start="2880" w:hanging="360"/>
+          <w:tab w:val="num" w:pos="4963"/>
+        </w:tabs>
+        <w:ind w:start="4963" w:hanging="283"/>
       </w:pPr>
       <w:rPr>
         <w:rFonts w:ascii="Symbol" w:hAnsi="Symbol" w:cs="Symbol" w:hint="default"/>
@@ -5320,31 +5915,31 @@
     <w:lvl w:ilvl="7">
       <w:start w:val="1"/>
       <w:numFmt w:val="bullet"/>
-      <w:lvlText w:val="◦"/>
-      <w:lvlJc w:val="start"/>
-      <w:pPr>
-        <w:tabs>
-          <w:tab w:val="num" w:pos="3240"/>
-        </w:tabs>
-        <w:ind w:start="3240" w:hanging="360"/>
-      </w:pPr>
-      <w:rPr>
-        <w:rFonts w:ascii="OpenSymbol" w:hAnsi="OpenSymbol" w:cs="OpenSymbol" w:hint="default"/>
+      <w:lvlText w:val=""/>
+      <w:lvlJc w:val="start"/>
+      <w:pPr>
+        <w:tabs>
+          <w:tab w:val="num" w:pos="5672"/>
+        </w:tabs>
+        <w:ind w:start="5672" w:hanging="283"/>
+      </w:pPr>
+      <w:rPr>
+        <w:rFonts w:ascii="Symbol" w:hAnsi="Symbol" w:cs="Symbol" w:hint="default"/>
       </w:rPr>
     </w:lvl>
     <w:lvl w:ilvl="8">
       <w:start w:val="1"/>
       <w:numFmt w:val="bullet"/>
-      <w:lvlText w:val="▪"/>
-      <w:lvlJc w:val="start"/>
-      <w:pPr>
-        <w:tabs>
-          <w:tab w:val="num" w:pos="3600"/>
-        </w:tabs>
-        <w:ind w:start="3600" w:hanging="360"/>
-      </w:pPr>
-      <w:rPr>
-        <w:rFonts w:ascii="OpenSymbol" w:hAnsi="OpenSymbol" w:cs="OpenSymbol" w:hint="default"/>
+      <w:lvlText w:val=""/>
+      <w:lvlJc w:val="start"/>
+      <w:pPr>
+        <w:tabs>
+          <w:tab w:val="num" w:pos="6381"/>
+        </w:tabs>
+        <w:ind w:start="6381" w:hanging="283"/>
+      </w:pPr>
+      <w:rPr>
+        <w:rFonts w:ascii="Symbol" w:hAnsi="Symbol" w:cs="Symbol" w:hint="default"/>
       </w:rPr>
     </w:lvl>
   </w:abstractNum>
@@ -5493,9 +6088,9 @@
       <w:lvlJc w:val="start"/>
       <w:pPr>
         <w:tabs>
-          <w:tab w:val="num" w:pos="709"/>
-        </w:tabs>
-        <w:ind w:start="709" w:hanging="283"/>
+          <w:tab w:val="num" w:pos="720"/>
+        </w:tabs>
+        <w:ind w:start="720" w:hanging="360"/>
       </w:pPr>
       <w:rPr>
         <w:rFonts w:ascii="Symbol" w:hAnsi="Symbol" w:cs="Symbol" w:hint="default"/>
@@ -5504,31 +6099,31 @@
     <w:lvl w:ilvl="1">
       <w:start w:val="1"/>
       <w:numFmt w:val="bullet"/>
-      <w:lvlText w:val=""/>
-      <w:lvlJc w:val="start"/>
-      <w:pPr>
-        <w:tabs>
-          <w:tab w:val="num" w:pos="1418"/>
-        </w:tabs>
-        <w:ind w:start="1418" w:hanging="283"/>
-      </w:pPr>
-      <w:rPr>
-        <w:rFonts w:ascii="Symbol" w:hAnsi="Symbol" w:cs="Symbol" w:hint="default"/>
+      <w:lvlText w:val="◦"/>
+      <w:lvlJc w:val="start"/>
+      <w:pPr>
+        <w:tabs>
+          <w:tab w:val="num" w:pos="1080"/>
+        </w:tabs>
+        <w:ind w:start="1080" w:hanging="360"/>
+      </w:pPr>
+      <w:rPr>
+        <w:rFonts w:ascii="OpenSymbol" w:hAnsi="OpenSymbol" w:cs="OpenSymbol" w:hint="default"/>
       </w:rPr>
     </w:lvl>
     <w:lvl w:ilvl="2">
       <w:start w:val="1"/>
       <w:numFmt w:val="bullet"/>
-      <w:lvlText w:val=""/>
-      <w:lvlJc w:val="start"/>
-      <w:pPr>
-        <w:tabs>
-          <w:tab w:val="num" w:pos="2127"/>
-        </w:tabs>
-        <w:ind w:start="2127" w:hanging="283"/>
-      </w:pPr>
-      <w:rPr>
-        <w:rFonts w:ascii="Symbol" w:hAnsi="Symbol" w:cs="Symbol" w:hint="default"/>
+      <w:lvlText w:val="▪"/>
+      <w:lvlJc w:val="start"/>
+      <w:pPr>
+        <w:tabs>
+          <w:tab w:val="num" w:pos="1440"/>
+        </w:tabs>
+        <w:ind w:start="1440" w:hanging="360"/>
+      </w:pPr>
+      <w:rPr>
+        <w:rFonts w:ascii="OpenSymbol" w:hAnsi="OpenSymbol" w:cs="OpenSymbol" w:hint="default"/>
       </w:rPr>
     </w:lvl>
     <w:lvl w:ilvl="3">
@@ -5538,9 +6133,9 @@
       <w:lvlJc w:val="start"/>
       <w:pPr>
         <w:tabs>
-          <w:tab w:val="num" w:pos="2836"/>
-        </w:tabs>
-        <w:ind w:start="2836" w:hanging="283"/>
+          <w:tab w:val="num" w:pos="1800"/>
+        </w:tabs>
+        <w:ind w:start="1800" w:hanging="360"/>
       </w:pPr>
       <w:rPr>
         <w:rFonts w:ascii="Symbol" w:hAnsi="Symbol" w:cs="Symbol" w:hint="default"/>
@@ -5549,31 +6144,31 @@
     <w:lvl w:ilvl="4">
       <w:start w:val="1"/>
       <w:numFmt w:val="bullet"/>
-      <w:lvlText w:val=""/>
-      <w:lvlJc w:val="start"/>
-      <w:pPr>
-        <w:tabs>
-          <w:tab w:val="num" w:pos="3545"/>
-        </w:tabs>
-        <w:ind w:start="3545" w:hanging="283"/>
-      </w:pPr>
-      <w:rPr>
-        <w:rFonts w:ascii="Symbol" w:hAnsi="Symbol" w:cs="Symbol" w:hint="default"/>
+      <w:lvlText w:val="◦"/>
+      <w:lvlJc w:val="start"/>
+      <w:pPr>
+        <w:tabs>
+          <w:tab w:val="num" w:pos="2160"/>
+        </w:tabs>
+        <w:ind w:start="2160" w:hanging="360"/>
+      </w:pPr>
+      <w:rPr>
+        <w:rFonts w:ascii="OpenSymbol" w:hAnsi="OpenSymbol" w:cs="OpenSymbol" w:hint="default"/>
       </w:rPr>
     </w:lvl>
     <w:lvl w:ilvl="5">
       <w:start w:val="1"/>
       <w:numFmt w:val="bullet"/>
-      <w:lvlText w:val=""/>
-      <w:lvlJc w:val="start"/>
-      <w:pPr>
-        <w:tabs>
-          <w:tab w:val="num" w:pos="4254"/>
-        </w:tabs>
-        <w:ind w:start="4254" w:hanging="283"/>
-      </w:pPr>
-      <w:rPr>
-        <w:rFonts w:ascii="Symbol" w:hAnsi="Symbol" w:cs="Symbol" w:hint="default"/>
+      <w:lvlText w:val="▪"/>
+      <w:lvlJc w:val="start"/>
+      <w:pPr>
+        <w:tabs>
+          <w:tab w:val="num" w:pos="2520"/>
+        </w:tabs>
+        <w:ind w:start="2520" w:hanging="360"/>
+      </w:pPr>
+      <w:rPr>
+        <w:rFonts w:ascii="OpenSymbol" w:hAnsi="OpenSymbol" w:cs="OpenSymbol" w:hint="default"/>
       </w:rPr>
     </w:lvl>
     <w:lvl w:ilvl="6">
@@ -5583,9 +6178,9 @@
       <w:lvlJc w:val="start"/>
       <w:pPr>
         <w:tabs>
-          <w:tab w:val="num" w:pos="4963"/>
-        </w:tabs>
-        <w:ind w:start="4963" w:hanging="283"/>
+          <w:tab w:val="num" w:pos="2880"/>
+        </w:tabs>
+        <w:ind w:start="2880" w:hanging="360"/>
       </w:pPr>
       <w:rPr>
         <w:rFonts w:ascii="Symbol" w:hAnsi="Symbol" w:cs="Symbol" w:hint="default"/>
@@ -5594,31 +6189,31 @@
     <w:lvl w:ilvl="7">
       <w:start w:val="1"/>
       <w:numFmt w:val="bullet"/>
-      <w:lvlText w:val=""/>
-      <w:lvlJc w:val="start"/>
-      <w:pPr>
-        <w:tabs>
-          <w:tab w:val="num" w:pos="5672"/>
-        </w:tabs>
-        <w:ind w:start="5672" w:hanging="283"/>
-      </w:pPr>
-      <w:rPr>
-        <w:rFonts w:ascii="Symbol" w:hAnsi="Symbol" w:cs="Symbol" w:hint="default"/>
+      <w:lvlText w:val="◦"/>
+      <w:lvlJc w:val="start"/>
+      <w:pPr>
+        <w:tabs>
+          <w:tab w:val="num" w:pos="3240"/>
+        </w:tabs>
+        <w:ind w:start="3240" w:hanging="360"/>
+      </w:pPr>
+      <w:rPr>
+        <w:rFonts w:ascii="OpenSymbol" w:hAnsi="OpenSymbol" w:cs="OpenSymbol" w:hint="default"/>
       </w:rPr>
     </w:lvl>
     <w:lvl w:ilvl="8">
       <w:start w:val="1"/>
       <w:numFmt w:val="bullet"/>
-      <w:lvlText w:val=""/>
-      <w:lvlJc w:val="start"/>
-      <w:pPr>
-        <w:tabs>
-          <w:tab w:val="num" w:pos="6381"/>
-        </w:tabs>
-        <w:ind w:start="6381" w:hanging="283"/>
-      </w:pPr>
-      <w:rPr>
-        <w:rFonts w:ascii="Symbol" w:hAnsi="Symbol" w:cs="Symbol" w:hint="default"/>
+      <w:lvlText w:val="▪"/>
+      <w:lvlJc w:val="start"/>
+      <w:pPr>
+        <w:tabs>
+          <w:tab w:val="num" w:pos="3600"/>
+        </w:tabs>
+        <w:ind w:start="3600" w:hanging="360"/>
+      </w:pPr>
+      <w:rPr>
+        <w:rFonts w:ascii="OpenSymbol" w:hAnsi="OpenSymbol" w:cs="OpenSymbol" w:hint="default"/>
       </w:rPr>
     </w:lvl>
   </w:abstractNum>
@@ -5630,9 +6225,9 @@
       <w:lvlJc w:val="start"/>
       <w:pPr>
         <w:tabs>
-          <w:tab w:val="num" w:pos="720"/>
-        </w:tabs>
-        <w:ind w:start="720" w:hanging="283"/>
+          <w:tab w:val="num" w:pos="709"/>
+        </w:tabs>
+        <w:ind w:start="709" w:hanging="283"/>
       </w:pPr>
       <w:rPr>
         <w:rFonts w:ascii="Symbol" w:hAnsi="Symbol" w:cs="Symbol" w:hint="default"/>
@@ -5640,99 +6235,123 @@
     </w:lvl>
     <w:lvl w:ilvl="1">
       <w:start w:val="1"/>
-      <w:numFmt w:val="decimal"/>
-      <w:lvlText w:val="%2."/>
-      <w:lvlJc w:val="start"/>
-      <w:pPr>
-        <w:tabs>
-          <w:tab w:val="num" w:pos="1080"/>
-        </w:tabs>
-        <w:ind w:start="1080" w:hanging="360"/>
-      </w:pPr>
+      <w:numFmt w:val="bullet"/>
+      <w:lvlText w:val=""/>
+      <w:lvlJc w:val="start"/>
+      <w:pPr>
+        <w:tabs>
+          <w:tab w:val="num" w:pos="1418"/>
+        </w:tabs>
+        <w:ind w:start="1418" w:hanging="283"/>
+      </w:pPr>
+      <w:rPr>
+        <w:rFonts w:ascii="Symbol" w:hAnsi="Symbol" w:cs="Symbol" w:hint="default"/>
+      </w:rPr>
     </w:lvl>
     <w:lvl w:ilvl="2">
       <w:start w:val="1"/>
-      <w:numFmt w:val="decimal"/>
-      <w:lvlText w:val="%3."/>
-      <w:lvlJc w:val="start"/>
-      <w:pPr>
-        <w:tabs>
-          <w:tab w:val="num" w:pos="1440"/>
-        </w:tabs>
-        <w:ind w:start="1440" w:hanging="360"/>
-      </w:pPr>
+      <w:numFmt w:val="bullet"/>
+      <w:lvlText w:val=""/>
+      <w:lvlJc w:val="start"/>
+      <w:pPr>
+        <w:tabs>
+          <w:tab w:val="num" w:pos="2127"/>
+        </w:tabs>
+        <w:ind w:start="2127" w:hanging="283"/>
+      </w:pPr>
+      <w:rPr>
+        <w:rFonts w:ascii="Symbol" w:hAnsi="Symbol" w:cs="Symbol" w:hint="default"/>
+      </w:rPr>
     </w:lvl>
     <w:lvl w:ilvl="3">
       <w:start w:val="1"/>
-      <w:numFmt w:val="decimal"/>
-      <w:lvlText w:val="%4."/>
-      <w:lvlJc w:val="start"/>
-      <w:pPr>
-        <w:tabs>
-          <w:tab w:val="num" w:pos="1800"/>
-        </w:tabs>
-        <w:ind w:start="1800" w:hanging="360"/>
-      </w:pPr>
+      <w:numFmt w:val="bullet"/>
+      <w:lvlText w:val=""/>
+      <w:lvlJc w:val="start"/>
+      <w:pPr>
+        <w:tabs>
+          <w:tab w:val="num" w:pos="2836"/>
+        </w:tabs>
+        <w:ind w:start="2836" w:hanging="283"/>
+      </w:pPr>
+      <w:rPr>
+        <w:rFonts w:ascii="Symbol" w:hAnsi="Symbol" w:cs="Symbol" w:hint="default"/>
+      </w:rPr>
     </w:lvl>
     <w:lvl w:ilvl="4">
       <w:start w:val="1"/>
-      <w:numFmt w:val="decimal"/>
-      <w:lvlText w:val="%5."/>
-      <w:lvlJc w:val="start"/>
-      <w:pPr>
-        <w:tabs>
-          <w:tab w:val="num" w:pos="2160"/>
-        </w:tabs>
-        <w:ind w:start="2160" w:hanging="360"/>
-      </w:pPr>
+      <w:numFmt w:val="bullet"/>
+      <w:lvlText w:val=""/>
+      <w:lvlJc w:val="start"/>
+      <w:pPr>
+        <w:tabs>
+          <w:tab w:val="num" w:pos="3545"/>
+        </w:tabs>
+        <w:ind w:start="3545" w:hanging="283"/>
+      </w:pPr>
+      <w:rPr>
+        <w:rFonts w:ascii="Symbol" w:hAnsi="Symbol" w:cs="Symbol" w:hint="default"/>
+      </w:rPr>
     </w:lvl>
     <w:lvl w:ilvl="5">
       <w:start w:val="1"/>
-      <w:numFmt w:val="decimal"/>
-      <w:lvlText w:val="%6."/>
-      <w:lvlJc w:val="start"/>
-      <w:pPr>
-        <w:tabs>
-          <w:tab w:val="num" w:pos="2520"/>
-        </w:tabs>
-        <w:ind w:start="2520" w:hanging="360"/>
-      </w:pPr>
+      <w:numFmt w:val="bullet"/>
+      <w:lvlText w:val=""/>
+      <w:lvlJc w:val="start"/>
+      <w:pPr>
+        <w:tabs>
+          <w:tab w:val="num" w:pos="4254"/>
+        </w:tabs>
+        <w:ind w:start="4254" w:hanging="283"/>
+      </w:pPr>
+      <w:rPr>
+        <w:rFonts w:ascii="Symbol" w:hAnsi="Symbol" w:cs="Symbol" w:hint="default"/>
+      </w:rPr>
     </w:lvl>
     <w:lvl w:ilvl="6">
       <w:start w:val="1"/>
-      <w:numFmt w:val="decimal"/>
-      <w:lvlText w:val="%7."/>
-      <w:lvlJc w:val="start"/>
-      <w:pPr>
-        <w:tabs>
-          <w:tab w:val="num" w:pos="2880"/>
-        </w:tabs>
-        <w:ind w:start="2880" w:hanging="360"/>
-      </w:pPr>
+      <w:numFmt w:val="bullet"/>
+      <w:lvlText w:val=""/>
+      <w:lvlJc w:val="start"/>
+      <w:pPr>
+        <w:tabs>
+          <w:tab w:val="num" w:pos="4963"/>
+        </w:tabs>
+        <w:ind w:start="4963" w:hanging="283"/>
+      </w:pPr>
+      <w:rPr>
+        <w:rFonts w:ascii="Symbol" w:hAnsi="Symbol" w:cs="Symbol" w:hint="default"/>
+      </w:rPr>
     </w:lvl>
     <w:lvl w:ilvl="7">
       <w:start w:val="1"/>
-      <w:numFmt w:val="decimal"/>
-      <w:lvlText w:val="%8."/>
-      <w:lvlJc w:val="start"/>
-      <w:pPr>
-        <w:tabs>
-          <w:tab w:val="num" w:pos="3240"/>
-        </w:tabs>
-        <w:ind w:start="3240" w:hanging="360"/>
-      </w:pPr>
+      <w:numFmt w:val="bullet"/>
+      <w:lvlText w:val=""/>
+      <w:lvlJc w:val="start"/>
+      <w:pPr>
+        <w:tabs>
+          <w:tab w:val="num" w:pos="5672"/>
+        </w:tabs>
+        <w:ind w:start="5672" w:hanging="283"/>
+      </w:pPr>
+      <w:rPr>
+        <w:rFonts w:ascii="Symbol" w:hAnsi="Symbol" w:cs="Symbol" w:hint="default"/>
+      </w:rPr>
     </w:lvl>
     <w:lvl w:ilvl="8">
       <w:start w:val="1"/>
-      <w:numFmt w:val="decimal"/>
-      <w:lvlText w:val="%9."/>
-      <w:lvlJc w:val="start"/>
-      <w:pPr>
-        <w:tabs>
-          <w:tab w:val="num" w:pos="3600"/>
-        </w:tabs>
-        <w:ind w:start="3600" w:hanging="360"/>
-      </w:pPr>
+      <w:numFmt w:val="bullet"/>
+      <w:lvlText w:val=""/>
+      <w:lvlJc w:val="start"/>
+      <w:pPr>
+        <w:tabs>
+          <w:tab w:val="num" w:pos="6381"/>
+        </w:tabs>
+        <w:ind w:start="6381" w:hanging="283"/>
+      </w:pPr>
+      <w:rPr>
+        <w:rFonts w:ascii="Symbol" w:hAnsi="Symbol" w:cs="Symbol" w:hint="default"/>
+      </w:rPr>
     </w:lvl>
   </w:abstractNum>
   <w:abstractNum w:abstractNumId="12">
@@ -5743,9 +6362,9 @@
       <w:lvlJc w:val="start"/>
       <w:pPr>
         <w:tabs>
-          <w:tab w:val="num" w:pos="720"/>
-        </w:tabs>
-        <w:ind w:start="720" w:hanging="283"/>
+          <w:tab w:val="num" w:pos="709"/>
+        </w:tabs>
+        <w:ind w:start="709" w:hanging="283"/>
       </w:pPr>
       <w:rPr>
         <w:rFonts w:ascii="Symbol" w:hAnsi="Symbol" w:cs="Symbol" w:hint="default"/>
@@ -5753,99 +6372,123 @@
     </w:lvl>
     <w:lvl w:ilvl="1">
       <w:start w:val="1"/>
-      <w:numFmt w:val="decimal"/>
-      <w:lvlText w:val="%2."/>
-      <w:lvlJc w:val="start"/>
-      <w:pPr>
-        <w:tabs>
-          <w:tab w:val="num" w:pos="1080"/>
-        </w:tabs>
-        <w:ind w:start="1080" w:hanging="360"/>
-      </w:pPr>
+      <w:numFmt w:val="bullet"/>
+      <w:lvlText w:val=""/>
+      <w:lvlJc w:val="start"/>
+      <w:pPr>
+        <w:tabs>
+          <w:tab w:val="num" w:pos="1418"/>
+        </w:tabs>
+        <w:ind w:start="1418" w:hanging="283"/>
+      </w:pPr>
+      <w:rPr>
+        <w:rFonts w:ascii="Symbol" w:hAnsi="Symbol" w:cs="Symbol" w:hint="default"/>
+      </w:rPr>
     </w:lvl>
     <w:lvl w:ilvl="2">
       <w:start w:val="1"/>
-      <w:numFmt w:val="decimal"/>
-      <w:lvlText w:val="%3."/>
-      <w:lvlJc w:val="start"/>
-      <w:pPr>
-        <w:tabs>
-          <w:tab w:val="num" w:pos="1440"/>
-        </w:tabs>
-        <w:ind w:start="1440" w:hanging="360"/>
-      </w:pPr>
+      <w:numFmt w:val="bullet"/>
+      <w:lvlText w:val=""/>
+      <w:lvlJc w:val="start"/>
+      <w:pPr>
+        <w:tabs>
+          <w:tab w:val="num" w:pos="2127"/>
+        </w:tabs>
+        <w:ind w:start="2127" w:hanging="283"/>
+      </w:pPr>
+      <w:rPr>
+        <w:rFonts w:ascii="Symbol" w:hAnsi="Symbol" w:cs="Symbol" w:hint="default"/>
+      </w:rPr>
     </w:lvl>
     <w:lvl w:ilvl="3">
       <w:start w:val="1"/>
-      <w:numFmt w:val="decimal"/>
-      <w:lvlText w:val="%4."/>
-      <w:lvlJc w:val="start"/>
-      <w:pPr>
-        <w:tabs>
-          <w:tab w:val="num" w:pos="1800"/>
-        </w:tabs>
-        <w:ind w:start="1800" w:hanging="360"/>
-      </w:pPr>
+      <w:numFmt w:val="bullet"/>
+      <w:lvlText w:val=""/>
+      <w:lvlJc w:val="start"/>
+      <w:pPr>
+        <w:tabs>
+          <w:tab w:val="num" w:pos="2836"/>
+        </w:tabs>
+        <w:ind w:start="2836" w:hanging="283"/>
+      </w:pPr>
+      <w:rPr>
+        <w:rFonts w:ascii="Symbol" w:hAnsi="Symbol" w:cs="Symbol" w:hint="default"/>
+      </w:rPr>
     </w:lvl>
     <w:lvl w:ilvl="4">
       <w:start w:val="1"/>
-      <w:numFmt w:val="decimal"/>
-      <w:lvlText w:val="%5."/>
-      <w:lvlJc w:val="start"/>
-      <w:pPr>
-        <w:tabs>
-          <w:tab w:val="num" w:pos="2160"/>
-        </w:tabs>
-        <w:ind w:start="2160" w:hanging="360"/>
-      </w:pPr>
+      <w:numFmt w:val="bullet"/>
+      <w:lvlText w:val=""/>
+      <w:lvlJc w:val="start"/>
+      <w:pPr>
+        <w:tabs>
+          <w:tab w:val="num" w:pos="3545"/>
+        </w:tabs>
+        <w:ind w:start="3545" w:hanging="283"/>
+      </w:pPr>
+      <w:rPr>
+        <w:rFonts w:ascii="Symbol" w:hAnsi="Symbol" w:cs="Symbol" w:hint="default"/>
+      </w:rPr>
     </w:lvl>
     <w:lvl w:ilvl="5">
       <w:start w:val="1"/>
-      <w:numFmt w:val="decimal"/>
-      <w:lvlText w:val="%6."/>
-      <w:lvlJc w:val="start"/>
-      <w:pPr>
-        <w:tabs>
-          <w:tab w:val="num" w:pos="2520"/>
-        </w:tabs>
-        <w:ind w:start="2520" w:hanging="360"/>
-      </w:pPr>
+      <w:numFmt w:val="bullet"/>
+      <w:lvlText w:val=""/>
+      <w:lvlJc w:val="start"/>
+      <w:pPr>
+        <w:tabs>
+          <w:tab w:val="num" w:pos="4254"/>
+        </w:tabs>
+        <w:ind w:start="4254" w:hanging="283"/>
+      </w:pPr>
+      <w:rPr>
+        <w:rFonts w:ascii="Symbol" w:hAnsi="Symbol" w:cs="Symbol" w:hint="default"/>
+      </w:rPr>
     </w:lvl>
     <w:lvl w:ilvl="6">
       <w:start w:val="1"/>
-      <w:numFmt w:val="decimal"/>
-      <w:lvlText w:val="%7."/>
-      <w:lvlJc w:val="start"/>
-      <w:pPr>
-        <w:tabs>
-          <w:tab w:val="num" w:pos="2880"/>
-        </w:tabs>
-        <w:ind w:start="2880" w:hanging="360"/>
-      </w:pPr>
+      <w:numFmt w:val="bullet"/>
+      <w:lvlText w:val=""/>
+      <w:lvlJc w:val="start"/>
+      <w:pPr>
+        <w:tabs>
+          <w:tab w:val="num" w:pos="4963"/>
+        </w:tabs>
+        <w:ind w:start="4963" w:hanging="283"/>
+      </w:pPr>
+      <w:rPr>
+        <w:rFonts w:ascii="Symbol" w:hAnsi="Symbol" w:cs="Symbol" w:hint="default"/>
+      </w:rPr>
     </w:lvl>
     <w:lvl w:ilvl="7">
       <w:start w:val="1"/>
-      <w:numFmt w:val="decimal"/>
-      <w:lvlText w:val="%8."/>
-      <w:lvlJc w:val="start"/>
-      <w:pPr>
-        <w:tabs>
-          <w:tab w:val="num" w:pos="3240"/>
-        </w:tabs>
-        <w:ind w:start="3240" w:hanging="360"/>
-      </w:pPr>
+      <w:numFmt w:val="bullet"/>
+      <w:lvlText w:val=""/>
+      <w:lvlJc w:val="start"/>
+      <w:pPr>
+        <w:tabs>
+          <w:tab w:val="num" w:pos="5672"/>
+        </w:tabs>
+        <w:ind w:start="5672" w:hanging="283"/>
+      </w:pPr>
+      <w:rPr>
+        <w:rFonts w:ascii="Symbol" w:hAnsi="Symbol" w:cs="Symbol" w:hint="default"/>
+      </w:rPr>
     </w:lvl>
     <w:lvl w:ilvl="8">
       <w:start w:val="1"/>
-      <w:numFmt w:val="decimal"/>
-      <w:lvlText w:val="%9."/>
-      <w:lvlJc w:val="start"/>
-      <w:pPr>
-        <w:tabs>
-          <w:tab w:val="num" w:pos="3600"/>
-        </w:tabs>
-        <w:ind w:start="3600" w:hanging="360"/>
-      </w:pPr>
+      <w:numFmt w:val="bullet"/>
+      <w:lvlText w:val=""/>
+      <w:lvlJc w:val="start"/>
+      <w:pPr>
+        <w:tabs>
+          <w:tab w:val="num" w:pos="6381"/>
+        </w:tabs>
+        <w:ind w:start="6381" w:hanging="283"/>
+      </w:pPr>
+      <w:rPr>
+        <w:rFonts w:ascii="Symbol" w:hAnsi="Symbol" w:cs="Symbol" w:hint="default"/>
+      </w:rPr>
     </w:lvl>
   </w:abstractNum>
   <w:abstractNum w:abstractNumId="13">
@@ -5858,7 +6501,7 @@
         <w:tabs>
           <w:tab w:val="num" w:pos="720"/>
         </w:tabs>
-        <w:ind w:start="720" w:hanging="360"/>
+        <w:ind w:start="720" w:hanging="283"/>
       </w:pPr>
       <w:rPr>
         <w:rFonts w:ascii="Symbol" w:hAnsi="Symbol" w:cs="Symbol" w:hint="default"/>
@@ -5866,8 +6509,8 @@
     </w:lvl>
     <w:lvl w:ilvl="1">
       <w:start w:val="1"/>
-      <w:numFmt w:val="bullet"/>
-      <w:lvlText w:val="◦"/>
+      <w:numFmt w:val="decimal"/>
+      <w:lvlText w:val="%2."/>
       <w:lvlJc w:val="start"/>
       <w:pPr>
         <w:tabs>
@@ -5875,14 +6518,11 @@
         </w:tabs>
         <w:ind w:start="1080" w:hanging="360"/>
       </w:pPr>
-      <w:rPr>
-        <w:rFonts w:ascii="OpenSymbol" w:hAnsi="OpenSymbol" w:cs="OpenSymbol" w:hint="default"/>
-      </w:rPr>
     </w:lvl>
     <w:lvl w:ilvl="2">
       <w:start w:val="1"/>
-      <w:numFmt w:val="bullet"/>
-      <w:lvlText w:val="▪"/>
+      <w:numFmt w:val="decimal"/>
+      <w:lvlText w:val="%3."/>
       <w:lvlJc w:val="start"/>
       <w:pPr>
         <w:tabs>
@@ -5890,14 +6530,11 @@
         </w:tabs>
         <w:ind w:start="1440" w:hanging="360"/>
       </w:pPr>
-      <w:rPr>
-        <w:rFonts w:ascii="OpenSymbol" w:hAnsi="OpenSymbol" w:cs="OpenSymbol" w:hint="default"/>
-      </w:rPr>
     </w:lvl>
     <w:lvl w:ilvl="3">
       <w:start w:val="1"/>
-      <w:numFmt w:val="bullet"/>
-      <w:lvlText w:val=""/>
+      <w:numFmt w:val="decimal"/>
+      <w:lvlText w:val="%4."/>
       <w:lvlJc w:val="start"/>
       <w:pPr>
         <w:tabs>
@@ -5905,14 +6542,11 @@
         </w:tabs>
         <w:ind w:start="1800" w:hanging="360"/>
       </w:pPr>
-      <w:rPr>
-        <w:rFonts w:ascii="Symbol" w:hAnsi="Symbol" w:cs="Symbol" w:hint="default"/>
-      </w:rPr>
     </w:lvl>
     <w:lvl w:ilvl="4">
       <w:start w:val="1"/>
-      <w:numFmt w:val="bullet"/>
-      <w:lvlText w:val="◦"/>
+      <w:numFmt w:val="decimal"/>
+      <w:lvlText w:val="%5."/>
       <w:lvlJc w:val="start"/>
       <w:pPr>
         <w:tabs>
@@ -5920,14 +6554,11 @@
         </w:tabs>
         <w:ind w:start="2160" w:hanging="360"/>
       </w:pPr>
-      <w:rPr>
-        <w:rFonts w:ascii="OpenSymbol" w:hAnsi="OpenSymbol" w:cs="OpenSymbol" w:hint="default"/>
-      </w:rPr>
     </w:lvl>
     <w:lvl w:ilvl="5">
       <w:start w:val="1"/>
-      <w:numFmt w:val="bullet"/>
-      <w:lvlText w:val="▪"/>
+      <w:numFmt w:val="decimal"/>
+      <w:lvlText w:val="%6."/>
       <w:lvlJc w:val="start"/>
       <w:pPr>
         <w:tabs>
@@ -5935,14 +6566,11 @@
         </w:tabs>
         <w:ind w:start="2520" w:hanging="360"/>
       </w:pPr>
-      <w:rPr>
-        <w:rFonts w:ascii="OpenSymbol" w:hAnsi="OpenSymbol" w:cs="OpenSymbol" w:hint="default"/>
-      </w:rPr>
     </w:lvl>
     <w:lvl w:ilvl="6">
       <w:start w:val="1"/>
-      <w:numFmt w:val="bullet"/>
-      <w:lvlText w:val=""/>
+      <w:numFmt w:val="decimal"/>
+      <w:lvlText w:val="%7."/>
       <w:lvlJc w:val="start"/>
       <w:pPr>
         <w:tabs>
@@ -5950,14 +6578,11 @@
         </w:tabs>
         <w:ind w:start="2880" w:hanging="360"/>
       </w:pPr>
-      <w:rPr>
-        <w:rFonts w:ascii="Symbol" w:hAnsi="Symbol" w:cs="Symbol" w:hint="default"/>
-      </w:rPr>
     </w:lvl>
     <w:lvl w:ilvl="7">
       <w:start w:val="1"/>
-      <w:numFmt w:val="bullet"/>
-      <w:lvlText w:val="◦"/>
+      <w:numFmt w:val="decimal"/>
+      <w:lvlText w:val="%8."/>
       <w:lvlJc w:val="start"/>
       <w:pPr>
         <w:tabs>
@@ -5965,14 +6590,11 @@
         </w:tabs>
         <w:ind w:start="3240" w:hanging="360"/>
       </w:pPr>
-      <w:rPr>
-        <w:rFonts w:ascii="OpenSymbol" w:hAnsi="OpenSymbol" w:cs="OpenSymbol" w:hint="default"/>
-      </w:rPr>
     </w:lvl>
     <w:lvl w:ilvl="8">
       <w:start w:val="1"/>
-      <w:numFmt w:val="bullet"/>
-      <w:lvlText w:val="▪"/>
+      <w:numFmt w:val="decimal"/>
+      <w:lvlText w:val="%9."/>
       <w:lvlJc w:val="start"/>
       <w:pPr>
         <w:tabs>
@@ -5980,9 +6602,6 @@
         </w:tabs>
         <w:ind w:start="3600" w:hanging="360"/>
       </w:pPr>
-      <w:rPr>
-        <w:rFonts w:ascii="OpenSymbol" w:hAnsi="OpenSymbol" w:cs="OpenSymbol" w:hint="default"/>
-      </w:rPr>
     </w:lvl>
   </w:abstractNum>
   <w:abstractNum w:abstractNumId="14">
@@ -5995,7 +6614,7 @@
         <w:tabs>
           <w:tab w:val="num" w:pos="720"/>
         </w:tabs>
-        <w:ind w:start="720" w:hanging="360"/>
+        <w:ind w:start="720" w:hanging="283"/>
       </w:pPr>
       <w:rPr>
         <w:rFonts w:ascii="Symbol" w:hAnsi="Symbol" w:cs="Symbol" w:hint="default"/>
@@ -6003,8 +6622,8 @@
     </w:lvl>
     <w:lvl w:ilvl="1">
       <w:start w:val="1"/>
-      <w:numFmt w:val="bullet"/>
-      <w:lvlText w:val="◦"/>
+      <w:numFmt w:val="decimal"/>
+      <w:lvlText w:val="%2."/>
       <w:lvlJc w:val="start"/>
       <w:pPr>
         <w:tabs>
@@ -6012,14 +6631,11 @@
         </w:tabs>
         <w:ind w:start="1080" w:hanging="360"/>
       </w:pPr>
-      <w:rPr>
-        <w:rFonts w:ascii="OpenSymbol" w:hAnsi="OpenSymbol" w:cs="OpenSymbol" w:hint="default"/>
-      </w:rPr>
     </w:lvl>
     <w:lvl w:ilvl="2">
       <w:start w:val="1"/>
-      <w:numFmt w:val="bullet"/>
-      <w:lvlText w:val="▪"/>
+      <w:numFmt w:val="decimal"/>
+      <w:lvlText w:val="%3."/>
       <w:lvlJc w:val="start"/>
       <w:pPr>
         <w:tabs>
@@ -6027,14 +6643,11 @@
         </w:tabs>
         <w:ind w:start="1440" w:hanging="360"/>
       </w:pPr>
-      <w:rPr>
-        <w:rFonts w:ascii="OpenSymbol" w:hAnsi="OpenSymbol" w:cs="OpenSymbol" w:hint="default"/>
-      </w:rPr>
     </w:lvl>
     <w:lvl w:ilvl="3">
       <w:start w:val="1"/>
-      <w:numFmt w:val="bullet"/>
-      <w:lvlText w:val=""/>
+      <w:numFmt w:val="decimal"/>
+      <w:lvlText w:val="%4."/>
       <w:lvlJc w:val="start"/>
       <w:pPr>
         <w:tabs>
@@ -6042,14 +6655,11 @@
         </w:tabs>
         <w:ind w:start="1800" w:hanging="360"/>
       </w:pPr>
-      <w:rPr>
-        <w:rFonts w:ascii="Symbol" w:hAnsi="Symbol" w:cs="Symbol" w:hint="default"/>
-      </w:rPr>
     </w:lvl>
     <w:lvl w:ilvl="4">
       <w:start w:val="1"/>
-      <w:numFmt w:val="bullet"/>
-      <w:lvlText w:val="◦"/>
+      <w:numFmt w:val="decimal"/>
+      <w:lvlText w:val="%5."/>
       <w:lvlJc w:val="start"/>
       <w:pPr>
         <w:tabs>
@@ -6057,14 +6667,11 @@
         </w:tabs>
         <w:ind w:start="2160" w:hanging="360"/>
       </w:pPr>
-      <w:rPr>
-        <w:rFonts w:ascii="OpenSymbol" w:hAnsi="OpenSymbol" w:cs="OpenSymbol" w:hint="default"/>
-      </w:rPr>
     </w:lvl>
     <w:lvl w:ilvl="5">
       <w:start w:val="1"/>
-      <w:numFmt w:val="bullet"/>
-      <w:lvlText w:val="▪"/>
+      <w:numFmt w:val="decimal"/>
+      <w:lvlText w:val="%6."/>
       <w:lvlJc w:val="start"/>
       <w:pPr>
         <w:tabs>
@@ -6072,14 +6679,11 @@
         </w:tabs>
         <w:ind w:start="2520" w:hanging="360"/>
       </w:pPr>
-      <w:rPr>
-        <w:rFonts w:ascii="OpenSymbol" w:hAnsi="OpenSymbol" w:cs="OpenSymbol" w:hint="default"/>
-      </w:rPr>
     </w:lvl>
     <w:lvl w:ilvl="6">
       <w:start w:val="1"/>
-      <w:numFmt w:val="bullet"/>
-      <w:lvlText w:val=""/>
+      <w:numFmt w:val="decimal"/>
+      <w:lvlText w:val="%7."/>
       <w:lvlJc w:val="start"/>
       <w:pPr>
         <w:tabs>
@@ -6087,14 +6691,11 @@
         </w:tabs>
         <w:ind w:start="2880" w:hanging="360"/>
       </w:pPr>
-      <w:rPr>
-        <w:rFonts w:ascii="Symbol" w:hAnsi="Symbol" w:cs="Symbol" w:hint="default"/>
-      </w:rPr>
     </w:lvl>
     <w:lvl w:ilvl="7">
       <w:start w:val="1"/>
-      <w:numFmt w:val="bullet"/>
-      <w:lvlText w:val="◦"/>
+      <w:numFmt w:val="decimal"/>
+      <w:lvlText w:val="%8."/>
       <w:lvlJc w:val="start"/>
       <w:pPr>
         <w:tabs>
@@ -6102,14 +6703,11 @@
         </w:tabs>
         <w:ind w:start="3240" w:hanging="360"/>
       </w:pPr>
-      <w:rPr>
-        <w:rFonts w:ascii="OpenSymbol" w:hAnsi="OpenSymbol" w:cs="OpenSymbol" w:hint="default"/>
-      </w:rPr>
     </w:lvl>
     <w:lvl w:ilvl="8">
       <w:start w:val="1"/>
-      <w:numFmt w:val="bullet"/>
-      <w:lvlText w:val="▪"/>
+      <w:numFmt w:val="decimal"/>
+      <w:lvlText w:val="%9."/>
       <w:lvlJc w:val="start"/>
       <w:pPr>
         <w:tabs>
@@ -6117,12 +6715,283 @@
         </w:tabs>
         <w:ind w:start="3600" w:hanging="360"/>
       </w:pPr>
-      <w:rPr>
-        <w:rFonts w:ascii="OpenSymbol" w:hAnsi="OpenSymbol" w:cs="OpenSymbol" w:hint="default"/>
-      </w:rPr>
     </w:lvl>
   </w:abstractNum>
   <w:abstractNum w:abstractNumId="15">
+    <w:lvl w:ilvl="0">
+      <w:start w:val="1"/>
+      <w:numFmt w:val="bullet"/>
+      <w:lvlText w:val=""/>
+      <w:lvlJc w:val="start"/>
+      <w:pPr>
+        <w:tabs>
+          <w:tab w:val="num" w:pos="720"/>
+        </w:tabs>
+        <w:ind w:start="720" w:hanging="360"/>
+      </w:pPr>
+      <w:rPr>
+        <w:rFonts w:ascii="Symbol" w:hAnsi="Symbol" w:cs="Symbol" w:hint="default"/>
+      </w:rPr>
+    </w:lvl>
+    <w:lvl w:ilvl="1">
+      <w:start w:val="1"/>
+      <w:numFmt w:val="bullet"/>
+      <w:lvlText w:val="◦"/>
+      <w:lvlJc w:val="start"/>
+      <w:pPr>
+        <w:tabs>
+          <w:tab w:val="num" w:pos="1080"/>
+        </w:tabs>
+        <w:ind w:start="1080" w:hanging="360"/>
+      </w:pPr>
+      <w:rPr>
+        <w:rFonts w:ascii="OpenSymbol" w:hAnsi="OpenSymbol" w:cs="OpenSymbol" w:hint="default"/>
+      </w:rPr>
+    </w:lvl>
+    <w:lvl w:ilvl="2">
+      <w:start w:val="1"/>
+      <w:numFmt w:val="bullet"/>
+      <w:lvlText w:val="▪"/>
+      <w:lvlJc w:val="start"/>
+      <w:pPr>
+        <w:tabs>
+          <w:tab w:val="num" w:pos="1440"/>
+        </w:tabs>
+        <w:ind w:start="1440" w:hanging="360"/>
+      </w:pPr>
+      <w:rPr>
+        <w:rFonts w:ascii="OpenSymbol" w:hAnsi="OpenSymbol" w:cs="OpenSymbol" w:hint="default"/>
+      </w:rPr>
+    </w:lvl>
+    <w:lvl w:ilvl="3">
+      <w:start w:val="1"/>
+      <w:numFmt w:val="bullet"/>
+      <w:lvlText w:val=""/>
+      <w:lvlJc w:val="start"/>
+      <w:pPr>
+        <w:tabs>
+          <w:tab w:val="num" w:pos="1800"/>
+        </w:tabs>
+        <w:ind w:start="1800" w:hanging="360"/>
+      </w:pPr>
+      <w:rPr>
+        <w:rFonts w:ascii="Symbol" w:hAnsi="Symbol" w:cs="Symbol" w:hint="default"/>
+      </w:rPr>
+    </w:lvl>
+    <w:lvl w:ilvl="4">
+      <w:start w:val="1"/>
+      <w:numFmt w:val="bullet"/>
+      <w:lvlText w:val="◦"/>
+      <w:lvlJc w:val="start"/>
+      <w:pPr>
+        <w:tabs>
+          <w:tab w:val="num" w:pos="2160"/>
+        </w:tabs>
+        <w:ind w:start="2160" w:hanging="360"/>
+      </w:pPr>
+      <w:rPr>
+        <w:rFonts w:ascii="OpenSymbol" w:hAnsi="OpenSymbol" w:cs="OpenSymbol" w:hint="default"/>
+      </w:rPr>
+    </w:lvl>
+    <w:lvl w:ilvl="5">
+      <w:start w:val="1"/>
+      <w:numFmt w:val="bullet"/>
+      <w:lvlText w:val="▪"/>
+      <w:lvlJc w:val="start"/>
+      <w:pPr>
+        <w:tabs>
+          <w:tab w:val="num" w:pos="2520"/>
+        </w:tabs>
+        <w:ind w:start="2520" w:hanging="360"/>
+      </w:pPr>
+      <w:rPr>
+        <w:rFonts w:ascii="OpenSymbol" w:hAnsi="OpenSymbol" w:cs="OpenSymbol" w:hint="default"/>
+      </w:rPr>
+    </w:lvl>
+    <w:lvl w:ilvl="6">
+      <w:start w:val="1"/>
+      <w:numFmt w:val="bullet"/>
+      <w:lvlText w:val=""/>
+      <w:lvlJc w:val="start"/>
+      <w:pPr>
+        <w:tabs>
+          <w:tab w:val="num" w:pos="2880"/>
+        </w:tabs>
+        <w:ind w:start="2880" w:hanging="360"/>
+      </w:pPr>
+      <w:rPr>
+        <w:rFonts w:ascii="Symbol" w:hAnsi="Symbol" w:cs="Symbol" w:hint="default"/>
+      </w:rPr>
+    </w:lvl>
+    <w:lvl w:ilvl="7">
+      <w:start w:val="1"/>
+      <w:numFmt w:val="bullet"/>
+      <w:lvlText w:val="◦"/>
+      <w:lvlJc w:val="start"/>
+      <w:pPr>
+        <w:tabs>
+          <w:tab w:val="num" w:pos="3240"/>
+        </w:tabs>
+        <w:ind w:start="3240" w:hanging="360"/>
+      </w:pPr>
+      <w:rPr>
+        <w:rFonts w:ascii="OpenSymbol" w:hAnsi="OpenSymbol" w:cs="OpenSymbol" w:hint="default"/>
+      </w:rPr>
+    </w:lvl>
+    <w:lvl w:ilvl="8">
+      <w:start w:val="1"/>
+      <w:numFmt w:val="bullet"/>
+      <w:lvlText w:val="▪"/>
+      <w:lvlJc w:val="start"/>
+      <w:pPr>
+        <w:tabs>
+          <w:tab w:val="num" w:pos="3600"/>
+        </w:tabs>
+        <w:ind w:start="3600" w:hanging="360"/>
+      </w:pPr>
+      <w:rPr>
+        <w:rFonts w:ascii="OpenSymbol" w:hAnsi="OpenSymbol" w:cs="OpenSymbol" w:hint="default"/>
+      </w:rPr>
+    </w:lvl>
+  </w:abstractNum>
+  <w:abstractNum w:abstractNumId="16">
+    <w:lvl w:ilvl="0">
+      <w:start w:val="1"/>
+      <w:numFmt w:val="bullet"/>
+      <w:lvlText w:val=""/>
+      <w:lvlJc w:val="start"/>
+      <w:pPr>
+        <w:tabs>
+          <w:tab w:val="num" w:pos="720"/>
+        </w:tabs>
+        <w:ind w:start="720" w:hanging="360"/>
+      </w:pPr>
+      <w:rPr>
+        <w:rFonts w:ascii="Symbol" w:hAnsi="Symbol" w:cs="Symbol" w:hint="default"/>
+      </w:rPr>
+    </w:lvl>
+    <w:lvl w:ilvl="1">
+      <w:start w:val="1"/>
+      <w:numFmt w:val="bullet"/>
+      <w:lvlText w:val="◦"/>
+      <w:lvlJc w:val="start"/>
+      <w:pPr>
+        <w:tabs>
+          <w:tab w:val="num" w:pos="1080"/>
+        </w:tabs>
+        <w:ind w:start="1080" w:hanging="360"/>
+      </w:pPr>
+      <w:rPr>
+        <w:rFonts w:ascii="OpenSymbol" w:hAnsi="OpenSymbol" w:cs="OpenSymbol" w:hint="default"/>
+      </w:rPr>
+    </w:lvl>
+    <w:lvl w:ilvl="2">
+      <w:start w:val="1"/>
+      <w:numFmt w:val="bullet"/>
+      <w:lvlText w:val="▪"/>
+      <w:lvlJc w:val="start"/>
+      <w:pPr>
+        <w:tabs>
+          <w:tab w:val="num" w:pos="1440"/>
+        </w:tabs>
+        <w:ind w:start="1440" w:hanging="360"/>
+      </w:pPr>
+      <w:rPr>
+        <w:rFonts w:ascii="OpenSymbol" w:hAnsi="OpenSymbol" w:cs="OpenSymbol" w:hint="default"/>
+      </w:rPr>
+    </w:lvl>
+    <w:lvl w:ilvl="3">
+      <w:start w:val="1"/>
+      <w:numFmt w:val="bullet"/>
+      <w:lvlText w:val=""/>
+      <w:lvlJc w:val="start"/>
+      <w:pPr>
+        <w:tabs>
+          <w:tab w:val="num" w:pos="1800"/>
+        </w:tabs>
+        <w:ind w:start="1800" w:hanging="360"/>
+      </w:pPr>
+      <w:rPr>
+        <w:rFonts w:ascii="Symbol" w:hAnsi="Symbol" w:cs="Symbol" w:hint="default"/>
+      </w:rPr>
+    </w:lvl>
+    <w:lvl w:ilvl="4">
+      <w:start w:val="1"/>
+      <w:numFmt w:val="bullet"/>
+      <w:lvlText w:val="◦"/>
+      <w:lvlJc w:val="start"/>
+      <w:pPr>
+        <w:tabs>
+          <w:tab w:val="num" w:pos="2160"/>
+        </w:tabs>
+        <w:ind w:start="2160" w:hanging="360"/>
+      </w:pPr>
+      <w:rPr>
+        <w:rFonts w:ascii="OpenSymbol" w:hAnsi="OpenSymbol" w:cs="OpenSymbol" w:hint="default"/>
+      </w:rPr>
+    </w:lvl>
+    <w:lvl w:ilvl="5">
+      <w:start w:val="1"/>
+      <w:numFmt w:val="bullet"/>
+      <w:lvlText w:val="▪"/>
+      <w:lvlJc w:val="start"/>
+      <w:pPr>
+        <w:tabs>
+          <w:tab w:val="num" w:pos="2520"/>
+        </w:tabs>
+        <w:ind w:start="2520" w:hanging="360"/>
+      </w:pPr>
+      <w:rPr>
+        <w:rFonts w:ascii="OpenSymbol" w:hAnsi="OpenSymbol" w:cs="OpenSymbol" w:hint="default"/>
+      </w:rPr>
+    </w:lvl>
+    <w:lvl w:ilvl="6">
+      <w:start w:val="1"/>
+      <w:numFmt w:val="bullet"/>
+      <w:lvlText w:val=""/>
+      <w:lvlJc w:val="start"/>
+      <w:pPr>
+        <w:tabs>
+          <w:tab w:val="num" w:pos="2880"/>
+        </w:tabs>
+        <w:ind w:start="2880" w:hanging="360"/>
+      </w:pPr>
+      <w:rPr>
+        <w:rFonts w:ascii="Symbol" w:hAnsi="Symbol" w:cs="Symbol" w:hint="default"/>
+      </w:rPr>
+    </w:lvl>
+    <w:lvl w:ilvl="7">
+      <w:start w:val="1"/>
+      <w:numFmt w:val="bullet"/>
+      <w:lvlText w:val="◦"/>
+      <w:lvlJc w:val="start"/>
+      <w:pPr>
+        <w:tabs>
+          <w:tab w:val="num" w:pos="3240"/>
+        </w:tabs>
+        <w:ind w:start="3240" w:hanging="360"/>
+      </w:pPr>
+      <w:rPr>
+        <w:rFonts w:ascii="OpenSymbol" w:hAnsi="OpenSymbol" w:cs="OpenSymbol" w:hint="default"/>
+      </w:rPr>
+    </w:lvl>
+    <w:lvl w:ilvl="8">
+      <w:start w:val="1"/>
+      <w:numFmt w:val="bullet"/>
+      <w:lvlText w:val="▪"/>
+      <w:lvlJc w:val="start"/>
+      <w:pPr>
+        <w:tabs>
+          <w:tab w:val="num" w:pos="3600"/>
+        </w:tabs>
+        <w:ind w:start="3600" w:hanging="360"/>
+      </w:pPr>
+      <w:rPr>
+        <w:rFonts w:ascii="OpenSymbol" w:hAnsi="OpenSymbol" w:cs="OpenSymbol" w:hint="default"/>
+      </w:rPr>
+    </w:lvl>
+  </w:abstractNum>
+  <w:abstractNum w:abstractNumId="17">
     <w:lvl w:ilvl="0">
       <w:start w:val="1"/>
       <w:numFmt w:val="bullet"/>
@@ -6303,6 +7172,12 @@
   </w:num>
   <w:num w:numId="15">
     <w:abstractNumId w:val="15"/>
+  </w:num>
+  <w:num w:numId="16">
+    <w:abstractNumId w:val="16"/>
+  </w:num>
+  <w:num w:numId="17">
+    <w:abstractNumId w:val="17"/>
   </w:num>
 </w:numbering>
 </file>
@@ -6393,6 +7268,10 @@
     <w:next w:val="BodyText"/>
     <w:qFormat/>
     <w:pPr>
+      <w:numPr>
+        <w:ilvl w:val="0"/>
+        <w:numId w:val="0"/>
+      </w:numPr>
       <w:spacing w:before="120" w:after="120"/>
       <w:outlineLvl w:val="3"/>
     </w:pPr>

</xml_diff>

<commit_message>
Update Spotify Connect design.docx, Spotify Connect design.odt, and 2 more files...
</commit_message>
<xml_diff>
--- a/Documents/Spotify/Spotify Connect design.docx
+++ b/Documents/Spotify/Spotify Connect design.docx
@@ -1826,7 +1826,7 @@
       <w:tblPr>
         <w:tblW w:w="6190" w:type="dxa"/>
         <w:jc w:val="start"/>
-        <w:tblInd w:w="0" w:type="dxa"/>
+        <w:tblInd w:w="28" w:type="dxa"/>
         <w:tblLayout w:type="fixed"/>
         <w:tblCellMar>
           <w:top w:w="28" w:type="dxa"/>
@@ -2095,7 +2095,7 @@
       <w:tblPr>
         <w:tblW w:w="5632" w:type="dxa"/>
         <w:jc w:val="start"/>
-        <w:tblInd w:w="0" w:type="dxa"/>
+        <w:tblInd w:w="28" w:type="dxa"/>
         <w:tblLayout w:type="fixed"/>
         <w:tblCellMar>
           <w:top w:w="28" w:type="dxa"/>
@@ -2310,7 +2310,7 @@
       <w:tblPr>
         <w:tblW w:w="5632" w:type="dxa"/>
         <w:jc w:val="start"/>
-        <w:tblInd w:w="0" w:type="dxa"/>
+        <w:tblInd w:w="28" w:type="dxa"/>
         <w:tblLayout w:type="fixed"/>
         <w:tblCellMar>
           <w:top w:w="28" w:type="dxa"/>
@@ -2525,7 +2525,7 @@
       <w:tblPr>
         <w:tblW w:w="5632" w:type="dxa"/>
         <w:jc w:val="start"/>
-        <w:tblInd w:w="0" w:type="dxa"/>
+        <w:tblInd w:w="28" w:type="dxa"/>
         <w:tblLayout w:type="fixed"/>
         <w:tblCellMar>
           <w:top w:w="28" w:type="dxa"/>
@@ -2848,7 +2848,7 @@
       <w:tblPr>
         <w:tblW w:w="5632" w:type="dxa"/>
         <w:jc w:val="start"/>
-        <w:tblInd w:w="0" w:type="dxa"/>
+        <w:tblInd w:w="28" w:type="dxa"/>
         <w:tblLayout w:type="fixed"/>
         <w:tblCellMar>
           <w:top w:w="28" w:type="dxa"/>
@@ -3171,7 +3171,7 @@
       <w:tblPr>
         <w:tblW w:w="5632" w:type="dxa"/>
         <w:jc w:val="start"/>
-        <w:tblInd w:w="0" w:type="dxa"/>
+        <w:tblInd w:w="28" w:type="dxa"/>
         <w:tblLayout w:type="fixed"/>
         <w:tblCellMar>
           <w:top w:w="28" w:type="dxa"/>
@@ -3386,7 +3386,7 @@
       <w:tblPr>
         <w:tblW w:w="5441" w:type="dxa"/>
         <w:jc w:val="start"/>
-        <w:tblInd w:w="0" w:type="dxa"/>
+        <w:tblInd w:w="28" w:type="dxa"/>
         <w:tblLayout w:type="fixed"/>
         <w:tblCellMar>
           <w:top w:w="28" w:type="dxa"/>
@@ -4868,6 +4868,2621 @@
         <w:t>stop:can be used to stop the mpv player using the method provided by the class</w:t>
       </w:r>
     </w:p>
+    <w:p>
+      <w:pPr>
+        <w:pStyle w:val="Heading1"/>
+        <w:ind w:hanging="0" w:start="0"/>
+        <w:rPr/>
+      </w:pPr>
+      <w:r>
+        <w:rPr/>
+        <w:t>Module Interface specification:</w:t>
+      </w:r>
+    </w:p>
+    <w:p>
+      <w:pPr>
+        <w:pStyle w:val="Heading2"/>
+        <w:rPr/>
+      </w:pPr>
+      <w:r>
+        <w:rPr/>
+        <w:t>Constants</w:t>
+      </w:r>
+    </w:p>
+    <w:p>
+      <w:pPr>
+        <w:pStyle w:val="Normal"/>
+        <w:ind w:hanging="0"/>
+        <w:jc w:val="start"/>
+        <w:rPr>
+          <w:rFonts w:ascii="Monospace" w:hAnsi="Monospace"/>
+        </w:rPr>
+      </w:pPr>
+      <w:r>
+        <w:rPr/>
+      </w:r>
+    </w:p>
+    <w:p>
+      <w:pPr>
+        <w:pStyle w:val="Normal"/>
+        <w:ind w:hanging="0"/>
+        <w:jc w:val="start"/>
+        <w:rPr>
+          <w:rFonts w:ascii="Monospace" w:hAnsi="Monospace"/>
+        </w:rPr>
+      </w:pPr>
+      <w:r>
+        <w:rPr>
+          <w:rFonts w:ascii="Monospace" w:hAnsi="Monospace"/>
+          <w:color w:val="000000"/>
+          <w:sz w:val="20"/>
+          <w:shd w:fill="FFFF96" w:val="clear"/>
+        </w:rPr>
+        <w:t>MESSAGE_SPOTIFY_TYPE</w:t>
+      </w:r>
+      <w:r>
+        <w:rPr>
+          <w:rFonts w:ascii="Monospace" w:hAnsi="Monospace"/>
+          <w:color w:val="000000"/>
+          <w:sz w:val="20"/>
+          <w:shd w:fill="E8F2FE" w:val="clear"/>
+        </w:rPr>
+        <w:t xml:space="preserve">        </w:t>
+        <w:tab/>
+        <w:tab/>
+        <w:t xml:space="preserve">  = </w:t>
+      </w:r>
+      <w:r>
+        <w:rPr>
+          <w:rFonts w:ascii="Monospace" w:hAnsi="Monospace"/>
+          <w:i/>
+          <w:color w:val="00AA00"/>
+          <w:sz w:val="20"/>
+          <w:shd w:fill="E8F2FE" w:val="clear"/>
+        </w:rPr>
+        <w:t>"</w:t>
+      </w:r>
+      <w:r>
+        <w:rPr>
+          <w:rFonts w:ascii="Monospace" w:hAnsi="Monospace"/>
+          <w:i/>
+          <w:color w:val="00AA00"/>
+          <w:sz w:val="20"/>
+          <w:u w:val="single"/>
+          <w:shd w:fill="E8F2FE" w:val="clear"/>
+        </w:rPr>
+        <w:t>Spotify</w:t>
+      </w:r>
+      <w:r>
+        <w:rPr>
+          <w:rFonts w:ascii="Monospace" w:hAnsi="Monospace"/>
+          <w:i/>
+          <w:color w:val="00AA00"/>
+          <w:sz w:val="20"/>
+          <w:shd w:fill="E8F2FE" w:val="clear"/>
+        </w:rPr>
+        <w:t xml:space="preserve"> message"</w:t>
+      </w:r>
+    </w:p>
+    <w:p>
+      <w:pPr>
+        <w:pStyle w:val="Normal"/>
+        <w:ind w:hanging="0"/>
+        <w:jc w:val="start"/>
+        <w:rPr>
+          <w:rFonts w:ascii="Monospace" w:hAnsi="Monospace"/>
+        </w:rPr>
+      </w:pPr>
+      <w:r>
+        <w:rPr/>
+      </w:r>
+    </w:p>
+    <w:p>
+      <w:pPr>
+        <w:pStyle w:val="Normal"/>
+        <w:ind w:hanging="0"/>
+        <w:jc w:val="start"/>
+        <w:rPr>
+          <w:rFonts w:ascii="Monospace" w:hAnsi="Monospace"/>
+        </w:rPr>
+      </w:pPr>
+      <w:r>
+        <w:rPr>
+          <w:rFonts w:ascii="Monospace" w:hAnsi="Monospace"/>
+          <w:i/>
+          <w:color w:val="C0C0C0"/>
+          <w:sz w:val="20"/>
+          <w:shd w:fill="E8F2FE" w:val="clear"/>
+        </w:rPr>
+        <w:t># SPOTIFY events and states</w:t>
+      </w:r>
+    </w:p>
+    <w:p>
+      <w:pPr>
+        <w:pStyle w:val="Normal"/>
+        <w:ind w:hanging="0"/>
+        <w:jc w:val="start"/>
+        <w:rPr>
+          <w:rFonts w:ascii="Monospace" w:hAnsi="Monospace"/>
+          <w:sz w:val="20"/>
+        </w:rPr>
+      </w:pPr>
+      <w:r>
+        <w:rPr>
+          <w:rFonts w:ascii="Monospace" w:hAnsi="Monospace"/>
+          <w:color w:val="000000"/>
+          <w:sz w:val="20"/>
+          <w:shd w:fill="FFFF96" w:val="clear"/>
+        </w:rPr>
+        <w:t>SPOTIFY_CONNECT_PLAYING_EVENT</w:t>
+      </w:r>
+      <w:r>
+        <w:rPr>
+          <w:rFonts w:ascii="Monospace" w:hAnsi="Monospace"/>
+          <w:color w:val="000000"/>
+          <w:sz w:val="20"/>
+        </w:rPr>
+        <w:t xml:space="preserve">        = </w:t>
+      </w:r>
+      <w:r>
+        <w:rPr>
+          <w:rFonts w:ascii="Monospace" w:hAnsi="Monospace"/>
+          <w:i/>
+          <w:color w:val="00AA00"/>
+          <w:sz w:val="20"/>
+        </w:rPr>
+        <w:t>"</w:t>
+      </w:r>
+      <w:r>
+        <w:rPr>
+          <w:rFonts w:ascii="Monospace" w:hAnsi="Monospace"/>
+          <w:i/>
+          <w:color w:val="00AA00"/>
+          <w:sz w:val="20"/>
+          <w:u w:val="single"/>
+        </w:rPr>
+        <w:t>Spotify</w:t>
+      </w:r>
+      <w:r>
+        <w:rPr>
+          <w:rFonts w:ascii="Monospace" w:hAnsi="Monospace"/>
+          <w:i/>
+          <w:color w:val="00AA00"/>
+          <w:sz w:val="20"/>
+        </w:rPr>
+        <w:t xml:space="preserve"> Connect playing event"</w:t>
+      </w:r>
+    </w:p>
+    <w:p>
+      <w:pPr>
+        <w:pStyle w:val="Normal"/>
+        <w:ind w:hanging="0"/>
+        <w:jc w:val="start"/>
+        <w:rPr>
+          <w:rFonts w:ascii="Monospace" w:hAnsi="Monospace"/>
+          <w:sz w:val="20"/>
+        </w:rPr>
+      </w:pPr>
+      <w:r>
+        <w:rPr>
+          <w:rFonts w:ascii="Monospace" w:hAnsi="Monospace"/>
+          <w:color w:val="000000"/>
+          <w:sz w:val="20"/>
+        </w:rPr>
+        <w:t xml:space="preserve">SPOTIFY_CONNECT_PAUSED_EVENT         = </w:t>
+      </w:r>
+      <w:r>
+        <w:rPr>
+          <w:rFonts w:ascii="Monospace" w:hAnsi="Monospace"/>
+          <w:i/>
+          <w:color w:val="00AA00"/>
+          <w:sz w:val="20"/>
+        </w:rPr>
+        <w:t>"</w:t>
+      </w:r>
+      <w:r>
+        <w:rPr>
+          <w:rFonts w:ascii="Monospace" w:hAnsi="Monospace"/>
+          <w:i/>
+          <w:color w:val="00AA00"/>
+          <w:sz w:val="20"/>
+          <w:u w:val="single"/>
+        </w:rPr>
+        <w:t>Spotify</w:t>
+      </w:r>
+      <w:r>
+        <w:rPr>
+          <w:rFonts w:ascii="Monospace" w:hAnsi="Monospace"/>
+          <w:i/>
+          <w:color w:val="00AA00"/>
+          <w:sz w:val="20"/>
+        </w:rPr>
+        <w:t xml:space="preserve"> Connect paused event"</w:t>
+      </w:r>
+    </w:p>
+    <w:p>
+      <w:pPr>
+        <w:pStyle w:val="Normal"/>
+        <w:ind w:hanging="0"/>
+        <w:jc w:val="start"/>
+        <w:rPr>
+          <w:rFonts w:ascii="Monospace" w:hAnsi="Monospace"/>
+          <w:sz w:val="20"/>
+        </w:rPr>
+      </w:pPr>
+      <w:r>
+        <w:rPr>
+          <w:rFonts w:ascii="Monospace" w:hAnsi="Monospace"/>
+          <w:color w:val="000000"/>
+          <w:sz w:val="20"/>
+        </w:rPr>
+        <w:t xml:space="preserve">SPOTIFY_CONNECT_STOPPED_EVENT        = </w:t>
+      </w:r>
+      <w:r>
+        <w:rPr>
+          <w:rFonts w:ascii="Monospace" w:hAnsi="Monospace"/>
+          <w:i/>
+          <w:color w:val="00AA00"/>
+          <w:sz w:val="20"/>
+        </w:rPr>
+        <w:t>"</w:t>
+      </w:r>
+      <w:r>
+        <w:rPr>
+          <w:rFonts w:ascii="Monospace" w:hAnsi="Monospace"/>
+          <w:i/>
+          <w:color w:val="00AA00"/>
+          <w:sz w:val="20"/>
+          <w:u w:val="single"/>
+        </w:rPr>
+        <w:t>Spotify</w:t>
+      </w:r>
+      <w:r>
+        <w:rPr>
+          <w:rFonts w:ascii="Monospace" w:hAnsi="Monospace"/>
+          <w:i/>
+          <w:color w:val="00AA00"/>
+          <w:sz w:val="20"/>
+        </w:rPr>
+        <w:t xml:space="preserve"> Connect stopped event"</w:t>
+      </w:r>
+    </w:p>
+    <w:p>
+      <w:pPr>
+        <w:pStyle w:val="Normal"/>
+        <w:ind w:hanging="0"/>
+        <w:jc w:val="start"/>
+        <w:rPr>
+          <w:rFonts w:ascii="Monospace" w:hAnsi="Monospace"/>
+          <w:sz w:val="20"/>
+        </w:rPr>
+      </w:pPr>
+      <w:r>
+        <w:rPr>
+          <w:rFonts w:ascii="Monospace" w:hAnsi="Monospace"/>
+          <w:color w:val="000000"/>
+          <w:sz w:val="20"/>
+        </w:rPr>
+        <w:t xml:space="preserve">SPOTIFY_CONNECT_CONNECTED_EVENT      = </w:t>
+      </w:r>
+      <w:r>
+        <w:rPr>
+          <w:rFonts w:ascii="Monospace" w:hAnsi="Monospace"/>
+          <w:i/>
+          <w:color w:val="00AA00"/>
+          <w:sz w:val="20"/>
+        </w:rPr>
+        <w:t>"</w:t>
+      </w:r>
+      <w:r>
+        <w:rPr>
+          <w:rFonts w:ascii="Monospace" w:hAnsi="Monospace"/>
+          <w:i/>
+          <w:color w:val="00AA00"/>
+          <w:sz w:val="20"/>
+          <w:u w:val="single"/>
+        </w:rPr>
+        <w:t>Spotify</w:t>
+      </w:r>
+      <w:r>
+        <w:rPr>
+          <w:rFonts w:ascii="Monospace" w:hAnsi="Monospace"/>
+          <w:i/>
+          <w:color w:val="00AA00"/>
+          <w:sz w:val="20"/>
+        </w:rPr>
+        <w:t xml:space="preserve"> Connect connected event"</w:t>
+      </w:r>
+    </w:p>
+    <w:p>
+      <w:pPr>
+        <w:pStyle w:val="Normal"/>
+        <w:ind w:hanging="0"/>
+        <w:jc w:val="start"/>
+        <w:rPr>
+          <w:rFonts w:ascii="Monospace" w:hAnsi="Monospace"/>
+          <w:sz w:val="20"/>
+        </w:rPr>
+      </w:pPr>
+      <w:r>
+        <w:rPr>
+          <w:rFonts w:ascii="Monospace" w:hAnsi="Monospace"/>
+          <w:color w:val="000000"/>
+          <w:sz w:val="20"/>
+        </w:rPr>
+        <w:t xml:space="preserve">SPOTIFY_CONNECT_DISCONNECTED_EVENT   = </w:t>
+      </w:r>
+      <w:r>
+        <w:rPr>
+          <w:rFonts w:ascii="Monospace" w:hAnsi="Monospace"/>
+          <w:i/>
+          <w:color w:val="00AA00"/>
+          <w:sz w:val="20"/>
+        </w:rPr>
+        <w:t>"</w:t>
+      </w:r>
+      <w:r>
+        <w:rPr>
+          <w:rFonts w:ascii="Monospace" w:hAnsi="Monospace"/>
+          <w:i/>
+          <w:color w:val="00AA00"/>
+          <w:sz w:val="20"/>
+          <w:u w:val="single"/>
+        </w:rPr>
+        <w:t>Spotify</w:t>
+      </w:r>
+      <w:r>
+        <w:rPr>
+          <w:rFonts w:ascii="Monospace" w:hAnsi="Monospace"/>
+          <w:i/>
+          <w:color w:val="00AA00"/>
+          <w:sz w:val="20"/>
+        </w:rPr>
+        <w:t xml:space="preserve"> Connect disconnected event"</w:t>
+      </w:r>
+    </w:p>
+    <w:p>
+      <w:pPr>
+        <w:pStyle w:val="Normal"/>
+        <w:spacing w:lineRule="auto" w:line="240" w:before="0" w:after="26"/>
+        <w:rPr>
+          <w:rFonts w:ascii="Liberation Serif" w:hAnsi="Liberation Serif"/>
+          <w:b w:val="false"/>
+          <w:bCs w:val="false"/>
+          <w:sz w:val="24"/>
+          <w:szCs w:val="24"/>
+          <w:u w:val="none"/>
+        </w:rPr>
+      </w:pPr>
+      <w:r>
+        <w:rPr>
+          <w:rFonts w:ascii="Monospace" w:hAnsi="Monospace"/>
+          <w:b w:val="false"/>
+          <w:bCs w:val="false"/>
+          <w:color w:val="000000"/>
+          <w:sz w:val="20"/>
+          <w:szCs w:val="24"/>
+          <w:u w:val="none"/>
+        </w:rPr>
+        <w:t xml:space="preserve">SPOTIFY_CONNECT_CLIENT_CHANGED_EVENT = </w:t>
+      </w:r>
+      <w:r>
+        <w:rPr>
+          <w:rFonts w:ascii="Monospace" w:hAnsi="Monospace"/>
+          <w:b w:val="false"/>
+          <w:bCs w:val="false"/>
+          <w:i/>
+          <w:color w:val="00AA00"/>
+          <w:sz w:val="20"/>
+          <w:szCs w:val="24"/>
+          <w:u w:val="none"/>
+        </w:rPr>
+        <w:t>"</w:t>
+      </w:r>
+      <w:r>
+        <w:rPr>
+          <w:rFonts w:ascii="Monospace" w:hAnsi="Monospace"/>
+          <w:b w:val="false"/>
+          <w:bCs w:val="false"/>
+          <w:i/>
+          <w:color w:val="00AA00"/>
+          <w:sz w:val="20"/>
+          <w:szCs w:val="24"/>
+          <w:u w:val="single"/>
+        </w:rPr>
+        <w:t>Spotify</w:t>
+      </w:r>
+      <w:r>
+        <w:rPr>
+          <w:rFonts w:ascii="Monospace" w:hAnsi="Monospace"/>
+          <w:b w:val="false"/>
+          <w:bCs w:val="false"/>
+          <w:i/>
+          <w:color w:val="00AA00"/>
+          <w:sz w:val="20"/>
+          <w:szCs w:val="24"/>
+          <w:u w:val="none"/>
+        </w:rPr>
+        <w:t xml:space="preserve"> Connect client changed event"</w:t>
+      </w:r>
+    </w:p>
+    <w:p>
+      <w:pPr>
+        <w:pStyle w:val="Normal"/>
+        <w:spacing w:lineRule="auto" w:line="240" w:before="0" w:after="26"/>
+        <w:rPr>
+          <w:rFonts w:ascii="Monospace" w:hAnsi="Monospace"/>
+          <w:i/>
+          <w:i/>
+          <w:color w:val="00AA00"/>
+          <w:sz w:val="20"/>
+        </w:rPr>
+      </w:pPr>
+      <w:r>
+        <w:rPr>
+          <w:b w:val="false"/>
+          <w:bCs w:val="false"/>
+          <w:sz w:val="24"/>
+          <w:szCs w:val="24"/>
+          <w:u w:val="none"/>
+        </w:rPr>
+      </w:r>
+    </w:p>
+    <w:p>
+      <w:pPr>
+        <w:pStyle w:val="Normal"/>
+        <w:ind w:hanging="0"/>
+        <w:jc w:val="start"/>
+        <w:rPr>
+          <w:rFonts w:ascii="Monospace" w:hAnsi="Monospace"/>
+          <w:sz w:val="20"/>
+        </w:rPr>
+      </w:pPr>
+      <w:r>
+        <w:rPr>
+          <w:rFonts w:ascii="Monospace" w:hAnsi="Monospace"/>
+          <w:i/>
+          <w:color w:val="C0C0C0"/>
+          <w:sz w:val="20"/>
+        </w:rPr>
+        <w:t># MPV_PLAYER COMMANDS ####</w:t>
+      </w:r>
+    </w:p>
+    <w:p>
+      <w:pPr>
+        <w:pStyle w:val="Normal"/>
+        <w:ind w:hanging="0"/>
+        <w:jc w:val="start"/>
+        <w:rPr>
+          <w:rFonts w:ascii="Monospace" w:hAnsi="Monospace"/>
+          <w:sz w:val="20"/>
+        </w:rPr>
+      </w:pPr>
+      <w:r>
+        <w:rPr>
+          <w:rFonts w:ascii="Monospace" w:hAnsi="Monospace"/>
+          <w:color w:val="000000"/>
+          <w:sz w:val="20"/>
+        </w:rPr>
+        <w:t xml:space="preserve">MPV_PLAYERCTL_PLAY  = </w:t>
+      </w:r>
+      <w:r>
+        <w:rPr>
+          <w:rFonts w:ascii="Monospace" w:hAnsi="Monospace"/>
+          <w:i/>
+          <w:color w:val="00AA00"/>
+          <w:sz w:val="20"/>
+        </w:rPr>
+        <w:t>"play"</w:t>
+      </w:r>
+    </w:p>
+    <w:p>
+      <w:pPr>
+        <w:pStyle w:val="Normal"/>
+        <w:ind w:hanging="0"/>
+        <w:jc w:val="start"/>
+        <w:rPr>
+          <w:rFonts w:ascii="Monospace" w:hAnsi="Monospace"/>
+          <w:sz w:val="20"/>
+        </w:rPr>
+      </w:pPr>
+      <w:r>
+        <w:rPr>
+          <w:rFonts w:ascii="Monospace" w:hAnsi="Monospace"/>
+          <w:color w:val="000000"/>
+          <w:sz w:val="20"/>
+        </w:rPr>
+        <w:t xml:space="preserve">MPV_PLAYERCTL_PAUSE = </w:t>
+      </w:r>
+      <w:r>
+        <w:rPr>
+          <w:rFonts w:ascii="Monospace" w:hAnsi="Monospace"/>
+          <w:i/>
+          <w:color w:val="00AA00"/>
+          <w:sz w:val="20"/>
+        </w:rPr>
+        <w:t>"pause"</w:t>
+      </w:r>
+    </w:p>
+    <w:p>
+      <w:pPr>
+        <w:pStyle w:val="Normal"/>
+        <w:spacing w:lineRule="auto" w:line="240" w:before="0" w:after="26"/>
+        <w:rPr>
+          <w:rFonts w:ascii="Liberation Serif" w:hAnsi="Liberation Serif"/>
+          <w:b w:val="false"/>
+          <w:bCs w:val="false"/>
+          <w:sz w:val="24"/>
+          <w:szCs w:val="24"/>
+          <w:u w:val="none"/>
+        </w:rPr>
+      </w:pPr>
+      <w:r>
+        <w:rPr>
+          <w:rFonts w:ascii="Monospace" w:hAnsi="Monospace"/>
+          <w:b w:val="false"/>
+          <w:bCs w:val="false"/>
+          <w:color w:val="000000"/>
+          <w:sz w:val="20"/>
+          <w:szCs w:val="24"/>
+          <w:u w:val="none"/>
+        </w:rPr>
+        <w:t xml:space="preserve">MPV_PLAYERCTL_STOP  = </w:t>
+      </w:r>
+      <w:r>
+        <w:rPr>
+          <w:rFonts w:ascii="Monospace" w:hAnsi="Monospace"/>
+          <w:b w:val="false"/>
+          <w:bCs w:val="false"/>
+          <w:i/>
+          <w:color w:val="00AA00"/>
+          <w:sz w:val="20"/>
+          <w:szCs w:val="24"/>
+          <w:u w:val="none"/>
+        </w:rPr>
+        <w:t>"stop"</w:t>
+      </w:r>
+    </w:p>
+    <w:p>
+      <w:pPr>
+        <w:pStyle w:val="Normal"/>
+        <w:spacing w:lineRule="auto" w:line="240" w:before="0" w:after="26"/>
+        <w:rPr>
+          <w:rFonts w:ascii="Monospace" w:hAnsi="Monospace"/>
+          <w:i/>
+          <w:i/>
+          <w:color w:val="00AA00"/>
+          <w:sz w:val="20"/>
+        </w:rPr>
+      </w:pPr>
+      <w:r>
+        <w:rPr>
+          <w:b w:val="false"/>
+          <w:bCs w:val="false"/>
+          <w:sz w:val="24"/>
+          <w:szCs w:val="24"/>
+          <w:u w:val="none"/>
+        </w:rPr>
+      </w:r>
+    </w:p>
+    <w:p>
+      <w:pPr>
+        <w:pStyle w:val="Normal"/>
+        <w:ind w:hanging="0"/>
+        <w:jc w:val="start"/>
+        <w:rPr>
+          <w:rFonts w:ascii="Monospace" w:hAnsi="Monospace"/>
+          <w:sz w:val="20"/>
+        </w:rPr>
+      </w:pPr>
+      <w:r>
+        <w:rPr>
+          <w:rFonts w:ascii="Monospace" w:hAnsi="Monospace"/>
+          <w:i/>
+          <w:color w:val="C0C0C0"/>
+          <w:sz w:val="20"/>
+        </w:rPr>
+        <w:t>#MPV_PLAYER STATES ####</w:t>
+      </w:r>
+    </w:p>
+    <w:p>
+      <w:pPr>
+        <w:pStyle w:val="Normal"/>
+        <w:ind w:hanging="0"/>
+        <w:jc w:val="start"/>
+        <w:rPr>
+          <w:rFonts w:ascii="Monospace" w:hAnsi="Monospace"/>
+          <w:sz w:val="20"/>
+        </w:rPr>
+      </w:pPr>
+      <w:r>
+        <w:rPr>
+          <w:rFonts w:ascii="Monospace" w:hAnsi="Monospace"/>
+          <w:color w:val="000000"/>
+          <w:sz w:val="20"/>
+        </w:rPr>
+        <w:t xml:space="preserve">MPV_PLAYERCTL_PLAYING_STATE = </w:t>
+      </w:r>
+      <w:r>
+        <w:rPr>
+          <w:rFonts w:ascii="Monospace" w:hAnsi="Monospace"/>
+          <w:i/>
+          <w:color w:val="00AA00"/>
+          <w:sz w:val="20"/>
+        </w:rPr>
+        <w:t>"playing"</w:t>
+      </w:r>
+    </w:p>
+    <w:p>
+      <w:pPr>
+        <w:pStyle w:val="Normal"/>
+        <w:ind w:hanging="0"/>
+        <w:jc w:val="start"/>
+        <w:rPr>
+          <w:rFonts w:ascii="Monospace" w:hAnsi="Monospace"/>
+          <w:sz w:val="20"/>
+        </w:rPr>
+      </w:pPr>
+      <w:r>
+        <w:rPr>
+          <w:rFonts w:ascii="Monospace" w:hAnsi="Monospace"/>
+          <w:color w:val="000000"/>
+          <w:sz w:val="20"/>
+        </w:rPr>
+        <w:t xml:space="preserve">MPV_PLAYERCTL_STOPPED_STATE = </w:t>
+      </w:r>
+      <w:r>
+        <w:rPr>
+          <w:rFonts w:ascii="Monospace" w:hAnsi="Monospace"/>
+          <w:i/>
+          <w:color w:val="00AA00"/>
+          <w:sz w:val="20"/>
+        </w:rPr>
+        <w:t>"stopped"</w:t>
+      </w:r>
+    </w:p>
+    <w:p>
+      <w:pPr>
+        <w:pStyle w:val="Normal"/>
+        <w:spacing w:lineRule="auto" w:line="240" w:before="0" w:after="26"/>
+        <w:rPr>
+          <w:rFonts w:ascii="Monospace" w:hAnsi="Monospace"/>
+          <w:i/>
+          <w:i/>
+          <w:color w:val="00AA00"/>
+          <w:sz w:val="20"/>
+        </w:rPr>
+      </w:pPr>
+      <w:r>
+        <w:rPr>
+          <w:rFonts w:ascii="Monospace" w:hAnsi="Monospace"/>
+          <w:b w:val="false"/>
+          <w:bCs w:val="false"/>
+          <w:color w:val="000000"/>
+          <w:sz w:val="20"/>
+          <w:szCs w:val="24"/>
+          <w:u w:val="none"/>
+        </w:rPr>
+        <w:t xml:space="preserve">MPV_PLAYERCTL_PAUSED_STATE  = </w:t>
+      </w:r>
+      <w:r>
+        <w:rPr>
+          <w:rFonts w:ascii="Monospace" w:hAnsi="Monospace"/>
+          <w:b w:val="false"/>
+          <w:bCs w:val="false"/>
+          <w:i/>
+          <w:color w:val="00AA00"/>
+          <w:sz w:val="20"/>
+          <w:szCs w:val="24"/>
+          <w:u w:val="none"/>
+        </w:rPr>
+        <w:t>"paused"</w:t>
+      </w:r>
+    </w:p>
+    <w:p>
+      <w:pPr>
+        <w:pStyle w:val="Heading2"/>
+        <w:rPr/>
+      </w:pPr>
+      <w:r>
+        <w:rPr/>
+        <w:t>Message-queue events</w:t>
+      </w:r>
+    </w:p>
+    <w:p>
+      <w:pPr>
+        <w:pStyle w:val="BodyText"/>
+        <w:spacing w:lineRule="auto" w:line="240" w:before="0" w:after="26"/>
+        <w:rPr>
+          <w:rFonts w:ascii="Liberation Serif" w:hAnsi="Liberation Serif"/>
+          <w:b w:val="false"/>
+          <w:bCs w:val="false"/>
+          <w:sz w:val="24"/>
+          <w:szCs w:val="24"/>
+          <w:u w:val="none"/>
+        </w:rPr>
+      </w:pPr>
+      <w:r>
+        <w:rPr>
+          <w:b w:val="false"/>
+          <w:bCs w:val="false"/>
+          <w:sz w:val="24"/>
+          <w:szCs w:val="24"/>
+          <w:u w:val="none"/>
+        </w:rPr>
+        <w:t>Uses the Message schema as defined in schemas.json</w:t>
+      </w:r>
+    </w:p>
+    <w:p>
+      <w:pPr>
+        <w:pStyle w:val="Normal"/>
+        <w:ind w:hanging="0"/>
+        <w:jc w:val="start"/>
+        <w:rPr>
+          <w:rFonts w:ascii="Monospace" w:hAnsi="Monospace"/>
+          <w:sz w:val="20"/>
+        </w:rPr>
+      </w:pPr>
+      <w:r>
+        <w:rPr>
+          <w:rFonts w:ascii="Monospace" w:hAnsi="Monospace"/>
+          <w:color w:val="000000"/>
+          <w:sz w:val="20"/>
+        </w:rPr>
+        <w:t>{</w:t>
+      </w:r>
+    </w:p>
+    <w:p>
+      <w:pPr>
+        <w:pStyle w:val="Normal"/>
+        <w:ind w:hanging="0"/>
+        <w:jc w:val="start"/>
+        <w:rPr>
+          <w:rFonts w:ascii="Monospace" w:hAnsi="Monospace"/>
+          <w:sz w:val="20"/>
+        </w:rPr>
+      </w:pPr>
+      <w:r>
+        <w:rPr>
+          <w:rFonts w:ascii="Monospace" w:hAnsi="Monospace"/>
+          <w:color w:val="000000"/>
+          <w:sz w:val="20"/>
+        </w:rPr>
+        <w:t xml:space="preserve">  </w:t>
+      </w:r>
+      <w:r>
+        <w:rPr>
+          <w:rFonts w:ascii="Monospace" w:hAnsi="Monospace"/>
+          <w:color w:val="859900"/>
+          <w:sz w:val="20"/>
+        </w:rPr>
+        <w:t>"$schema"</w:t>
+      </w:r>
+      <w:r>
+        <w:rPr>
+          <w:rFonts w:ascii="Monospace" w:hAnsi="Monospace"/>
+          <w:color w:val="000000"/>
+          <w:sz w:val="20"/>
+        </w:rPr>
+        <w:t xml:space="preserve">: </w:t>
+      </w:r>
+      <w:r>
+        <w:rPr>
+          <w:rFonts w:ascii="Monospace" w:hAnsi="Monospace"/>
+          <w:color w:val="2AA198"/>
+          <w:sz w:val="20"/>
+        </w:rPr>
+        <w:t>"http://json-schema.org/draft-07/schema#"</w:t>
+      </w:r>
+      <w:r>
+        <w:rPr>
+          <w:rFonts w:ascii="Monospace" w:hAnsi="Monospace"/>
+          <w:color w:val="000000"/>
+          <w:sz w:val="20"/>
+        </w:rPr>
+        <w:t>,</w:t>
+      </w:r>
+    </w:p>
+    <w:p>
+      <w:pPr>
+        <w:pStyle w:val="Normal"/>
+        <w:ind w:hanging="0"/>
+        <w:jc w:val="start"/>
+        <w:rPr>
+          <w:rFonts w:ascii="Monospace" w:hAnsi="Monospace"/>
+          <w:sz w:val="20"/>
+        </w:rPr>
+      </w:pPr>
+      <w:r>
+        <w:rPr>
+          <w:rFonts w:ascii="Monospace" w:hAnsi="Monospace"/>
+          <w:color w:val="000000"/>
+          <w:sz w:val="20"/>
+        </w:rPr>
+        <w:t xml:space="preserve">  </w:t>
+      </w:r>
+      <w:r>
+        <w:rPr>
+          <w:rFonts w:ascii="Monospace" w:hAnsi="Monospace"/>
+          <w:color w:val="859900"/>
+          <w:sz w:val="20"/>
+        </w:rPr>
+        <w:t>"Messages"</w:t>
+      </w:r>
+      <w:r>
+        <w:rPr>
+          <w:rFonts w:ascii="Monospace" w:hAnsi="Monospace"/>
+          <w:color w:val="000000"/>
+          <w:sz w:val="20"/>
+        </w:rPr>
+        <w:t>: {</w:t>
+      </w:r>
+    </w:p>
+    <w:p>
+      <w:pPr>
+        <w:pStyle w:val="Normal"/>
+        <w:ind w:hanging="0"/>
+        <w:jc w:val="start"/>
+        <w:rPr>
+          <w:rFonts w:ascii="Monospace" w:hAnsi="Monospace"/>
+          <w:sz w:val="20"/>
+        </w:rPr>
+      </w:pPr>
+      <w:r>
+        <w:rPr>
+          <w:rFonts w:ascii="Monospace" w:hAnsi="Monospace"/>
+          <w:color w:val="000000"/>
+          <w:sz w:val="20"/>
+        </w:rPr>
+        <w:t xml:space="preserve">    </w:t>
+      </w:r>
+      <w:r>
+        <w:rPr>
+          <w:rFonts w:ascii="Monospace" w:hAnsi="Monospace"/>
+          <w:color w:val="859900"/>
+          <w:sz w:val="20"/>
+        </w:rPr>
+        <w:t>"type"</w:t>
+      </w:r>
+      <w:r>
+        <w:rPr>
+          <w:rFonts w:ascii="Monospace" w:hAnsi="Monospace"/>
+          <w:color w:val="000000"/>
+          <w:sz w:val="20"/>
+        </w:rPr>
+        <w:t xml:space="preserve">: </w:t>
+      </w:r>
+      <w:r>
+        <w:rPr>
+          <w:rFonts w:ascii="Monospace" w:hAnsi="Monospace"/>
+          <w:color w:val="2AA198"/>
+          <w:sz w:val="20"/>
+        </w:rPr>
+        <w:t>"object"</w:t>
+      </w:r>
+      <w:r>
+        <w:rPr>
+          <w:rFonts w:ascii="Monospace" w:hAnsi="Monospace"/>
+          <w:color w:val="000000"/>
+          <w:sz w:val="20"/>
+        </w:rPr>
+        <w:t>,</w:t>
+      </w:r>
+    </w:p>
+    <w:p>
+      <w:pPr>
+        <w:pStyle w:val="Normal"/>
+        <w:ind w:hanging="0"/>
+        <w:jc w:val="start"/>
+        <w:rPr>
+          <w:rFonts w:ascii="Monospace" w:hAnsi="Monospace"/>
+          <w:sz w:val="20"/>
+        </w:rPr>
+      </w:pPr>
+      <w:r>
+        <w:rPr>
+          <w:rFonts w:ascii="Monospace" w:hAnsi="Monospace"/>
+          <w:color w:val="000000"/>
+          <w:sz w:val="20"/>
+        </w:rPr>
+        <w:t xml:space="preserve">    </w:t>
+      </w:r>
+      <w:r>
+        <w:rPr>
+          <w:rFonts w:ascii="Monospace" w:hAnsi="Monospace"/>
+          <w:color w:val="859900"/>
+          <w:sz w:val="20"/>
+        </w:rPr>
+        <w:t>"properties"</w:t>
+      </w:r>
+      <w:r>
+        <w:rPr>
+          <w:rFonts w:ascii="Monospace" w:hAnsi="Monospace"/>
+          <w:color w:val="000000"/>
+          <w:sz w:val="20"/>
+        </w:rPr>
+        <w:t>: {</w:t>
+      </w:r>
+    </w:p>
+    <w:p>
+      <w:pPr>
+        <w:pStyle w:val="Normal"/>
+        <w:ind w:hanging="0"/>
+        <w:jc w:val="start"/>
+        <w:rPr>
+          <w:rFonts w:ascii="Monospace" w:hAnsi="Monospace"/>
+          <w:sz w:val="20"/>
+        </w:rPr>
+      </w:pPr>
+      <w:r>
+        <w:rPr>
+          <w:rFonts w:ascii="Monospace" w:hAnsi="Monospace"/>
+          <w:color w:val="000000"/>
+          <w:sz w:val="20"/>
+        </w:rPr>
+        <w:t xml:space="preserve">      </w:t>
+      </w:r>
+      <w:r>
+        <w:rPr>
+          <w:rFonts w:ascii="Monospace" w:hAnsi="Monospace"/>
+          <w:color w:val="859900"/>
+          <w:sz w:val="20"/>
+        </w:rPr>
+        <w:t>"type"</w:t>
+      </w:r>
+      <w:r>
+        <w:rPr>
+          <w:rFonts w:ascii="Monospace" w:hAnsi="Monospace"/>
+          <w:color w:val="000000"/>
+          <w:sz w:val="20"/>
+        </w:rPr>
+        <w:t>:</w:t>
+        <w:tab/>
+        <w:t xml:space="preserve">{ </w:t>
+      </w:r>
+      <w:r>
+        <w:rPr>
+          <w:rFonts w:ascii="Monospace" w:hAnsi="Monospace"/>
+          <w:color w:val="859900"/>
+          <w:sz w:val="20"/>
+        </w:rPr>
+        <w:t>"type"</w:t>
+      </w:r>
+      <w:r>
+        <w:rPr>
+          <w:rFonts w:ascii="Monospace" w:hAnsi="Monospace"/>
+          <w:color w:val="000000"/>
+          <w:sz w:val="20"/>
+        </w:rPr>
+        <w:t xml:space="preserve">: </w:t>
+      </w:r>
+      <w:r>
+        <w:rPr>
+          <w:rFonts w:ascii="Monospace" w:hAnsi="Monospace"/>
+          <w:color w:val="2AA198"/>
+          <w:sz w:val="20"/>
+        </w:rPr>
+        <w:t>"string"</w:t>
+      </w:r>
+      <w:r>
+        <w:rPr>
+          <w:rFonts w:ascii="Monospace" w:hAnsi="Monospace"/>
+          <w:color w:val="000000"/>
+          <w:sz w:val="20"/>
+        </w:rPr>
+        <w:t xml:space="preserve"> },</w:t>
+      </w:r>
+    </w:p>
+    <w:p>
+      <w:pPr>
+        <w:pStyle w:val="Normal"/>
+        <w:ind w:hanging="0"/>
+        <w:jc w:val="start"/>
+        <w:rPr>
+          <w:rFonts w:ascii="Monospace" w:hAnsi="Monospace"/>
+          <w:sz w:val="20"/>
+        </w:rPr>
+      </w:pPr>
+      <w:r>
+        <w:rPr>
+          <w:rFonts w:ascii="Monospace" w:hAnsi="Monospace"/>
+          <w:color w:val="000000"/>
+          <w:sz w:val="20"/>
+        </w:rPr>
+        <w:t xml:space="preserve">      </w:t>
+      </w:r>
+      <w:r>
+        <w:rPr>
+          <w:rFonts w:ascii="Monospace" w:hAnsi="Monospace"/>
+          <w:color w:val="859900"/>
+          <w:sz w:val="20"/>
+        </w:rPr>
+        <w:t>"state"</w:t>
+      </w:r>
+      <w:r>
+        <w:rPr>
+          <w:rFonts w:ascii="Monospace" w:hAnsi="Monospace"/>
+          <w:color w:val="000000"/>
+          <w:sz w:val="20"/>
+        </w:rPr>
+        <w:t>:</w:t>
+        <w:tab/>
+        <w:t xml:space="preserve">{ </w:t>
+      </w:r>
+      <w:r>
+        <w:rPr>
+          <w:rFonts w:ascii="Monospace" w:hAnsi="Monospace"/>
+          <w:color w:val="859900"/>
+          <w:sz w:val="20"/>
+        </w:rPr>
+        <w:t>"type"</w:t>
+      </w:r>
+      <w:r>
+        <w:rPr>
+          <w:rFonts w:ascii="Monospace" w:hAnsi="Monospace"/>
+          <w:color w:val="000000"/>
+          <w:sz w:val="20"/>
+        </w:rPr>
+        <w:t xml:space="preserve">: </w:t>
+      </w:r>
+      <w:r>
+        <w:rPr>
+          <w:rFonts w:ascii="Monospace" w:hAnsi="Monospace"/>
+          <w:color w:val="2AA198"/>
+          <w:sz w:val="20"/>
+        </w:rPr>
+        <w:t>"string"</w:t>
+      </w:r>
+      <w:r>
+        <w:rPr>
+          <w:rFonts w:ascii="Monospace" w:hAnsi="Monospace"/>
+          <w:color w:val="000000"/>
+          <w:sz w:val="20"/>
+        </w:rPr>
+        <w:t xml:space="preserve"> },</w:t>
+      </w:r>
+    </w:p>
+    <w:p>
+      <w:pPr>
+        <w:pStyle w:val="Normal"/>
+        <w:ind w:hanging="0"/>
+        <w:jc w:val="start"/>
+        <w:rPr>
+          <w:rFonts w:ascii="Monospace" w:hAnsi="Monospace"/>
+          <w:sz w:val="20"/>
+        </w:rPr>
+      </w:pPr>
+      <w:r>
+        <w:rPr>
+          <w:rFonts w:ascii="Monospace" w:hAnsi="Monospace"/>
+          <w:color w:val="000000"/>
+          <w:sz w:val="20"/>
+        </w:rPr>
+        <w:t xml:space="preserve">      </w:t>
+      </w:r>
+      <w:r>
+        <w:rPr>
+          <w:rFonts w:ascii="Monospace" w:hAnsi="Monospace"/>
+          <w:color w:val="859900"/>
+          <w:sz w:val="20"/>
+        </w:rPr>
+        <w:t>"error"</w:t>
+      </w:r>
+      <w:r>
+        <w:rPr>
+          <w:rFonts w:ascii="Monospace" w:hAnsi="Monospace"/>
+          <w:color w:val="000000"/>
+          <w:sz w:val="20"/>
+        </w:rPr>
+        <w:t>:</w:t>
+        <w:tab/>
+        <w:t xml:space="preserve">{ </w:t>
+      </w:r>
+      <w:r>
+        <w:rPr>
+          <w:rFonts w:ascii="Monospace" w:hAnsi="Monospace"/>
+          <w:color w:val="859900"/>
+          <w:sz w:val="20"/>
+        </w:rPr>
+        <w:t>"type"</w:t>
+      </w:r>
+      <w:r>
+        <w:rPr>
+          <w:rFonts w:ascii="Monospace" w:hAnsi="Monospace"/>
+          <w:color w:val="000000"/>
+          <w:sz w:val="20"/>
+        </w:rPr>
+        <w:t xml:space="preserve">: </w:t>
+      </w:r>
+      <w:r>
+        <w:rPr>
+          <w:rFonts w:ascii="Monospace" w:hAnsi="Monospace"/>
+          <w:color w:val="2AA198"/>
+          <w:sz w:val="20"/>
+        </w:rPr>
+        <w:t>"string"</w:t>
+      </w:r>
+      <w:r>
+        <w:rPr>
+          <w:rFonts w:ascii="Monospace" w:hAnsi="Monospace"/>
+          <w:color w:val="000000"/>
+          <w:sz w:val="20"/>
+        </w:rPr>
+        <w:t xml:space="preserve"> },</w:t>
+      </w:r>
+    </w:p>
+    <w:p>
+      <w:pPr>
+        <w:pStyle w:val="Normal"/>
+        <w:ind w:hanging="0"/>
+        <w:jc w:val="start"/>
+        <w:rPr>
+          <w:rFonts w:ascii="Monospace" w:hAnsi="Monospace"/>
+          <w:sz w:val="20"/>
+        </w:rPr>
+      </w:pPr>
+      <w:r>
+        <w:rPr>
+          <w:rFonts w:ascii="Monospace" w:hAnsi="Monospace"/>
+          <w:color w:val="000000"/>
+          <w:sz w:val="20"/>
+        </w:rPr>
+        <w:tab/>
+        <w:t xml:space="preserve">  </w:t>
+      </w:r>
+      <w:r>
+        <w:rPr>
+          <w:rFonts w:ascii="Monospace" w:hAnsi="Monospace"/>
+          <w:color w:val="859900"/>
+          <w:sz w:val="20"/>
+        </w:rPr>
+        <w:t>"data"</w:t>
+      </w:r>
+      <w:r>
+        <w:rPr>
+          <w:rFonts w:ascii="Monospace" w:hAnsi="Monospace"/>
+          <w:color w:val="000000"/>
+          <w:sz w:val="20"/>
+        </w:rPr>
+        <w:t>:</w:t>
+        <w:tab/>
+        <w:t xml:space="preserve">{ </w:t>
+      </w:r>
+      <w:r>
+        <w:rPr>
+          <w:rFonts w:ascii="Monospace" w:hAnsi="Monospace"/>
+          <w:color w:val="859900"/>
+          <w:sz w:val="20"/>
+        </w:rPr>
+        <w:t>"type"</w:t>
+      </w:r>
+      <w:r>
+        <w:rPr>
+          <w:rFonts w:ascii="Monospace" w:hAnsi="Monospace"/>
+          <w:color w:val="000000"/>
+          <w:sz w:val="20"/>
+        </w:rPr>
+        <w:t xml:space="preserve">: </w:t>
+      </w:r>
+      <w:r>
+        <w:rPr>
+          <w:rFonts w:ascii="Monospace" w:hAnsi="Monospace"/>
+          <w:color w:val="2AA198"/>
+          <w:sz w:val="20"/>
+        </w:rPr>
+        <w:t>"array"</w:t>
+      </w:r>
+      <w:r>
+        <w:rPr>
+          <w:rFonts w:ascii="Monospace" w:hAnsi="Monospace"/>
+          <w:color w:val="000000"/>
+          <w:sz w:val="20"/>
+        </w:rPr>
+        <w:t xml:space="preserve"> }</w:t>
+      </w:r>
+    </w:p>
+    <w:p>
+      <w:pPr>
+        <w:pStyle w:val="Normal"/>
+        <w:ind w:hanging="0"/>
+        <w:jc w:val="start"/>
+        <w:rPr>
+          <w:rFonts w:ascii="Monospace" w:hAnsi="Monospace"/>
+          <w:sz w:val="20"/>
+        </w:rPr>
+      </w:pPr>
+      <w:r>
+        <w:rPr>
+          <w:rFonts w:ascii="Monospace" w:hAnsi="Monospace"/>
+          <w:color w:val="000000"/>
+          <w:sz w:val="20"/>
+        </w:rPr>
+        <w:t xml:space="preserve">    </w:t>
+      </w:r>
+      <w:r>
+        <w:rPr>
+          <w:rFonts w:ascii="Monospace" w:hAnsi="Monospace"/>
+          <w:color w:val="000000"/>
+          <w:sz w:val="20"/>
+        </w:rPr>
+        <w:t>},</w:t>
+      </w:r>
+    </w:p>
+    <w:p>
+      <w:pPr>
+        <w:pStyle w:val="Normal"/>
+        <w:ind w:hanging="0"/>
+        <w:jc w:val="start"/>
+        <w:rPr>
+          <w:rFonts w:ascii="Monospace" w:hAnsi="Monospace"/>
+          <w:sz w:val="20"/>
+        </w:rPr>
+      </w:pPr>
+      <w:r>
+        <w:rPr>
+          <w:rFonts w:ascii="Monospace" w:hAnsi="Monospace"/>
+          <w:color w:val="000000"/>
+          <w:sz w:val="20"/>
+        </w:rPr>
+        <w:t xml:space="preserve">    </w:t>
+      </w:r>
+      <w:r>
+        <w:rPr>
+          <w:rFonts w:ascii="Monospace" w:hAnsi="Monospace"/>
+          <w:color w:val="859900"/>
+          <w:sz w:val="20"/>
+        </w:rPr>
+        <w:t>"required"</w:t>
+      </w:r>
+      <w:r>
+        <w:rPr>
+          <w:rFonts w:ascii="Monospace" w:hAnsi="Monospace"/>
+          <w:color w:val="000000"/>
+          <w:sz w:val="20"/>
+        </w:rPr>
+        <w:t>: [</w:t>
+      </w:r>
+      <w:r>
+        <w:rPr>
+          <w:rFonts w:ascii="Monospace" w:hAnsi="Monospace"/>
+          <w:color w:val="2AA198"/>
+          <w:sz w:val="20"/>
+        </w:rPr>
+        <w:t>"type"</w:t>
+      </w:r>
+      <w:r>
+        <w:rPr>
+          <w:rFonts w:ascii="Monospace" w:hAnsi="Monospace"/>
+          <w:color w:val="000000"/>
+          <w:sz w:val="20"/>
+        </w:rPr>
+        <w:t xml:space="preserve">, </w:t>
+      </w:r>
+      <w:r>
+        <w:rPr>
+          <w:rFonts w:ascii="Monospace" w:hAnsi="Monospace"/>
+          <w:color w:val="2AA198"/>
+          <w:sz w:val="20"/>
+        </w:rPr>
+        <w:t>"state"</w:t>
+      </w:r>
+      <w:r>
+        <w:rPr>
+          <w:rFonts w:ascii="Monospace" w:hAnsi="Monospace"/>
+          <w:color w:val="000000"/>
+          <w:sz w:val="20"/>
+        </w:rPr>
+        <w:t xml:space="preserve">, </w:t>
+      </w:r>
+      <w:r>
+        <w:rPr>
+          <w:rFonts w:ascii="Monospace" w:hAnsi="Monospace"/>
+          <w:color w:val="2AA198"/>
+          <w:sz w:val="20"/>
+        </w:rPr>
+        <w:t>"error"</w:t>
+      </w:r>
+      <w:r>
+        <w:rPr>
+          <w:rFonts w:ascii="Monospace" w:hAnsi="Monospace"/>
+          <w:color w:val="000000"/>
+          <w:sz w:val="20"/>
+        </w:rPr>
+        <w:t>]</w:t>
+      </w:r>
+    </w:p>
+    <w:p>
+      <w:pPr>
+        <w:pStyle w:val="Normal"/>
+        <w:spacing w:lineRule="auto" w:line="240" w:before="0" w:after="26"/>
+        <w:rPr>
+          <w:rFonts w:ascii="Liberation Serif" w:hAnsi="Liberation Serif"/>
+          <w:b w:val="false"/>
+          <w:bCs w:val="false"/>
+          <w:sz w:val="24"/>
+          <w:szCs w:val="24"/>
+          <w:u w:val="none"/>
+        </w:rPr>
+      </w:pPr>
+      <w:r>
+        <w:rPr>
+          <w:rFonts w:ascii="Monospace" w:hAnsi="Monospace"/>
+          <w:b w:val="false"/>
+          <w:bCs w:val="false"/>
+          <w:color w:val="000000"/>
+          <w:sz w:val="20"/>
+          <w:szCs w:val="24"/>
+          <w:u w:val="none"/>
+        </w:rPr>
+        <w:t xml:space="preserve">  </w:t>
+      </w:r>
+      <w:r>
+        <w:rPr>
+          <w:rFonts w:ascii="Monospace" w:hAnsi="Monospace"/>
+          <w:b w:val="false"/>
+          <w:bCs w:val="false"/>
+          <w:color w:val="000000"/>
+          <w:sz w:val="20"/>
+          <w:szCs w:val="24"/>
+          <w:u w:val="none"/>
+        </w:rPr>
+        <w:t>}</w:t>
+      </w:r>
+    </w:p>
+    <w:p>
+      <w:pPr>
+        <w:pStyle w:val="BodyText"/>
+        <w:spacing w:lineRule="auto" w:line="240" w:before="0" w:after="26"/>
+        <w:rPr>
+          <w:rFonts w:ascii="Liberation Serif" w:hAnsi="Liberation Serif"/>
+          <w:b w:val="false"/>
+          <w:bCs w:val="false"/>
+          <w:sz w:val="24"/>
+          <w:szCs w:val="24"/>
+          <w:u w:val="none"/>
+        </w:rPr>
+      </w:pPr>
+      <w:r>
+        <w:rPr>
+          <w:b w:val="false"/>
+          <w:bCs w:val="false"/>
+          <w:sz w:val="24"/>
+          <w:szCs w:val="24"/>
+          <w:u w:val="none"/>
+        </w:rPr>
+      </w:r>
+    </w:p>
+    <w:p>
+      <w:pPr>
+        <w:pStyle w:val="Normal"/>
+        <w:spacing w:lineRule="auto" w:line="240" w:before="0" w:after="26"/>
+        <w:rPr>
+          <w:rFonts w:ascii="Liberation Serif" w:hAnsi="Liberation Serif"/>
+          <w:b w:val="false"/>
+          <w:bCs w:val="false"/>
+          <w:sz w:val="24"/>
+          <w:szCs w:val="24"/>
+          <w:u w:val="none"/>
+        </w:rPr>
+      </w:pPr>
+      <w:r>
+        <w:rPr>
+          <w:rFonts w:ascii="Monospace" w:hAnsi="Monospace"/>
+          <w:b w:val="false"/>
+          <w:bCs w:val="false"/>
+          <w:color w:val="000000"/>
+          <w:sz w:val="20"/>
+          <w:szCs w:val="24"/>
+          <w:u w:val="none"/>
+          <w:shd w:fill="E8F2FE" w:val="clear"/>
+        </w:rPr>
+        <w:t>message[</w:t>
+      </w:r>
+      <w:r>
+        <w:rPr>
+          <w:rFonts w:ascii="Monospace" w:hAnsi="Monospace"/>
+          <w:b w:val="false"/>
+          <w:bCs w:val="false"/>
+          <w:i/>
+          <w:color w:val="00AA00"/>
+          <w:sz w:val="20"/>
+          <w:szCs w:val="24"/>
+          <w:u w:val="none"/>
+          <w:shd w:fill="E8F2FE" w:val="clear"/>
+        </w:rPr>
+        <w:t>"</w:t>
+      </w:r>
+      <w:r>
+        <w:rPr>
+          <w:rFonts w:ascii="Monospace" w:hAnsi="Monospace"/>
+          <w:b w:val="false"/>
+          <w:bCs w:val="false"/>
+          <w:i/>
+          <w:color w:val="00AA00"/>
+          <w:sz w:val="20"/>
+          <w:szCs w:val="24"/>
+          <w:u w:val="none"/>
+          <w:shd w:fill="E8F2FE" w:val="clear"/>
+        </w:rPr>
+        <w:t>type"</w:t>
+      </w:r>
+      <w:r>
+        <w:rPr>
+          <w:rFonts w:ascii="Monospace" w:hAnsi="Monospace"/>
+          <w:b w:val="false"/>
+          <w:bCs w:val="false"/>
+          <w:color w:val="000000"/>
+          <w:sz w:val="20"/>
+          <w:szCs w:val="24"/>
+          <w:u w:val="none"/>
+          <w:shd w:fill="E8F2FE" w:val="clear"/>
+        </w:rPr>
+        <w:t>]  = MESSAGE_SPOTIFY_TYPE</w:t>
+      </w:r>
+    </w:p>
+    <w:p>
+      <w:pPr>
+        <w:pStyle w:val="Normal"/>
+        <w:spacing w:lineRule="auto" w:line="240" w:before="0" w:after="26"/>
+        <w:rPr>
+          <w:rFonts w:ascii="Monospace" w:hAnsi="Monospace"/>
+          <w:color w:val="000000"/>
+          <w:sz w:val="20"/>
+          <w:shd w:fill="E8F2FE" w:val="clear"/>
+        </w:rPr>
+      </w:pPr>
+      <w:r>
+        <w:rPr>
+          <w:b w:val="false"/>
+          <w:bCs w:val="false"/>
+          <w:sz w:val="24"/>
+          <w:szCs w:val="24"/>
+          <w:u w:val="none"/>
+        </w:rPr>
+      </w:r>
+    </w:p>
+    <w:p>
+      <w:pPr>
+        <w:pStyle w:val="Normal"/>
+        <w:ind w:hanging="0"/>
+        <w:jc w:val="start"/>
+        <w:rPr>
+          <w:rFonts w:ascii="Monospace" w:hAnsi="Monospace"/>
+          <w:sz w:val="20"/>
+        </w:rPr>
+      </w:pPr>
+      <w:r>
+        <w:rPr>
+          <w:rFonts w:ascii="Monospace" w:hAnsi="Monospace"/>
+          <w:color w:val="000000"/>
+          <w:sz w:val="20"/>
+        </w:rPr>
+        <w:t>message[</w:t>
+      </w:r>
+      <w:r>
+        <w:rPr>
+          <w:rFonts w:ascii="Monospace" w:hAnsi="Monospace"/>
+          <w:i/>
+          <w:color w:val="00AA00"/>
+          <w:sz w:val="20"/>
+        </w:rPr>
+        <w:t>"state"</w:t>
+      </w:r>
+      <w:r>
+        <w:rPr>
+          <w:rFonts w:ascii="Monospace" w:hAnsi="Monospace"/>
+          <w:color w:val="000000"/>
+          <w:sz w:val="20"/>
+        </w:rPr>
+        <w:t>] = SPOTIFY_CONNECT_PLAYING_EVENT</w:t>
+      </w:r>
+    </w:p>
+    <w:p>
+      <w:pPr>
+        <w:pStyle w:val="Normal"/>
+        <w:ind w:hanging="0"/>
+        <w:jc w:val="start"/>
+        <w:rPr>
+          <w:rFonts w:ascii="Monospace" w:hAnsi="Monospace"/>
+          <w:sz w:val="20"/>
+        </w:rPr>
+      </w:pPr>
+      <w:r>
+        <w:rPr>
+          <w:rFonts w:ascii="Monospace" w:hAnsi="Monospace"/>
+          <w:color w:val="000000"/>
+          <w:sz w:val="20"/>
+        </w:rPr>
+        <w:t>message[</w:t>
+      </w:r>
+      <w:r>
+        <w:rPr>
+          <w:rFonts w:ascii="Monospace" w:hAnsi="Monospace"/>
+          <w:i/>
+          <w:color w:val="00AA00"/>
+          <w:sz w:val="20"/>
+        </w:rPr>
+        <w:t>"state"</w:t>
+      </w:r>
+      <w:r>
+        <w:rPr>
+          <w:rFonts w:ascii="Monospace" w:hAnsi="Monospace"/>
+          <w:color w:val="000000"/>
+          <w:sz w:val="20"/>
+        </w:rPr>
+        <w:t>] = SPOTIFY_CONNECT_PAUSED_EVENT</w:t>
+      </w:r>
+    </w:p>
+    <w:p>
+      <w:pPr>
+        <w:pStyle w:val="Normal"/>
+        <w:ind w:hanging="0"/>
+        <w:jc w:val="start"/>
+        <w:rPr>
+          <w:rFonts w:ascii="Monospace" w:hAnsi="Monospace"/>
+          <w:sz w:val="20"/>
+        </w:rPr>
+      </w:pPr>
+      <w:r>
+        <w:rPr>
+          <w:rFonts w:ascii="Monospace" w:hAnsi="Monospace"/>
+          <w:color w:val="000000"/>
+          <w:sz w:val="20"/>
+        </w:rPr>
+        <w:t>message[</w:t>
+      </w:r>
+      <w:r>
+        <w:rPr>
+          <w:rFonts w:ascii="Monospace" w:hAnsi="Monospace"/>
+          <w:i/>
+          <w:color w:val="00AA00"/>
+          <w:sz w:val="20"/>
+        </w:rPr>
+        <w:t>"state"</w:t>
+      </w:r>
+      <w:r>
+        <w:rPr>
+          <w:rFonts w:ascii="Monospace" w:hAnsi="Monospace"/>
+          <w:color w:val="000000"/>
+          <w:sz w:val="20"/>
+        </w:rPr>
+        <w:t>] = SPOTIFY_CONNECT_STOPPED_EVENT</w:t>
+      </w:r>
+    </w:p>
+    <w:p>
+      <w:pPr>
+        <w:pStyle w:val="Normal"/>
+        <w:ind w:hanging="0"/>
+        <w:jc w:val="start"/>
+        <w:rPr>
+          <w:rFonts w:ascii="Monospace" w:hAnsi="Monospace"/>
+          <w:sz w:val="20"/>
+        </w:rPr>
+      </w:pPr>
+      <w:r>
+        <w:rPr>
+          <w:rFonts w:ascii="Monospace" w:hAnsi="Monospace"/>
+          <w:color w:val="000000"/>
+          <w:sz w:val="20"/>
+        </w:rPr>
+        <w:t>message[</w:t>
+      </w:r>
+      <w:r>
+        <w:rPr>
+          <w:rFonts w:ascii="Monospace" w:hAnsi="Monospace"/>
+          <w:i/>
+          <w:color w:val="00AA00"/>
+          <w:sz w:val="20"/>
+        </w:rPr>
+        <w:t>"state"</w:t>
+      </w:r>
+      <w:r>
+        <w:rPr>
+          <w:rFonts w:ascii="Monospace" w:hAnsi="Monospace"/>
+          <w:color w:val="000000"/>
+          <w:sz w:val="20"/>
+        </w:rPr>
+        <w:t>] = SPOTIFY_CONNECT_CONNECTED_EVENT</w:t>
+      </w:r>
+    </w:p>
+    <w:p>
+      <w:pPr>
+        <w:pStyle w:val="Normal"/>
+        <w:ind w:hanging="0"/>
+        <w:jc w:val="start"/>
+        <w:rPr>
+          <w:rFonts w:ascii="Monospace" w:hAnsi="Monospace"/>
+          <w:sz w:val="20"/>
+        </w:rPr>
+      </w:pPr>
+      <w:r>
+        <w:rPr>
+          <w:rFonts w:ascii="Monospace" w:hAnsi="Monospace"/>
+          <w:color w:val="000000"/>
+          <w:sz w:val="20"/>
+        </w:rPr>
+        <w:t>message[</w:t>
+      </w:r>
+      <w:r>
+        <w:rPr>
+          <w:rFonts w:ascii="Monospace" w:hAnsi="Monospace"/>
+          <w:i/>
+          <w:color w:val="00AA00"/>
+          <w:sz w:val="20"/>
+        </w:rPr>
+        <w:t>"state"</w:t>
+      </w:r>
+      <w:r>
+        <w:rPr>
+          <w:rFonts w:ascii="Monospace" w:hAnsi="Monospace"/>
+          <w:color w:val="000000"/>
+          <w:sz w:val="20"/>
+        </w:rPr>
+        <w:t>] = SPOTIFY_CONNECT_DISCONNECTED_EVENT</w:t>
+      </w:r>
+    </w:p>
+    <w:p>
+      <w:pPr>
+        <w:pStyle w:val="Normal"/>
+        <w:spacing w:lineRule="auto" w:line="240" w:before="0" w:after="26"/>
+        <w:rPr/>
+      </w:pPr>
+      <w:r>
+        <w:rPr>
+          <w:rFonts w:ascii="Monospace" w:hAnsi="Monospace"/>
+          <w:b w:val="false"/>
+          <w:bCs w:val="false"/>
+          <w:color w:val="000000"/>
+          <w:sz w:val="20"/>
+          <w:szCs w:val="24"/>
+          <w:u w:val="none"/>
+        </w:rPr>
+        <w:t>message[</w:t>
+      </w:r>
+      <w:r>
+        <w:rPr>
+          <w:rFonts w:ascii="Monospace" w:hAnsi="Monospace"/>
+          <w:b w:val="false"/>
+          <w:bCs w:val="false"/>
+          <w:i/>
+          <w:color w:val="00AA00"/>
+          <w:sz w:val="20"/>
+          <w:szCs w:val="24"/>
+          <w:u w:val="none"/>
+        </w:rPr>
+        <w:t>"state"</w:t>
+      </w:r>
+      <w:r>
+        <w:rPr>
+          <w:rFonts w:ascii="Monospace" w:hAnsi="Monospace"/>
+          <w:b w:val="false"/>
+          <w:bCs w:val="false"/>
+          <w:color w:val="000000"/>
+          <w:sz w:val="20"/>
+          <w:szCs w:val="24"/>
+          <w:u w:val="none"/>
+        </w:rPr>
+        <w:t>] = SPOTIFY_CONNECT_CLIENT_CHANGED_EVENT</w:t>
+      </w:r>
+    </w:p>
+    <w:p>
+      <w:pPr>
+        <w:pStyle w:val="Normal"/>
+        <w:spacing w:lineRule="auto" w:line="240" w:before="0" w:after="26"/>
+        <w:rPr>
+          <w:rFonts w:ascii="Monospace" w:hAnsi="Monospace"/>
+          <w:b w:val="false"/>
+          <w:bCs w:val="false"/>
+          <w:color w:val="000000"/>
+          <w:sz w:val="20"/>
+          <w:szCs w:val="24"/>
+          <w:u w:val="none"/>
+        </w:rPr>
+      </w:pPr>
+      <w:r>
+        <w:rPr/>
+      </w:r>
+    </w:p>
+    <w:p>
+      <w:pPr>
+        <w:pStyle w:val="Normal"/>
+        <w:spacing w:lineRule="auto" w:line="240" w:before="0" w:after="26"/>
+        <w:rPr/>
+      </w:pPr>
+      <w:r>
+        <w:rPr>
+          <w:rFonts w:ascii="Monospace" w:hAnsi="Monospace"/>
+          <w:b w:val="false"/>
+          <w:bCs w:val="false"/>
+          <w:color w:val="000000"/>
+          <w:sz w:val="20"/>
+          <w:szCs w:val="24"/>
+          <w:u w:val="none"/>
+        </w:rPr>
+        <w:t>For all message[</w:t>
+      </w:r>
+      <w:r>
+        <w:rPr>
+          <w:rFonts w:ascii="Monospace" w:hAnsi="Monospace"/>
+          <w:b w:val="false"/>
+          <w:bCs w:val="false"/>
+          <w:i/>
+          <w:color w:val="00AA00"/>
+          <w:sz w:val="20"/>
+          <w:szCs w:val="24"/>
+          <w:u w:val="none"/>
+        </w:rPr>
+        <w:t>"state"</w:t>
+      </w:r>
+      <w:r>
+        <w:rPr>
+          <w:rFonts w:ascii="Monospace" w:hAnsi="Monospace"/>
+          <w:b w:val="false"/>
+          <w:bCs w:val="false"/>
+          <w:color w:val="000000"/>
+          <w:sz w:val="20"/>
+          <w:szCs w:val="24"/>
+          <w:u w:val="none"/>
+        </w:rPr>
+        <w:t xml:space="preserve">] the </w:t>
+      </w:r>
+      <w:r>
+        <w:rPr>
+          <w:rFonts w:ascii="Monospace" w:hAnsi="Monospace"/>
+          <w:b w:val="false"/>
+          <w:bCs w:val="false"/>
+          <w:color w:val="000000"/>
+          <w:sz w:val="20"/>
+          <w:szCs w:val="24"/>
+          <w:u w:val="none"/>
+          <w:shd w:fill="E8F2FE" w:val="clear"/>
+        </w:rPr>
+        <w:t>message[</w:t>
+      </w:r>
+      <w:r>
+        <w:rPr>
+          <w:rFonts w:ascii="Monospace" w:hAnsi="Monospace"/>
+          <w:i/>
+          <w:color w:val="00AA00"/>
+          <w:sz w:val="20"/>
+          <w:shd w:fill="E8F2FE" w:val="clear"/>
+        </w:rPr>
+        <w:t>"error"</w:t>
+      </w:r>
+      <w:r>
+        <w:rPr>
+          <w:rFonts w:ascii="Monospace" w:hAnsi="Monospace"/>
+          <w:color w:val="000000"/>
+          <w:sz w:val="20"/>
+          <w:shd w:fill="E8F2FE" w:val="clear"/>
+        </w:rPr>
+        <w:t xml:space="preserve">] = </w:t>
+      </w:r>
+      <w:r>
+        <w:rPr>
+          <w:rFonts w:ascii="Monospace" w:hAnsi="Monospace"/>
+          <w:i/>
+          <w:color w:val="00AA00"/>
+          <w:sz w:val="20"/>
+          <w:shd w:fill="E8F2FE" w:val="clear"/>
+        </w:rPr>
+        <w:t>"None"</w:t>
+      </w:r>
+    </w:p>
+    <w:p>
+      <w:pPr>
+        <w:pStyle w:val="Normal"/>
+        <w:spacing w:lineRule="auto" w:line="240" w:before="0" w:after="26"/>
+        <w:rPr>
+          <w:rFonts w:ascii="Monospace" w:hAnsi="Monospace"/>
+          <w:i/>
+          <w:i/>
+          <w:color w:val="00AA00"/>
+          <w:sz w:val="20"/>
+          <w:shd w:fill="E8F2FE" w:val="clear"/>
+        </w:rPr>
+      </w:pPr>
+      <w:r>
+        <w:rPr/>
+      </w:r>
+    </w:p>
+    <w:p>
+      <w:pPr>
+        <w:pStyle w:val="Heading2"/>
+        <w:rPr/>
+      </w:pPr>
+      <w:r>
+        <w:rPr/>
+        <w:t>SpotifyConnect class methods:</w:t>
+      </w:r>
+    </w:p>
+    <w:p>
+      <w:pPr>
+        <w:pStyle w:val="Normal"/>
+        <w:rPr/>
+      </w:pPr>
+      <w:r>
+        <w:rPr>
+          <w:rFonts w:ascii="Monospace" w:hAnsi="Monospace"/>
+          <w:color w:val="0000FF"/>
+          <w:sz w:val="20"/>
+          <w:shd w:fill="E8F2FE" w:val="clear"/>
+        </w:rPr>
+        <w:t>class</w:t>
+      </w:r>
+      <w:r>
+        <w:rPr>
+          <w:rFonts w:ascii="Monospace" w:hAnsi="Monospace"/>
+          <w:color w:val="000000"/>
+          <w:sz w:val="20"/>
+          <w:shd w:fill="E8F2FE" w:val="clear"/>
+        </w:rPr>
+        <w:t xml:space="preserve"> </w:t>
+      </w:r>
+      <w:r>
+        <w:rPr>
+          <w:rFonts w:ascii="Monospace" w:hAnsi="Monospace"/>
+          <w:b/>
+          <w:color w:val="000000"/>
+          <w:sz w:val="20"/>
+          <w:shd w:fill="E8F2FE" w:val="clear"/>
+        </w:rPr>
+        <w:t>SpotifyConnect</w:t>
+      </w:r>
+      <w:r>
+        <w:rPr>
+          <w:rFonts w:ascii="Monospace" w:hAnsi="Monospace"/>
+          <w:color w:val="000000"/>
+          <w:sz w:val="20"/>
+          <w:shd w:fill="E8F2FE" w:val="clear"/>
+        </w:rPr>
+        <w:t>():</w:t>
+      </w:r>
+    </w:p>
+    <w:p>
+      <w:pPr>
+        <w:pStyle w:val="Normal"/>
+        <w:rPr/>
+      </w:pPr>
+      <w:r>
+        <w:rPr>
+          <w:rFonts w:ascii="Monospace" w:hAnsi="Monospace"/>
+          <w:color w:val="000000"/>
+          <w:sz w:val="20"/>
+          <w:shd w:fill="E8F2FE" w:val="clear"/>
+        </w:rPr>
+        <w:t xml:space="preserve">    </w:t>
+      </w:r>
+      <w:r>
+        <w:rPr>
+          <w:rFonts w:ascii="Monospace" w:hAnsi="Monospace"/>
+          <w:color w:val="0000FF"/>
+          <w:sz w:val="20"/>
+          <w:shd w:fill="E8F2FE" w:val="clear"/>
+        </w:rPr>
+        <w:t>def</w:t>
+      </w:r>
+      <w:r>
+        <w:rPr>
+          <w:rFonts w:ascii="Monospace" w:hAnsi="Monospace"/>
+          <w:color w:val="000000"/>
+          <w:sz w:val="20"/>
+          <w:shd w:fill="E8F2FE" w:val="clear"/>
+        </w:rPr>
+        <w:t xml:space="preserve"> </w:t>
+      </w:r>
+      <w:r>
+        <w:rPr>
+          <w:rFonts w:ascii="Monospace" w:hAnsi="Monospace"/>
+          <w:b/>
+          <w:color w:val="000000"/>
+          <w:sz w:val="20"/>
+          <w:shd w:fill="E8F2FE" w:val="clear"/>
+        </w:rPr>
+        <w:t>__init__</w:t>
+      </w:r>
+      <w:r>
+        <w:rPr>
+          <w:rFonts w:ascii="Monospace" w:hAnsi="Monospace"/>
+          <w:color w:val="000000"/>
+          <w:sz w:val="20"/>
+          <w:shd w:fill="E8F2FE" w:val="clear"/>
+        </w:rPr>
+        <w:t>(</w:t>
+      </w:r>
+      <w:r>
+        <w:rPr>
+          <w:rFonts w:ascii="Monospace" w:hAnsi="Monospace"/>
+          <w:i/>
+          <w:color w:val="000000"/>
+          <w:sz w:val="20"/>
+          <w:shd w:fill="E8F2FE" w:val="clear"/>
+        </w:rPr>
+        <w:t>self</w:t>
+      </w:r>
+      <w:r>
+        <w:rPr>
+          <w:rFonts w:ascii="Monospace" w:hAnsi="Monospace"/>
+          <w:color w:val="000000"/>
+          <w:sz w:val="20"/>
+          <w:shd w:fill="E8F2FE" w:val="clear"/>
+        </w:rPr>
+        <w:t>, msg_queue):</w:t>
+      </w:r>
+    </w:p>
+    <w:p>
+      <w:pPr>
+        <w:pStyle w:val="Normal"/>
+        <w:rPr>
+          <w:rFonts w:ascii="Monospace" w:hAnsi="Monospace"/>
+          <w:color w:val="000000"/>
+          <w:sz w:val="20"/>
+          <w:shd w:fill="E8F2FE" w:val="clear"/>
+        </w:rPr>
+      </w:pPr>
+      <w:r>
+        <w:rPr/>
+      </w:r>
+    </w:p>
+    <w:p>
+      <w:pPr>
+        <w:pStyle w:val="Normal"/>
+        <w:rPr/>
+      </w:pPr>
+      <w:r>
+        <w:rPr>
+          <w:rFonts w:ascii="Monospace" w:hAnsi="Monospace"/>
+          <w:color w:val="000000"/>
+          <w:sz w:val="20"/>
+          <w:shd w:fill="E8F2FE" w:val="clear"/>
+        </w:rPr>
+        <w:t xml:space="preserve">    </w:t>
+      </w:r>
+      <w:r>
+        <w:rPr>
+          <w:rFonts w:ascii="Monospace" w:hAnsi="Monospace"/>
+          <w:color w:val="0000FF"/>
+          <w:sz w:val="20"/>
+          <w:shd w:fill="E8F2FE" w:val="clear"/>
+        </w:rPr>
+        <w:t>def</w:t>
+      </w:r>
+      <w:r>
+        <w:rPr>
+          <w:rFonts w:ascii="Monospace" w:hAnsi="Monospace"/>
+          <w:color w:val="000000"/>
+          <w:sz w:val="20"/>
+          <w:shd w:fill="E8F2FE" w:val="clear"/>
+        </w:rPr>
+        <w:t xml:space="preserve"> </w:t>
+      </w:r>
+      <w:r>
+        <w:rPr>
+          <w:rFonts w:ascii="Monospace" w:hAnsi="Monospace"/>
+          <w:b/>
+          <w:color w:val="000000"/>
+          <w:sz w:val="20"/>
+          <w:shd w:fill="E8F2FE" w:val="clear"/>
+        </w:rPr>
+        <w:t>get_state</w:t>
+      </w:r>
+      <w:r>
+        <w:rPr>
+          <w:rFonts w:ascii="Monospace" w:hAnsi="Monospace"/>
+          <w:color w:val="000000"/>
+          <w:sz w:val="20"/>
+          <w:shd w:fill="E8F2FE" w:val="clear"/>
+        </w:rPr>
+        <w:t>(</w:t>
+      </w:r>
+      <w:r>
+        <w:rPr>
+          <w:rFonts w:ascii="Monospace" w:hAnsi="Monospace"/>
+          <w:i/>
+          <w:color w:val="000000"/>
+          <w:sz w:val="20"/>
+          <w:shd w:fill="E8F2FE" w:val="clear"/>
+        </w:rPr>
+        <w:t>self</w:t>
+      </w:r>
+      <w:r>
+        <w:rPr>
+          <w:rFonts w:ascii="Monospace" w:hAnsi="Monospace"/>
+          <w:color w:val="000000"/>
+          <w:sz w:val="20"/>
+          <w:shd w:fill="E8F2FE" w:val="clear"/>
+        </w:rPr>
+        <w:t>):</w:t>
+      </w:r>
+    </w:p>
+    <w:p>
+      <w:pPr>
+        <w:pStyle w:val="Normal"/>
+        <w:ind w:hanging="0"/>
+        <w:jc w:val="start"/>
+        <w:rPr>
+          <w:rFonts w:ascii="Monospace" w:hAnsi="Monospace"/>
+          <w:sz w:val="20"/>
+        </w:rPr>
+      </w:pPr>
+      <w:r>
+        <w:rPr>
+          <w:rFonts w:ascii="Monospace" w:hAnsi="Monospace"/>
+          <w:color w:val="000000"/>
+          <w:sz w:val="20"/>
+          <w:shd w:fill="E8F2FE" w:val="clear"/>
+        </w:rPr>
+        <w:t xml:space="preserve">        </w:t>
+      </w:r>
+      <w:r>
+        <w:rPr>
+          <w:rFonts w:ascii="Monospace" w:hAnsi="Monospace"/>
+          <w:i/>
+          <w:color w:val="00AA00"/>
+          <w:sz w:val="20"/>
+        </w:rPr>
+        <w:t>'''</w:t>
+      </w:r>
+    </w:p>
+    <w:p>
+      <w:pPr>
+        <w:pStyle w:val="Normal"/>
+        <w:ind w:hanging="0"/>
+        <w:jc w:val="start"/>
+        <w:rPr>
+          <w:rFonts w:ascii="Monospace" w:hAnsi="Monospace"/>
+          <w:sz w:val="20"/>
+        </w:rPr>
+      </w:pPr>
+      <w:r>
+        <w:rPr>
+          <w:rFonts w:ascii="Monospace" w:hAnsi="Monospace"/>
+          <w:i/>
+          <w:color w:val="00AA00"/>
+          <w:sz w:val="20"/>
+        </w:rPr>
+        <w:t xml:space="preserve">        </w:t>
+      </w:r>
+      <w:r>
+        <w:rPr>
+          <w:rFonts w:ascii="Monospace" w:hAnsi="Monospace"/>
+          <w:i/>
+          <w:color w:val="00AA00"/>
+          <w:sz w:val="20"/>
+        </w:rPr>
+        <w:t xml:space="preserve">Return the actual state of the </w:t>
+      </w:r>
+      <w:r>
+        <w:rPr>
+          <w:rFonts w:ascii="Monospace" w:hAnsi="Monospace"/>
+          <w:i/>
+          <w:color w:val="00AA00"/>
+          <w:sz w:val="20"/>
+          <w:u w:val="single"/>
+        </w:rPr>
+        <w:t>Spotify</w:t>
+      </w:r>
+      <w:r>
+        <w:rPr>
+          <w:rFonts w:ascii="Monospace" w:hAnsi="Monospace"/>
+          <w:i/>
+          <w:color w:val="00AA00"/>
+          <w:sz w:val="20"/>
+        </w:rPr>
+        <w:t xml:space="preserve"> Connect servers and related </w:t>
+        <w:tab/>
+        <w:tab/>
+        <w:tab/>
+        <w:t>events</w:t>
+      </w:r>
+    </w:p>
+    <w:p>
+      <w:pPr>
+        <w:pStyle w:val="Normal"/>
+        <w:ind w:hanging="0"/>
+        <w:jc w:val="start"/>
+        <w:rPr>
+          <w:rFonts w:ascii="Monospace" w:hAnsi="Monospace"/>
+          <w:sz w:val="20"/>
+        </w:rPr>
+      </w:pPr>
+      <w:r>
+        <w:rPr>
+          <w:rFonts w:ascii="Monospace" w:hAnsi="Monospace"/>
+          <w:i/>
+          <w:color w:val="00AA00"/>
+          <w:sz w:val="20"/>
+        </w:rPr>
+        <w:t xml:space="preserve">        </w:t>
+      </w:r>
+      <w:r>
+        <w:rPr>
+          <w:rFonts w:ascii="Monospace" w:hAnsi="Monospace"/>
+          <w:b/>
+          <w:color w:val="00AA00"/>
+          <w:sz w:val="20"/>
+        </w:rPr>
+        <w:t>:return</w:t>
+      </w:r>
+      <w:r>
+        <w:rPr>
+          <w:rFonts w:ascii="Monospace" w:hAnsi="Monospace"/>
+          <w:i/>
+          <w:color w:val="00AA00"/>
+          <w:sz w:val="20"/>
+        </w:rPr>
+        <w:t xml:space="preserve"> self.state = current state</w:t>
+      </w:r>
+    </w:p>
+    <w:p>
+      <w:pPr>
+        <w:pStyle w:val="Normal"/>
+        <w:rPr>
+          <w:rFonts w:ascii="Monospace" w:hAnsi="Monospace"/>
+          <w:color w:val="000000"/>
+          <w:sz w:val="20"/>
+          <w:shd w:fill="E8F2FE" w:val="clear"/>
+        </w:rPr>
+      </w:pPr>
+      <w:r>
+        <w:rPr>
+          <w:rFonts w:ascii="Monospace" w:hAnsi="Monospace"/>
+          <w:i/>
+          <w:color w:val="00AA00"/>
+          <w:sz w:val="20"/>
+        </w:rPr>
+        <w:t xml:space="preserve">        </w:t>
+      </w:r>
+      <w:r>
+        <w:rPr>
+          <w:rFonts w:ascii="Monospace" w:hAnsi="Monospace"/>
+          <w:i/>
+          <w:color w:val="00AA00"/>
+          <w:sz w:val="20"/>
+        </w:rPr>
+        <w:t>'''</w:t>
+      </w:r>
+    </w:p>
+    <w:p>
+      <w:pPr>
+        <w:pStyle w:val="Normal"/>
+        <w:rPr/>
+      </w:pPr>
+      <w:r>
+        <w:rPr>
+          <w:rFonts w:ascii="Monospace" w:hAnsi="Monospace"/>
+          <w:color w:val="000000"/>
+          <w:sz w:val="20"/>
+          <w:shd w:fill="E8F2FE" w:val="clear"/>
+        </w:rPr>
+        <w:t xml:space="preserve">    </w:t>
+      </w:r>
+      <w:r>
+        <w:rPr>
+          <w:rFonts w:ascii="Monospace" w:hAnsi="Monospace"/>
+          <w:color w:val="0000FF"/>
+          <w:sz w:val="20"/>
+          <w:shd w:fill="E8F2FE" w:val="clear"/>
+        </w:rPr>
+        <w:t>def</w:t>
+      </w:r>
+      <w:r>
+        <w:rPr>
+          <w:rFonts w:ascii="Monospace" w:hAnsi="Monospace"/>
+          <w:color w:val="000000"/>
+          <w:sz w:val="20"/>
+          <w:shd w:fill="E8F2FE" w:val="clear"/>
+        </w:rPr>
+        <w:t xml:space="preserve"> </w:t>
+      </w:r>
+      <w:r>
+        <w:rPr>
+          <w:rFonts w:ascii="Monospace" w:hAnsi="Monospace"/>
+          <w:b/>
+          <w:color w:val="000000"/>
+          <w:sz w:val="20"/>
+          <w:shd w:fill="E8F2FE" w:val="clear"/>
+        </w:rPr>
+        <w:t>playerctl_command</w:t>
+      </w:r>
+      <w:r>
+        <w:rPr>
+          <w:rFonts w:ascii="Monospace" w:hAnsi="Monospace"/>
+          <w:color w:val="000000"/>
+          <w:sz w:val="20"/>
+          <w:shd w:fill="E8F2FE" w:val="clear"/>
+        </w:rPr>
+        <w:t>(</w:t>
+      </w:r>
+      <w:r>
+        <w:rPr>
+          <w:rFonts w:ascii="Monospace" w:hAnsi="Monospace"/>
+          <w:i/>
+          <w:color w:val="000000"/>
+          <w:sz w:val="20"/>
+          <w:shd w:fill="E8F2FE" w:val="clear"/>
+        </w:rPr>
+        <w:t>self</w:t>
+      </w:r>
+      <w:r>
+        <w:rPr>
+          <w:rFonts w:ascii="Monospace" w:hAnsi="Monospace"/>
+          <w:color w:val="000000"/>
+          <w:sz w:val="20"/>
+          <w:shd w:fill="E8F2FE" w:val="clear"/>
+        </w:rPr>
+        <w:t>,command):</w:t>
+      </w:r>
+    </w:p>
+    <w:p>
+      <w:pPr>
+        <w:pStyle w:val="Normal"/>
+        <w:ind w:hanging="0"/>
+        <w:jc w:val="start"/>
+        <w:rPr>
+          <w:rFonts w:ascii="Monospace" w:hAnsi="Monospace"/>
+          <w:sz w:val="20"/>
+        </w:rPr>
+      </w:pPr>
+      <w:r>
+        <w:rPr>
+          <w:rFonts w:ascii="Monospace" w:hAnsi="Monospace"/>
+          <w:i/>
+          <w:color w:val="000000"/>
+          <w:sz w:val="20"/>
+          <w:shd w:fill="E8F2FE" w:val="clear"/>
+        </w:rPr>
+        <w:t xml:space="preserve">        </w:t>
+      </w:r>
+      <w:r>
+        <w:rPr>
+          <w:rFonts w:ascii="Monospace" w:hAnsi="Monospace"/>
+          <w:i/>
+          <w:color w:val="00AA00"/>
+          <w:sz w:val="20"/>
+        </w:rPr>
+        <w:t>'''</w:t>
+      </w:r>
+    </w:p>
+    <w:p>
+      <w:pPr>
+        <w:pStyle w:val="Normal"/>
+        <w:ind w:hanging="0"/>
+        <w:jc w:val="start"/>
+        <w:rPr>
+          <w:rFonts w:ascii="Monospace" w:hAnsi="Monospace"/>
+          <w:sz w:val="20"/>
+        </w:rPr>
+      </w:pPr>
+      <w:r>
+        <w:rPr>
+          <w:rFonts w:ascii="Monospace" w:hAnsi="Monospace"/>
+          <w:i/>
+          <w:color w:val="00AA00"/>
+          <w:sz w:val="20"/>
+        </w:rPr>
+        <w:t xml:space="preserve">        </w:t>
+      </w:r>
+      <w:r>
+        <w:rPr>
+          <w:rFonts w:ascii="Monospace" w:hAnsi="Monospace"/>
+          <w:i/>
+          <w:color w:val="00AA00"/>
+          <w:sz w:val="20"/>
+        </w:rPr>
+        <w:t xml:space="preserve">Send command to </w:t>
+      </w:r>
+      <w:r>
+        <w:rPr>
+          <w:rFonts w:ascii="Monospace" w:hAnsi="Monospace"/>
+          <w:i/>
+          <w:color w:val="00AA00"/>
+          <w:sz w:val="20"/>
+          <w:u w:val="single"/>
+        </w:rPr>
+        <w:t>playerctl</w:t>
+      </w:r>
+      <w:r>
+        <w:rPr>
+          <w:rFonts w:ascii="Monospace" w:hAnsi="Monospace"/>
+          <w:i/>
+          <w:color w:val="00AA00"/>
+          <w:sz w:val="20"/>
+        </w:rPr>
+        <w:t xml:space="preserve"> via </w:t>
+      </w:r>
+      <w:r>
+        <w:rPr>
+          <w:rFonts w:ascii="Monospace" w:hAnsi="Monospace"/>
+          <w:i/>
+          <w:color w:val="00AA00"/>
+          <w:sz w:val="20"/>
+          <w:u w:val="single"/>
+        </w:rPr>
+        <w:t>mpris</w:t>
+      </w:r>
+      <w:r>
+        <w:rPr>
+          <w:rFonts w:ascii="Monospace" w:hAnsi="Monospace"/>
+          <w:i/>
+          <w:color w:val="00AA00"/>
+          <w:sz w:val="20"/>
+        </w:rPr>
+        <w:t xml:space="preserve"> player interface</w:t>
+      </w:r>
+    </w:p>
+    <w:p>
+      <w:pPr>
+        <w:pStyle w:val="Normal"/>
+        <w:ind w:hanging="0"/>
+        <w:jc w:val="start"/>
+        <w:rPr>
+          <w:rFonts w:ascii="Monospace" w:hAnsi="Monospace"/>
+          <w:sz w:val="20"/>
+        </w:rPr>
+      </w:pPr>
+      <w:r>
+        <w:rPr>
+          <w:rFonts w:ascii="Monospace" w:hAnsi="Monospace"/>
+          <w:i/>
+          <w:color w:val="00AA00"/>
+          <w:sz w:val="20"/>
+        </w:rPr>
+        <w:t xml:space="preserve">        </w:t>
+      </w:r>
+      <w:r>
+        <w:rPr>
+          <w:rFonts w:ascii="Monospace" w:hAnsi="Monospace"/>
+          <w:b/>
+          <w:color w:val="00AA00"/>
+          <w:sz w:val="20"/>
+        </w:rPr>
+        <w:t>:</w:t>
+      </w:r>
+      <w:r>
+        <w:rPr>
+          <w:rFonts w:ascii="Monospace" w:hAnsi="Monospace"/>
+          <w:b/>
+          <w:color w:val="00AA00"/>
+          <w:sz w:val="20"/>
+          <w:u w:val="single"/>
+        </w:rPr>
+        <w:t>param</w:t>
+      </w:r>
+      <w:r>
+        <w:rPr>
+          <w:rFonts w:ascii="Monospace" w:hAnsi="Monospace"/>
+          <w:i/>
+          <w:color w:val="00AA00"/>
+          <w:sz w:val="20"/>
+        </w:rPr>
+        <w:t xml:space="preserve"> command = player command = [ MPV_PLAYERCTL_PLAY, </w:t>
+      </w:r>
+    </w:p>
+    <w:p>
+      <w:pPr>
+        <w:pStyle w:val="Normal"/>
+        <w:ind w:hanging="0"/>
+        <w:jc w:val="start"/>
+        <w:rPr>
+          <w:rFonts w:ascii="Monospace" w:hAnsi="Monospace"/>
+          <w:sz w:val="20"/>
+        </w:rPr>
+      </w:pPr>
+      <w:r>
+        <w:rPr>
+          <w:rFonts w:ascii="Monospace" w:hAnsi="Monospace"/>
+          <w:i/>
+          <w:color w:val="00AA00"/>
+          <w:sz w:val="20"/>
+        </w:rPr>
+        <w:t xml:space="preserve">                                            </w:t>
+      </w:r>
+      <w:r>
+        <w:rPr>
+          <w:rFonts w:ascii="Monospace" w:hAnsi="Monospace"/>
+          <w:i/>
+          <w:color w:val="00AA00"/>
+          <w:sz w:val="20"/>
+        </w:rPr>
+        <w:t xml:space="preserve">MPV_PLAYERCTL_PAUSE, </w:t>
+      </w:r>
+    </w:p>
+    <w:p>
+      <w:pPr>
+        <w:pStyle w:val="Normal"/>
+        <w:ind w:hanging="0"/>
+        <w:jc w:val="start"/>
+        <w:rPr>
+          <w:rFonts w:ascii="Monospace" w:hAnsi="Monospace"/>
+          <w:sz w:val="20"/>
+        </w:rPr>
+      </w:pPr>
+      <w:r>
+        <w:rPr>
+          <w:rFonts w:ascii="Monospace" w:hAnsi="Monospace"/>
+          <w:i/>
+          <w:color w:val="00AA00"/>
+          <w:sz w:val="20"/>
+        </w:rPr>
+        <w:t xml:space="preserve">                                            </w:t>
+      </w:r>
+      <w:r>
+        <w:rPr>
+          <w:rFonts w:ascii="Monospace" w:hAnsi="Monospace"/>
+          <w:i/>
+          <w:color w:val="00AA00"/>
+          <w:sz w:val="20"/>
+        </w:rPr>
+        <w:t>MPV_PLAYERCTL_STOP]</w:t>
+      </w:r>
+    </w:p>
+    <w:p>
+      <w:pPr>
+        <w:pStyle w:val="Normal"/>
+        <w:ind w:hanging="0"/>
+        <w:jc w:val="start"/>
+        <w:rPr>
+          <w:rFonts w:ascii="Monospace" w:hAnsi="Monospace"/>
+          <w:sz w:val="20"/>
+        </w:rPr>
+      </w:pPr>
+      <w:r>
+        <w:rPr>
+          <w:rFonts w:ascii="Monospace" w:hAnsi="Monospace"/>
+          <w:i/>
+          <w:color w:val="00AA00"/>
+          <w:sz w:val="20"/>
+        </w:rPr>
+        <w:t xml:space="preserve">        </w:t>
+      </w:r>
+      <w:r>
+        <w:rPr>
+          <w:rFonts w:ascii="Monospace" w:hAnsi="Monospace"/>
+          <w:b/>
+          <w:color w:val="00AA00"/>
+          <w:sz w:val="20"/>
+        </w:rPr>
+        <w:t>:return</w:t>
+      </w:r>
+      <w:r>
+        <w:rPr>
+          <w:rFonts w:ascii="Monospace" w:hAnsi="Monospace"/>
+          <w:i/>
+          <w:color w:val="00AA00"/>
+          <w:sz w:val="20"/>
+        </w:rPr>
+        <w:t xml:space="preserve"> self.state = state of </w:t>
+      </w:r>
+      <w:r>
+        <w:rPr>
+          <w:rFonts w:ascii="Monospace" w:hAnsi="Monospace"/>
+          <w:i/>
+          <w:color w:val="00AA00"/>
+          <w:sz w:val="20"/>
+          <w:u w:val="single"/>
+        </w:rPr>
+        <w:t>mpv</w:t>
+      </w:r>
+      <w:r>
+        <w:rPr>
+          <w:rFonts w:ascii="Monospace" w:hAnsi="Monospace"/>
+          <w:i/>
+          <w:color w:val="00AA00"/>
+          <w:sz w:val="20"/>
+        </w:rPr>
+        <w:t xml:space="preserve"> </w:t>
+      </w:r>
+      <w:r>
+        <w:rPr>
+          <w:rFonts w:ascii="Monospace" w:hAnsi="Monospace"/>
+          <w:i/>
+          <w:color w:val="00AA00"/>
+          <w:sz w:val="20"/>
+          <w:u w:val="single"/>
+        </w:rPr>
+        <w:t>mpris</w:t>
+      </w:r>
+      <w:r>
+        <w:rPr>
+          <w:rFonts w:ascii="Monospace" w:hAnsi="Monospace"/>
+          <w:i/>
+          <w:color w:val="00AA00"/>
+          <w:sz w:val="20"/>
+        </w:rPr>
+        <w:t xml:space="preserve"> player-control = </w:t>
+        <w:tab/>
+        <w:tab/>
+        <w:tab/>
+        <w:tab/>
+        <w:tab/>
+        <w:tab/>
+        <w:t xml:space="preserve">[ MPV_PLAYERCTL_PLAYING_STATE |                                                                 </w:t>
+        <w:tab/>
+        <w:tab/>
+        <w:tab/>
+        <w:tab/>
+        <w:t xml:space="preserve">  MPV_PLAYERCTL_STOPPED_STATE |</w:t>
+      </w:r>
+    </w:p>
+    <w:p>
+      <w:pPr>
+        <w:pStyle w:val="Normal"/>
+        <w:ind w:hanging="0"/>
+        <w:jc w:val="start"/>
+        <w:rPr>
+          <w:rFonts w:ascii="Monospace" w:hAnsi="Monospace"/>
+          <w:sz w:val="20"/>
+        </w:rPr>
+      </w:pPr>
+      <w:r>
+        <w:rPr>
+          <w:rFonts w:ascii="Monospace" w:hAnsi="Monospace"/>
+          <w:i/>
+          <w:color w:val="00AA00"/>
+          <w:sz w:val="20"/>
+        </w:rPr>
+        <w:t xml:space="preserve">                         </w:t>
+      </w:r>
+      <w:r>
+        <w:rPr>
+          <w:rFonts w:ascii="Monospace" w:hAnsi="Monospace"/>
+          <w:i/>
+          <w:color w:val="00AA00"/>
+          <w:sz w:val="20"/>
+        </w:rPr>
+        <w:t>MPV_PLAYERCTL_PAUSED_STATE]</w:t>
+      </w:r>
+    </w:p>
+    <w:p>
+      <w:pPr>
+        <w:pStyle w:val="Normal"/>
+        <w:ind w:hanging="0"/>
+        <w:jc w:val="start"/>
+        <w:rPr>
+          <w:rFonts w:ascii="Monospace" w:hAnsi="Monospace"/>
+          <w:sz w:val="20"/>
+        </w:rPr>
+      </w:pPr>
+      <w:r>
+        <w:rPr>
+          <w:rFonts w:ascii="Monospace" w:hAnsi="Monospace"/>
+          <w:i/>
+          <w:color w:val="00AA00"/>
+          <w:sz w:val="20"/>
+        </w:rPr>
+        <w:t xml:space="preserve">        </w:t>
+      </w:r>
+      <w:r>
+        <w:rPr>
+          <w:rFonts w:ascii="Monospace" w:hAnsi="Monospace"/>
+          <w:i/>
+          <w:color w:val="00AA00"/>
+          <w:sz w:val="20"/>
+        </w:rPr>
+        <w:t>'''</w:t>
+      </w:r>
+    </w:p>
+    <w:p>
+      <w:pPr>
+        <w:pStyle w:val="Normal"/>
+        <w:ind w:hanging="0"/>
+        <w:jc w:val="start"/>
+        <w:rPr>
+          <w:rFonts w:ascii="Monospace" w:hAnsi="Monospace"/>
+          <w:sz w:val="20"/>
+        </w:rPr>
+      </w:pPr>
+      <w:r>
+        <w:rPr>
+          <w:b w:val="false"/>
+          <w:bCs w:val="false"/>
+          <w:sz w:val="24"/>
+          <w:szCs w:val="24"/>
+          <w:u w:val="none"/>
+        </w:rPr>
+      </w:r>
+    </w:p>
     <w:sectPr>
       <w:type w:val="nextPage"/>
       <w:pgSz w:w="11906" w:h="16838"/>
@@ -4886,6 +7501,7 @@
   <w:abstractNum w:abstractNumId="1">
     <w:lvl w:ilvl="0">
       <w:start w:val="1"/>
+      <w:pStyle w:val="Heading1"/>
       <w:numFmt w:val="none"/>
       <w:suff w:val="nothing"/>
       <w:lvlText w:val="%1"/>
@@ -7218,6 +9834,26 @@
       <w:sz w:val="24"/>
       <w:szCs w:val="24"/>
       <w:lang w:val="en-US" w:eastAsia="zh-CN" w:bidi="hi-IN"/>
+    </w:rPr>
+  </w:style>
+  <w:style w:type="paragraph" w:styleId="Heading1">
+    <w:name w:val="Heading 1"/>
+    <w:basedOn w:val="Heading"/>
+    <w:next w:val="BodyText"/>
+    <w:qFormat/>
+    <w:pPr>
+      <w:numPr>
+        <w:ilvl w:val="0"/>
+        <w:numId w:val="1"/>
+      </w:numPr>
+      <w:spacing w:before="240" w:after="120"/>
+      <w:outlineLvl w:val="0"/>
+    </w:pPr>
+    <w:rPr>
+      <w:b/>
+      <w:bCs/>
+      <w:sz w:val="36"/>
+      <w:szCs w:val="36"/>
     </w:rPr>
   </w:style>
   <w:style w:type="paragraph" w:styleId="Heading2">

</xml_diff>

<commit_message>
Update Spotify Connect design.docx, Spotify Connect design.odt, and 6 more files...
</commit_message>
<xml_diff>
--- a/Documents/Spotify/Spotify Connect design.docx
+++ b/Documents/Spotify/Spotify Connect design.docx
@@ -5546,71 +5546,1348 @@
         <w:pStyle w:val="Normal"/>
         <w:spacing w:lineRule="auto" w:line="240" w:before="0" w:after="26"/>
         <w:rPr>
+          <w:rFonts w:ascii="Liberation Serif" w:hAnsi="Liberation Serif"/>
+          <w:b w:val="false"/>
+          <w:bCs w:val="false"/>
+          <w:sz w:val="24"/>
+          <w:szCs w:val="24"/>
+          <w:u w:val="none"/>
+        </w:rPr>
+      </w:pPr>
+      <w:r>
+        <w:rPr>
+          <w:rFonts w:ascii="Monospace" w:hAnsi="Monospace"/>
+          <w:b w:val="false"/>
+          <w:bCs w:val="false"/>
+          <w:color w:val="000000"/>
+          <w:sz w:val="20"/>
+          <w:szCs w:val="24"/>
+          <w:u w:val="none"/>
+        </w:rPr>
+        <w:t xml:space="preserve">MPV_PLAYERCTL_PAUSED_STATE  = </w:t>
+      </w:r>
+      <w:r>
+        <w:rPr>
+          <w:rFonts w:ascii="Monospace" w:hAnsi="Monospace"/>
+          <w:b w:val="false"/>
+          <w:bCs w:val="false"/>
+          <w:i/>
+          <w:color w:val="00AA00"/>
+          <w:sz w:val="20"/>
+          <w:szCs w:val="24"/>
+          <w:u w:val="none"/>
+        </w:rPr>
+        <w:t>"paused"</w:t>
+      </w:r>
+    </w:p>
+    <w:p>
+      <w:pPr>
+        <w:pStyle w:val="Heading2"/>
+        <w:rPr/>
+      </w:pPr>
+      <w:r>
+        <w:rPr/>
+        <w:t>Message-queue events</w:t>
+      </w:r>
+    </w:p>
+    <w:p>
+      <w:pPr>
+        <w:pStyle w:val="BodyText"/>
+        <w:spacing w:lineRule="auto" w:line="240" w:before="0" w:after="26"/>
+        <w:rPr>
+          <w:rFonts w:ascii="Liberation Serif" w:hAnsi="Liberation Serif"/>
+          <w:b w:val="false"/>
+          <w:bCs w:val="false"/>
+          <w:sz w:val="24"/>
+          <w:szCs w:val="24"/>
+          <w:u w:val="none"/>
+        </w:rPr>
+      </w:pPr>
+      <w:r>
+        <w:rPr>
+          <w:b w:val="false"/>
+          <w:bCs w:val="false"/>
+          <w:sz w:val="24"/>
+          <w:szCs w:val="24"/>
+          <w:u w:val="none"/>
+        </w:rPr>
+        <w:t>Uses the Message schema as defined in schemas.json</w:t>
+      </w:r>
+    </w:p>
+    <w:p>
+      <w:pPr>
+        <w:pStyle w:val="Normal"/>
+        <w:ind w:hanging="0"/>
+        <w:jc w:val="start"/>
+        <w:rPr>
+          <w:rFonts w:ascii="Monospace" w:hAnsi="Monospace"/>
+          <w:sz w:val="20"/>
+        </w:rPr>
+      </w:pPr>
+      <w:r>
+        <w:rPr>
+          <w:rFonts w:ascii="Monospace" w:hAnsi="Monospace"/>
+          <w:color w:val="000000"/>
+          <w:sz w:val="20"/>
+        </w:rPr>
+        <w:t>{</w:t>
+      </w:r>
+    </w:p>
+    <w:p>
+      <w:pPr>
+        <w:pStyle w:val="Normal"/>
+        <w:ind w:hanging="0"/>
+        <w:jc w:val="start"/>
+        <w:rPr>
+          <w:rFonts w:ascii="Monospace" w:hAnsi="Monospace"/>
+          <w:sz w:val="20"/>
+        </w:rPr>
+      </w:pPr>
+      <w:r>
+        <w:rPr>
+          <w:rFonts w:ascii="Monospace" w:hAnsi="Monospace"/>
+          <w:color w:val="000000"/>
+          <w:sz w:val="20"/>
+        </w:rPr>
+        <w:t xml:space="preserve">  </w:t>
+      </w:r>
+      <w:r>
+        <w:rPr>
+          <w:rFonts w:ascii="Monospace" w:hAnsi="Monospace"/>
+          <w:color w:val="859900"/>
+          <w:sz w:val="20"/>
+        </w:rPr>
+        <w:t>"$schema"</w:t>
+      </w:r>
+      <w:r>
+        <w:rPr>
+          <w:rFonts w:ascii="Monospace" w:hAnsi="Monospace"/>
+          <w:color w:val="000000"/>
+          <w:sz w:val="20"/>
+        </w:rPr>
+        <w:t xml:space="preserve">: </w:t>
+      </w:r>
+      <w:r>
+        <w:rPr>
+          <w:rFonts w:ascii="Monospace" w:hAnsi="Monospace"/>
+          <w:color w:val="2AA198"/>
+          <w:sz w:val="20"/>
+        </w:rPr>
+        <w:t>"http://json-schema.org/draft-07/schema#"</w:t>
+      </w:r>
+      <w:r>
+        <w:rPr>
+          <w:rFonts w:ascii="Monospace" w:hAnsi="Monospace"/>
+          <w:color w:val="000000"/>
+          <w:sz w:val="20"/>
+        </w:rPr>
+        <w:t>,</w:t>
+      </w:r>
+    </w:p>
+    <w:p>
+      <w:pPr>
+        <w:pStyle w:val="Normal"/>
+        <w:ind w:hanging="0"/>
+        <w:jc w:val="start"/>
+        <w:rPr>
+          <w:rFonts w:ascii="Monospace" w:hAnsi="Monospace"/>
+          <w:sz w:val="20"/>
+        </w:rPr>
+      </w:pPr>
+      <w:r>
+        <w:rPr>
+          <w:rFonts w:ascii="Monospace" w:hAnsi="Monospace"/>
+          <w:color w:val="000000"/>
+          <w:sz w:val="20"/>
+        </w:rPr>
+        <w:t xml:space="preserve">  </w:t>
+      </w:r>
+      <w:r>
+        <w:rPr>
+          <w:rFonts w:ascii="Monospace" w:hAnsi="Monospace"/>
+          <w:color w:val="859900"/>
+          <w:sz w:val="20"/>
+        </w:rPr>
+        <w:t>"Messages"</w:t>
+      </w:r>
+      <w:r>
+        <w:rPr>
+          <w:rFonts w:ascii="Monospace" w:hAnsi="Monospace"/>
+          <w:color w:val="000000"/>
+          <w:sz w:val="20"/>
+        </w:rPr>
+        <w:t>: {</w:t>
+      </w:r>
+    </w:p>
+    <w:p>
+      <w:pPr>
+        <w:pStyle w:val="Normal"/>
+        <w:ind w:hanging="0"/>
+        <w:jc w:val="start"/>
+        <w:rPr>
+          <w:rFonts w:ascii="Monospace" w:hAnsi="Monospace"/>
+          <w:sz w:val="20"/>
+        </w:rPr>
+      </w:pPr>
+      <w:r>
+        <w:rPr>
+          <w:rFonts w:ascii="Monospace" w:hAnsi="Monospace"/>
+          <w:color w:val="000000"/>
+          <w:sz w:val="20"/>
+        </w:rPr>
+        <w:t xml:space="preserve">    </w:t>
+      </w:r>
+      <w:r>
+        <w:rPr>
+          <w:rFonts w:ascii="Monospace" w:hAnsi="Monospace"/>
+          <w:color w:val="859900"/>
+          <w:sz w:val="20"/>
+        </w:rPr>
+        <w:t>"type"</w:t>
+      </w:r>
+      <w:r>
+        <w:rPr>
+          <w:rFonts w:ascii="Monospace" w:hAnsi="Monospace"/>
+          <w:color w:val="000000"/>
+          <w:sz w:val="20"/>
+        </w:rPr>
+        <w:t xml:space="preserve">: </w:t>
+      </w:r>
+      <w:r>
+        <w:rPr>
+          <w:rFonts w:ascii="Monospace" w:hAnsi="Monospace"/>
+          <w:color w:val="2AA198"/>
+          <w:sz w:val="20"/>
+        </w:rPr>
+        <w:t>"object"</w:t>
+      </w:r>
+      <w:r>
+        <w:rPr>
+          <w:rFonts w:ascii="Monospace" w:hAnsi="Monospace"/>
+          <w:color w:val="000000"/>
+          <w:sz w:val="20"/>
+        </w:rPr>
+        <w:t>,</w:t>
+      </w:r>
+    </w:p>
+    <w:p>
+      <w:pPr>
+        <w:pStyle w:val="Normal"/>
+        <w:ind w:hanging="0"/>
+        <w:jc w:val="start"/>
+        <w:rPr>
+          <w:rFonts w:ascii="Monospace" w:hAnsi="Monospace"/>
+          <w:sz w:val="20"/>
+        </w:rPr>
+      </w:pPr>
+      <w:r>
+        <w:rPr>
+          <w:rFonts w:ascii="Monospace" w:hAnsi="Monospace"/>
+          <w:color w:val="000000"/>
+          <w:sz w:val="20"/>
+        </w:rPr>
+        <w:t xml:space="preserve">    </w:t>
+      </w:r>
+      <w:r>
+        <w:rPr>
+          <w:rFonts w:ascii="Monospace" w:hAnsi="Monospace"/>
+          <w:color w:val="859900"/>
+          <w:sz w:val="20"/>
+        </w:rPr>
+        <w:t>"properties"</w:t>
+      </w:r>
+      <w:r>
+        <w:rPr>
+          <w:rFonts w:ascii="Monospace" w:hAnsi="Monospace"/>
+          <w:color w:val="000000"/>
+          <w:sz w:val="20"/>
+        </w:rPr>
+        <w:t>: {</w:t>
+      </w:r>
+    </w:p>
+    <w:p>
+      <w:pPr>
+        <w:pStyle w:val="Normal"/>
+        <w:ind w:hanging="0"/>
+        <w:jc w:val="start"/>
+        <w:rPr>
+          <w:rFonts w:ascii="Monospace" w:hAnsi="Monospace"/>
+          <w:sz w:val="20"/>
+        </w:rPr>
+      </w:pPr>
+      <w:r>
+        <w:rPr>
+          <w:rFonts w:ascii="Monospace" w:hAnsi="Monospace"/>
+          <w:color w:val="000000"/>
+          <w:sz w:val="20"/>
+        </w:rPr>
+        <w:t xml:space="preserve">      </w:t>
+      </w:r>
+      <w:r>
+        <w:rPr>
+          <w:rFonts w:ascii="Monospace" w:hAnsi="Monospace"/>
+          <w:color w:val="859900"/>
+          <w:sz w:val="20"/>
+        </w:rPr>
+        <w:t>"type"</w:t>
+      </w:r>
+      <w:r>
+        <w:rPr>
+          <w:rFonts w:ascii="Monospace" w:hAnsi="Monospace"/>
+          <w:color w:val="000000"/>
+          <w:sz w:val="20"/>
+        </w:rPr>
+        <w:t>:</w:t>
+        <w:tab/>
+        <w:t xml:space="preserve">{ </w:t>
+      </w:r>
+      <w:r>
+        <w:rPr>
+          <w:rFonts w:ascii="Monospace" w:hAnsi="Monospace"/>
+          <w:color w:val="859900"/>
+          <w:sz w:val="20"/>
+        </w:rPr>
+        <w:t>"type"</w:t>
+      </w:r>
+      <w:r>
+        <w:rPr>
+          <w:rFonts w:ascii="Monospace" w:hAnsi="Monospace"/>
+          <w:color w:val="000000"/>
+          <w:sz w:val="20"/>
+        </w:rPr>
+        <w:t xml:space="preserve">: </w:t>
+      </w:r>
+      <w:r>
+        <w:rPr>
+          <w:rFonts w:ascii="Monospace" w:hAnsi="Monospace"/>
+          <w:color w:val="2AA198"/>
+          <w:sz w:val="20"/>
+        </w:rPr>
+        <w:t>"string"</w:t>
+      </w:r>
+      <w:r>
+        <w:rPr>
+          <w:rFonts w:ascii="Monospace" w:hAnsi="Monospace"/>
+          <w:color w:val="000000"/>
+          <w:sz w:val="20"/>
+        </w:rPr>
+        <w:t xml:space="preserve"> },</w:t>
+      </w:r>
+    </w:p>
+    <w:p>
+      <w:pPr>
+        <w:pStyle w:val="Normal"/>
+        <w:ind w:hanging="0"/>
+        <w:jc w:val="start"/>
+        <w:rPr>
+          <w:rFonts w:ascii="Monospace" w:hAnsi="Monospace"/>
+          <w:sz w:val="20"/>
+        </w:rPr>
+      </w:pPr>
+      <w:r>
+        <w:rPr>
+          <w:rFonts w:ascii="Monospace" w:hAnsi="Monospace"/>
+          <w:color w:val="000000"/>
+          <w:sz w:val="20"/>
+        </w:rPr>
+        <w:t xml:space="preserve">      </w:t>
+      </w:r>
+      <w:r>
+        <w:rPr>
+          <w:rFonts w:ascii="Monospace" w:hAnsi="Monospace"/>
+          <w:color w:val="859900"/>
+          <w:sz w:val="20"/>
+        </w:rPr>
+        <w:t>"state"</w:t>
+      </w:r>
+      <w:r>
+        <w:rPr>
+          <w:rFonts w:ascii="Monospace" w:hAnsi="Monospace"/>
+          <w:color w:val="000000"/>
+          <w:sz w:val="20"/>
+        </w:rPr>
+        <w:t>:</w:t>
+        <w:tab/>
+        <w:t xml:space="preserve">{ </w:t>
+      </w:r>
+      <w:r>
+        <w:rPr>
+          <w:rFonts w:ascii="Monospace" w:hAnsi="Monospace"/>
+          <w:color w:val="859900"/>
+          <w:sz w:val="20"/>
+        </w:rPr>
+        <w:t>"type"</w:t>
+      </w:r>
+      <w:r>
+        <w:rPr>
+          <w:rFonts w:ascii="Monospace" w:hAnsi="Monospace"/>
+          <w:color w:val="000000"/>
+          <w:sz w:val="20"/>
+        </w:rPr>
+        <w:t xml:space="preserve">: </w:t>
+      </w:r>
+      <w:r>
+        <w:rPr>
+          <w:rFonts w:ascii="Monospace" w:hAnsi="Monospace"/>
+          <w:color w:val="2AA198"/>
+          <w:sz w:val="20"/>
+        </w:rPr>
+        <w:t>"string"</w:t>
+      </w:r>
+      <w:r>
+        <w:rPr>
+          <w:rFonts w:ascii="Monospace" w:hAnsi="Monospace"/>
+          <w:color w:val="000000"/>
+          <w:sz w:val="20"/>
+        </w:rPr>
+        <w:t xml:space="preserve"> },</w:t>
+      </w:r>
+    </w:p>
+    <w:p>
+      <w:pPr>
+        <w:pStyle w:val="Normal"/>
+        <w:ind w:hanging="0"/>
+        <w:jc w:val="start"/>
+        <w:rPr>
+          <w:rFonts w:ascii="Monospace" w:hAnsi="Monospace"/>
+          <w:sz w:val="20"/>
+        </w:rPr>
+      </w:pPr>
+      <w:r>
+        <w:rPr>
+          <w:rFonts w:ascii="Monospace" w:hAnsi="Monospace"/>
+          <w:color w:val="000000"/>
+          <w:sz w:val="20"/>
+        </w:rPr>
+        <w:t xml:space="preserve">      </w:t>
+      </w:r>
+      <w:r>
+        <w:rPr>
+          <w:rFonts w:ascii="Monospace" w:hAnsi="Monospace"/>
+          <w:color w:val="859900"/>
+          <w:sz w:val="20"/>
+        </w:rPr>
+        <w:t>"error"</w:t>
+      </w:r>
+      <w:r>
+        <w:rPr>
+          <w:rFonts w:ascii="Monospace" w:hAnsi="Monospace"/>
+          <w:color w:val="000000"/>
+          <w:sz w:val="20"/>
+        </w:rPr>
+        <w:t>:</w:t>
+        <w:tab/>
+        <w:t xml:space="preserve">{ </w:t>
+      </w:r>
+      <w:r>
+        <w:rPr>
+          <w:rFonts w:ascii="Monospace" w:hAnsi="Monospace"/>
+          <w:color w:val="859900"/>
+          <w:sz w:val="20"/>
+        </w:rPr>
+        <w:t>"type"</w:t>
+      </w:r>
+      <w:r>
+        <w:rPr>
+          <w:rFonts w:ascii="Monospace" w:hAnsi="Monospace"/>
+          <w:color w:val="000000"/>
+          <w:sz w:val="20"/>
+        </w:rPr>
+        <w:t xml:space="preserve">: </w:t>
+      </w:r>
+      <w:r>
+        <w:rPr>
+          <w:rFonts w:ascii="Monospace" w:hAnsi="Monospace"/>
+          <w:color w:val="2AA198"/>
+          <w:sz w:val="20"/>
+        </w:rPr>
+        <w:t>"string"</w:t>
+      </w:r>
+      <w:r>
+        <w:rPr>
+          <w:rFonts w:ascii="Monospace" w:hAnsi="Monospace"/>
+          <w:color w:val="000000"/>
+          <w:sz w:val="20"/>
+        </w:rPr>
+        <w:t xml:space="preserve"> },</w:t>
+      </w:r>
+    </w:p>
+    <w:p>
+      <w:pPr>
+        <w:pStyle w:val="Normal"/>
+        <w:ind w:hanging="0"/>
+        <w:jc w:val="start"/>
+        <w:rPr>
+          <w:rFonts w:ascii="Monospace" w:hAnsi="Monospace"/>
+          <w:sz w:val="20"/>
+        </w:rPr>
+      </w:pPr>
+      <w:r>
+        <w:rPr>
+          <w:rFonts w:ascii="Monospace" w:hAnsi="Monospace"/>
+          <w:color w:val="000000"/>
+          <w:sz w:val="20"/>
+        </w:rPr>
+        <w:tab/>
+        <w:t xml:space="preserve">  </w:t>
+      </w:r>
+      <w:r>
+        <w:rPr>
+          <w:rFonts w:ascii="Monospace" w:hAnsi="Monospace"/>
+          <w:color w:val="859900"/>
+          <w:sz w:val="20"/>
+        </w:rPr>
+        <w:t>"data"</w:t>
+      </w:r>
+      <w:r>
+        <w:rPr>
+          <w:rFonts w:ascii="Monospace" w:hAnsi="Monospace"/>
+          <w:color w:val="000000"/>
+          <w:sz w:val="20"/>
+        </w:rPr>
+        <w:t>:</w:t>
+        <w:tab/>
+        <w:t xml:space="preserve">{ </w:t>
+      </w:r>
+      <w:r>
+        <w:rPr>
+          <w:rFonts w:ascii="Monospace" w:hAnsi="Monospace"/>
+          <w:color w:val="859900"/>
+          <w:sz w:val="20"/>
+        </w:rPr>
+        <w:t>"type"</w:t>
+      </w:r>
+      <w:r>
+        <w:rPr>
+          <w:rFonts w:ascii="Monospace" w:hAnsi="Monospace"/>
+          <w:color w:val="000000"/>
+          <w:sz w:val="20"/>
+        </w:rPr>
+        <w:t xml:space="preserve">: </w:t>
+      </w:r>
+      <w:r>
+        <w:rPr>
+          <w:rFonts w:ascii="Monospace" w:hAnsi="Monospace"/>
+          <w:color w:val="2AA198"/>
+          <w:sz w:val="20"/>
+        </w:rPr>
+        <w:t>"array"</w:t>
+      </w:r>
+      <w:r>
+        <w:rPr>
+          <w:rFonts w:ascii="Monospace" w:hAnsi="Monospace"/>
+          <w:color w:val="000000"/>
+          <w:sz w:val="20"/>
+        </w:rPr>
+        <w:t xml:space="preserve"> }</w:t>
+      </w:r>
+    </w:p>
+    <w:p>
+      <w:pPr>
+        <w:pStyle w:val="Normal"/>
+        <w:ind w:hanging="0"/>
+        <w:jc w:val="start"/>
+        <w:rPr>
+          <w:rFonts w:ascii="Monospace" w:hAnsi="Monospace"/>
+          <w:sz w:val="20"/>
+        </w:rPr>
+      </w:pPr>
+      <w:r>
+        <w:rPr>
+          <w:rFonts w:ascii="Monospace" w:hAnsi="Monospace"/>
+          <w:color w:val="000000"/>
+          <w:sz w:val="20"/>
+        </w:rPr>
+        <w:t xml:space="preserve">    </w:t>
+      </w:r>
+      <w:r>
+        <w:rPr>
+          <w:rFonts w:ascii="Monospace" w:hAnsi="Monospace"/>
+          <w:color w:val="000000"/>
+          <w:sz w:val="20"/>
+        </w:rPr>
+        <w:t>},</w:t>
+      </w:r>
+    </w:p>
+    <w:p>
+      <w:pPr>
+        <w:pStyle w:val="Normal"/>
+        <w:ind w:hanging="0"/>
+        <w:jc w:val="start"/>
+        <w:rPr>
+          <w:rFonts w:ascii="Monospace" w:hAnsi="Monospace"/>
+          <w:sz w:val="20"/>
+        </w:rPr>
+      </w:pPr>
+      <w:r>
+        <w:rPr>
+          <w:rFonts w:ascii="Monospace" w:hAnsi="Monospace"/>
+          <w:color w:val="000000"/>
+          <w:sz w:val="20"/>
+        </w:rPr>
+        <w:t xml:space="preserve">    </w:t>
+      </w:r>
+      <w:r>
+        <w:rPr>
+          <w:rFonts w:ascii="Monospace" w:hAnsi="Monospace"/>
+          <w:color w:val="859900"/>
+          <w:sz w:val="20"/>
+        </w:rPr>
+        <w:t>"required"</w:t>
+      </w:r>
+      <w:r>
+        <w:rPr>
+          <w:rFonts w:ascii="Monospace" w:hAnsi="Monospace"/>
+          <w:color w:val="000000"/>
+          <w:sz w:val="20"/>
+        </w:rPr>
+        <w:t>: [</w:t>
+      </w:r>
+      <w:r>
+        <w:rPr>
+          <w:rFonts w:ascii="Monospace" w:hAnsi="Monospace"/>
+          <w:color w:val="2AA198"/>
+          <w:sz w:val="20"/>
+        </w:rPr>
+        <w:t>"type"</w:t>
+      </w:r>
+      <w:r>
+        <w:rPr>
+          <w:rFonts w:ascii="Monospace" w:hAnsi="Monospace"/>
+          <w:color w:val="000000"/>
+          <w:sz w:val="20"/>
+        </w:rPr>
+        <w:t xml:space="preserve">, </w:t>
+      </w:r>
+      <w:r>
+        <w:rPr>
+          <w:rFonts w:ascii="Monospace" w:hAnsi="Monospace"/>
+          <w:color w:val="2AA198"/>
+          <w:sz w:val="20"/>
+        </w:rPr>
+        <w:t>"state"</w:t>
+      </w:r>
+      <w:r>
+        <w:rPr>
+          <w:rFonts w:ascii="Monospace" w:hAnsi="Monospace"/>
+          <w:color w:val="000000"/>
+          <w:sz w:val="20"/>
+        </w:rPr>
+        <w:t xml:space="preserve">, </w:t>
+      </w:r>
+      <w:r>
+        <w:rPr>
+          <w:rFonts w:ascii="Monospace" w:hAnsi="Monospace"/>
+          <w:color w:val="2AA198"/>
+          <w:sz w:val="20"/>
+        </w:rPr>
+        <w:t>"error"</w:t>
+      </w:r>
+      <w:r>
+        <w:rPr>
+          <w:rFonts w:ascii="Monospace" w:hAnsi="Monospace"/>
+          <w:color w:val="000000"/>
+          <w:sz w:val="20"/>
+        </w:rPr>
+        <w:t>]</w:t>
+      </w:r>
+    </w:p>
+    <w:p>
+      <w:pPr>
+        <w:pStyle w:val="Normal"/>
+        <w:spacing w:lineRule="auto" w:line="240" w:before="0" w:after="26"/>
+        <w:rPr>
+          <w:rFonts w:ascii="Monospace" w:hAnsi="Monospace"/>
+          <w:b w:val="false"/>
+          <w:bCs w:val="false"/>
+          <w:color w:val="000000"/>
+          <w:sz w:val="20"/>
+          <w:szCs w:val="24"/>
+          <w:u w:val="none"/>
+        </w:rPr>
+      </w:pPr>
+      <w:r>
+        <w:rPr>
+          <w:rFonts w:ascii="Monospace" w:hAnsi="Monospace"/>
+          <w:b w:val="false"/>
+          <w:bCs w:val="false"/>
+          <w:color w:val="000000"/>
+          <w:sz w:val="20"/>
+          <w:szCs w:val="24"/>
+          <w:u w:val="none"/>
+        </w:rPr>
+        <w:t xml:space="preserve">  </w:t>
+      </w:r>
+      <w:r>
+        <w:rPr>
+          <w:rFonts w:ascii="Monospace" w:hAnsi="Monospace"/>
+          <w:b w:val="false"/>
+          <w:bCs w:val="false"/>
+          <w:color w:val="000000"/>
+          <w:sz w:val="20"/>
+          <w:szCs w:val="24"/>
+          <w:u w:val="none"/>
+        </w:rPr>
+        <w:t>}</w:t>
+      </w:r>
+    </w:p>
+    <w:p>
+      <w:pPr>
+        <w:pStyle w:val="BodyText"/>
+        <w:spacing w:lineRule="auto" w:line="240" w:before="0" w:after="26"/>
+        <w:rPr>
+          <w:rFonts w:ascii="Liberation Serif" w:hAnsi="Liberation Serif"/>
+          <w:b w:val="false"/>
+          <w:bCs w:val="false"/>
+          <w:sz w:val="24"/>
+          <w:szCs w:val="24"/>
+          <w:u w:val="none"/>
+        </w:rPr>
+      </w:pPr>
+      <w:r>
+        <w:rPr>
+          <w:b w:val="false"/>
+          <w:bCs w:val="false"/>
+          <w:sz w:val="24"/>
+          <w:szCs w:val="24"/>
+          <w:u w:val="none"/>
+        </w:rPr>
+      </w:r>
+    </w:p>
+    <w:p>
+      <w:pPr>
+        <w:pStyle w:val="Normal"/>
+        <w:spacing w:lineRule="auto" w:line="240" w:before="0" w:after="26"/>
+        <w:rPr>
+          <w:rFonts w:ascii="Liberation Serif" w:hAnsi="Liberation Serif"/>
+          <w:b w:val="false"/>
+          <w:bCs w:val="false"/>
+          <w:sz w:val="24"/>
+          <w:szCs w:val="24"/>
+          <w:u w:val="none"/>
+        </w:rPr>
+      </w:pPr>
+      <w:r>
+        <w:rPr>
+          <w:rFonts w:ascii="Monospace" w:hAnsi="Monospace"/>
+          <w:b w:val="false"/>
+          <w:bCs w:val="false"/>
+          <w:color w:val="000000"/>
+          <w:sz w:val="20"/>
+          <w:szCs w:val="24"/>
+          <w:u w:val="none"/>
+          <w:shd w:fill="E8F2FE" w:val="clear"/>
+        </w:rPr>
+        <w:t>message[</w:t>
+      </w:r>
+      <w:r>
+        <w:rPr>
+          <w:rFonts w:ascii="Monospace" w:hAnsi="Monospace"/>
+          <w:b w:val="false"/>
+          <w:bCs w:val="false"/>
+          <w:i/>
+          <w:color w:val="00AA00"/>
+          <w:sz w:val="20"/>
+          <w:szCs w:val="24"/>
+          <w:u w:val="none"/>
+          <w:shd w:fill="E8F2FE" w:val="clear"/>
+        </w:rPr>
+        <w:t>"type"</w:t>
+      </w:r>
+      <w:r>
+        <w:rPr>
+          <w:rFonts w:ascii="Monospace" w:hAnsi="Monospace"/>
+          <w:b w:val="false"/>
+          <w:bCs w:val="false"/>
+          <w:color w:val="000000"/>
+          <w:sz w:val="20"/>
+          <w:szCs w:val="24"/>
+          <w:u w:val="none"/>
+          <w:shd w:fill="E8F2FE" w:val="clear"/>
+        </w:rPr>
+        <w:t>]  = MESSAGE_SPOTIFY_TYPE</w:t>
+      </w:r>
+    </w:p>
+    <w:p>
+      <w:pPr>
+        <w:pStyle w:val="Normal"/>
+        <w:spacing w:lineRule="auto" w:line="240" w:before="0" w:after="26"/>
+        <w:rPr>
+          <w:rFonts w:ascii="Monospace" w:hAnsi="Monospace"/>
+          <w:color w:val="000000"/>
+          <w:sz w:val="20"/>
+          <w:shd w:fill="E8F2FE" w:val="clear"/>
+        </w:rPr>
+      </w:pPr>
+      <w:r>
+        <w:rPr>
+          <w:b w:val="false"/>
+          <w:bCs w:val="false"/>
+          <w:sz w:val="24"/>
+          <w:szCs w:val="24"/>
+          <w:u w:val="none"/>
+        </w:rPr>
+      </w:r>
+    </w:p>
+    <w:p>
+      <w:pPr>
+        <w:pStyle w:val="Normal"/>
+        <w:ind w:hanging="0"/>
+        <w:jc w:val="start"/>
+        <w:rPr>
+          <w:rFonts w:ascii="Monospace" w:hAnsi="Monospace"/>
+          <w:sz w:val="20"/>
+        </w:rPr>
+      </w:pPr>
+      <w:r>
+        <w:rPr>
+          <w:rFonts w:ascii="Monospace" w:hAnsi="Monospace"/>
+          <w:color w:val="000000"/>
+          <w:sz w:val="20"/>
+        </w:rPr>
+        <w:t>message[</w:t>
+      </w:r>
+      <w:r>
+        <w:rPr>
+          <w:rFonts w:ascii="Monospace" w:hAnsi="Monospace"/>
+          <w:i/>
+          <w:color w:val="00AA00"/>
+          <w:sz w:val="20"/>
+        </w:rPr>
+        <w:t>"state"</w:t>
+      </w:r>
+      <w:r>
+        <w:rPr>
+          <w:rFonts w:ascii="Monospace" w:hAnsi="Monospace"/>
+          <w:color w:val="000000"/>
+          <w:sz w:val="20"/>
+        </w:rPr>
+        <w:t>] = SPOTIFY_CONNECT_PLAYING_EVENT</w:t>
+      </w:r>
+    </w:p>
+    <w:p>
+      <w:pPr>
+        <w:pStyle w:val="Normal"/>
+        <w:ind w:hanging="0"/>
+        <w:jc w:val="start"/>
+        <w:rPr>
+          <w:rFonts w:ascii="Monospace" w:hAnsi="Monospace"/>
+          <w:sz w:val="20"/>
+        </w:rPr>
+      </w:pPr>
+      <w:r>
+        <w:rPr>
+          <w:rFonts w:ascii="Monospace" w:hAnsi="Monospace"/>
+          <w:color w:val="000000"/>
+          <w:sz w:val="20"/>
+        </w:rPr>
+        <w:t>message[</w:t>
+      </w:r>
+      <w:r>
+        <w:rPr>
+          <w:rFonts w:ascii="Monospace" w:hAnsi="Monospace"/>
+          <w:i/>
+          <w:color w:val="00AA00"/>
+          <w:sz w:val="20"/>
+        </w:rPr>
+        <w:t>"state"</w:t>
+      </w:r>
+      <w:r>
+        <w:rPr>
+          <w:rFonts w:ascii="Monospace" w:hAnsi="Monospace"/>
+          <w:color w:val="000000"/>
+          <w:sz w:val="20"/>
+        </w:rPr>
+        <w:t>] = SPOTIFY_CONNECT_PAUSED_EVENT</w:t>
+      </w:r>
+    </w:p>
+    <w:p>
+      <w:pPr>
+        <w:pStyle w:val="Normal"/>
+        <w:ind w:hanging="0"/>
+        <w:jc w:val="start"/>
+        <w:rPr>
+          <w:rFonts w:ascii="Monospace" w:hAnsi="Monospace"/>
+          <w:sz w:val="20"/>
+        </w:rPr>
+      </w:pPr>
+      <w:r>
+        <w:rPr>
+          <w:rFonts w:ascii="Monospace" w:hAnsi="Monospace"/>
+          <w:color w:val="000000"/>
+          <w:sz w:val="20"/>
+        </w:rPr>
+        <w:t>message[</w:t>
+      </w:r>
+      <w:r>
+        <w:rPr>
+          <w:rFonts w:ascii="Monospace" w:hAnsi="Monospace"/>
+          <w:i/>
+          <w:color w:val="00AA00"/>
+          <w:sz w:val="20"/>
+        </w:rPr>
+        <w:t>"state"</w:t>
+      </w:r>
+      <w:r>
+        <w:rPr>
+          <w:rFonts w:ascii="Monospace" w:hAnsi="Monospace"/>
+          <w:color w:val="000000"/>
+          <w:sz w:val="20"/>
+        </w:rPr>
+        <w:t>] = SPOTIFY_CONNECT_STOPPED_EVENT</w:t>
+      </w:r>
+    </w:p>
+    <w:p>
+      <w:pPr>
+        <w:pStyle w:val="Normal"/>
+        <w:ind w:hanging="0"/>
+        <w:jc w:val="start"/>
+        <w:rPr>
+          <w:rFonts w:ascii="Monospace" w:hAnsi="Monospace"/>
+          <w:sz w:val="20"/>
+        </w:rPr>
+      </w:pPr>
+      <w:r>
+        <w:rPr>
+          <w:rFonts w:ascii="Monospace" w:hAnsi="Monospace"/>
+          <w:color w:val="000000"/>
+          <w:sz w:val="20"/>
+        </w:rPr>
+        <w:t>message[</w:t>
+      </w:r>
+      <w:r>
+        <w:rPr>
+          <w:rFonts w:ascii="Monospace" w:hAnsi="Monospace"/>
+          <w:i/>
+          <w:color w:val="00AA00"/>
+          <w:sz w:val="20"/>
+        </w:rPr>
+        <w:t>"state"</w:t>
+      </w:r>
+      <w:r>
+        <w:rPr>
+          <w:rFonts w:ascii="Monospace" w:hAnsi="Monospace"/>
+          <w:color w:val="000000"/>
+          <w:sz w:val="20"/>
+        </w:rPr>
+        <w:t>] = SPOTIFY_CONNECT_CONNECTED_EVENT</w:t>
+      </w:r>
+    </w:p>
+    <w:p>
+      <w:pPr>
+        <w:pStyle w:val="Normal"/>
+        <w:ind w:hanging="0"/>
+        <w:jc w:val="start"/>
+        <w:rPr>
+          <w:rFonts w:ascii="Monospace" w:hAnsi="Monospace"/>
+          <w:sz w:val="20"/>
+        </w:rPr>
+      </w:pPr>
+      <w:r>
+        <w:rPr>
+          <w:rFonts w:ascii="Monospace" w:hAnsi="Monospace"/>
+          <w:color w:val="000000"/>
+          <w:sz w:val="20"/>
+        </w:rPr>
+        <w:t>message[</w:t>
+      </w:r>
+      <w:r>
+        <w:rPr>
+          <w:rFonts w:ascii="Monospace" w:hAnsi="Monospace"/>
+          <w:i/>
+          <w:color w:val="00AA00"/>
+          <w:sz w:val="20"/>
+        </w:rPr>
+        <w:t>"state"</w:t>
+      </w:r>
+      <w:r>
+        <w:rPr>
+          <w:rFonts w:ascii="Monospace" w:hAnsi="Monospace"/>
+          <w:color w:val="000000"/>
+          <w:sz w:val="20"/>
+        </w:rPr>
+        <w:t>] = SPOTIFY_CONNECT_DISCONNECTED_EVENT</w:t>
+      </w:r>
+    </w:p>
+    <w:p>
+      <w:pPr>
+        <w:pStyle w:val="Normal"/>
+        <w:spacing w:lineRule="auto" w:line="240" w:before="0" w:after="26"/>
+        <w:rPr/>
+      </w:pPr>
+      <w:r>
+        <w:rPr>
+          <w:rFonts w:ascii="Monospace" w:hAnsi="Monospace"/>
+          <w:b w:val="false"/>
+          <w:bCs w:val="false"/>
+          <w:color w:val="000000"/>
+          <w:sz w:val="20"/>
+          <w:szCs w:val="24"/>
+          <w:u w:val="none"/>
+        </w:rPr>
+        <w:t>message[</w:t>
+      </w:r>
+      <w:r>
+        <w:rPr>
+          <w:rFonts w:ascii="Monospace" w:hAnsi="Monospace"/>
+          <w:b w:val="false"/>
+          <w:bCs w:val="false"/>
+          <w:i/>
+          <w:color w:val="00AA00"/>
+          <w:sz w:val="20"/>
+          <w:szCs w:val="24"/>
+          <w:u w:val="none"/>
+        </w:rPr>
+        <w:t>"state"</w:t>
+      </w:r>
+      <w:r>
+        <w:rPr>
+          <w:rFonts w:ascii="Monospace" w:hAnsi="Monospace"/>
+          <w:b w:val="false"/>
+          <w:bCs w:val="false"/>
+          <w:color w:val="000000"/>
+          <w:sz w:val="20"/>
+          <w:szCs w:val="24"/>
+          <w:u w:val="none"/>
+        </w:rPr>
+        <w:t>] = SPOTIFY_CONNECT_CLIENT_CHANGED_EVENT</w:t>
+      </w:r>
+    </w:p>
+    <w:p>
+      <w:pPr>
+        <w:pStyle w:val="Normal"/>
+        <w:spacing w:lineRule="auto" w:line="240" w:before="0" w:after="26"/>
+        <w:rPr>
+          <w:rFonts w:ascii="Monospace" w:hAnsi="Monospace"/>
+          <w:b w:val="false"/>
+          <w:bCs w:val="false"/>
+          <w:color w:val="000000"/>
+          <w:sz w:val="20"/>
+          <w:szCs w:val="24"/>
+          <w:u w:val="none"/>
+        </w:rPr>
+      </w:pPr>
+      <w:r>
+        <w:rPr/>
+      </w:r>
+    </w:p>
+    <w:p>
+      <w:pPr>
+        <w:pStyle w:val="Normal"/>
+        <w:spacing w:lineRule="auto" w:line="240" w:before="0" w:after="26"/>
+        <w:rPr/>
+      </w:pPr>
+      <w:r>
+        <w:rPr>
+          <w:rFonts w:ascii="Monospace" w:hAnsi="Monospace"/>
+          <w:b w:val="false"/>
+          <w:bCs w:val="false"/>
+          <w:color w:val="000000"/>
+          <w:sz w:val="20"/>
+          <w:szCs w:val="24"/>
+          <w:u w:val="none"/>
+        </w:rPr>
+        <w:t>For all message[</w:t>
+      </w:r>
+      <w:r>
+        <w:rPr>
+          <w:rFonts w:ascii="Monospace" w:hAnsi="Monospace"/>
+          <w:b w:val="false"/>
+          <w:bCs w:val="false"/>
+          <w:i/>
+          <w:color w:val="00AA00"/>
+          <w:sz w:val="20"/>
+          <w:szCs w:val="24"/>
+          <w:u w:val="none"/>
+        </w:rPr>
+        <w:t>"state"</w:t>
+      </w:r>
+      <w:r>
+        <w:rPr>
+          <w:rFonts w:ascii="Monospace" w:hAnsi="Monospace"/>
+          <w:b w:val="false"/>
+          <w:bCs w:val="false"/>
+          <w:color w:val="000000"/>
+          <w:sz w:val="20"/>
+          <w:szCs w:val="24"/>
+          <w:u w:val="none"/>
+        </w:rPr>
+        <w:t xml:space="preserve">] the </w:t>
+      </w:r>
+      <w:r>
+        <w:rPr>
+          <w:rFonts w:ascii="Monospace" w:hAnsi="Monospace"/>
+          <w:b w:val="false"/>
+          <w:bCs w:val="false"/>
+          <w:color w:val="000000"/>
+          <w:sz w:val="20"/>
+          <w:szCs w:val="24"/>
+          <w:u w:val="none"/>
+          <w:shd w:fill="E8F2FE" w:val="clear"/>
+        </w:rPr>
+        <w:t>message[</w:t>
+      </w:r>
+      <w:r>
+        <w:rPr>
+          <w:rFonts w:ascii="Monospace" w:hAnsi="Monospace"/>
+          <w:i/>
+          <w:color w:val="00AA00"/>
+          <w:sz w:val="20"/>
+          <w:shd w:fill="E8F2FE" w:val="clear"/>
+        </w:rPr>
+        <w:t>"error"</w:t>
+      </w:r>
+      <w:r>
+        <w:rPr>
+          <w:rFonts w:ascii="Monospace" w:hAnsi="Monospace"/>
+          <w:color w:val="000000"/>
+          <w:sz w:val="20"/>
+          <w:shd w:fill="E8F2FE" w:val="clear"/>
+        </w:rPr>
+        <w:t xml:space="preserve">] = </w:t>
+      </w:r>
+      <w:r>
+        <w:rPr>
+          <w:rFonts w:ascii="Monospace" w:hAnsi="Monospace"/>
+          <w:i/>
+          <w:color w:val="00AA00"/>
+          <w:sz w:val="20"/>
+          <w:shd w:fill="E8F2FE" w:val="clear"/>
+        </w:rPr>
+        <w:t>"None"</w:t>
+      </w:r>
+    </w:p>
+    <w:p>
+      <w:pPr>
+        <w:pStyle w:val="Normal"/>
+        <w:spacing w:lineRule="auto" w:line="240" w:before="0" w:after="26"/>
+        <w:rPr>
           <w:rFonts w:ascii="Monospace" w:hAnsi="Monospace"/>
           <w:i/>
           <w:i/>
           <w:color w:val="00AA00"/>
           <w:sz w:val="20"/>
-        </w:rPr>
-      </w:pPr>
-      <w:r>
-        <w:rPr>
-          <w:rFonts w:ascii="Monospace" w:hAnsi="Monospace"/>
-          <w:b w:val="false"/>
-          <w:bCs w:val="false"/>
+          <w:shd w:fill="E8F2FE" w:val="clear"/>
+        </w:rPr>
+      </w:pPr>
+      <w:r>
+        <w:rPr/>
+      </w:r>
+    </w:p>
+    <w:p>
+      <w:pPr>
+        <w:pStyle w:val="Heading2"/>
+        <w:rPr/>
+      </w:pPr>
+      <w:r>
+        <w:rPr/>
+        <w:t>SpotifyConnect class methods:</w:t>
+      </w:r>
+    </w:p>
+    <w:p>
+      <w:pPr>
+        <w:pStyle w:val="Normal"/>
+        <w:rPr>
+          <w:rFonts w:ascii="FreeMono" w:hAnsi="FreeMono"/>
+        </w:rPr>
+      </w:pPr>
+      <w:r>
+        <w:rPr>
+          <w:rFonts w:ascii="FreeMono" w:hAnsi="FreeMono"/>
+          <w:color w:val="0000FF"/>
+          <w:sz w:val="20"/>
+          <w:shd w:fill="E8F2FE" w:val="clear"/>
+        </w:rPr>
+        <w:t>class</w:t>
+      </w:r>
+      <w:r>
+        <w:rPr>
+          <w:rFonts w:ascii="FreeMono" w:hAnsi="FreeMono"/>
           <w:color w:val="000000"/>
           <w:sz w:val="20"/>
-          <w:szCs w:val="24"/>
-          <w:u w:val="none"/>
-        </w:rPr>
-        <w:t xml:space="preserve">MPV_PLAYERCTL_PAUSED_STATE  = </w:t>
-      </w:r>
-      <w:r>
-        <w:rPr>
-          <w:rFonts w:ascii="Monospace" w:hAnsi="Monospace"/>
-          <w:b w:val="false"/>
-          <w:bCs w:val="false"/>
+          <w:shd w:fill="E8F2FE" w:val="clear"/>
+        </w:rPr>
+        <w:t xml:space="preserve"> </w:t>
+      </w:r>
+      <w:r>
+        <w:rPr>
+          <w:rFonts w:ascii="FreeMono" w:hAnsi="FreeMono"/>
+          <w:b/>
+          <w:color w:val="000000"/>
+          <w:sz w:val="20"/>
+          <w:shd w:fill="E8F2FE" w:val="clear"/>
+        </w:rPr>
+        <w:t>SpotifyConnect</w:t>
+      </w:r>
+      <w:r>
+        <w:rPr>
+          <w:rFonts w:ascii="FreeMono" w:hAnsi="FreeMono"/>
+          <w:color w:val="000000"/>
+          <w:sz w:val="20"/>
+          <w:shd w:fill="E8F2FE" w:val="clear"/>
+        </w:rPr>
+        <w:t>():</w:t>
+      </w:r>
+    </w:p>
+    <w:p>
+      <w:pPr>
+        <w:pStyle w:val="Normal"/>
+        <w:rPr>
+          <w:rFonts w:ascii="FreeMono" w:hAnsi="FreeMono"/>
+        </w:rPr>
+      </w:pPr>
+      <w:r>
+        <w:rPr>
+          <w:rFonts w:ascii="FreeMono" w:hAnsi="FreeMono"/>
+          <w:color w:val="000000"/>
+          <w:sz w:val="20"/>
+          <w:shd w:fill="E8F2FE" w:val="clear"/>
+        </w:rPr>
+        <w:t xml:space="preserve">    </w:t>
+      </w:r>
+      <w:r>
+        <w:rPr>
+          <w:rFonts w:ascii="FreeMono" w:hAnsi="FreeMono"/>
+          <w:color w:val="0000FF"/>
+          <w:sz w:val="20"/>
+          <w:shd w:fill="E8F2FE" w:val="clear"/>
+        </w:rPr>
+        <w:t>def</w:t>
+      </w:r>
+      <w:r>
+        <w:rPr>
+          <w:rFonts w:ascii="FreeMono" w:hAnsi="FreeMono"/>
+          <w:color w:val="000000"/>
+          <w:sz w:val="20"/>
+          <w:shd w:fill="E8F2FE" w:val="clear"/>
+        </w:rPr>
+        <w:t xml:space="preserve"> </w:t>
+      </w:r>
+      <w:r>
+        <w:rPr>
+          <w:rFonts w:ascii="FreeMono" w:hAnsi="FreeMono"/>
+          <w:b/>
+          <w:color w:val="000000"/>
+          <w:sz w:val="20"/>
+          <w:shd w:fill="E8F2FE" w:val="clear"/>
+        </w:rPr>
+        <w:t>__init__</w:t>
+      </w:r>
+      <w:r>
+        <w:rPr>
+          <w:rFonts w:ascii="FreeMono" w:hAnsi="FreeMono"/>
+          <w:color w:val="000000"/>
+          <w:sz w:val="20"/>
+          <w:shd w:fill="E8F2FE" w:val="clear"/>
+        </w:rPr>
+        <w:t>(</w:t>
+      </w:r>
+      <w:r>
+        <w:rPr>
+          <w:rFonts w:ascii="FreeMono" w:hAnsi="FreeMono"/>
           <w:i/>
-          <w:color w:val="00AA00"/>
-          <w:sz w:val="20"/>
-          <w:szCs w:val="24"/>
-          <w:u w:val="none"/>
-        </w:rPr>
-        <w:t>"paused"</w:t>
-      </w:r>
-    </w:p>
-    <w:p>
-      <w:pPr>
-        <w:pStyle w:val="Heading2"/>
-        <w:rPr/>
-      </w:pPr>
-      <w:r>
-        <w:rPr/>
-        <w:t>Message-queue events</w:t>
-      </w:r>
-    </w:p>
-    <w:p>
-      <w:pPr>
-        <w:pStyle w:val="BodyText"/>
-        <w:spacing w:lineRule="auto" w:line="240" w:before="0" w:after="26"/>
-        <w:rPr>
-          <w:rFonts w:ascii="Liberation Serif" w:hAnsi="Liberation Serif"/>
-          <w:b w:val="false"/>
-          <w:bCs w:val="false"/>
-          <w:sz w:val="24"/>
-          <w:szCs w:val="24"/>
-          <w:u w:val="none"/>
-        </w:rPr>
-      </w:pPr>
-      <w:r>
-        <w:rPr>
-          <w:b w:val="false"/>
-          <w:bCs w:val="false"/>
-          <w:sz w:val="24"/>
-          <w:szCs w:val="24"/>
-          <w:u w:val="none"/>
-        </w:rPr>
-        <w:t>Uses the Message schema as defined in schemas.json</w:t>
+          <w:color w:val="000000"/>
+          <w:sz w:val="20"/>
+          <w:shd w:fill="E8F2FE" w:val="clear"/>
+        </w:rPr>
+        <w:t>self</w:t>
+      </w:r>
+      <w:r>
+        <w:rPr>
+          <w:rFonts w:ascii="FreeMono" w:hAnsi="FreeMono"/>
+          <w:color w:val="000000"/>
+          <w:sz w:val="20"/>
+          <w:shd w:fill="E8F2FE" w:val="clear"/>
+        </w:rPr>
+        <w:t>, msg_queue):</w:t>
+      </w:r>
+    </w:p>
+    <w:p>
+      <w:pPr>
+        <w:pStyle w:val="Normal"/>
+        <w:rPr>
+          <w:color w:val="000000"/>
+          <w:sz w:val="20"/>
+          <w:shd w:fill="E8F2FE" w:val="clear"/>
+        </w:rPr>
+      </w:pPr>
+      <w:r>
+        <w:rPr>
+          <w:rFonts w:ascii="FreeMono" w:hAnsi="FreeMono"/>
+        </w:rPr>
+      </w:r>
+    </w:p>
+    <w:p>
+      <w:pPr>
+        <w:pStyle w:val="Normal"/>
+        <w:rPr>
+          <w:rFonts w:ascii="FreeMono" w:hAnsi="FreeMono"/>
+        </w:rPr>
+      </w:pPr>
+      <w:r>
+        <w:rPr>
+          <w:rFonts w:ascii="FreeMono" w:hAnsi="FreeMono"/>
+          <w:color w:val="000000"/>
+          <w:sz w:val="20"/>
+          <w:shd w:fill="E8F2FE" w:val="clear"/>
+        </w:rPr>
+        <w:t xml:space="preserve">    </w:t>
+      </w:r>
+      <w:r>
+        <w:rPr>
+          <w:rFonts w:ascii="FreeMono" w:hAnsi="FreeMono"/>
+          <w:color w:val="0000FF"/>
+          <w:sz w:val="20"/>
+          <w:shd w:fill="E8F2FE" w:val="clear"/>
+        </w:rPr>
+        <w:t>def</w:t>
+      </w:r>
+      <w:r>
+        <w:rPr>
+          <w:rFonts w:ascii="FreeMono" w:hAnsi="FreeMono"/>
+          <w:color w:val="000000"/>
+          <w:sz w:val="20"/>
+          <w:shd w:fill="E8F2FE" w:val="clear"/>
+        </w:rPr>
+        <w:t xml:space="preserve"> </w:t>
+      </w:r>
+      <w:r>
+        <w:rPr>
+          <w:rFonts w:ascii="FreeMono" w:hAnsi="FreeMono"/>
+          <w:b/>
+          <w:color w:val="000000"/>
+          <w:sz w:val="20"/>
+          <w:shd w:fill="E8F2FE" w:val="clear"/>
+        </w:rPr>
+        <w:t>get_state</w:t>
+      </w:r>
+      <w:r>
+        <w:rPr>
+          <w:rFonts w:ascii="FreeMono" w:hAnsi="FreeMono"/>
+          <w:color w:val="000000"/>
+          <w:sz w:val="20"/>
+          <w:shd w:fill="E8F2FE" w:val="clear"/>
+        </w:rPr>
+        <w:t>(</w:t>
+      </w:r>
+      <w:r>
+        <w:rPr>
+          <w:rFonts w:ascii="FreeMono" w:hAnsi="FreeMono"/>
+          <w:i/>
+          <w:color w:val="000000"/>
+          <w:sz w:val="20"/>
+          <w:shd w:fill="E8F2FE" w:val="clear"/>
+        </w:rPr>
+        <w:t>self</w:t>
+      </w:r>
+      <w:r>
+        <w:rPr>
+          <w:rFonts w:ascii="FreeMono" w:hAnsi="FreeMono"/>
+          <w:color w:val="000000"/>
+          <w:sz w:val="20"/>
+          <w:shd w:fill="E8F2FE" w:val="clear"/>
+        </w:rPr>
+        <w:t>):</w:t>
       </w:r>
     </w:p>
     <w:p>
@@ -5625,11 +6902,22 @@
       </w:pPr>
       <w:r>
         <w:rPr>
-          <w:rFonts w:ascii="Monospace" w:hAnsi="Monospace"/>
+          <w:rFonts w:ascii="FreeMono" w:hAnsi="FreeMono"/>
+          <w:i/>
           <w:color w:val="000000"/>
           <w:sz w:val="20"/>
-        </w:rPr>
-        <w:t>{</w:t>
+          <w:shd w:fill="E8F2FE" w:val="clear"/>
+        </w:rPr>
+        <w:t xml:space="preserve">        </w:t>
+      </w:r>
+      <w:r>
+        <w:rPr>
+          <w:rFonts w:ascii="FreeMono" w:hAnsi="FreeMono"/>
+          <w:i/>
+          <w:color w:val="00AA00"/>
+          <w:sz w:val="20"/>
+        </w:rPr>
+        <w:t>'''</w:t>
       </w:r>
     </w:p>
     <w:p>
@@ -5644,1327 +6932,35 @@
       </w:pPr>
       <w:r>
         <w:rPr>
-          <w:rFonts w:ascii="Monospace" w:hAnsi="Monospace"/>
-          <w:color w:val="000000"/>
-          <w:sz w:val="20"/>
-        </w:rPr>
-        <w:t xml:space="preserve">  </w:t>
-      </w:r>
-      <w:r>
-        <w:rPr>
-          <w:rFonts w:ascii="Monospace" w:hAnsi="Monospace"/>
-          <w:color w:val="859900"/>
-          <w:sz w:val="20"/>
-        </w:rPr>
-        <w:t>"$schema"</w:t>
-      </w:r>
-      <w:r>
-        <w:rPr>
-          <w:rFonts w:ascii="Monospace" w:hAnsi="Monospace"/>
-          <w:color w:val="000000"/>
-          <w:sz w:val="20"/>
-        </w:rPr>
-        <w:t xml:space="preserve">: </w:t>
-      </w:r>
-      <w:r>
-        <w:rPr>
-          <w:rFonts w:ascii="Monospace" w:hAnsi="Monospace"/>
-          <w:color w:val="2AA198"/>
-          <w:sz w:val="20"/>
-        </w:rPr>
-        <w:t>"http://json-schema.org/draft-07/schema#"</w:t>
-      </w:r>
-      <w:r>
-        <w:rPr>
-          <w:rFonts w:ascii="Monospace" w:hAnsi="Monospace"/>
-          <w:color w:val="000000"/>
-          <w:sz w:val="20"/>
-        </w:rPr>
-        <w:t>,</w:t>
-      </w:r>
-    </w:p>
-    <w:p>
-      <w:pPr>
-        <w:pStyle w:val="Normal"/>
-        <w:ind w:hanging="0"/>
-        <w:jc w:val="start"/>
-        <w:rPr>
-          <w:rFonts w:ascii="Monospace" w:hAnsi="Monospace"/>
-          <w:sz w:val="20"/>
-        </w:rPr>
-      </w:pPr>
-      <w:r>
-        <w:rPr>
-          <w:rFonts w:ascii="Monospace" w:hAnsi="Monospace"/>
-          <w:color w:val="000000"/>
-          <w:sz w:val="20"/>
-        </w:rPr>
-        <w:t xml:space="preserve">  </w:t>
-      </w:r>
-      <w:r>
-        <w:rPr>
-          <w:rFonts w:ascii="Monospace" w:hAnsi="Monospace"/>
-          <w:color w:val="859900"/>
-          <w:sz w:val="20"/>
-        </w:rPr>
-        <w:t>"Messages"</w:t>
-      </w:r>
-      <w:r>
-        <w:rPr>
-          <w:rFonts w:ascii="Monospace" w:hAnsi="Monospace"/>
-          <w:color w:val="000000"/>
-          <w:sz w:val="20"/>
-        </w:rPr>
-        <w:t>: {</w:t>
-      </w:r>
-    </w:p>
-    <w:p>
-      <w:pPr>
-        <w:pStyle w:val="Normal"/>
-        <w:ind w:hanging="0"/>
-        <w:jc w:val="start"/>
-        <w:rPr>
-          <w:rFonts w:ascii="Monospace" w:hAnsi="Monospace"/>
-          <w:sz w:val="20"/>
-        </w:rPr>
-      </w:pPr>
-      <w:r>
-        <w:rPr>
-          <w:rFonts w:ascii="Monospace" w:hAnsi="Monospace"/>
-          <w:color w:val="000000"/>
-          <w:sz w:val="20"/>
-        </w:rPr>
-        <w:t xml:space="preserve">    </w:t>
-      </w:r>
-      <w:r>
-        <w:rPr>
-          <w:rFonts w:ascii="Monospace" w:hAnsi="Monospace"/>
-          <w:color w:val="859900"/>
-          <w:sz w:val="20"/>
-        </w:rPr>
-        <w:t>"type"</w:t>
-      </w:r>
-      <w:r>
-        <w:rPr>
-          <w:rFonts w:ascii="Monospace" w:hAnsi="Monospace"/>
-          <w:color w:val="000000"/>
-          <w:sz w:val="20"/>
-        </w:rPr>
-        <w:t xml:space="preserve">: </w:t>
-      </w:r>
-      <w:r>
-        <w:rPr>
-          <w:rFonts w:ascii="Monospace" w:hAnsi="Monospace"/>
-          <w:color w:val="2AA198"/>
-          <w:sz w:val="20"/>
-        </w:rPr>
-        <w:t>"object"</w:t>
-      </w:r>
-      <w:r>
-        <w:rPr>
-          <w:rFonts w:ascii="Monospace" w:hAnsi="Monospace"/>
-          <w:color w:val="000000"/>
-          <w:sz w:val="20"/>
-        </w:rPr>
-        <w:t>,</w:t>
-      </w:r>
-    </w:p>
-    <w:p>
-      <w:pPr>
-        <w:pStyle w:val="Normal"/>
-        <w:ind w:hanging="0"/>
-        <w:jc w:val="start"/>
-        <w:rPr>
-          <w:rFonts w:ascii="Monospace" w:hAnsi="Monospace"/>
-          <w:sz w:val="20"/>
-        </w:rPr>
-      </w:pPr>
-      <w:r>
-        <w:rPr>
-          <w:rFonts w:ascii="Monospace" w:hAnsi="Monospace"/>
-          <w:color w:val="000000"/>
-          <w:sz w:val="20"/>
-        </w:rPr>
-        <w:t xml:space="preserve">    </w:t>
-      </w:r>
-      <w:r>
-        <w:rPr>
-          <w:rFonts w:ascii="Monospace" w:hAnsi="Monospace"/>
-          <w:color w:val="859900"/>
-          <w:sz w:val="20"/>
-        </w:rPr>
-        <w:t>"properties"</w:t>
-      </w:r>
-      <w:r>
-        <w:rPr>
-          <w:rFonts w:ascii="Monospace" w:hAnsi="Monospace"/>
-          <w:color w:val="000000"/>
-          <w:sz w:val="20"/>
-        </w:rPr>
-        <w:t>: {</w:t>
-      </w:r>
-    </w:p>
-    <w:p>
-      <w:pPr>
-        <w:pStyle w:val="Normal"/>
-        <w:ind w:hanging="0"/>
-        <w:jc w:val="start"/>
-        <w:rPr>
-          <w:rFonts w:ascii="Monospace" w:hAnsi="Monospace"/>
-          <w:sz w:val="20"/>
-        </w:rPr>
-      </w:pPr>
-      <w:r>
-        <w:rPr>
-          <w:rFonts w:ascii="Monospace" w:hAnsi="Monospace"/>
-          <w:color w:val="000000"/>
-          <w:sz w:val="20"/>
-        </w:rPr>
-        <w:t xml:space="preserve">      </w:t>
-      </w:r>
-      <w:r>
-        <w:rPr>
-          <w:rFonts w:ascii="Monospace" w:hAnsi="Monospace"/>
-          <w:color w:val="859900"/>
-          <w:sz w:val="20"/>
-        </w:rPr>
-        <w:t>"type"</w:t>
-      </w:r>
-      <w:r>
-        <w:rPr>
-          <w:rFonts w:ascii="Monospace" w:hAnsi="Monospace"/>
-          <w:color w:val="000000"/>
-          <w:sz w:val="20"/>
-        </w:rPr>
-        <w:t>:</w:t>
-        <w:tab/>
-        <w:t xml:space="preserve">{ </w:t>
-      </w:r>
-      <w:r>
-        <w:rPr>
-          <w:rFonts w:ascii="Monospace" w:hAnsi="Monospace"/>
-          <w:color w:val="859900"/>
-          <w:sz w:val="20"/>
-        </w:rPr>
-        <w:t>"type"</w:t>
-      </w:r>
-      <w:r>
-        <w:rPr>
-          <w:rFonts w:ascii="Monospace" w:hAnsi="Monospace"/>
-          <w:color w:val="000000"/>
-          <w:sz w:val="20"/>
-        </w:rPr>
-        <w:t xml:space="preserve">: </w:t>
-      </w:r>
-      <w:r>
-        <w:rPr>
-          <w:rFonts w:ascii="Monospace" w:hAnsi="Monospace"/>
-          <w:color w:val="2AA198"/>
-          <w:sz w:val="20"/>
-        </w:rPr>
-        <w:t>"string"</w:t>
-      </w:r>
-      <w:r>
-        <w:rPr>
-          <w:rFonts w:ascii="Monospace" w:hAnsi="Monospace"/>
-          <w:color w:val="000000"/>
-          <w:sz w:val="20"/>
-        </w:rPr>
-        <w:t xml:space="preserve"> },</w:t>
-      </w:r>
-    </w:p>
-    <w:p>
-      <w:pPr>
-        <w:pStyle w:val="Normal"/>
-        <w:ind w:hanging="0"/>
-        <w:jc w:val="start"/>
-        <w:rPr>
-          <w:rFonts w:ascii="Monospace" w:hAnsi="Monospace"/>
-          <w:sz w:val="20"/>
-        </w:rPr>
-      </w:pPr>
-      <w:r>
-        <w:rPr>
-          <w:rFonts w:ascii="Monospace" w:hAnsi="Monospace"/>
-          <w:color w:val="000000"/>
-          <w:sz w:val="20"/>
-        </w:rPr>
-        <w:t xml:space="preserve">      </w:t>
-      </w:r>
-      <w:r>
-        <w:rPr>
-          <w:rFonts w:ascii="Monospace" w:hAnsi="Monospace"/>
-          <w:color w:val="859900"/>
-          <w:sz w:val="20"/>
-        </w:rPr>
-        <w:t>"state"</w:t>
-      </w:r>
-      <w:r>
-        <w:rPr>
-          <w:rFonts w:ascii="Monospace" w:hAnsi="Monospace"/>
-          <w:color w:val="000000"/>
-          <w:sz w:val="20"/>
-        </w:rPr>
-        <w:t>:</w:t>
-        <w:tab/>
-        <w:t xml:space="preserve">{ </w:t>
-      </w:r>
-      <w:r>
-        <w:rPr>
-          <w:rFonts w:ascii="Monospace" w:hAnsi="Monospace"/>
-          <w:color w:val="859900"/>
-          <w:sz w:val="20"/>
-        </w:rPr>
-        <w:t>"type"</w:t>
-      </w:r>
-      <w:r>
-        <w:rPr>
-          <w:rFonts w:ascii="Monospace" w:hAnsi="Monospace"/>
-          <w:color w:val="000000"/>
-          <w:sz w:val="20"/>
-        </w:rPr>
-        <w:t xml:space="preserve">: </w:t>
-      </w:r>
-      <w:r>
-        <w:rPr>
-          <w:rFonts w:ascii="Monospace" w:hAnsi="Monospace"/>
-          <w:color w:val="2AA198"/>
-          <w:sz w:val="20"/>
-        </w:rPr>
-        <w:t>"string"</w:t>
-      </w:r>
-      <w:r>
-        <w:rPr>
-          <w:rFonts w:ascii="Monospace" w:hAnsi="Monospace"/>
-          <w:color w:val="000000"/>
-          <w:sz w:val="20"/>
-        </w:rPr>
-        <w:t xml:space="preserve"> },</w:t>
-      </w:r>
-    </w:p>
-    <w:p>
-      <w:pPr>
-        <w:pStyle w:val="Normal"/>
-        <w:ind w:hanging="0"/>
-        <w:jc w:val="start"/>
-        <w:rPr>
-          <w:rFonts w:ascii="Monospace" w:hAnsi="Monospace"/>
-          <w:sz w:val="20"/>
-        </w:rPr>
-      </w:pPr>
-      <w:r>
-        <w:rPr>
-          <w:rFonts w:ascii="Monospace" w:hAnsi="Monospace"/>
-          <w:color w:val="000000"/>
-          <w:sz w:val="20"/>
-        </w:rPr>
-        <w:t xml:space="preserve">      </w:t>
-      </w:r>
-      <w:r>
-        <w:rPr>
-          <w:rFonts w:ascii="Monospace" w:hAnsi="Monospace"/>
-          <w:color w:val="859900"/>
-          <w:sz w:val="20"/>
-        </w:rPr>
-        <w:t>"error"</w:t>
-      </w:r>
-      <w:r>
-        <w:rPr>
-          <w:rFonts w:ascii="Monospace" w:hAnsi="Monospace"/>
-          <w:color w:val="000000"/>
-          <w:sz w:val="20"/>
-        </w:rPr>
-        <w:t>:</w:t>
-        <w:tab/>
-        <w:t xml:space="preserve">{ </w:t>
-      </w:r>
-      <w:r>
-        <w:rPr>
-          <w:rFonts w:ascii="Monospace" w:hAnsi="Monospace"/>
-          <w:color w:val="859900"/>
-          <w:sz w:val="20"/>
-        </w:rPr>
-        <w:t>"type"</w:t>
-      </w:r>
-      <w:r>
-        <w:rPr>
-          <w:rFonts w:ascii="Monospace" w:hAnsi="Monospace"/>
-          <w:color w:val="000000"/>
-          <w:sz w:val="20"/>
-        </w:rPr>
-        <w:t xml:space="preserve">: </w:t>
-      </w:r>
-      <w:r>
-        <w:rPr>
-          <w:rFonts w:ascii="Monospace" w:hAnsi="Monospace"/>
-          <w:color w:val="2AA198"/>
-          <w:sz w:val="20"/>
-        </w:rPr>
-        <w:t>"string"</w:t>
-      </w:r>
-      <w:r>
-        <w:rPr>
-          <w:rFonts w:ascii="Monospace" w:hAnsi="Monospace"/>
-          <w:color w:val="000000"/>
-          <w:sz w:val="20"/>
-        </w:rPr>
-        <w:t xml:space="preserve"> },</w:t>
-      </w:r>
-    </w:p>
-    <w:p>
-      <w:pPr>
-        <w:pStyle w:val="Normal"/>
-        <w:ind w:hanging="0"/>
-        <w:jc w:val="start"/>
-        <w:rPr>
-          <w:rFonts w:ascii="Monospace" w:hAnsi="Monospace"/>
-          <w:sz w:val="20"/>
-        </w:rPr>
-      </w:pPr>
-      <w:r>
-        <w:rPr>
-          <w:rFonts w:ascii="Monospace" w:hAnsi="Monospace"/>
-          <w:color w:val="000000"/>
-          <w:sz w:val="20"/>
-        </w:rPr>
-        <w:tab/>
-        <w:t xml:space="preserve">  </w:t>
-      </w:r>
-      <w:r>
-        <w:rPr>
-          <w:rFonts w:ascii="Monospace" w:hAnsi="Monospace"/>
-          <w:color w:val="859900"/>
-          <w:sz w:val="20"/>
-        </w:rPr>
-        <w:t>"data"</w:t>
-      </w:r>
-      <w:r>
-        <w:rPr>
-          <w:rFonts w:ascii="Monospace" w:hAnsi="Monospace"/>
-          <w:color w:val="000000"/>
-          <w:sz w:val="20"/>
-        </w:rPr>
-        <w:t>:</w:t>
-        <w:tab/>
-        <w:t xml:space="preserve">{ </w:t>
-      </w:r>
-      <w:r>
-        <w:rPr>
-          <w:rFonts w:ascii="Monospace" w:hAnsi="Monospace"/>
-          <w:color w:val="859900"/>
-          <w:sz w:val="20"/>
-        </w:rPr>
-        <w:t>"type"</w:t>
-      </w:r>
-      <w:r>
-        <w:rPr>
-          <w:rFonts w:ascii="Monospace" w:hAnsi="Monospace"/>
-          <w:color w:val="000000"/>
-          <w:sz w:val="20"/>
-        </w:rPr>
-        <w:t xml:space="preserve">: </w:t>
-      </w:r>
-      <w:r>
-        <w:rPr>
-          <w:rFonts w:ascii="Monospace" w:hAnsi="Monospace"/>
-          <w:color w:val="2AA198"/>
-          <w:sz w:val="20"/>
-        </w:rPr>
-        <w:t>"array"</w:t>
-      </w:r>
-      <w:r>
-        <w:rPr>
-          <w:rFonts w:ascii="Monospace" w:hAnsi="Monospace"/>
-          <w:color w:val="000000"/>
-          <w:sz w:val="20"/>
-        </w:rPr>
-        <w:t xml:space="preserve"> }</w:t>
-      </w:r>
-    </w:p>
-    <w:p>
-      <w:pPr>
-        <w:pStyle w:val="Normal"/>
-        <w:ind w:hanging="0"/>
-        <w:jc w:val="start"/>
-        <w:rPr>
-          <w:rFonts w:ascii="Monospace" w:hAnsi="Monospace"/>
-          <w:sz w:val="20"/>
-        </w:rPr>
-      </w:pPr>
-      <w:r>
-        <w:rPr>
-          <w:rFonts w:ascii="Monospace" w:hAnsi="Monospace"/>
-          <w:color w:val="000000"/>
-          <w:sz w:val="20"/>
-        </w:rPr>
-        <w:t xml:space="preserve">    </w:t>
-      </w:r>
-      <w:r>
-        <w:rPr>
-          <w:rFonts w:ascii="Monospace" w:hAnsi="Monospace"/>
-          <w:color w:val="000000"/>
-          <w:sz w:val="20"/>
-        </w:rPr>
-        <w:t>},</w:t>
-      </w:r>
-    </w:p>
-    <w:p>
-      <w:pPr>
-        <w:pStyle w:val="Normal"/>
-        <w:ind w:hanging="0"/>
-        <w:jc w:val="start"/>
-        <w:rPr>
-          <w:rFonts w:ascii="Monospace" w:hAnsi="Monospace"/>
-          <w:sz w:val="20"/>
-        </w:rPr>
-      </w:pPr>
-      <w:r>
-        <w:rPr>
-          <w:rFonts w:ascii="Monospace" w:hAnsi="Monospace"/>
-          <w:color w:val="000000"/>
-          <w:sz w:val="20"/>
-        </w:rPr>
-        <w:t xml:space="preserve">    </w:t>
-      </w:r>
-      <w:r>
-        <w:rPr>
-          <w:rFonts w:ascii="Monospace" w:hAnsi="Monospace"/>
-          <w:color w:val="859900"/>
-          <w:sz w:val="20"/>
-        </w:rPr>
-        <w:t>"required"</w:t>
-      </w:r>
-      <w:r>
-        <w:rPr>
-          <w:rFonts w:ascii="Monospace" w:hAnsi="Monospace"/>
-          <w:color w:val="000000"/>
-          <w:sz w:val="20"/>
-        </w:rPr>
-        <w:t>: [</w:t>
-      </w:r>
-      <w:r>
-        <w:rPr>
-          <w:rFonts w:ascii="Monospace" w:hAnsi="Monospace"/>
-          <w:color w:val="2AA198"/>
-          <w:sz w:val="20"/>
-        </w:rPr>
-        <w:t>"type"</w:t>
-      </w:r>
-      <w:r>
-        <w:rPr>
-          <w:rFonts w:ascii="Monospace" w:hAnsi="Monospace"/>
-          <w:color w:val="000000"/>
-          <w:sz w:val="20"/>
-        </w:rPr>
-        <w:t xml:space="preserve">, </w:t>
-      </w:r>
-      <w:r>
-        <w:rPr>
-          <w:rFonts w:ascii="Monospace" w:hAnsi="Monospace"/>
-          <w:color w:val="2AA198"/>
-          <w:sz w:val="20"/>
-        </w:rPr>
-        <w:t>"state"</w:t>
-      </w:r>
-      <w:r>
-        <w:rPr>
-          <w:rFonts w:ascii="Monospace" w:hAnsi="Monospace"/>
-          <w:color w:val="000000"/>
-          <w:sz w:val="20"/>
-        </w:rPr>
-        <w:t xml:space="preserve">, </w:t>
-      </w:r>
-      <w:r>
-        <w:rPr>
-          <w:rFonts w:ascii="Monospace" w:hAnsi="Monospace"/>
-          <w:color w:val="2AA198"/>
-          <w:sz w:val="20"/>
-        </w:rPr>
-        <w:t>"error"</w:t>
-      </w:r>
-      <w:r>
-        <w:rPr>
-          <w:rFonts w:ascii="Monospace" w:hAnsi="Monospace"/>
-          <w:color w:val="000000"/>
-          <w:sz w:val="20"/>
-        </w:rPr>
-        <w:t>]</w:t>
-      </w:r>
-    </w:p>
-    <w:p>
-      <w:pPr>
-        <w:pStyle w:val="Normal"/>
-        <w:spacing w:lineRule="auto" w:line="240" w:before="0" w:after="26"/>
-        <w:rPr>
-          <w:rFonts w:ascii="Liberation Serif" w:hAnsi="Liberation Serif"/>
-          <w:b w:val="false"/>
-          <w:bCs w:val="false"/>
-          <w:sz w:val="24"/>
-          <w:szCs w:val="24"/>
-          <w:u w:val="none"/>
-        </w:rPr>
-      </w:pPr>
-      <w:r>
-        <w:rPr>
-          <w:rFonts w:ascii="Monospace" w:hAnsi="Monospace"/>
-          <w:b w:val="false"/>
-          <w:bCs w:val="false"/>
-          <w:color w:val="000000"/>
-          <w:sz w:val="20"/>
-          <w:szCs w:val="24"/>
-          <w:u w:val="none"/>
-        </w:rPr>
-        <w:t xml:space="preserve">  </w:t>
-      </w:r>
-      <w:r>
-        <w:rPr>
-          <w:rFonts w:ascii="Monospace" w:hAnsi="Monospace"/>
-          <w:b w:val="false"/>
-          <w:bCs w:val="false"/>
-          <w:color w:val="000000"/>
-          <w:sz w:val="20"/>
-          <w:szCs w:val="24"/>
-          <w:u w:val="none"/>
-        </w:rPr>
-        <w:t>}</w:t>
-      </w:r>
-    </w:p>
-    <w:p>
-      <w:pPr>
-        <w:pStyle w:val="BodyText"/>
-        <w:spacing w:lineRule="auto" w:line="240" w:before="0" w:after="26"/>
-        <w:rPr>
-          <w:rFonts w:ascii="Liberation Serif" w:hAnsi="Liberation Serif"/>
-          <w:b w:val="false"/>
-          <w:bCs w:val="false"/>
-          <w:sz w:val="24"/>
-          <w:szCs w:val="24"/>
-          <w:u w:val="none"/>
-        </w:rPr>
-      </w:pPr>
-      <w:r>
-        <w:rPr>
-          <w:b w:val="false"/>
-          <w:bCs w:val="false"/>
-          <w:sz w:val="24"/>
-          <w:szCs w:val="24"/>
-          <w:u w:val="none"/>
-        </w:rPr>
-      </w:r>
-    </w:p>
-    <w:p>
-      <w:pPr>
-        <w:pStyle w:val="Normal"/>
-        <w:spacing w:lineRule="auto" w:line="240" w:before="0" w:after="26"/>
-        <w:rPr>
-          <w:rFonts w:ascii="Liberation Serif" w:hAnsi="Liberation Serif"/>
-          <w:b w:val="false"/>
-          <w:bCs w:val="false"/>
-          <w:sz w:val="24"/>
-          <w:szCs w:val="24"/>
-          <w:u w:val="none"/>
-        </w:rPr>
-      </w:pPr>
-      <w:r>
-        <w:rPr>
-          <w:rFonts w:ascii="Monospace" w:hAnsi="Monospace"/>
-          <w:b w:val="false"/>
-          <w:bCs w:val="false"/>
-          <w:color w:val="000000"/>
-          <w:sz w:val="20"/>
-          <w:szCs w:val="24"/>
-          <w:u w:val="none"/>
-          <w:shd w:fill="E8F2FE" w:val="clear"/>
-        </w:rPr>
-        <w:t>message[</w:t>
-      </w:r>
-      <w:r>
-        <w:rPr>
-          <w:rFonts w:ascii="Monospace" w:hAnsi="Monospace"/>
-          <w:b w:val="false"/>
-          <w:bCs w:val="false"/>
+          <w:rFonts w:ascii="FreeMono" w:hAnsi="FreeMono"/>
           <w:i/>
           <w:color w:val="00AA00"/>
           <w:sz w:val="20"/>
-          <w:szCs w:val="24"/>
-          <w:u w:val="none"/>
-          <w:shd w:fill="E8F2FE" w:val="clear"/>
-        </w:rPr>
-        <w:t>"</w:t>
-      </w:r>
-      <w:r>
-        <w:rPr>
-          <w:rFonts w:ascii="Monospace" w:hAnsi="Monospace"/>
-          <w:b w:val="false"/>
-          <w:bCs w:val="false"/>
+        </w:rPr>
+        <w:t xml:space="preserve">        </w:t>
+      </w:r>
+      <w:r>
+        <w:rPr>
+          <w:rFonts w:ascii="FreeMono" w:hAnsi="FreeMono"/>
           <w:i/>
           <w:color w:val="00AA00"/>
           <w:sz w:val="20"/>
-          <w:szCs w:val="24"/>
-          <w:u w:val="none"/>
-          <w:shd w:fill="E8F2FE" w:val="clear"/>
-        </w:rPr>
-        <w:t>type"</w:t>
-      </w:r>
-      <w:r>
-        <w:rPr>
-          <w:rFonts w:ascii="Monospace" w:hAnsi="Monospace"/>
-          <w:b w:val="false"/>
-          <w:bCs w:val="false"/>
-          <w:color w:val="000000"/>
-          <w:sz w:val="20"/>
-          <w:szCs w:val="24"/>
-          <w:u w:val="none"/>
-          <w:shd w:fill="E8F2FE" w:val="clear"/>
-        </w:rPr>
-        <w:t>]  = MESSAGE_SPOTIFY_TYPE</w:t>
-      </w:r>
-    </w:p>
-    <w:p>
-      <w:pPr>
-        <w:pStyle w:val="Normal"/>
-        <w:spacing w:lineRule="auto" w:line="240" w:before="0" w:after="26"/>
-        <w:rPr>
-          <w:rFonts w:ascii="Monospace" w:hAnsi="Monospace"/>
-          <w:color w:val="000000"/>
-          <w:sz w:val="20"/>
-          <w:shd w:fill="E8F2FE" w:val="clear"/>
-        </w:rPr>
-      </w:pPr>
-      <w:r>
-        <w:rPr>
-          <w:b w:val="false"/>
-          <w:bCs w:val="false"/>
-          <w:sz w:val="24"/>
-          <w:szCs w:val="24"/>
-          <w:u w:val="none"/>
-        </w:rPr>
-      </w:r>
-    </w:p>
-    <w:p>
-      <w:pPr>
-        <w:pStyle w:val="Normal"/>
-        <w:ind w:hanging="0"/>
-        <w:jc w:val="start"/>
-        <w:rPr>
-          <w:rFonts w:ascii="Monospace" w:hAnsi="Monospace"/>
-          <w:sz w:val="20"/>
-        </w:rPr>
-      </w:pPr>
-      <w:r>
-        <w:rPr>
-          <w:rFonts w:ascii="Monospace" w:hAnsi="Monospace"/>
-          <w:color w:val="000000"/>
-          <w:sz w:val="20"/>
-        </w:rPr>
-        <w:t>message[</w:t>
-      </w:r>
-      <w:r>
-        <w:rPr>
-          <w:rFonts w:ascii="Monospace" w:hAnsi="Monospace"/>
+        </w:rPr>
+        <w:t xml:space="preserve">Return the actual state of the </w:t>
+      </w:r>
+      <w:r>
+        <w:rPr>
+          <w:rFonts w:ascii="FreeMono" w:hAnsi="FreeMono"/>
           <w:i/>
           <w:color w:val="00AA00"/>
           <w:sz w:val="20"/>
-        </w:rPr>
-        <w:t>"state"</w:t>
-      </w:r>
-      <w:r>
-        <w:rPr>
-          <w:rFonts w:ascii="Monospace" w:hAnsi="Monospace"/>
-          <w:color w:val="000000"/>
-          <w:sz w:val="20"/>
-        </w:rPr>
-        <w:t>] = SPOTIFY_CONNECT_PLAYING_EVENT</w:t>
-      </w:r>
-    </w:p>
-    <w:p>
-      <w:pPr>
-        <w:pStyle w:val="Normal"/>
-        <w:ind w:hanging="0"/>
-        <w:jc w:val="start"/>
-        <w:rPr>
-          <w:rFonts w:ascii="Monospace" w:hAnsi="Monospace"/>
-          <w:sz w:val="20"/>
-        </w:rPr>
-      </w:pPr>
-      <w:r>
-        <w:rPr>
-          <w:rFonts w:ascii="Monospace" w:hAnsi="Monospace"/>
-          <w:color w:val="000000"/>
-          <w:sz w:val="20"/>
-        </w:rPr>
-        <w:t>message[</w:t>
-      </w:r>
-      <w:r>
-        <w:rPr>
-          <w:rFonts w:ascii="Monospace" w:hAnsi="Monospace"/>
-          <w:i/>
-          <w:color w:val="00AA00"/>
-          <w:sz w:val="20"/>
-        </w:rPr>
-        <w:t>"state"</w:t>
-      </w:r>
-      <w:r>
-        <w:rPr>
-          <w:rFonts w:ascii="Monospace" w:hAnsi="Monospace"/>
-          <w:color w:val="000000"/>
-          <w:sz w:val="20"/>
-        </w:rPr>
-        <w:t>] = SPOTIFY_CONNECT_PAUSED_EVENT</w:t>
-      </w:r>
-    </w:p>
-    <w:p>
-      <w:pPr>
-        <w:pStyle w:val="Normal"/>
-        <w:ind w:hanging="0"/>
-        <w:jc w:val="start"/>
-        <w:rPr>
-          <w:rFonts w:ascii="Monospace" w:hAnsi="Monospace"/>
-          <w:sz w:val="20"/>
-        </w:rPr>
-      </w:pPr>
-      <w:r>
-        <w:rPr>
-          <w:rFonts w:ascii="Monospace" w:hAnsi="Monospace"/>
-          <w:color w:val="000000"/>
-          <w:sz w:val="20"/>
-        </w:rPr>
-        <w:t>message[</w:t>
-      </w:r>
-      <w:r>
-        <w:rPr>
-          <w:rFonts w:ascii="Monospace" w:hAnsi="Monospace"/>
-          <w:i/>
-          <w:color w:val="00AA00"/>
-          <w:sz w:val="20"/>
-        </w:rPr>
-        <w:t>"state"</w:t>
-      </w:r>
-      <w:r>
-        <w:rPr>
-          <w:rFonts w:ascii="Monospace" w:hAnsi="Monospace"/>
-          <w:color w:val="000000"/>
-          <w:sz w:val="20"/>
-        </w:rPr>
-        <w:t>] = SPOTIFY_CONNECT_STOPPED_EVENT</w:t>
-      </w:r>
-    </w:p>
-    <w:p>
-      <w:pPr>
-        <w:pStyle w:val="Normal"/>
-        <w:ind w:hanging="0"/>
-        <w:jc w:val="start"/>
-        <w:rPr>
-          <w:rFonts w:ascii="Monospace" w:hAnsi="Monospace"/>
-          <w:sz w:val="20"/>
-        </w:rPr>
-      </w:pPr>
-      <w:r>
-        <w:rPr>
-          <w:rFonts w:ascii="Monospace" w:hAnsi="Monospace"/>
-          <w:color w:val="000000"/>
-          <w:sz w:val="20"/>
-        </w:rPr>
-        <w:t>message[</w:t>
-      </w:r>
-      <w:r>
-        <w:rPr>
-          <w:rFonts w:ascii="Monospace" w:hAnsi="Monospace"/>
-          <w:i/>
-          <w:color w:val="00AA00"/>
-          <w:sz w:val="20"/>
-        </w:rPr>
-        <w:t>"state"</w:t>
-      </w:r>
-      <w:r>
-        <w:rPr>
-          <w:rFonts w:ascii="Monospace" w:hAnsi="Monospace"/>
-          <w:color w:val="000000"/>
-          <w:sz w:val="20"/>
-        </w:rPr>
-        <w:t>] = SPOTIFY_CONNECT_CONNECTED_EVENT</w:t>
-      </w:r>
-    </w:p>
-    <w:p>
-      <w:pPr>
-        <w:pStyle w:val="Normal"/>
-        <w:ind w:hanging="0"/>
-        <w:jc w:val="start"/>
-        <w:rPr>
-          <w:rFonts w:ascii="Monospace" w:hAnsi="Monospace"/>
-          <w:sz w:val="20"/>
-        </w:rPr>
-      </w:pPr>
-      <w:r>
-        <w:rPr>
-          <w:rFonts w:ascii="Monospace" w:hAnsi="Monospace"/>
-          <w:color w:val="000000"/>
-          <w:sz w:val="20"/>
-        </w:rPr>
-        <w:t>message[</w:t>
-      </w:r>
-      <w:r>
-        <w:rPr>
-          <w:rFonts w:ascii="Monospace" w:hAnsi="Monospace"/>
-          <w:i/>
-          <w:color w:val="00AA00"/>
-          <w:sz w:val="20"/>
-        </w:rPr>
-        <w:t>"state"</w:t>
-      </w:r>
-      <w:r>
-        <w:rPr>
-          <w:rFonts w:ascii="Monospace" w:hAnsi="Monospace"/>
-          <w:color w:val="000000"/>
-          <w:sz w:val="20"/>
-        </w:rPr>
-        <w:t>] = SPOTIFY_CONNECT_DISCONNECTED_EVENT</w:t>
-      </w:r>
-    </w:p>
-    <w:p>
-      <w:pPr>
-        <w:pStyle w:val="Normal"/>
-        <w:spacing w:lineRule="auto" w:line="240" w:before="0" w:after="26"/>
-        <w:rPr/>
-      </w:pPr>
-      <w:r>
-        <w:rPr>
-          <w:rFonts w:ascii="Monospace" w:hAnsi="Monospace"/>
-          <w:b w:val="false"/>
-          <w:bCs w:val="false"/>
-          <w:color w:val="000000"/>
-          <w:sz w:val="20"/>
-          <w:szCs w:val="24"/>
-          <w:u w:val="none"/>
-        </w:rPr>
-        <w:t>message[</w:t>
-      </w:r>
-      <w:r>
-        <w:rPr>
-          <w:rFonts w:ascii="Monospace" w:hAnsi="Monospace"/>
-          <w:b w:val="false"/>
-          <w:bCs w:val="false"/>
-          <w:i/>
-          <w:color w:val="00AA00"/>
-          <w:sz w:val="20"/>
-          <w:szCs w:val="24"/>
-          <w:u w:val="none"/>
-        </w:rPr>
-        <w:t>"state"</w:t>
-      </w:r>
-      <w:r>
-        <w:rPr>
-          <w:rFonts w:ascii="Monospace" w:hAnsi="Monospace"/>
-          <w:b w:val="false"/>
-          <w:bCs w:val="false"/>
-          <w:color w:val="000000"/>
-          <w:sz w:val="20"/>
-          <w:szCs w:val="24"/>
-          <w:u w:val="none"/>
-        </w:rPr>
-        <w:t>] = SPOTIFY_CONNECT_CLIENT_CHANGED_EVENT</w:t>
-      </w:r>
-    </w:p>
-    <w:p>
-      <w:pPr>
-        <w:pStyle w:val="Normal"/>
-        <w:spacing w:lineRule="auto" w:line="240" w:before="0" w:after="26"/>
-        <w:rPr>
-          <w:rFonts w:ascii="Monospace" w:hAnsi="Monospace"/>
-          <w:b w:val="false"/>
-          <w:bCs w:val="false"/>
-          <w:color w:val="000000"/>
-          <w:sz w:val="20"/>
-          <w:szCs w:val="24"/>
-          <w:u w:val="none"/>
-        </w:rPr>
-      </w:pPr>
-      <w:r>
-        <w:rPr/>
-      </w:r>
-    </w:p>
-    <w:p>
-      <w:pPr>
-        <w:pStyle w:val="Normal"/>
-        <w:spacing w:lineRule="auto" w:line="240" w:before="0" w:after="26"/>
-        <w:rPr/>
-      </w:pPr>
-      <w:r>
-        <w:rPr>
-          <w:rFonts w:ascii="Monospace" w:hAnsi="Monospace"/>
-          <w:b w:val="false"/>
-          <w:bCs w:val="false"/>
-          <w:color w:val="000000"/>
-          <w:sz w:val="20"/>
-          <w:szCs w:val="24"/>
-          <w:u w:val="none"/>
-        </w:rPr>
-        <w:t>For all message[</w:t>
-      </w:r>
-      <w:r>
-        <w:rPr>
-          <w:rFonts w:ascii="Monospace" w:hAnsi="Monospace"/>
-          <w:b w:val="false"/>
-          <w:bCs w:val="false"/>
-          <w:i/>
-          <w:color w:val="00AA00"/>
-          <w:sz w:val="20"/>
-          <w:szCs w:val="24"/>
-          <w:u w:val="none"/>
-        </w:rPr>
-        <w:t>"state"</w:t>
-      </w:r>
-      <w:r>
-        <w:rPr>
-          <w:rFonts w:ascii="Monospace" w:hAnsi="Monospace"/>
-          <w:b w:val="false"/>
-          <w:bCs w:val="false"/>
-          <w:color w:val="000000"/>
-          <w:sz w:val="20"/>
-          <w:szCs w:val="24"/>
-          <w:u w:val="none"/>
-        </w:rPr>
-        <w:t xml:space="preserve">] the </w:t>
-      </w:r>
-      <w:r>
-        <w:rPr>
-          <w:rFonts w:ascii="Monospace" w:hAnsi="Monospace"/>
-          <w:b w:val="false"/>
-          <w:bCs w:val="false"/>
-          <w:color w:val="000000"/>
-          <w:sz w:val="20"/>
-          <w:szCs w:val="24"/>
-          <w:u w:val="none"/>
-          <w:shd w:fill="E8F2FE" w:val="clear"/>
-        </w:rPr>
-        <w:t>message[</w:t>
-      </w:r>
-      <w:r>
-        <w:rPr>
-          <w:rFonts w:ascii="Monospace" w:hAnsi="Monospace"/>
-          <w:i/>
-          <w:color w:val="00AA00"/>
-          <w:sz w:val="20"/>
-          <w:shd w:fill="E8F2FE" w:val="clear"/>
-        </w:rPr>
-        <w:t>"error"</w:t>
-      </w:r>
-      <w:r>
-        <w:rPr>
-          <w:rFonts w:ascii="Monospace" w:hAnsi="Monospace"/>
-          <w:color w:val="000000"/>
-          <w:sz w:val="20"/>
-          <w:shd w:fill="E8F2FE" w:val="clear"/>
-        </w:rPr>
-        <w:t xml:space="preserve">] = </w:t>
-      </w:r>
-      <w:r>
-        <w:rPr>
-          <w:rFonts w:ascii="Monospace" w:hAnsi="Monospace"/>
-          <w:i/>
-          <w:color w:val="00AA00"/>
-          <w:sz w:val="20"/>
-          <w:shd w:fill="E8F2FE" w:val="clear"/>
-        </w:rPr>
-        <w:t>"None"</w:t>
-      </w:r>
-    </w:p>
-    <w:p>
-      <w:pPr>
-        <w:pStyle w:val="Normal"/>
-        <w:spacing w:lineRule="auto" w:line="240" w:before="0" w:after="26"/>
-        <w:rPr>
-          <w:rFonts w:ascii="Monospace" w:hAnsi="Monospace"/>
-          <w:i/>
-          <w:i/>
-          <w:color w:val="00AA00"/>
-          <w:sz w:val="20"/>
-          <w:shd w:fill="E8F2FE" w:val="clear"/>
-        </w:rPr>
-      </w:pPr>
-      <w:r>
-        <w:rPr/>
-      </w:r>
-    </w:p>
-    <w:p>
-      <w:pPr>
-        <w:pStyle w:val="Heading2"/>
-        <w:rPr/>
-      </w:pPr>
-      <w:r>
-        <w:rPr/>
-        <w:t>SpotifyConnect class methods:</w:t>
-      </w:r>
-    </w:p>
-    <w:p>
-      <w:pPr>
-        <w:pStyle w:val="Normal"/>
-        <w:rPr/>
-      </w:pPr>
-      <w:r>
-        <w:rPr>
-          <w:rFonts w:ascii="Monospace" w:hAnsi="Monospace"/>
-          <w:color w:val="0000FF"/>
-          <w:sz w:val="20"/>
-          <w:shd w:fill="E8F2FE" w:val="clear"/>
-        </w:rPr>
-        <w:t>class</w:t>
-      </w:r>
-      <w:r>
-        <w:rPr>
-          <w:rFonts w:ascii="Monospace" w:hAnsi="Monospace"/>
-          <w:color w:val="000000"/>
-          <w:sz w:val="20"/>
-          <w:shd w:fill="E8F2FE" w:val="clear"/>
-        </w:rPr>
-        <w:t xml:space="preserve"> </w:t>
-      </w:r>
-      <w:r>
-        <w:rPr>
-          <w:rFonts w:ascii="Monospace" w:hAnsi="Monospace"/>
-          <w:b/>
-          <w:color w:val="000000"/>
-          <w:sz w:val="20"/>
-          <w:shd w:fill="E8F2FE" w:val="clear"/>
-        </w:rPr>
-        <w:t>SpotifyConnect</w:t>
-      </w:r>
-      <w:r>
-        <w:rPr>
-          <w:rFonts w:ascii="Monospace" w:hAnsi="Monospace"/>
-          <w:color w:val="000000"/>
-          <w:sz w:val="20"/>
-          <w:shd w:fill="E8F2FE" w:val="clear"/>
-        </w:rPr>
-        <w:t>():</w:t>
-      </w:r>
-    </w:p>
-    <w:p>
-      <w:pPr>
-        <w:pStyle w:val="Normal"/>
-        <w:rPr/>
-      </w:pPr>
-      <w:r>
-        <w:rPr>
-          <w:rFonts w:ascii="Monospace" w:hAnsi="Monospace"/>
-          <w:color w:val="000000"/>
-          <w:sz w:val="20"/>
-          <w:shd w:fill="E8F2FE" w:val="clear"/>
-        </w:rPr>
-        <w:t xml:space="preserve">    </w:t>
-      </w:r>
-      <w:r>
-        <w:rPr>
-          <w:rFonts w:ascii="Monospace" w:hAnsi="Monospace"/>
-          <w:color w:val="0000FF"/>
-          <w:sz w:val="20"/>
-          <w:shd w:fill="E8F2FE" w:val="clear"/>
-        </w:rPr>
-        <w:t>def</w:t>
-      </w:r>
-      <w:r>
-        <w:rPr>
-          <w:rFonts w:ascii="Monospace" w:hAnsi="Monospace"/>
-          <w:color w:val="000000"/>
-          <w:sz w:val="20"/>
-          <w:shd w:fill="E8F2FE" w:val="clear"/>
-        </w:rPr>
-        <w:t xml:space="preserve"> </w:t>
-      </w:r>
-      <w:r>
-        <w:rPr>
-          <w:rFonts w:ascii="Monospace" w:hAnsi="Monospace"/>
-          <w:b/>
-          <w:color w:val="000000"/>
-          <w:sz w:val="20"/>
-          <w:shd w:fill="E8F2FE" w:val="clear"/>
-        </w:rPr>
-        <w:t>__init__</w:t>
-      </w:r>
-      <w:r>
-        <w:rPr>
-          <w:rFonts w:ascii="Monospace" w:hAnsi="Monospace"/>
-          <w:color w:val="000000"/>
-          <w:sz w:val="20"/>
-          <w:shd w:fill="E8F2FE" w:val="clear"/>
-        </w:rPr>
-        <w:t>(</w:t>
-      </w:r>
-      <w:r>
-        <w:rPr>
-          <w:rFonts w:ascii="Monospace" w:hAnsi="Monospace"/>
-          <w:i/>
-          <w:color w:val="000000"/>
-          <w:sz w:val="20"/>
-          <w:shd w:fill="E8F2FE" w:val="clear"/>
-        </w:rPr>
-        <w:t>self</w:t>
-      </w:r>
-      <w:r>
-        <w:rPr>
-          <w:rFonts w:ascii="Monospace" w:hAnsi="Monospace"/>
-          <w:color w:val="000000"/>
-          <w:sz w:val="20"/>
-          <w:shd w:fill="E8F2FE" w:val="clear"/>
-        </w:rPr>
-        <w:t>, msg_queue):</w:t>
-      </w:r>
-    </w:p>
-    <w:p>
-      <w:pPr>
-        <w:pStyle w:val="Normal"/>
-        <w:rPr>
-          <w:rFonts w:ascii="Monospace" w:hAnsi="Monospace"/>
-          <w:color w:val="000000"/>
-          <w:sz w:val="20"/>
-          <w:shd w:fill="E8F2FE" w:val="clear"/>
-        </w:rPr>
-      </w:pPr>
-      <w:r>
-        <w:rPr/>
-      </w:r>
-    </w:p>
-    <w:p>
-      <w:pPr>
-        <w:pStyle w:val="Normal"/>
-        <w:rPr/>
-      </w:pPr>
-      <w:r>
-        <w:rPr>
-          <w:rFonts w:ascii="Monospace" w:hAnsi="Monospace"/>
-          <w:color w:val="000000"/>
-          <w:sz w:val="20"/>
-          <w:shd w:fill="E8F2FE" w:val="clear"/>
-        </w:rPr>
-        <w:t xml:space="preserve">    </w:t>
-      </w:r>
-      <w:r>
-        <w:rPr>
-          <w:rFonts w:ascii="Monospace" w:hAnsi="Monospace"/>
-          <w:color w:val="0000FF"/>
-          <w:sz w:val="20"/>
-          <w:shd w:fill="E8F2FE" w:val="clear"/>
-        </w:rPr>
-        <w:t>def</w:t>
-      </w:r>
-      <w:r>
-        <w:rPr>
-          <w:rFonts w:ascii="Monospace" w:hAnsi="Monospace"/>
-          <w:color w:val="000000"/>
-          <w:sz w:val="20"/>
-          <w:shd w:fill="E8F2FE" w:val="clear"/>
-        </w:rPr>
-        <w:t xml:space="preserve"> </w:t>
-      </w:r>
-      <w:r>
-        <w:rPr>
-          <w:rFonts w:ascii="Monospace" w:hAnsi="Monospace"/>
-          <w:b/>
-          <w:color w:val="000000"/>
-          <w:sz w:val="20"/>
-          <w:shd w:fill="E8F2FE" w:val="clear"/>
-        </w:rPr>
-        <w:t>get_state</w:t>
-      </w:r>
-      <w:r>
-        <w:rPr>
-          <w:rFonts w:ascii="Monospace" w:hAnsi="Monospace"/>
-          <w:color w:val="000000"/>
-          <w:sz w:val="20"/>
-          <w:shd w:fill="E8F2FE" w:val="clear"/>
-        </w:rPr>
-        <w:t>(</w:t>
-      </w:r>
-      <w:r>
-        <w:rPr>
-          <w:rFonts w:ascii="Monospace" w:hAnsi="Monospace"/>
-          <w:i/>
-          <w:color w:val="000000"/>
-          <w:sz w:val="20"/>
-          <w:shd w:fill="E8F2FE" w:val="clear"/>
-        </w:rPr>
-        <w:t>self</w:t>
-      </w:r>
-      <w:r>
-        <w:rPr>
-          <w:rFonts w:ascii="Monospace" w:hAnsi="Monospace"/>
-          <w:color w:val="000000"/>
-          <w:sz w:val="20"/>
-          <w:shd w:fill="E8F2FE" w:val="clear"/>
-        </w:rPr>
-        <w:t>):</w:t>
-      </w:r>
-    </w:p>
-    <w:p>
-      <w:pPr>
-        <w:pStyle w:val="Normal"/>
-        <w:ind w:hanging="0"/>
-        <w:jc w:val="start"/>
-        <w:rPr>
-          <w:rFonts w:ascii="Monospace" w:hAnsi="Monospace"/>
-          <w:sz w:val="20"/>
-        </w:rPr>
-      </w:pPr>
-      <w:r>
-        <w:rPr>
-          <w:rFonts w:ascii="Monospace" w:hAnsi="Monospace"/>
-          <w:color w:val="000000"/>
-          <w:sz w:val="20"/>
-          <w:shd w:fill="E8F2FE" w:val="clear"/>
-        </w:rPr>
-        <w:t xml:space="preserve">        </w:t>
-      </w:r>
-      <w:r>
-        <w:rPr>
-          <w:rFonts w:ascii="Monospace" w:hAnsi="Monospace"/>
-          <w:i/>
-          <w:color w:val="00AA00"/>
-          <w:sz w:val="20"/>
-        </w:rPr>
-        <w:t>'''</w:t>
-      </w:r>
-    </w:p>
-    <w:p>
-      <w:pPr>
-        <w:pStyle w:val="Normal"/>
-        <w:ind w:hanging="0"/>
-        <w:jc w:val="start"/>
-        <w:rPr>
-          <w:rFonts w:ascii="Monospace" w:hAnsi="Monospace"/>
-          <w:sz w:val="20"/>
-        </w:rPr>
-      </w:pPr>
-      <w:r>
-        <w:rPr>
-          <w:rFonts w:ascii="Monospace" w:hAnsi="Monospace"/>
-          <w:i/>
-          <w:color w:val="00AA00"/>
-          <w:sz w:val="20"/>
-        </w:rPr>
-        <w:t xml:space="preserve">        </w:t>
-      </w:r>
-      <w:r>
-        <w:rPr>
-          <w:rFonts w:ascii="Monospace" w:hAnsi="Monospace"/>
-          <w:i/>
-          <w:color w:val="00AA00"/>
-          <w:sz w:val="20"/>
-        </w:rPr>
-        <w:t xml:space="preserve">Return the actual state of the </w:t>
-      </w:r>
-      <w:r>
-        <w:rPr>
-          <w:rFonts w:ascii="Monospace" w:hAnsi="Monospace"/>
-          <w:i/>
-          <w:color w:val="00AA00"/>
-          <w:sz w:val="20"/>
           <w:u w:val="single"/>
         </w:rPr>
         <w:t>Spotify</w:t>
       </w:r>
       <w:r>
         <w:rPr>
-          <w:rFonts w:ascii="Monospace" w:hAnsi="Monospace"/>
+          <w:rFonts w:ascii="FreeMono" w:hAnsi="FreeMono"/>
           <w:i/>
           <w:color w:val="00AA00"/>
           <w:sz w:val="20"/>
@@ -6988,7 +6984,7 @@
       </w:pPr>
       <w:r>
         <w:rPr>
-          <w:rFonts w:ascii="Monospace" w:hAnsi="Monospace"/>
+          <w:rFonts w:ascii="FreeMono" w:hAnsi="FreeMono"/>
           <w:i/>
           <w:color w:val="00AA00"/>
           <w:sz w:val="20"/>
@@ -6997,7 +6993,7 @@
       </w:r>
       <w:r>
         <w:rPr>
-          <w:rFonts w:ascii="Monospace" w:hAnsi="Monospace"/>
+          <w:rFonts w:ascii="FreeMono" w:hAnsi="FreeMono"/>
           <w:b/>
           <w:color w:val="00AA00"/>
           <w:sz w:val="20"/>
@@ -7006,112 +7002,12 @@
       </w:r>
       <w:r>
         <w:rPr>
-          <w:rFonts w:ascii="Monospace" w:hAnsi="Monospace"/>
+          <w:rFonts w:ascii="FreeMono" w:hAnsi="FreeMono"/>
           <w:i/>
           <w:color w:val="00AA00"/>
           <w:sz w:val="20"/>
         </w:rPr>
-        <w:t xml:space="preserve"> self.state = current state</w:t>
-      </w:r>
-    </w:p>
-    <w:p>
-      <w:pPr>
-        <w:pStyle w:val="Normal"/>
-        <w:rPr>
-          <w:rFonts w:ascii="Monospace" w:hAnsi="Monospace"/>
-          <w:color w:val="000000"/>
-          <w:sz w:val="20"/>
-          <w:shd w:fill="E8F2FE" w:val="clear"/>
-        </w:rPr>
-      </w:pPr>
-      <w:r>
-        <w:rPr>
-          <w:rFonts w:ascii="Monospace" w:hAnsi="Monospace"/>
-          <w:i/>
-          <w:color w:val="00AA00"/>
-          <w:sz w:val="20"/>
-        </w:rPr>
-        <w:t xml:space="preserve">        </w:t>
-      </w:r>
-      <w:r>
-        <w:rPr>
-          <w:rFonts w:ascii="Monospace" w:hAnsi="Monospace"/>
-          <w:i/>
-          <w:color w:val="00AA00"/>
-          <w:sz w:val="20"/>
-        </w:rPr>
-        <w:t>'''</w:t>
-      </w:r>
-    </w:p>
-    <w:p>
-      <w:pPr>
-        <w:pStyle w:val="Normal"/>
-        <w:rPr/>
-      </w:pPr>
-      <w:r>
-        <w:rPr>
-          <w:rFonts w:ascii="Monospace" w:hAnsi="Monospace"/>
-          <w:color w:val="000000"/>
-          <w:sz w:val="20"/>
-          <w:shd w:fill="E8F2FE" w:val="clear"/>
-        </w:rPr>
-        <w:t xml:space="preserve">    </w:t>
-      </w:r>
-      <w:r>
-        <w:rPr>
-          <w:rFonts w:ascii="Monospace" w:hAnsi="Monospace"/>
-          <w:color w:val="0000FF"/>
-          <w:sz w:val="20"/>
-          <w:shd w:fill="E8F2FE" w:val="clear"/>
-        </w:rPr>
-        <w:t>def</w:t>
-      </w:r>
-      <w:r>
-        <w:rPr>
-          <w:rFonts w:ascii="Monospace" w:hAnsi="Monospace"/>
-          <w:color w:val="000000"/>
-          <w:sz w:val="20"/>
-          <w:shd w:fill="E8F2FE" w:val="clear"/>
-        </w:rPr>
-        <w:t xml:space="preserve"> </w:t>
-      </w:r>
-      <w:r>
-        <w:rPr>
-          <w:rFonts w:ascii="Monospace" w:hAnsi="Monospace"/>
-          <w:b/>
-          <w:color w:val="000000"/>
-          <w:sz w:val="20"/>
-          <w:shd w:fill="E8F2FE" w:val="clear"/>
-        </w:rPr>
-        <w:t>playerctl_command</w:t>
-      </w:r>
-      <w:r>
-        <w:rPr>
-          <w:rFonts w:ascii="Monospace" w:hAnsi="Monospace"/>
-          <w:color w:val="000000"/>
-          <w:sz w:val="20"/>
-          <w:shd w:fill="E8F2FE" w:val="clear"/>
-        </w:rPr>
-        <w:t>(</w:t>
-      </w:r>
-      <w:r>
-        <w:rPr>
-          <w:rFonts w:ascii="Monospace" w:hAnsi="Monospace"/>
-          <w:i/>
-          <w:color w:val="000000"/>
-          <w:sz w:val="20"/>
-          <w:shd w:fill="E8F2FE" w:val="clear"/>
-        </w:rPr>
-        <w:t>self</w:t>
-      </w:r>
-      <w:r>
-        <w:rPr>
-          <w:rFonts w:ascii="Monospace" w:hAnsi="Monospace"/>
-          <w:color w:val="000000"/>
-          <w:sz w:val="20"/>
-          <w:shd w:fill="E8F2FE" w:val="clear"/>
-        </w:rPr>
-        <w:t>,command):</w:t>
+        <w:t xml:space="preserve"> self.state = current state = [  MPV_PLAYERCTL_PLAYING_STATE |</w:t>
       </w:r>
     </w:p>
     <w:p>
@@ -7126,22 +7022,21 @@
       </w:pPr>
       <w:r>
         <w:rPr>
-          <w:rFonts w:ascii="Monospace" w:hAnsi="Monospace"/>
-          <w:i/>
-          <w:color w:val="000000"/>
-          <w:sz w:val="20"/>
-          <w:shd w:fill="E8F2FE" w:val="clear"/>
-        </w:rPr>
-        <w:t xml:space="preserve">        </w:t>
-      </w:r>
-      <w:r>
-        <w:rPr>
-          <w:rFonts w:ascii="Monospace" w:hAnsi="Monospace"/>
+          <w:rFonts w:ascii="FreeMono" w:hAnsi="FreeMono"/>
           <w:i/>
           <w:color w:val="00AA00"/>
           <w:sz w:val="20"/>
         </w:rPr>
-        <w:t>'''</w:t>
+        <w:t xml:space="preserve">                                                </w:t>
+      </w:r>
+      <w:r>
+        <w:rPr>
+          <w:rFonts w:ascii="FreeMono" w:hAnsi="FreeMono"/>
+          <w:i/>
+          <w:color w:val="00AA00"/>
+          <w:sz w:val="20"/>
+        </w:rPr>
+        <w:t>MPV_PLAYERCTL_STOPPED_STATE |</w:t>
       </w:r>
     </w:p>
     <w:p>
@@ -7156,59 +7051,21 @@
       </w:pPr>
       <w:r>
         <w:rPr>
-          <w:rFonts w:ascii="Monospace" w:hAnsi="Monospace"/>
+          <w:rFonts w:ascii="FreeMono" w:hAnsi="FreeMono"/>
           <w:i/>
           <w:color w:val="00AA00"/>
           <w:sz w:val="20"/>
         </w:rPr>
-        <w:t xml:space="preserve">        </w:t>
-      </w:r>
-      <w:r>
-        <w:rPr>
-          <w:rFonts w:ascii="Monospace" w:hAnsi="Monospace"/>
+        <w:t xml:space="preserve">                                                </w:t>
+      </w:r>
+      <w:r>
+        <w:rPr>
+          <w:rFonts w:ascii="FreeMono" w:hAnsi="FreeMono"/>
           <w:i/>
           <w:color w:val="00AA00"/>
           <w:sz w:val="20"/>
         </w:rPr>
-        <w:t xml:space="preserve">Send command to </w:t>
-      </w:r>
-      <w:r>
-        <w:rPr>
-          <w:rFonts w:ascii="Monospace" w:hAnsi="Monospace"/>
-          <w:i/>
-          <w:color w:val="00AA00"/>
-          <w:sz w:val="20"/>
-          <w:u w:val="single"/>
-        </w:rPr>
-        <w:t>playerctl</w:t>
-      </w:r>
-      <w:r>
-        <w:rPr>
-          <w:rFonts w:ascii="Monospace" w:hAnsi="Monospace"/>
-          <w:i/>
-          <w:color w:val="00AA00"/>
-          <w:sz w:val="20"/>
-        </w:rPr>
-        <w:t xml:space="preserve"> via </w:t>
-      </w:r>
-      <w:r>
-        <w:rPr>
-          <w:rFonts w:ascii="Monospace" w:hAnsi="Monospace"/>
-          <w:i/>
-          <w:color w:val="00AA00"/>
-          <w:sz w:val="20"/>
-          <w:u w:val="single"/>
-        </w:rPr>
-        <w:t>mpris</w:t>
-      </w:r>
-      <w:r>
-        <w:rPr>
-          <w:rFonts w:ascii="Monospace" w:hAnsi="Monospace"/>
-          <w:i/>
-          <w:color w:val="00AA00"/>
-          <w:sz w:val="20"/>
-        </w:rPr>
-        <w:t xml:space="preserve"> player interface</w:t>
+        <w:t>MPV_PLAYERCTL_PAUSED_STATE]</w:t>
       </w:r>
     </w:p>
     <w:p>
@@ -7223,7 +7080,7 @@
       </w:pPr>
       <w:r>
         <w:rPr>
-          <w:rFonts w:ascii="Monospace" w:hAnsi="Monospace"/>
+          <w:rFonts w:ascii="FreeMono" w:hAnsi="FreeMono"/>
           <w:i/>
           <w:color w:val="00AA00"/>
           <w:sz w:val="20"/>
@@ -7232,31 +7089,12 @@
       </w:r>
       <w:r>
         <w:rPr>
-          <w:rFonts w:ascii="Monospace" w:hAnsi="Monospace"/>
-          <w:b/>
-          <w:color w:val="00AA00"/>
-          <w:sz w:val="20"/>
-        </w:rPr>
-        <w:t>:</w:t>
-      </w:r>
-      <w:r>
-        <w:rPr>
-          <w:rFonts w:ascii="Monospace" w:hAnsi="Monospace"/>
-          <w:b/>
-          <w:color w:val="00AA00"/>
-          <w:sz w:val="20"/>
-          <w:u w:val="single"/>
-        </w:rPr>
-        <w:t>param</w:t>
-      </w:r>
-      <w:r>
-        <w:rPr>
-          <w:rFonts w:ascii="Monospace" w:hAnsi="Monospace"/>
+          <w:rFonts w:ascii="FreeMono" w:hAnsi="FreeMono"/>
           <w:i/>
           <w:color w:val="00AA00"/>
           <w:sz w:val="20"/>
         </w:rPr>
-        <w:t xml:space="preserve"> command = player command = [ MPV_PLAYERCTL_PLAY, </w:t>
+        <w:t>'''</w:t>
       </w:r>
     </w:p>
     <w:p>
@@ -7271,21 +7109,81 @@
       </w:pPr>
       <w:r>
         <w:rPr>
-          <w:rFonts w:ascii="Monospace" w:hAnsi="Monospace"/>
+          <w:rFonts w:ascii="FreeMono" w:hAnsi="FreeMono"/>
+        </w:rPr>
+      </w:r>
+    </w:p>
+    <w:p>
+      <w:pPr>
+        <w:pStyle w:val="Normal"/>
+        <w:rPr>
+          <w:rFonts w:ascii="FreeMono" w:hAnsi="FreeMono"/>
+        </w:rPr>
+      </w:pPr>
+      <w:r>
+        <w:rPr>
+          <w:rFonts w:ascii="FreeMono" w:hAnsi="FreeMono"/>
+          <w:color w:val="000000"/>
+          <w:sz w:val="20"/>
+          <w:shd w:fill="E8F2FE" w:val="clear"/>
+        </w:rPr>
+        <w:t xml:space="preserve">    </w:t>
+      </w:r>
+      <w:r>
+        <w:rPr>
+          <w:rFonts w:ascii="FreeMono" w:hAnsi="FreeMono"/>
+          <w:color w:val="0000FF"/>
+          <w:sz w:val="20"/>
+          <w:shd w:fill="E8F2FE" w:val="clear"/>
+        </w:rPr>
+        <w:t>def</w:t>
+      </w:r>
+      <w:r>
+        <w:rPr>
+          <w:rFonts w:ascii="FreeMono" w:hAnsi="FreeMono"/>
+          <w:color w:val="000000"/>
+          <w:sz w:val="20"/>
+          <w:shd w:fill="E8F2FE" w:val="clear"/>
+        </w:rPr>
+        <w:t xml:space="preserve"> </w:t>
+      </w:r>
+      <w:r>
+        <w:rPr>
+          <w:rFonts w:ascii="FreeMono" w:hAnsi="FreeMono"/>
+          <w:b/>
+          <w:color w:val="000000"/>
+          <w:sz w:val="20"/>
+          <w:shd w:fill="E8F2FE" w:val="clear"/>
+        </w:rPr>
+        <w:t>playerctl_command</w:t>
+      </w:r>
+      <w:r>
+        <w:rPr>
+          <w:rFonts w:ascii="FreeMono" w:hAnsi="FreeMono"/>
+          <w:color w:val="000000"/>
+          <w:sz w:val="20"/>
+          <w:shd w:fill="E8F2FE" w:val="clear"/>
+        </w:rPr>
+        <w:t>(</w:t>
+      </w:r>
+      <w:r>
+        <w:rPr>
+          <w:rFonts w:ascii="FreeMono" w:hAnsi="FreeMono"/>
           <w:i/>
-          <w:color w:val="00AA00"/>
-          <w:sz w:val="20"/>
-        </w:rPr>
-        <w:t xml:space="preserve">                                            </w:t>
-      </w:r>
-      <w:r>
-        <w:rPr>
-          <w:rFonts w:ascii="Monospace" w:hAnsi="Monospace"/>
-          <w:i/>
-          <w:color w:val="00AA00"/>
-          <w:sz w:val="20"/>
-        </w:rPr>
-        <w:t xml:space="preserve">MPV_PLAYERCTL_PAUSE, </w:t>
+          <w:color w:val="000000"/>
+          <w:sz w:val="20"/>
+          <w:shd w:fill="E8F2FE" w:val="clear"/>
+        </w:rPr>
+        <w:t>self</w:t>
+      </w:r>
+      <w:r>
+        <w:rPr>
+          <w:rFonts w:ascii="FreeMono" w:hAnsi="FreeMono"/>
+          <w:color w:val="000000"/>
+          <w:sz w:val="20"/>
+          <w:shd w:fill="E8F2FE" w:val="clear"/>
+        </w:rPr>
+        <w:t>,command):</w:t>
       </w:r>
     </w:p>
     <w:p>
@@ -7300,21 +7198,22 @@
       </w:pPr>
       <w:r>
         <w:rPr>
-          <w:rFonts w:ascii="Monospace" w:hAnsi="Monospace"/>
+          <w:rFonts w:ascii="FreeMono" w:hAnsi="FreeMono"/>
+          <w:i/>
+          <w:color w:val="000000"/>
+          <w:sz w:val="20"/>
+          <w:shd w:fill="E8F2FE" w:val="clear"/>
+        </w:rPr>
+        <w:t xml:space="preserve">        </w:t>
+      </w:r>
+      <w:r>
+        <w:rPr>
+          <w:rFonts w:ascii="FreeMono" w:hAnsi="FreeMono"/>
           <w:i/>
           <w:color w:val="00AA00"/>
           <w:sz w:val="20"/>
         </w:rPr>
-        <w:t xml:space="preserve">                                            </w:t>
-      </w:r>
-      <w:r>
-        <w:rPr>
-          <w:rFonts w:ascii="Monospace" w:hAnsi="Monospace"/>
-          <w:i/>
-          <w:color w:val="00AA00"/>
-          <w:sz w:val="20"/>
-        </w:rPr>
-        <w:t>MPV_PLAYERCTL_STOP]</w:t>
+        <w:t>'''</w:t>
       </w:r>
     </w:p>
     <w:p>
@@ -7329,7 +7228,7 @@
       </w:pPr>
       <w:r>
         <w:rPr>
-          <w:rFonts w:ascii="Monospace" w:hAnsi="Monospace"/>
+          <w:rFonts w:ascii="FreeMono" w:hAnsi="FreeMono"/>
           <w:i/>
           <w:color w:val="00AA00"/>
           <w:sz w:val="20"/>
@@ -7338,54 +7237,227 @@
       </w:r>
       <w:r>
         <w:rPr>
-          <w:rFonts w:ascii="Monospace" w:hAnsi="Monospace"/>
+          <w:rFonts w:ascii="FreeMono" w:hAnsi="FreeMono"/>
+          <w:i/>
+          <w:color w:val="00AA00"/>
+          <w:sz w:val="20"/>
+        </w:rPr>
+        <w:t xml:space="preserve">Send command to </w:t>
+      </w:r>
+      <w:r>
+        <w:rPr>
+          <w:rFonts w:ascii="FreeMono" w:hAnsi="FreeMono"/>
+          <w:i/>
+          <w:color w:val="00AA00"/>
+          <w:sz w:val="20"/>
+          <w:u w:val="single"/>
+        </w:rPr>
+        <w:t>playerctl</w:t>
+      </w:r>
+      <w:r>
+        <w:rPr>
+          <w:rFonts w:ascii="FreeMono" w:hAnsi="FreeMono"/>
+          <w:i/>
+          <w:color w:val="00AA00"/>
+          <w:sz w:val="20"/>
+        </w:rPr>
+        <w:t xml:space="preserve"> via </w:t>
+      </w:r>
+      <w:r>
+        <w:rPr>
+          <w:rFonts w:ascii="FreeMono" w:hAnsi="FreeMono"/>
+          <w:i/>
+          <w:color w:val="00AA00"/>
+          <w:sz w:val="20"/>
+          <w:u w:val="single"/>
+        </w:rPr>
+        <w:t>mpris</w:t>
+      </w:r>
+      <w:r>
+        <w:rPr>
+          <w:rFonts w:ascii="FreeMono" w:hAnsi="FreeMono"/>
+          <w:i/>
+          <w:color w:val="00AA00"/>
+          <w:sz w:val="20"/>
+        </w:rPr>
+        <w:t xml:space="preserve"> player interface</w:t>
+      </w:r>
+    </w:p>
+    <w:p>
+      <w:pPr>
+        <w:pStyle w:val="Normal"/>
+        <w:ind w:hanging="0"/>
+        <w:jc w:val="start"/>
+        <w:rPr>
+          <w:rFonts w:ascii="Monospace" w:hAnsi="Monospace"/>
+          <w:sz w:val="20"/>
+        </w:rPr>
+      </w:pPr>
+      <w:r>
+        <w:rPr>
+          <w:rFonts w:ascii="FreeMono" w:hAnsi="FreeMono"/>
+          <w:i/>
+          <w:color w:val="00AA00"/>
+          <w:sz w:val="20"/>
+        </w:rPr>
+        <w:t xml:space="preserve">        </w:t>
+      </w:r>
+      <w:r>
+        <w:rPr>
+          <w:rFonts w:ascii="FreeMono" w:hAnsi="FreeMono"/>
           <w:b/>
           <w:color w:val="00AA00"/>
           <w:sz w:val="20"/>
         </w:rPr>
-        <w:t>:return</w:t>
-      </w:r>
-      <w:r>
-        <w:rPr>
-          <w:rFonts w:ascii="Monospace" w:hAnsi="Monospace"/>
+        <w:t>:</w:t>
+      </w:r>
+      <w:r>
+        <w:rPr>
+          <w:rFonts w:ascii="FreeMono" w:hAnsi="FreeMono"/>
+          <w:b/>
+          <w:color w:val="00AA00"/>
+          <w:sz w:val="20"/>
+          <w:u w:val="single"/>
+        </w:rPr>
+        <w:t>param</w:t>
+      </w:r>
+      <w:r>
+        <w:rPr>
+          <w:rFonts w:ascii="FreeMono" w:hAnsi="FreeMono"/>
           <w:i/>
           <w:color w:val="00AA00"/>
           <w:sz w:val="20"/>
         </w:rPr>
-        <w:t xml:space="preserve"> self.state = state of </w:t>
-      </w:r>
-      <w:r>
-        <w:rPr>
-          <w:rFonts w:ascii="Monospace" w:hAnsi="Monospace"/>
+        <w:t xml:space="preserve"> command = player command = [ MPV_PLAYERCTL_PLAY, </w:t>
+      </w:r>
+    </w:p>
+    <w:p>
+      <w:pPr>
+        <w:pStyle w:val="Normal"/>
+        <w:ind w:hanging="0"/>
+        <w:jc w:val="start"/>
+        <w:rPr>
+          <w:rFonts w:ascii="Monospace" w:hAnsi="Monospace"/>
+          <w:sz w:val="20"/>
+        </w:rPr>
+      </w:pPr>
+      <w:r>
+        <w:rPr>
+          <w:rFonts w:ascii="FreeMono" w:hAnsi="FreeMono"/>
           <w:i/>
           <w:color w:val="00AA00"/>
           <w:sz w:val="20"/>
-          <w:u w:val="single"/>
-        </w:rPr>
-        <w:t>mpv</w:t>
-      </w:r>
-      <w:r>
-        <w:rPr>
-          <w:rFonts w:ascii="Monospace" w:hAnsi="Monospace"/>
+        </w:rPr>
+        <w:t xml:space="preserve">                                            </w:t>
+      </w:r>
+      <w:r>
+        <w:rPr>
+          <w:rFonts w:ascii="FreeMono" w:hAnsi="FreeMono"/>
           <w:i/>
           <w:color w:val="00AA00"/>
           <w:sz w:val="20"/>
         </w:rPr>
-        <w:t xml:space="preserve"> </w:t>
-      </w:r>
-      <w:r>
-        <w:rPr>
-          <w:rFonts w:ascii="Monospace" w:hAnsi="Monospace"/>
+        <w:t xml:space="preserve">MPV_PLAYERCTL_PAUSE, </w:t>
+      </w:r>
+    </w:p>
+    <w:p>
+      <w:pPr>
+        <w:pStyle w:val="Normal"/>
+        <w:ind w:hanging="0"/>
+        <w:jc w:val="start"/>
+        <w:rPr>
+          <w:rFonts w:ascii="Monospace" w:hAnsi="Monospace"/>
+          <w:sz w:val="20"/>
+        </w:rPr>
+      </w:pPr>
+      <w:r>
+        <w:rPr>
+          <w:rFonts w:ascii="FreeMono" w:hAnsi="FreeMono"/>
           <w:i/>
           <w:color w:val="00AA00"/>
           <w:sz w:val="20"/>
+        </w:rPr>
+        <w:t xml:space="preserve">                                            </w:t>
+      </w:r>
+      <w:r>
+        <w:rPr>
+          <w:rFonts w:ascii="FreeMono" w:hAnsi="FreeMono"/>
+          <w:i/>
+          <w:color w:val="00AA00"/>
+          <w:sz w:val="20"/>
+        </w:rPr>
+        <w:t>MPV_PLAYERCTL_STOP]</w:t>
+      </w:r>
+    </w:p>
+    <w:p>
+      <w:pPr>
+        <w:pStyle w:val="Normal"/>
+        <w:ind w:hanging="0"/>
+        <w:jc w:val="start"/>
+        <w:rPr>
+          <w:rFonts w:ascii="Monospace" w:hAnsi="Monospace"/>
+          <w:sz w:val="20"/>
+        </w:rPr>
+      </w:pPr>
+      <w:r>
+        <w:rPr>
+          <w:rFonts w:ascii="FreeMono" w:hAnsi="FreeMono"/>
+          <w:i/>
+          <w:color w:val="00AA00"/>
+          <w:sz w:val="20"/>
+        </w:rPr>
+        <w:t xml:space="preserve">        </w:t>
+      </w:r>
+      <w:r>
+        <w:rPr>
+          <w:rFonts w:ascii="FreeMono" w:hAnsi="FreeMono"/>
+          <w:b/>
+          <w:color w:val="00AA00"/>
+          <w:sz w:val="20"/>
+        </w:rPr>
+        <w:t>:return</w:t>
+      </w:r>
+      <w:r>
+        <w:rPr>
+          <w:rFonts w:ascii="FreeMono" w:hAnsi="FreeMono"/>
+          <w:i/>
+          <w:color w:val="00AA00"/>
+          <w:sz w:val="20"/>
+        </w:rPr>
+        <w:t xml:space="preserve"> self.state = state of </w:t>
+      </w:r>
+      <w:r>
+        <w:rPr>
+          <w:rFonts w:ascii="FreeMono" w:hAnsi="FreeMono"/>
+          <w:i/>
+          <w:color w:val="00AA00"/>
+          <w:sz w:val="20"/>
           <w:u w:val="single"/>
         </w:rPr>
+        <w:t>mpv</w:t>
+      </w:r>
+      <w:r>
+        <w:rPr>
+          <w:rFonts w:ascii="FreeMono" w:hAnsi="FreeMono"/>
+          <w:i/>
+          <w:color w:val="00AA00"/>
+          <w:sz w:val="20"/>
+        </w:rPr>
+        <w:t xml:space="preserve"> </w:t>
+      </w:r>
+      <w:r>
+        <w:rPr>
+          <w:rFonts w:ascii="FreeMono" w:hAnsi="FreeMono"/>
+          <w:i/>
+          <w:color w:val="00AA00"/>
+          <w:sz w:val="20"/>
+          <w:u w:val="single"/>
+        </w:rPr>
         <w:t>mpris</w:t>
       </w:r>
       <w:r>
         <w:rPr>
-          <w:rFonts w:ascii="Monospace" w:hAnsi="Monospace"/>
+          <w:rFonts w:ascii="FreeMono" w:hAnsi="FreeMono"/>
           <w:i/>
           <w:color w:val="00AA00"/>
           <w:sz w:val="20"/>
@@ -7417,7 +7489,7 @@
       </w:pPr>
       <w:r>
         <w:rPr>
-          <w:rFonts w:ascii="Monospace" w:hAnsi="Monospace"/>
+          <w:rFonts w:ascii="FreeMono" w:hAnsi="FreeMono"/>
           <w:i/>
           <w:color w:val="00AA00"/>
           <w:sz w:val="20"/>
@@ -7426,7 +7498,7 @@
       </w:r>
       <w:r>
         <w:rPr>
-          <w:rFonts w:ascii="Monospace" w:hAnsi="Monospace"/>
+          <w:rFonts w:ascii="FreeMono" w:hAnsi="FreeMono"/>
           <w:i/>
           <w:color w:val="00AA00"/>
           <w:sz w:val="20"/>
@@ -7446,7 +7518,7 @@
       </w:pPr>
       <w:r>
         <w:rPr>
-          <w:rFonts w:ascii="Monospace" w:hAnsi="Monospace"/>
+          <w:rFonts w:ascii="FreeMono" w:hAnsi="FreeMono"/>
           <w:i/>
           <w:color w:val="00AA00"/>
           <w:sz w:val="20"/>
@@ -7455,7 +7527,7 @@
       </w:r>
       <w:r>
         <w:rPr>
-          <w:rFonts w:ascii="Monospace" w:hAnsi="Monospace"/>
+          <w:rFonts w:ascii="FreeMono" w:hAnsi="FreeMono"/>
           <w:i/>
           <w:color w:val="00AA00"/>
           <w:sz w:val="20"/>
@@ -7475,6 +7547,7 @@
       </w:pPr>
       <w:r>
         <w:rPr>
+          <w:rFonts w:ascii="FreeMono" w:hAnsi="FreeMono"/>
           <w:b w:val="false"/>
           <w:bCs w:val="false"/>
           <w:sz w:val="24"/>

</xml_diff>

<commit_message>
Update Spotify Connect design.docx, Spotify Connect design.odt, and 7 more files...
</commit_message>
<xml_diff>
--- a/Documents/Spotify/Spotify Connect design.docx
+++ b/Documents/Spotify/Spotify Connect design.docx
@@ -4913,7 +4913,7 @@
       </w:pPr>
       <w:r>
         <w:rPr>
-          <w:rFonts w:ascii="Monospace" w:hAnsi="Monospace"/>
+          <w:rFonts w:ascii="FreeMono" w:hAnsi="FreeMono"/>
           <w:color w:val="000000"/>
           <w:sz w:val="20"/>
           <w:shd w:fill="FFFF96" w:val="clear"/>
@@ -4922,7 +4922,7 @@
       </w:r>
       <w:r>
         <w:rPr>
-          <w:rFonts w:ascii="Monospace" w:hAnsi="Monospace"/>
+          <w:rFonts w:ascii="FreeMono" w:hAnsi="FreeMono"/>
           <w:color w:val="000000"/>
           <w:sz w:val="20"/>
           <w:shd w:fill="E8F2FE" w:val="clear"/>
@@ -4934,7 +4934,7 @@
       </w:r>
       <w:r>
         <w:rPr>
-          <w:rFonts w:ascii="Monospace" w:hAnsi="Monospace"/>
+          <w:rFonts w:ascii="FreeMono" w:hAnsi="FreeMono"/>
           <w:i/>
           <w:color w:val="00AA00"/>
           <w:sz w:val="20"/>
@@ -4944,7 +4944,7 @@
       </w:r>
       <w:r>
         <w:rPr>
-          <w:rFonts w:ascii="Monospace" w:hAnsi="Monospace"/>
+          <w:rFonts w:ascii="FreeMono" w:hAnsi="FreeMono"/>
           <w:i/>
           <w:color w:val="00AA00"/>
           <w:sz w:val="20"/>
@@ -4955,7 +4955,7 @@
       </w:r>
       <w:r>
         <w:rPr>
-          <w:rFonts w:ascii="Monospace" w:hAnsi="Monospace"/>
+          <w:rFonts w:ascii="FreeMono" w:hAnsi="FreeMono"/>
           <w:i/>
           <w:color w:val="00AA00"/>
           <w:sz w:val="20"/>
@@ -4974,7 +4974,9 @@
         </w:rPr>
       </w:pPr>
       <w:r>
-        <w:rPr/>
+        <w:rPr>
+          <w:rFonts w:ascii="FreeMono" w:hAnsi="FreeMono"/>
+        </w:rPr>
       </w:r>
     </w:p>
     <w:p>
@@ -4988,7 +4990,7 @@
       </w:pPr>
       <w:r>
         <w:rPr>
-          <w:rFonts w:ascii="Monospace" w:hAnsi="Monospace"/>
+          <w:rFonts w:ascii="FreeMono" w:hAnsi="FreeMono"/>
           <w:i/>
           <w:color w:val="C0C0C0"/>
           <w:sz w:val="20"/>
@@ -5009,7 +5011,7 @@
       </w:pPr>
       <w:r>
         <w:rPr>
-          <w:rFonts w:ascii="Monospace" w:hAnsi="Monospace"/>
+          <w:rFonts w:ascii="FreeMono" w:hAnsi="FreeMono"/>
           <w:color w:val="000000"/>
           <w:sz w:val="20"/>
           <w:shd w:fill="FFFF96" w:val="clear"/>
@@ -5018,7 +5020,7 @@
       </w:r>
       <w:r>
         <w:rPr>
-          <w:rFonts w:ascii="Monospace" w:hAnsi="Monospace"/>
+          <w:rFonts w:ascii="FreeMono" w:hAnsi="FreeMono"/>
           <w:color w:val="000000"/>
           <w:sz w:val="20"/>
         </w:rPr>
@@ -5026,7 +5028,7 @@
       </w:r>
       <w:r>
         <w:rPr>
-          <w:rFonts w:ascii="Monospace" w:hAnsi="Monospace"/>
+          <w:rFonts w:ascii="FreeMono" w:hAnsi="FreeMono"/>
           <w:i/>
           <w:color w:val="00AA00"/>
           <w:sz w:val="20"/>
@@ -5035,7 +5037,7 @@
       </w:r>
       <w:r>
         <w:rPr>
-          <w:rFonts w:ascii="Monospace" w:hAnsi="Monospace"/>
+          <w:rFonts w:ascii="FreeMono" w:hAnsi="FreeMono"/>
           <w:i/>
           <w:color w:val="00AA00"/>
           <w:sz w:val="20"/>
@@ -5045,7 +5047,7 @@
       </w:r>
       <w:r>
         <w:rPr>
-          <w:rFonts w:ascii="Monospace" w:hAnsi="Monospace"/>
+          <w:rFonts w:ascii="FreeMono" w:hAnsi="FreeMono"/>
           <w:i/>
           <w:color w:val="00AA00"/>
           <w:sz w:val="20"/>
@@ -5065,7 +5067,7 @@
       </w:pPr>
       <w:r>
         <w:rPr>
-          <w:rFonts w:ascii="Monospace" w:hAnsi="Monospace"/>
+          <w:rFonts w:ascii="FreeMono" w:hAnsi="FreeMono"/>
           <w:color w:val="000000"/>
           <w:sz w:val="20"/>
         </w:rPr>
@@ -5073,7 +5075,7 @@
       </w:r>
       <w:r>
         <w:rPr>
-          <w:rFonts w:ascii="Monospace" w:hAnsi="Monospace"/>
+          <w:rFonts w:ascii="FreeMono" w:hAnsi="FreeMono"/>
           <w:i/>
           <w:color w:val="00AA00"/>
           <w:sz w:val="20"/>
@@ -5082,7 +5084,7 @@
       </w:r>
       <w:r>
         <w:rPr>
-          <w:rFonts w:ascii="Monospace" w:hAnsi="Monospace"/>
+          <w:rFonts w:ascii="FreeMono" w:hAnsi="FreeMono"/>
           <w:i/>
           <w:color w:val="00AA00"/>
           <w:sz w:val="20"/>
@@ -5092,7 +5094,7 @@
       </w:r>
       <w:r>
         <w:rPr>
-          <w:rFonts w:ascii="Monospace" w:hAnsi="Monospace"/>
+          <w:rFonts w:ascii="FreeMono" w:hAnsi="FreeMono"/>
           <w:i/>
           <w:color w:val="00AA00"/>
           <w:sz w:val="20"/>
@@ -5112,7 +5114,7 @@
       </w:pPr>
       <w:r>
         <w:rPr>
-          <w:rFonts w:ascii="Monospace" w:hAnsi="Monospace"/>
+          <w:rFonts w:ascii="FreeMono" w:hAnsi="FreeMono"/>
           <w:color w:val="000000"/>
           <w:sz w:val="20"/>
         </w:rPr>
@@ -5120,7 +5122,7 @@
       </w:r>
       <w:r>
         <w:rPr>
-          <w:rFonts w:ascii="Monospace" w:hAnsi="Monospace"/>
+          <w:rFonts w:ascii="FreeMono" w:hAnsi="FreeMono"/>
           <w:i/>
           <w:color w:val="00AA00"/>
           <w:sz w:val="20"/>
@@ -5129,7 +5131,7 @@
       </w:r>
       <w:r>
         <w:rPr>
-          <w:rFonts w:ascii="Monospace" w:hAnsi="Monospace"/>
+          <w:rFonts w:ascii="FreeMono" w:hAnsi="FreeMono"/>
           <w:i/>
           <w:color w:val="00AA00"/>
           <w:sz w:val="20"/>
@@ -5139,7 +5141,7 @@
       </w:r>
       <w:r>
         <w:rPr>
-          <w:rFonts w:ascii="Monospace" w:hAnsi="Monospace"/>
+          <w:rFonts w:ascii="FreeMono" w:hAnsi="FreeMono"/>
           <w:i/>
           <w:color w:val="00AA00"/>
           <w:sz w:val="20"/>
@@ -5159,7 +5161,7 @@
       </w:pPr>
       <w:r>
         <w:rPr>
-          <w:rFonts w:ascii="Monospace" w:hAnsi="Monospace"/>
+          <w:rFonts w:ascii="FreeMono" w:hAnsi="FreeMono"/>
           <w:color w:val="000000"/>
           <w:sz w:val="20"/>
         </w:rPr>
@@ -5167,7 +5169,7 @@
       </w:r>
       <w:r>
         <w:rPr>
-          <w:rFonts w:ascii="Monospace" w:hAnsi="Monospace"/>
+          <w:rFonts w:ascii="FreeMono" w:hAnsi="FreeMono"/>
           <w:i/>
           <w:color w:val="00AA00"/>
           <w:sz w:val="20"/>
@@ -5176,7 +5178,7 @@
       </w:r>
       <w:r>
         <w:rPr>
-          <w:rFonts w:ascii="Monospace" w:hAnsi="Monospace"/>
+          <w:rFonts w:ascii="FreeMono" w:hAnsi="FreeMono"/>
           <w:i/>
           <w:color w:val="00AA00"/>
           <w:sz w:val="20"/>
@@ -5186,7 +5188,7 @@
       </w:r>
       <w:r>
         <w:rPr>
-          <w:rFonts w:ascii="Monospace" w:hAnsi="Monospace"/>
+          <w:rFonts w:ascii="FreeMono" w:hAnsi="FreeMono"/>
           <w:i/>
           <w:color w:val="00AA00"/>
           <w:sz w:val="20"/>
@@ -5206,7 +5208,7 @@
       </w:pPr>
       <w:r>
         <w:rPr>
-          <w:rFonts w:ascii="Monospace" w:hAnsi="Monospace"/>
+          <w:rFonts w:ascii="FreeMono" w:hAnsi="FreeMono"/>
           <w:color w:val="000000"/>
           <w:sz w:val="20"/>
         </w:rPr>
@@ -5214,7 +5216,7 @@
       </w:r>
       <w:r>
         <w:rPr>
-          <w:rFonts w:ascii="Monospace" w:hAnsi="Monospace"/>
+          <w:rFonts w:ascii="FreeMono" w:hAnsi="FreeMono"/>
           <w:i/>
           <w:color w:val="00AA00"/>
           <w:sz w:val="20"/>
@@ -5223,7 +5225,7 @@
       </w:r>
       <w:r>
         <w:rPr>
-          <w:rFonts w:ascii="Monospace" w:hAnsi="Monospace"/>
+          <w:rFonts w:ascii="FreeMono" w:hAnsi="FreeMono"/>
           <w:i/>
           <w:color w:val="00AA00"/>
           <w:sz w:val="20"/>
@@ -5233,7 +5235,7 @@
       </w:r>
       <w:r>
         <w:rPr>
-          <w:rFonts w:ascii="Monospace" w:hAnsi="Monospace"/>
+          <w:rFonts w:ascii="FreeMono" w:hAnsi="FreeMono"/>
           <w:i/>
           <w:color w:val="00AA00"/>
           <w:sz w:val="20"/>
@@ -5246,17 +5248,17 @@
         <w:pStyle w:val="Normal"/>
         <w:spacing w:lineRule="auto" w:line="240" w:before="0" w:after="26"/>
         <w:rPr>
-          <w:rFonts w:ascii="Liberation Serif" w:hAnsi="Liberation Serif"/>
-          <w:b w:val="false"/>
-          <w:bCs w:val="false"/>
-          <w:sz w:val="24"/>
-          <w:szCs w:val="24"/>
-          <w:u w:val="none"/>
-        </w:rPr>
-      </w:pPr>
-      <w:r>
-        <w:rPr>
-          <w:rFonts w:ascii="Monospace" w:hAnsi="Monospace"/>
+          <w:rFonts w:ascii="FreeMono" w:hAnsi="FreeMono"/>
+          <w:b w:val="false"/>
+          <w:bCs w:val="false"/>
+          <w:sz w:val="24"/>
+          <w:szCs w:val="24"/>
+          <w:u w:val="none"/>
+        </w:rPr>
+      </w:pPr>
+      <w:r>
+        <w:rPr>
+          <w:rFonts w:ascii="FreeMono" w:hAnsi="FreeMono"/>
           <w:b w:val="false"/>
           <w:bCs w:val="false"/>
           <w:color w:val="000000"/>
@@ -5268,7 +5270,7 @@
       </w:r>
       <w:r>
         <w:rPr>
-          <w:rFonts w:ascii="Monospace" w:hAnsi="Monospace"/>
+          <w:rFonts w:ascii="FreeMono" w:hAnsi="FreeMono"/>
           <w:b w:val="false"/>
           <w:bCs w:val="false"/>
           <w:i/>
@@ -5281,7 +5283,7 @@
       </w:r>
       <w:r>
         <w:rPr>
-          <w:rFonts w:ascii="Monospace" w:hAnsi="Monospace"/>
+          <w:rFonts w:ascii="FreeMono" w:hAnsi="FreeMono"/>
           <w:b w:val="false"/>
           <w:bCs w:val="false"/>
           <w:i/>
@@ -5294,7 +5296,7 @@
       </w:r>
       <w:r>
         <w:rPr>
-          <w:rFonts w:ascii="Monospace" w:hAnsi="Monospace"/>
+          <w:rFonts w:ascii="FreeMono" w:hAnsi="FreeMono"/>
           <w:b w:val="false"/>
           <w:bCs w:val="false"/>
           <w:i/>
@@ -5311,7 +5313,6 @@
         <w:pStyle w:val="Normal"/>
         <w:spacing w:lineRule="auto" w:line="240" w:before="0" w:after="26"/>
         <w:rPr>
-          <w:rFonts w:ascii="Monospace" w:hAnsi="Monospace"/>
           <w:i/>
           <w:i/>
           <w:color w:val="00AA00"/>
@@ -5320,6 +5321,7 @@
       </w:pPr>
       <w:r>
         <w:rPr>
+          <w:rFonts w:ascii="FreeMono" w:hAnsi="FreeMono"/>
           <w:b w:val="false"/>
           <w:bCs w:val="false"/>
           <w:sz w:val="24"/>
@@ -5340,7 +5342,7 @@
       </w:pPr>
       <w:r>
         <w:rPr>
-          <w:rFonts w:ascii="Monospace" w:hAnsi="Monospace"/>
+          <w:rFonts w:ascii="FreeMono" w:hAnsi="FreeMono"/>
           <w:i/>
           <w:color w:val="C0C0C0"/>
           <w:sz w:val="20"/>
@@ -5360,7 +5362,7 @@
       </w:pPr>
       <w:r>
         <w:rPr>
-          <w:rFonts w:ascii="Monospace" w:hAnsi="Monospace"/>
+          <w:rFonts w:ascii="FreeMono" w:hAnsi="FreeMono"/>
           <w:color w:val="000000"/>
           <w:sz w:val="20"/>
         </w:rPr>
@@ -5368,7 +5370,7 @@
       </w:r>
       <w:r>
         <w:rPr>
-          <w:rFonts w:ascii="Monospace" w:hAnsi="Monospace"/>
+          <w:rFonts w:ascii="FreeMono" w:hAnsi="FreeMono"/>
           <w:i/>
           <w:color w:val="00AA00"/>
           <w:sz w:val="20"/>
@@ -5388,7 +5390,7 @@
       </w:pPr>
       <w:r>
         <w:rPr>
-          <w:rFonts w:ascii="Monospace" w:hAnsi="Monospace"/>
+          <w:rFonts w:ascii="FreeMono" w:hAnsi="FreeMono"/>
           <w:color w:val="000000"/>
           <w:sz w:val="20"/>
         </w:rPr>
@@ -5396,7 +5398,7 @@
       </w:r>
       <w:r>
         <w:rPr>
-          <w:rFonts w:ascii="Monospace" w:hAnsi="Monospace"/>
+          <w:rFonts w:ascii="FreeMono" w:hAnsi="FreeMono"/>
           <w:i/>
           <w:color w:val="00AA00"/>
           <w:sz w:val="20"/>
@@ -5409,17 +5411,17 @@
         <w:pStyle w:val="Normal"/>
         <w:spacing w:lineRule="auto" w:line="240" w:before="0" w:after="26"/>
         <w:rPr>
-          <w:rFonts w:ascii="Liberation Serif" w:hAnsi="Liberation Serif"/>
-          <w:b w:val="false"/>
-          <w:bCs w:val="false"/>
-          <w:sz w:val="24"/>
-          <w:szCs w:val="24"/>
-          <w:u w:val="none"/>
-        </w:rPr>
-      </w:pPr>
-      <w:r>
-        <w:rPr>
-          <w:rFonts w:ascii="Monospace" w:hAnsi="Monospace"/>
+          <w:rFonts w:ascii="FreeMono" w:hAnsi="FreeMono"/>
+          <w:b w:val="false"/>
+          <w:bCs w:val="false"/>
+          <w:sz w:val="24"/>
+          <w:szCs w:val="24"/>
+          <w:u w:val="none"/>
+        </w:rPr>
+      </w:pPr>
+      <w:r>
+        <w:rPr>
+          <w:rFonts w:ascii="FreeMono" w:hAnsi="FreeMono"/>
           <w:b w:val="false"/>
           <w:bCs w:val="false"/>
           <w:color w:val="000000"/>
@@ -5431,7 +5433,7 @@
       </w:r>
       <w:r>
         <w:rPr>
-          <w:rFonts w:ascii="Monospace" w:hAnsi="Monospace"/>
+          <w:rFonts w:ascii="FreeMono" w:hAnsi="FreeMono"/>
           <w:b w:val="false"/>
           <w:bCs w:val="false"/>
           <w:i/>
@@ -5448,7 +5450,6 @@
         <w:pStyle w:val="Normal"/>
         <w:spacing w:lineRule="auto" w:line="240" w:before="0" w:after="26"/>
         <w:rPr>
-          <w:rFonts w:ascii="Monospace" w:hAnsi="Monospace"/>
           <w:i/>
           <w:i/>
           <w:color w:val="00AA00"/>
@@ -5457,6 +5458,7 @@
       </w:pPr>
       <w:r>
         <w:rPr>
+          <w:rFonts w:ascii="FreeMono" w:hAnsi="FreeMono"/>
           <w:b w:val="false"/>
           <w:bCs w:val="false"/>
           <w:sz w:val="24"/>
@@ -5477,7 +5479,7 @@
       </w:pPr>
       <w:r>
         <w:rPr>
-          <w:rFonts w:ascii="Monospace" w:hAnsi="Monospace"/>
+          <w:rFonts w:ascii="FreeMono" w:hAnsi="FreeMono"/>
           <w:i/>
           <w:color w:val="C0C0C0"/>
           <w:sz w:val="20"/>
@@ -5497,7 +5499,7 @@
       </w:pPr>
       <w:r>
         <w:rPr>
-          <w:rFonts w:ascii="Monospace" w:hAnsi="Monospace"/>
+          <w:rFonts w:ascii="FreeMono" w:hAnsi="FreeMono"/>
           <w:color w:val="000000"/>
           <w:sz w:val="20"/>
         </w:rPr>
@@ -5505,7 +5507,7 @@
       </w:r>
       <w:r>
         <w:rPr>
-          <w:rFonts w:ascii="Monospace" w:hAnsi="Monospace"/>
+          <w:rFonts w:ascii="FreeMono" w:hAnsi="FreeMono"/>
           <w:i/>
           <w:color w:val="00AA00"/>
           <w:sz w:val="20"/>
@@ -5525,7 +5527,7 @@
       </w:pPr>
       <w:r>
         <w:rPr>
-          <w:rFonts w:ascii="Monospace" w:hAnsi="Monospace"/>
+          <w:rFonts w:ascii="FreeMono" w:hAnsi="FreeMono"/>
           <w:color w:val="000000"/>
           <w:sz w:val="20"/>
         </w:rPr>
@@ -5533,7 +5535,7 @@
       </w:r>
       <w:r>
         <w:rPr>
-          <w:rFonts w:ascii="Monospace" w:hAnsi="Monospace"/>
+          <w:rFonts w:ascii="FreeMono" w:hAnsi="FreeMono"/>
           <w:i/>
           <w:color w:val="00AA00"/>
           <w:sz w:val="20"/>
@@ -5546,17 +5548,17 @@
         <w:pStyle w:val="Normal"/>
         <w:spacing w:lineRule="auto" w:line="240" w:before="0" w:after="26"/>
         <w:rPr>
-          <w:rFonts w:ascii="Liberation Serif" w:hAnsi="Liberation Serif"/>
-          <w:b w:val="false"/>
-          <w:bCs w:val="false"/>
-          <w:sz w:val="24"/>
-          <w:szCs w:val="24"/>
-          <w:u w:val="none"/>
-        </w:rPr>
-      </w:pPr>
-      <w:r>
-        <w:rPr>
-          <w:rFonts w:ascii="Monospace" w:hAnsi="Monospace"/>
+          <w:rFonts w:ascii="FreeMono" w:hAnsi="FreeMono"/>
+          <w:b w:val="false"/>
+          <w:bCs w:val="false"/>
+          <w:sz w:val="24"/>
+          <w:szCs w:val="24"/>
+          <w:u w:val="none"/>
+        </w:rPr>
+      </w:pPr>
+      <w:r>
+        <w:rPr>
+          <w:rFonts w:ascii="FreeMono" w:hAnsi="FreeMono"/>
           <w:b w:val="false"/>
           <w:bCs w:val="false"/>
           <w:color w:val="000000"/>
@@ -5568,7 +5570,7 @@
       </w:r>
       <w:r>
         <w:rPr>
-          <w:rFonts w:ascii="Monospace" w:hAnsi="Monospace"/>
+          <w:rFonts w:ascii="FreeMono" w:hAnsi="FreeMono"/>
           <w:b w:val="false"/>
           <w:bCs w:val="false"/>
           <w:i/>
@@ -5578,6 +5580,354 @@
           <w:u w:val="none"/>
         </w:rPr>
         <w:t>"paused"</w:t>
+      </w:r>
+    </w:p>
+    <w:p>
+      <w:pPr>
+        <w:pStyle w:val="Normal"/>
+        <w:spacing w:lineRule="auto" w:line="240" w:before="0" w:after="26"/>
+        <w:rPr>
+          <w:i/>
+          <w:i/>
+          <w:color w:val="00AA00"/>
+          <w:sz w:val="20"/>
+        </w:rPr>
+      </w:pPr>
+      <w:r>
+        <w:rPr>
+          <w:rFonts w:ascii="FreeMono" w:hAnsi="FreeMono"/>
+          <w:b w:val="false"/>
+          <w:bCs w:val="false"/>
+          <w:sz w:val="24"/>
+          <w:szCs w:val="24"/>
+          <w:u w:val="none"/>
+        </w:rPr>
+      </w:r>
+    </w:p>
+    <w:p>
+      <w:pPr>
+        <w:pStyle w:val="Normal"/>
+        <w:ind w:hanging="0"/>
+        <w:jc w:val="start"/>
+        <w:rPr>
+          <w:rFonts w:ascii="Monospace" w:hAnsi="Monospace"/>
+          <w:sz w:val="20"/>
+        </w:rPr>
+      </w:pPr>
+      <w:r>
+        <w:rPr>
+          <w:rFonts w:ascii="FreeMono" w:hAnsi="FreeMono"/>
+          <w:i/>
+          <w:color w:val="000000"/>
+          <w:sz w:val="20"/>
+          <w:shd w:fill="FFFF96" w:val="clear"/>
+        </w:rPr>
+        <w:t>SPOTIFY_CONNECT_SERVERS_RUNNING</w:t>
+      </w:r>
+      <w:r>
+        <w:rPr>
+          <w:rFonts w:ascii="FreeMono" w:hAnsi="FreeMono"/>
+          <w:color w:val="000000"/>
+          <w:sz w:val="20"/>
+        </w:rPr>
+        <w:t xml:space="preserve">    </w:t>
+      </w:r>
+      <w:r>
+        <w:rPr>
+          <w:rFonts w:ascii="FreeMono" w:hAnsi="FreeMono"/>
+          <w:color w:val="000000"/>
+          <w:sz w:val="20"/>
+        </w:rPr>
+        <w:t>=</w:t>
+      </w:r>
+      <w:r>
+        <w:rPr>
+          <w:rFonts w:ascii="FreeMono" w:hAnsi="FreeMono"/>
+          <w:color w:val="000000"/>
+          <w:sz w:val="20"/>
+        </w:rPr>
+        <w:t xml:space="preserve"> </w:t>
+      </w:r>
+      <w:r>
+        <w:rPr>
+          <w:rFonts w:ascii="FreeMono" w:hAnsi="FreeMono"/>
+          <w:i/>
+          <w:color w:val="00AA00"/>
+          <w:sz w:val="20"/>
+        </w:rPr>
+        <w:t>"</w:t>
+      </w:r>
+      <w:r>
+        <w:rPr>
+          <w:rFonts w:ascii="FreeMono" w:hAnsi="FreeMono"/>
+          <w:i/>
+          <w:color w:val="00AA00"/>
+          <w:sz w:val="20"/>
+          <w:u w:val="single"/>
+        </w:rPr>
+        <w:t>Spotify</w:t>
+      </w:r>
+      <w:r>
+        <w:rPr>
+          <w:rFonts w:ascii="FreeMono" w:hAnsi="FreeMono"/>
+          <w:i/>
+          <w:color w:val="00AA00"/>
+          <w:sz w:val="20"/>
+        </w:rPr>
+        <w:t xml:space="preserve"> Connect local serversunning"</w:t>
+      </w:r>
+    </w:p>
+    <w:p>
+      <w:pPr>
+        <w:pStyle w:val="Normal"/>
+        <w:ind w:hanging="0"/>
+        <w:jc w:val="start"/>
+        <w:rPr>
+          <w:rFonts w:ascii="Monospace" w:hAnsi="Monospace"/>
+          <w:sz w:val="20"/>
+        </w:rPr>
+      </w:pPr>
+      <w:r>
+        <w:rPr>
+          <w:rFonts w:ascii="FreeMono" w:hAnsi="FreeMono"/>
+          <w:color w:val="000000"/>
+          <w:sz w:val="20"/>
+        </w:rPr>
+        <w:t xml:space="preserve">SPOTIFY_CONNECT_SERVERS_NOT_RUNNING = </w:t>
+      </w:r>
+      <w:r>
+        <w:rPr>
+          <w:rFonts w:ascii="FreeMono" w:hAnsi="FreeMono"/>
+          <w:i/>
+          <w:color w:val="00AA00"/>
+          <w:sz w:val="20"/>
+        </w:rPr>
+        <w:t>"</w:t>
+      </w:r>
+      <w:r>
+        <w:rPr>
+          <w:rFonts w:ascii="FreeMono" w:hAnsi="FreeMono"/>
+          <w:i/>
+          <w:color w:val="00AA00"/>
+          <w:sz w:val="20"/>
+          <w:u w:val="single"/>
+        </w:rPr>
+        <w:t>Spotify</w:t>
+      </w:r>
+      <w:r>
+        <w:rPr>
+          <w:rFonts w:ascii="FreeMono" w:hAnsi="FreeMono"/>
+          <w:i/>
+          <w:color w:val="00AA00"/>
+          <w:sz w:val="20"/>
+        </w:rPr>
+        <w:t xml:space="preserve"> Connect local servers NOT running"</w:t>
+      </w:r>
+    </w:p>
+    <w:p>
+      <w:pPr>
+        <w:pStyle w:val="Normal"/>
+        <w:ind w:hanging="0"/>
+        <w:jc w:val="start"/>
+        <w:rPr>
+          <w:rFonts w:ascii="Monospace" w:hAnsi="Monospace"/>
+          <w:sz w:val="20"/>
+        </w:rPr>
+      </w:pPr>
+      <w:r>
+        <w:rPr>
+          <w:rFonts w:ascii="FreeMono" w:hAnsi="FreeMono"/>
+          <w:color w:val="000000"/>
+          <w:sz w:val="20"/>
+        </w:rPr>
+        <w:t xml:space="preserve">SPOTIFY_CONNECT_MPV_SERVICE_NOT_ACTIVE = </w:t>
+      </w:r>
+      <w:r>
+        <w:rPr>
+          <w:rFonts w:ascii="FreeMono" w:hAnsi="FreeMono"/>
+          <w:i/>
+          <w:color w:val="00AA00"/>
+          <w:sz w:val="20"/>
+        </w:rPr>
+        <w:t>"</w:t>
+      </w:r>
+      <w:r>
+        <w:rPr>
+          <w:rFonts w:ascii="FreeMono" w:hAnsi="FreeMono"/>
+          <w:i/>
+          <w:color w:val="00AA00"/>
+          <w:sz w:val="20"/>
+          <w:u w:val="single"/>
+        </w:rPr>
+        <w:t>Spotify</w:t>
+      </w:r>
+      <w:r>
+        <w:rPr>
+          <w:rFonts w:ascii="FreeMono" w:hAnsi="FreeMono"/>
+          <w:i/>
+          <w:color w:val="00AA00"/>
+          <w:sz w:val="20"/>
+        </w:rPr>
+        <w:t xml:space="preserve"> Connect MPV service not active"</w:t>
+      </w:r>
+    </w:p>
+    <w:p>
+      <w:pPr>
+        <w:pStyle w:val="Normal"/>
+        <w:ind w:hanging="0"/>
+        <w:jc w:val="start"/>
+        <w:rPr>
+          <w:rFonts w:ascii="Monospace" w:hAnsi="Monospace"/>
+          <w:sz w:val="20"/>
+        </w:rPr>
+      </w:pPr>
+      <w:r>
+        <w:rPr>
+          <w:rFonts w:ascii="FreeMono" w:hAnsi="FreeMono"/>
+          <w:color w:val="000000"/>
+          <w:sz w:val="20"/>
+        </w:rPr>
+        <w:t xml:space="preserve">SPOTIFY_CONNECT_MPV_SERVICE_IS_ACTIVE = </w:t>
+      </w:r>
+      <w:r>
+        <w:rPr>
+          <w:rFonts w:ascii="FreeMono" w:hAnsi="FreeMono"/>
+          <w:i/>
+          <w:color w:val="00AA00"/>
+          <w:sz w:val="20"/>
+        </w:rPr>
+        <w:t>"</w:t>
+      </w:r>
+      <w:r>
+        <w:rPr>
+          <w:rFonts w:ascii="FreeMono" w:hAnsi="FreeMono"/>
+          <w:i/>
+          <w:color w:val="00AA00"/>
+          <w:sz w:val="20"/>
+          <w:u w:val="single"/>
+        </w:rPr>
+        <w:t>Spotify</w:t>
+      </w:r>
+      <w:r>
+        <w:rPr>
+          <w:rFonts w:ascii="FreeMono" w:hAnsi="FreeMono"/>
+          <w:i/>
+          <w:color w:val="00AA00"/>
+          <w:sz w:val="20"/>
+        </w:rPr>
+        <w:t xml:space="preserve"> Connect MPV service is active"</w:t>
+      </w:r>
+    </w:p>
+    <w:p>
+      <w:pPr>
+        <w:pStyle w:val="Normal"/>
+        <w:ind w:hanging="0"/>
+        <w:jc w:val="start"/>
+        <w:rPr>
+          <w:rFonts w:ascii="Monospace" w:hAnsi="Monospace"/>
+          <w:sz w:val="20"/>
+        </w:rPr>
+      </w:pPr>
+      <w:r>
+        <w:rPr>
+          <w:rFonts w:ascii="FreeMono" w:hAnsi="FreeMono"/>
+          <w:color w:val="000000"/>
+          <w:sz w:val="20"/>
+        </w:rPr>
+        <w:t xml:space="preserve">SPOTIFY_CONNECT_MPV_MPRIS_PLAYER_NOT_FOUND = </w:t>
+      </w:r>
+      <w:r>
+        <w:rPr>
+          <w:rFonts w:ascii="FreeMono" w:hAnsi="FreeMono"/>
+          <w:i/>
+          <w:color w:val="00AA00"/>
+          <w:sz w:val="20"/>
+        </w:rPr>
+        <w:t>"</w:t>
+      </w:r>
+      <w:r>
+        <w:rPr>
+          <w:rFonts w:ascii="FreeMono" w:hAnsi="FreeMono"/>
+          <w:i/>
+          <w:color w:val="00AA00"/>
+          <w:sz w:val="20"/>
+          <w:u w:val="single"/>
+        </w:rPr>
+        <w:t>Spotify</w:t>
+      </w:r>
+      <w:r>
+        <w:rPr>
+          <w:rFonts w:ascii="FreeMono" w:hAnsi="FreeMono"/>
+          <w:i/>
+          <w:color w:val="00AA00"/>
+          <w:sz w:val="20"/>
+        </w:rPr>
+        <w:t xml:space="preserve"> Connect MPV MPRIS player not found"</w:t>
+      </w:r>
+    </w:p>
+    <w:p>
+      <w:pPr>
+        <w:pStyle w:val="Normal"/>
+        <w:spacing w:lineRule="auto" w:line="240" w:before="0" w:after="26"/>
+        <w:rPr>
+          <w:rFonts w:ascii="FreeMono" w:hAnsi="FreeMono"/>
+          <w:b w:val="false"/>
+          <w:bCs w:val="false"/>
+          <w:sz w:val="24"/>
+          <w:szCs w:val="24"/>
+          <w:u w:val="none"/>
+        </w:rPr>
+      </w:pPr>
+      <w:r>
+        <w:rPr>
+          <w:rFonts w:ascii="FreeMono" w:hAnsi="FreeMono"/>
+          <w:b w:val="false"/>
+          <w:bCs w:val="false"/>
+          <w:color w:val="000000"/>
+          <w:sz w:val="20"/>
+          <w:szCs w:val="24"/>
+          <w:u w:val="none"/>
+        </w:rPr>
+        <w:t xml:space="preserve">SPOTIFY_CONNECT_MPV_STATE_OK  = </w:t>
+      </w:r>
+      <w:r>
+        <w:rPr>
+          <w:rFonts w:ascii="FreeMono" w:hAnsi="FreeMono"/>
+          <w:b w:val="false"/>
+          <w:bCs w:val="false"/>
+          <w:i/>
+          <w:color w:val="00AA00"/>
+          <w:sz w:val="20"/>
+          <w:szCs w:val="24"/>
+          <w:u w:val="none"/>
+        </w:rPr>
+        <w:t>"</w:t>
+      </w:r>
+      <w:r>
+        <w:rPr>
+          <w:rFonts w:ascii="FreeMono" w:hAnsi="FreeMono"/>
+          <w:b w:val="false"/>
+          <w:bCs w:val="false"/>
+          <w:i/>
+          <w:color w:val="00AA00"/>
+          <w:sz w:val="20"/>
+          <w:szCs w:val="24"/>
+          <w:u w:val="single"/>
+        </w:rPr>
+        <w:t>Spotify</w:t>
+      </w:r>
+      <w:r>
+        <w:rPr>
+          <w:rFonts w:ascii="FreeMono" w:hAnsi="FreeMono"/>
+          <w:b w:val="false"/>
+          <w:bCs w:val="false"/>
+          <w:i/>
+          <w:color w:val="00AA00"/>
+          <w:sz w:val="20"/>
+          <w:szCs w:val="24"/>
+          <w:u w:val="none"/>
+        </w:rPr>
+        <w:t xml:space="preserve"> Connect MPV State OK"</w:t>
       </w:r>
     </w:p>
     <w:p>
@@ -6820,13 +7170,17 @@
     <w:p>
       <w:pPr>
         <w:pStyle w:val="Normal"/>
-        <w:rPr>
-          <w:rFonts w:ascii="FreeMono" w:hAnsi="FreeMono"/>
-        </w:rPr>
-      </w:pPr>
-      <w:r>
-        <w:rPr>
-          <w:rFonts w:ascii="FreeMono" w:hAnsi="FreeMono"/>
+        <w:ind w:hanging="0"/>
+        <w:jc w:val="start"/>
+        <w:rPr>
+          <w:rFonts w:ascii="Monospace" w:hAnsi="Monospace"/>
+          <w:sz w:val="20"/>
+        </w:rPr>
+      </w:pPr>
+      <w:r>
+        <w:rPr>
+          <w:rFonts w:ascii="FreeMono" w:hAnsi="FreeMono"/>
+          <w:i/>
           <w:color w:val="000000"/>
           <w:sz w:val="20"/>
           <w:shd w:fill="E8F2FE" w:val="clear"/>
@@ -6838,7 +7192,6 @@
           <w:rFonts w:ascii="FreeMono" w:hAnsi="FreeMono"/>
           <w:color w:val="0000FF"/>
           <w:sz w:val="20"/>
-          <w:shd w:fill="E8F2FE" w:val="clear"/>
         </w:rPr>
         <w:t>def</w:t>
       </w:r>
@@ -6847,7 +7200,6 @@
           <w:rFonts w:ascii="FreeMono" w:hAnsi="FreeMono"/>
           <w:color w:val="000000"/>
           <w:sz w:val="20"/>
-          <w:shd w:fill="E8F2FE" w:val="clear"/>
         </w:rPr>
         <w:t xml:space="preserve"> </w:t>
       </w:r>
@@ -6857,7 +7209,6 @@
           <w:b/>
           <w:color w:val="000000"/>
           <w:sz w:val="20"/>
-          <w:shd w:fill="E8F2FE" w:val="clear"/>
         </w:rPr>
         <w:t>get_state</w:t>
       </w:r>
@@ -6866,7 +7217,6 @@
           <w:rFonts w:ascii="FreeMono" w:hAnsi="FreeMono"/>
           <w:color w:val="000000"/>
           <w:sz w:val="20"/>
-          <w:shd w:fill="E8F2FE" w:val="clear"/>
         </w:rPr>
         <w:t>(</w:t>
       </w:r>
@@ -6876,7 +7226,6 @@
           <w:i/>
           <w:color w:val="000000"/>
           <w:sz w:val="20"/>
-          <w:shd w:fill="E8F2FE" w:val="clear"/>
         </w:rPr>
         <w:t>self</w:t>
       </w:r>
@@ -6885,7 +7234,6 @@
           <w:rFonts w:ascii="FreeMono" w:hAnsi="FreeMono"/>
           <w:color w:val="000000"/>
           <w:sz w:val="20"/>
-          <w:shd w:fill="E8F2FE" w:val="clear"/>
         </w:rPr>
         <w:t>):</w:t>
       </w:r>
@@ -6903,10 +7251,8 @@
       <w:r>
         <w:rPr>
           <w:rFonts w:ascii="FreeMono" w:hAnsi="FreeMono"/>
-          <w:i/>
           <w:color w:val="000000"/>
           <w:sz w:val="20"/>
-          <w:shd w:fill="E8F2FE" w:val="clear"/>
         </w:rPr>
         <w:t xml:space="preserve">        </w:t>
       </w:r>
@@ -7007,7 +7353,7 @@
           <w:color w:val="00AA00"/>
           <w:sz w:val="20"/>
         </w:rPr>
-        <w:t xml:space="preserve"> self.state = current state = [  MPV_PLAYERCTL_PLAYING_STATE |</w:t>
+        <w:t xml:space="preserve"> self.state = current state = </w:t>
       </w:r>
     </w:p>
     <w:p>
@@ -7027,16 +7373,10 @@
           <w:color w:val="00AA00"/>
           <w:sz w:val="20"/>
         </w:rPr>
-        <w:t xml:space="preserve">                                                </w:t>
-      </w:r>
-      <w:r>
-        <w:rPr>
-          <w:rFonts w:ascii="FreeMono" w:hAnsi="FreeMono"/>
-          <w:i/>
-          <w:color w:val="00AA00"/>
-          <w:sz w:val="20"/>
-        </w:rPr>
-        <w:t>MPV_PLAYERCTL_STOPPED_STATE |</w:t>
+        <w:tab/>
+        <w:tab/>
+        <w:tab/>
+        <w:t>[  SPOTIFY_CONNECT_SERVERS_RUNNING |</w:t>
       </w:r>
     </w:p>
     <w:p>
@@ -7056,7 +7396,7 @@
           <w:color w:val="00AA00"/>
           <w:sz w:val="20"/>
         </w:rPr>
-        <w:t xml:space="preserve">                                                </w:t>
+        <w:t xml:space="preserve">                     </w:t>
       </w:r>
       <w:r>
         <w:rPr>
@@ -7065,7 +7405,139 @@
           <w:color w:val="00AA00"/>
           <w:sz w:val="20"/>
         </w:rPr>
-        <w:t>MPV_PLAYERCTL_PAUSED_STATE]</w:t>
+        <w:t>SPOTIFY_CONNECT_SERVERS_NOT_RUNNING |</w:t>
+      </w:r>
+    </w:p>
+    <w:p>
+      <w:pPr>
+        <w:pStyle w:val="Normal"/>
+        <w:ind w:hanging="0"/>
+        <w:jc w:val="start"/>
+        <w:rPr>
+          <w:rFonts w:ascii="Monospace" w:hAnsi="Monospace"/>
+          <w:sz w:val="20"/>
+        </w:rPr>
+      </w:pPr>
+      <w:r>
+        <w:rPr>
+          <w:rFonts w:ascii="FreeMono" w:hAnsi="FreeMono"/>
+          <w:i/>
+          <w:color w:val="00AA00"/>
+          <w:sz w:val="20"/>
+        </w:rPr>
+        <w:t xml:space="preserve">                     </w:t>
+      </w:r>
+      <w:r>
+        <w:rPr>
+          <w:rFonts w:ascii="FreeMono" w:hAnsi="FreeMono"/>
+          <w:i/>
+          <w:color w:val="00AA00"/>
+          <w:sz w:val="20"/>
+        </w:rPr>
+        <w:t>SPOTIFY_CONNECT_MPV_SERVICE_NOT_ACTIVE |</w:t>
+      </w:r>
+    </w:p>
+    <w:p>
+      <w:pPr>
+        <w:pStyle w:val="Normal"/>
+        <w:ind w:hanging="0"/>
+        <w:jc w:val="start"/>
+        <w:rPr>
+          <w:rFonts w:ascii="Monospace" w:hAnsi="Monospace"/>
+          <w:sz w:val="20"/>
+        </w:rPr>
+      </w:pPr>
+      <w:r>
+        <w:rPr>
+          <w:rFonts w:ascii="FreeMono" w:hAnsi="FreeMono"/>
+          <w:i/>
+          <w:color w:val="00AA00"/>
+          <w:sz w:val="20"/>
+        </w:rPr>
+        <w:t xml:space="preserve">                     </w:t>
+      </w:r>
+      <w:r>
+        <w:rPr>
+          <w:rFonts w:ascii="FreeMono" w:hAnsi="FreeMono"/>
+          <w:i/>
+          <w:color w:val="00AA00"/>
+          <w:sz w:val="20"/>
+        </w:rPr>
+        <w:t>SPOTIFY_CONNECT_MPV_SERVICE_IS_ACTIVE |</w:t>
+      </w:r>
+    </w:p>
+    <w:p>
+      <w:pPr>
+        <w:pStyle w:val="Normal"/>
+        <w:ind w:hanging="0"/>
+        <w:jc w:val="start"/>
+        <w:rPr>
+          <w:rFonts w:ascii="Monospace" w:hAnsi="Monospace"/>
+          <w:sz w:val="20"/>
+        </w:rPr>
+      </w:pPr>
+      <w:r>
+        <w:rPr>
+          <w:rFonts w:ascii="FreeMono" w:hAnsi="FreeMono"/>
+          <w:i/>
+          <w:color w:val="00AA00"/>
+          <w:sz w:val="20"/>
+        </w:rPr>
+        <w:t xml:space="preserve">                     </w:t>
+      </w:r>
+      <w:r>
+        <w:rPr>
+          <w:rFonts w:ascii="FreeMono" w:hAnsi="FreeMono"/>
+          <w:i/>
+          <w:color w:val="00AA00"/>
+          <w:sz w:val="20"/>
+        </w:rPr>
+        <w:t>SPOTIFY_CONNECT_MPV_MPRIS_PLAYER_NOT_FOUND |</w:t>
+      </w:r>
+    </w:p>
+    <w:p>
+      <w:pPr>
+        <w:pStyle w:val="Normal"/>
+        <w:ind w:hanging="0"/>
+        <w:jc w:val="start"/>
+        <w:rPr>
+          <w:rFonts w:ascii="Monospace" w:hAnsi="Monospace"/>
+          <w:sz w:val="20"/>
+        </w:rPr>
+      </w:pPr>
+      <w:r>
+        <w:rPr>
+          <w:rFonts w:ascii="FreeMono" w:hAnsi="FreeMono"/>
+          <w:i/>
+          <w:color w:val="00AA00"/>
+          <w:sz w:val="20"/>
+        </w:rPr>
+        <w:t xml:space="preserve">                     </w:t>
+      </w:r>
+      <w:r>
+        <w:rPr>
+          <w:rFonts w:ascii="FreeMono" w:hAnsi="FreeMono"/>
+          <w:i/>
+          <w:color w:val="00AA00"/>
+          <w:sz w:val="20"/>
+        </w:rPr>
+        <w:t xml:space="preserve">SPOTIFY_CONNECT_MPV_STATE_OK ]  </w:t>
+      </w:r>
+    </w:p>
+    <w:p>
+      <w:pPr>
+        <w:pStyle w:val="Normal"/>
+        <w:ind w:hanging="0"/>
+        <w:jc w:val="start"/>
+        <w:rPr>
+          <w:rFonts w:ascii="Monospace" w:hAnsi="Monospace"/>
+          <w:sz w:val="20"/>
+        </w:rPr>
+      </w:pPr>
+      <w:r>
+        <w:rPr>
+          <w:rFonts w:ascii="FreeMono" w:hAnsi="FreeMono"/>
+        </w:rPr>
       </w:r>
     </w:p>
     <w:p>

</xml_diff>

<commit_message>
Update Activity_view.odg, Activity_view_spotify_connect_play_disconnect.jpg, and 5 more files...
</commit_message>
<xml_diff>
--- a/Documents/Spotify/Spotify Connect design.docx
+++ b/Documents/Spotify/Spotify Connect design.docx
@@ -1826,7 +1826,7 @@
       <w:tblPr>
         <w:tblW w:w="6190" w:type="dxa"/>
         <w:jc w:val="start"/>
-        <w:tblInd w:w="28" w:type="dxa"/>
+        <w:tblInd w:w="0" w:type="dxa"/>
         <w:tblLayout w:type="fixed"/>
         <w:tblCellMar>
           <w:top w:w="28" w:type="dxa"/>
@@ -2095,7 +2095,7 @@
       <w:tblPr>
         <w:tblW w:w="5632" w:type="dxa"/>
         <w:jc w:val="start"/>
-        <w:tblInd w:w="28" w:type="dxa"/>
+        <w:tblInd w:w="0" w:type="dxa"/>
         <w:tblLayout w:type="fixed"/>
         <w:tblCellMar>
           <w:top w:w="28" w:type="dxa"/>
@@ -2310,7 +2310,7 @@
       <w:tblPr>
         <w:tblW w:w="5632" w:type="dxa"/>
         <w:jc w:val="start"/>
-        <w:tblInd w:w="28" w:type="dxa"/>
+        <w:tblInd w:w="0" w:type="dxa"/>
         <w:tblLayout w:type="fixed"/>
         <w:tblCellMar>
           <w:top w:w="28" w:type="dxa"/>
@@ -2525,7 +2525,7 @@
       <w:tblPr>
         <w:tblW w:w="5632" w:type="dxa"/>
         <w:jc w:val="start"/>
-        <w:tblInd w:w="28" w:type="dxa"/>
+        <w:tblInd w:w="0" w:type="dxa"/>
         <w:tblLayout w:type="fixed"/>
         <w:tblCellMar>
           <w:top w:w="28" w:type="dxa"/>
@@ -2848,7 +2848,7 @@
       <w:tblPr>
         <w:tblW w:w="5632" w:type="dxa"/>
         <w:jc w:val="start"/>
-        <w:tblInd w:w="28" w:type="dxa"/>
+        <w:tblInd w:w="0" w:type="dxa"/>
         <w:tblLayout w:type="fixed"/>
         <w:tblCellMar>
           <w:top w:w="28" w:type="dxa"/>
@@ -3171,7 +3171,7 @@
       <w:tblPr>
         <w:tblW w:w="5632" w:type="dxa"/>
         <w:jc w:val="start"/>
-        <w:tblInd w:w="28" w:type="dxa"/>
+        <w:tblInd w:w="0" w:type="dxa"/>
         <w:tblLayout w:type="fixed"/>
         <w:tblCellMar>
           <w:top w:w="28" w:type="dxa"/>
@@ -3386,7 +3386,7 @@
       <w:tblPr>
         <w:tblW w:w="5441" w:type="dxa"/>
         <w:jc w:val="start"/>
-        <w:tblInd w:w="28" w:type="dxa"/>
+        <w:tblInd w:w="0" w:type="dxa"/>
         <w:tblLayout w:type="fixed"/>
         <w:tblCellMar>
           <w:top w:w="28" w:type="dxa"/>
@@ -8009,23 +8009,180 @@
     </w:p>
     <w:p>
       <w:pPr>
-        <w:pStyle w:val="Normal"/>
-        <w:ind w:hanging="0"/>
-        <w:jc w:val="start"/>
-        <w:rPr>
-          <w:rFonts w:ascii="Monospace" w:hAnsi="Monospace"/>
-          <w:sz w:val="20"/>
-        </w:rPr>
-      </w:pPr>
-      <w:r>
-        <w:rPr>
-          <w:rFonts w:ascii="FreeMono" w:hAnsi="FreeMono"/>
-          <w:b w:val="false"/>
-          <w:bCs w:val="false"/>
-          <w:sz w:val="24"/>
-          <w:szCs w:val="24"/>
-          <w:u w:val="none"/>
-        </w:rPr>
+        <w:pStyle w:val="Heading2"/>
+        <w:rPr/>
+      </w:pPr>
+      <w:r>
+        <w:rPr/>
+        <w:t>Activity view diagrams</w:t>
+      </w:r>
+    </w:p>
+    <w:p>
+      <w:pPr>
+        <w:pStyle w:val="Heading3"/>
+        <w:rPr/>
+      </w:pPr>
+      <w:r>
+        <w:rPr/>
+        <w:t>Activity view for play-pause at the Spotify App</w:t>
+      </w:r>
+    </w:p>
+    <w:p>
+      <w:pPr>
+        <w:pStyle w:val="BodyText"/>
+        <w:rPr/>
+      </w:pPr>
+      <w:r>
+        <w:rPr/>
+        <w:drawing>
+          <wp:anchor behindDoc="0" distT="0" distB="0" distL="0" distR="0" simplePos="0" locked="0" layoutInCell="0" allowOverlap="1" relativeHeight="3">
+            <wp:simplePos x="0" y="0"/>
+            <wp:positionH relativeFrom="column">
+              <wp:posOffset>-720090</wp:posOffset>
+            </wp:positionH>
+            <wp:positionV relativeFrom="paragraph">
+              <wp:posOffset>30480</wp:posOffset>
+            </wp:positionV>
+            <wp:extent cx="7560310" cy="4718050"/>
+            <wp:effectExtent l="0" t="0" r="0" b="0"/>
+            <wp:wrapSquare wrapText="largest"/>
+            <wp:docPr id="2" name="Object1" descr="" title=""/>
+            <wp:cNvGraphicFramePr>
+              <a:graphicFrameLocks xmlns:a="http://schemas.openxmlformats.org/drawingml/2006/main" noChangeAspect="1"/>
+            </wp:cNvGraphicFramePr>
+            <a:graphic xmlns:a="http://schemas.openxmlformats.org/drawingml/2006/main">
+              <a:graphicData uri="http://schemas.openxmlformats.org/drawingml/2006/picture">
+                <pic:pic xmlns:pic="http://schemas.openxmlformats.org/drawingml/2006/picture">
+                  <pic:nvPicPr>
+                    <pic:cNvPr id="2" name="Object1" descr="" title=""/>
+                    <pic:cNvPicPr>
+                      <a:picLocks noChangeAspect="1" noChangeArrowheads="1"/>
+                    </pic:cNvPicPr>
+                  </pic:nvPicPr>
+                  <pic:blipFill>
+                    <a:blip r:embed="rId4"/>
+                    <a:stretch>
+                      <a:fillRect/>
+                    </a:stretch>
+                  </pic:blipFill>
+                  <pic:spPr bwMode="auto">
+                    <a:xfrm>
+                      <a:off x="0" y="0"/>
+                      <a:ext cx="7560310" cy="4718050"/>
+                    </a:xfrm>
+                    <a:prstGeom prst="rect">
+                      <a:avLst/>
+                    </a:prstGeom>
+                  </pic:spPr>
+                </pic:pic>
+              </a:graphicData>
+            </a:graphic>
+          </wp:anchor>
+        </w:drawing>
+      </w:r>
+    </w:p>
+    <w:p>
+      <w:pPr>
+        <w:pStyle w:val="Heading3"/>
+        <w:rPr/>
+      </w:pPr>
+      <w:r>
+        <w:rPr/>
+      </w:r>
+      <w:r>
+        <w:br w:type="page"/>
+      </w:r>
+    </w:p>
+    <w:p>
+      <w:pPr>
+        <w:pStyle w:val="Heading3"/>
+        <w:rPr/>
+      </w:pPr>
+      <w:r>
+        <w:rPr/>
+        <w:t>Activity view for play-disconnect at Spotify App and local play-pause</w:t>
+      </w:r>
+    </w:p>
+    <w:p>
+      <w:pPr>
+        <w:pStyle w:val="BodyText"/>
+        <w:rPr/>
+      </w:pPr>
+      <w:r>
+        <w:rPr/>
+      </w:r>
+    </w:p>
+    <w:p>
+      <w:pPr>
+        <w:pStyle w:val="BodyText"/>
+        <w:rPr/>
+      </w:pPr>
+      <w:r>
+        <w:rPr/>
+        <w:drawing>
+          <wp:anchor behindDoc="0" distT="0" distB="0" distL="0" distR="0" simplePos="0" locked="0" layoutInCell="0" allowOverlap="1" relativeHeight="4">
+            <wp:simplePos x="0" y="0"/>
+            <wp:positionH relativeFrom="column">
+              <wp:align>center</wp:align>
+            </wp:positionH>
+            <wp:positionV relativeFrom="paragraph">
+              <wp:posOffset>635</wp:posOffset>
+            </wp:positionV>
+            <wp:extent cx="7560310" cy="4718050"/>
+            <wp:effectExtent l="0" t="0" r="0" b="0"/>
+            <wp:wrapSquare wrapText="largest"/>
+            <wp:docPr id="3" name="Object2" descr="" title=""/>
+            <wp:cNvGraphicFramePr>
+              <a:graphicFrameLocks xmlns:a="http://schemas.openxmlformats.org/drawingml/2006/main" noChangeAspect="1"/>
+            </wp:cNvGraphicFramePr>
+            <a:graphic xmlns:a="http://schemas.openxmlformats.org/drawingml/2006/main">
+              <a:graphicData uri="http://schemas.openxmlformats.org/drawingml/2006/picture">
+                <pic:pic xmlns:pic="http://schemas.openxmlformats.org/drawingml/2006/picture">
+                  <pic:nvPicPr>
+                    <pic:cNvPr id="3" name="Object2" descr="" title=""/>
+                    <pic:cNvPicPr>
+                      <a:picLocks noChangeAspect="1" noChangeArrowheads="1"/>
+                    </pic:cNvPicPr>
+                  </pic:nvPicPr>
+                  <pic:blipFill>
+                    <a:blip r:embed="rId5"/>
+                    <a:stretch>
+                      <a:fillRect/>
+                    </a:stretch>
+                  </pic:blipFill>
+                  <pic:spPr bwMode="auto">
+                    <a:xfrm>
+                      <a:off x="0" y="0"/>
+                      <a:ext cx="7560310" cy="4718050"/>
+                    </a:xfrm>
+                    <a:prstGeom prst="rect">
+                      <a:avLst/>
+                    </a:prstGeom>
+                  </pic:spPr>
+                </pic:pic>
+              </a:graphicData>
+            </a:graphic>
+          </wp:anchor>
+        </w:drawing>
+      </w:r>
+    </w:p>
+    <w:p>
+      <w:pPr>
+        <w:pStyle w:val="BodyText"/>
+        <w:rPr/>
+      </w:pPr>
+      <w:r>
+        <w:rPr/>
+      </w:r>
+    </w:p>
+    <w:p>
+      <w:pPr>
+        <w:pStyle w:val="BodyText"/>
+        <w:spacing w:before="0" w:after="140"/>
+        <w:rPr/>
+      </w:pPr>
+      <w:r>
+        <w:rPr/>
       </w:r>
     </w:p>
     <w:sectPr>

</xml_diff>